<commit_message>
Corrige el enlace del repositorio en el informe y la presentación
La cuenta de GitHub es augustocco.

Co-Authored-By: Claude Opus 5.5 <noreply@anthropic.com>
</commit_message>
<xml_diff>
--- a/docs/informe/Informe-AulaNube.docx
+++ b/docs/informe/Informe-AulaNube.docx
@@ -201,7 +201,7 @@
           <w:sz w:val="20"/>
           <w:szCs w:val="20"/>
         </w:rPr>
-        <w:t>Repositorio: https://github.com/augustcco/aulanube</w:t>
+        <w:t>Repositorio: https://github.com/augustocco/aulanube</w:t>
       </w:r>
     </w:p>
     <w:p>
@@ -262,7 +262,7 @@
     <w:sdt>
       <w:sdtPr>
         <w:alias w:val="Contenido"/>
-        <w:id w:val="1627576929"/>
+        <w:id w:val="-1368607259"/>
       </w:sdtPr>
       <w:sdtEndPr/>
       <w:sdtContent>
@@ -283,15 +283,15 @@
             <w:fldChar w:fldCharType="begin"/>
           </w:r>
           <w:r>
-            <w:instrText>TOC \h \o "1</w:instrText>
+            <w:instrText>TOC \h \o "</w:instrText>
           </w:r>
           <w:r>
-            <w:instrText>-2"</w:instrText>
+            <w:instrText>1-2"</w:instrText>
           </w:r>
           <w:r>
             <w:fldChar w:fldCharType="separate"/>
           </w:r>
-          <w:hyperlink w:anchor="_Toc243463374" w:history="1">
+          <w:hyperlink w:anchor="_Toc243463649" w:history="1">
             <w:r>
               <w:rPr>
                 <w:rStyle w:val="Hipervnculo"/>
@@ -315,7 +315,7 @@
               <w:rPr>
                 <w:noProof/>
               </w:rPr>
-              <w:instrText xml:space="preserve"> PAGEREF _Toc243463374 \h </w:instrText>
+              <w:instrText xml:space="preserve"> PAGEREF _Toc243463649 \h </w:instrText>
             </w:r>
             <w:r>
               <w:rPr>
@@ -355,7 +355,7 @@
               <w:szCs w:val="22"/>
             </w:rPr>
           </w:pPr>
-          <w:hyperlink w:anchor="_Toc243463375" w:history="1">
+          <w:hyperlink w:anchor="_Toc243463650" w:history="1">
             <w:r>
               <w:rPr>
                 <w:rStyle w:val="Hipervnculo"/>
@@ -379,7 +379,7 @@
               <w:rPr>
                 <w:noProof/>
               </w:rPr>
-              <w:instrText xml:space="preserve"> PAGEREF _Toc243463375 \h </w:instrText>
+              <w:instrText xml:space="preserve"> PAGEREF _Toc243463650 \h </w:instrText>
             </w:r>
             <w:r>
               <w:rPr>
@@ -419,7 +419,7 @@
               <w:szCs w:val="22"/>
             </w:rPr>
           </w:pPr>
-          <w:hyperlink w:anchor="_Toc243463376" w:history="1">
+          <w:hyperlink w:anchor="_Toc243463651" w:history="1">
             <w:r>
               <w:rPr>
                 <w:rStyle w:val="Hipervnculo"/>
@@ -443,7 +443,7 @@
               <w:rPr>
                 <w:noProof/>
               </w:rPr>
-              <w:instrText xml:space="preserve"> PAGEREF _Toc243463376 \h </w:instrText>
+              <w:instrText xml:space="preserve"> PAGEREF _Toc243463651 \h </w:instrText>
             </w:r>
             <w:r>
               <w:rPr>
@@ -483,7 +483,7 @@
               <w:szCs w:val="22"/>
             </w:rPr>
           </w:pPr>
-          <w:hyperlink w:anchor="_Toc243463377" w:history="1">
+          <w:hyperlink w:anchor="_Toc243463652" w:history="1">
             <w:r>
               <w:rPr>
                 <w:rStyle w:val="Hipervnculo"/>
@@ -507,7 +507,7 @@
               <w:rPr>
                 <w:noProof/>
               </w:rPr>
-              <w:instrText xml:space="preserve"> PAGEREF _Toc243463377 \h </w:instrText>
+              <w:instrText xml:space="preserve"> PAGEREF _Toc243463652 \h </w:instrText>
             </w:r>
             <w:r>
               <w:rPr>
@@ -547,7 +547,7 @@
               <w:szCs w:val="22"/>
             </w:rPr>
           </w:pPr>
-          <w:hyperlink w:anchor="_Toc243463378" w:history="1">
+          <w:hyperlink w:anchor="_Toc243463653" w:history="1">
             <w:r>
               <w:rPr>
                 <w:rStyle w:val="Hipervnculo"/>
@@ -571,7 +571,7 @@
               <w:rPr>
                 <w:noProof/>
               </w:rPr>
-              <w:instrText xml:space="preserve"> PAGEREF _Toc243463378 \h </w:instrText>
+              <w:instrText xml:space="preserve"> PAGEREF _Toc243463653 \h </w:instrText>
             </w:r>
             <w:r>
               <w:rPr>
@@ -611,7 +611,7 @@
               <w:szCs w:val="22"/>
             </w:rPr>
           </w:pPr>
-          <w:hyperlink w:anchor="_Toc243463379" w:history="1">
+          <w:hyperlink w:anchor="_Toc243463654" w:history="1">
             <w:r>
               <w:rPr>
                 <w:rStyle w:val="Hipervnculo"/>
@@ -635,7 +635,7 @@
               <w:rPr>
                 <w:noProof/>
               </w:rPr>
-              <w:instrText xml:space="preserve"> PAGEREF _Toc243463379 \h </w:instrText>
+              <w:instrText xml:space="preserve"> PAGEREF _Toc243463654 \h </w:instrText>
             </w:r>
             <w:r>
               <w:rPr>
@@ -675,7 +675,7 @@
               <w:szCs w:val="22"/>
             </w:rPr>
           </w:pPr>
-          <w:hyperlink w:anchor="_Toc243463380" w:history="1">
+          <w:hyperlink w:anchor="_Toc243463655" w:history="1">
             <w:r>
               <w:rPr>
                 <w:rStyle w:val="Hipervnculo"/>
@@ -699,7 +699,7 @@
               <w:rPr>
                 <w:noProof/>
               </w:rPr>
-              <w:instrText xml:space="preserve"> PAGEREF _Toc243463380 \h </w:instrText>
+              <w:instrText xml:space="preserve"> PAGEREF _Toc243463655 \h </w:instrText>
             </w:r>
             <w:r>
               <w:rPr>
@@ -739,7 +739,7 @@
               <w:szCs w:val="22"/>
             </w:rPr>
           </w:pPr>
-          <w:hyperlink w:anchor="_Toc243463381" w:history="1">
+          <w:hyperlink w:anchor="_Toc243463656" w:history="1">
             <w:r>
               <w:rPr>
                 <w:rStyle w:val="Hipervnculo"/>
@@ -763,7 +763,7 @@
               <w:rPr>
                 <w:noProof/>
               </w:rPr>
-              <w:instrText xml:space="preserve"> PAGEREF _Toc243463381 \h </w:instrText>
+              <w:instrText xml:space="preserve"> PAGEREF _Toc243463656 \h </w:instrText>
             </w:r>
             <w:r>
               <w:rPr>
@@ -803,7 +803,7 @@
               <w:szCs w:val="22"/>
             </w:rPr>
           </w:pPr>
-          <w:hyperlink w:anchor="_Toc243463382" w:history="1">
+          <w:hyperlink w:anchor="_Toc243463657" w:history="1">
             <w:r>
               <w:rPr>
                 <w:rStyle w:val="Hipervnculo"/>
@@ -827,7 +827,7 @@
               <w:rPr>
                 <w:noProof/>
               </w:rPr>
-              <w:instrText xml:space="preserve"> PAGEREF _Toc243463382 \h </w:instrText>
+              <w:instrText xml:space="preserve"> PAGEREF _Toc243463657 \h </w:instrText>
             </w:r>
             <w:r>
               <w:rPr>
@@ -867,7 +867,7 @@
               <w:szCs w:val="22"/>
             </w:rPr>
           </w:pPr>
-          <w:hyperlink w:anchor="_Toc243463383" w:history="1">
+          <w:hyperlink w:anchor="_Toc243463658" w:history="1">
             <w:r>
               <w:rPr>
                 <w:rStyle w:val="Hipervnculo"/>
@@ -891,7 +891,7 @@
               <w:rPr>
                 <w:noProof/>
               </w:rPr>
-              <w:instrText xml:space="preserve"> PAGEREF _Toc243463383 \h </w:instrText>
+              <w:instrText xml:space="preserve"> PAGEREF _Toc243463658 \h </w:instrText>
             </w:r>
             <w:r>
               <w:rPr>
@@ -931,7 +931,7 @@
               <w:szCs w:val="22"/>
             </w:rPr>
           </w:pPr>
-          <w:hyperlink w:anchor="_Toc243463384" w:history="1">
+          <w:hyperlink w:anchor="_Toc243463659" w:history="1">
             <w:r>
               <w:rPr>
                 <w:rStyle w:val="Hipervnculo"/>
@@ -955,7 +955,7 @@
               <w:rPr>
                 <w:noProof/>
               </w:rPr>
-              <w:instrText xml:space="preserve"> PAGEREF _Toc243463384 \h </w:instrText>
+              <w:instrText xml:space="preserve"> PAGEREF _Toc243463659 \h </w:instrText>
             </w:r>
             <w:r>
               <w:rPr>
@@ -995,7 +995,7 @@
               <w:szCs w:val="22"/>
             </w:rPr>
           </w:pPr>
-          <w:hyperlink w:anchor="_Toc243463385" w:history="1">
+          <w:hyperlink w:anchor="_Toc243463660" w:history="1">
             <w:r>
               <w:rPr>
                 <w:rStyle w:val="Hipervnculo"/>
@@ -1019,7 +1019,7 @@
               <w:rPr>
                 <w:noProof/>
               </w:rPr>
-              <w:instrText xml:space="preserve"> PAGEREF _Toc243463385 \h </w:instrText>
+              <w:instrText xml:space="preserve"> PAGEREF _Toc243463660 \h </w:instrText>
             </w:r>
             <w:r>
               <w:rPr>
@@ -1059,7 +1059,7 @@
               <w:szCs w:val="22"/>
             </w:rPr>
           </w:pPr>
-          <w:hyperlink w:anchor="_Toc243463386" w:history="1">
+          <w:hyperlink w:anchor="_Toc243463661" w:history="1">
             <w:r>
               <w:rPr>
                 <w:rStyle w:val="Hipervnculo"/>
@@ -1083,7 +1083,7 @@
               <w:rPr>
                 <w:noProof/>
               </w:rPr>
-              <w:instrText xml:space="preserve"> PAGEREF _Toc243463386 \h </w:instrText>
+              <w:instrText xml:space="preserve"> PAGEREF _Toc243463661 \h </w:instrText>
             </w:r>
             <w:r>
               <w:rPr>
@@ -1123,7 +1123,7 @@
               <w:szCs w:val="22"/>
             </w:rPr>
           </w:pPr>
-          <w:hyperlink w:anchor="_Toc243463387" w:history="1">
+          <w:hyperlink w:anchor="_Toc243463662" w:history="1">
             <w:r>
               <w:rPr>
                 <w:rStyle w:val="Hipervnculo"/>
@@ -1147,7 +1147,7 @@
               <w:rPr>
                 <w:noProof/>
               </w:rPr>
-              <w:instrText xml:space="preserve"> PAGEREF _Toc243463387 \h </w:instrText>
+              <w:instrText xml:space="preserve"> PAGEREF _Toc243463662 \h </w:instrText>
             </w:r>
             <w:r>
               <w:rPr>
@@ -1187,7 +1187,7 @@
               <w:szCs w:val="22"/>
             </w:rPr>
           </w:pPr>
-          <w:hyperlink w:anchor="_Toc243463388" w:history="1">
+          <w:hyperlink w:anchor="_Toc243463663" w:history="1">
             <w:r>
               <w:rPr>
                 <w:rStyle w:val="Hipervnculo"/>
@@ -1211,7 +1211,7 @@
               <w:rPr>
                 <w:noProof/>
               </w:rPr>
-              <w:instrText xml:space="preserve"> PAGEREF _Toc243463388 \h </w:instrText>
+              <w:instrText xml:space="preserve"> PAGEREF _Toc243463663 \h </w:instrText>
             </w:r>
             <w:r>
               <w:rPr>
@@ -1251,7 +1251,7 @@
               <w:szCs w:val="22"/>
             </w:rPr>
           </w:pPr>
-          <w:hyperlink w:anchor="_Toc243463389" w:history="1">
+          <w:hyperlink w:anchor="_Toc243463664" w:history="1">
             <w:r>
               <w:rPr>
                 <w:rStyle w:val="Hipervnculo"/>
@@ -1275,7 +1275,7 @@
               <w:rPr>
                 <w:noProof/>
               </w:rPr>
-              <w:instrText xml:space="preserve"> PAGEREF _Toc243463389 \h </w:instrText>
+              <w:instrText xml:space="preserve"> PAGEREF _Toc243463664 \h </w:instrText>
             </w:r>
             <w:r>
               <w:rPr>
@@ -1315,7 +1315,7 @@
               <w:szCs w:val="22"/>
             </w:rPr>
           </w:pPr>
-          <w:hyperlink w:anchor="_Toc243463390" w:history="1">
+          <w:hyperlink w:anchor="_Toc243463665" w:history="1">
             <w:r>
               <w:rPr>
                 <w:rStyle w:val="Hipervnculo"/>
@@ -1339,7 +1339,7 @@
               <w:rPr>
                 <w:noProof/>
               </w:rPr>
-              <w:instrText xml:space="preserve"> PAGEREF _Toc243463390 \h </w:instrText>
+              <w:instrText xml:space="preserve"> PAGEREF _Toc243463665 \h </w:instrText>
             </w:r>
             <w:r>
               <w:rPr>
@@ -1379,7 +1379,7 @@
               <w:szCs w:val="22"/>
             </w:rPr>
           </w:pPr>
-          <w:hyperlink w:anchor="_Toc243463391" w:history="1">
+          <w:hyperlink w:anchor="_Toc243463666" w:history="1">
             <w:r>
               <w:rPr>
                 <w:rStyle w:val="Hipervnculo"/>
@@ -1403,7 +1403,7 @@
               <w:rPr>
                 <w:noProof/>
               </w:rPr>
-              <w:instrText xml:space="preserve"> PAGEREF _Toc243463391 \h </w:instrText>
+              <w:instrText xml:space="preserve"> PAGEREF _Toc243463666 \h </w:instrText>
             </w:r>
             <w:r>
               <w:rPr>
@@ -1443,7 +1443,7 @@
               <w:szCs w:val="22"/>
             </w:rPr>
           </w:pPr>
-          <w:hyperlink w:anchor="_Toc243463392" w:history="1">
+          <w:hyperlink w:anchor="_Toc243463667" w:history="1">
             <w:r>
               <w:rPr>
                 <w:rStyle w:val="Hipervnculo"/>
@@ -1467,7 +1467,7 @@
               <w:rPr>
                 <w:noProof/>
               </w:rPr>
-              <w:instrText xml:space="preserve"> PAGEREF _Toc243463392 \h </w:instrText>
+              <w:instrText xml:space="preserve"> PAGEREF _Toc243463667 \h </w:instrText>
             </w:r>
             <w:r>
               <w:rPr>
@@ -1507,7 +1507,7 @@
               <w:szCs w:val="22"/>
             </w:rPr>
           </w:pPr>
-          <w:hyperlink w:anchor="_Toc243463393" w:history="1">
+          <w:hyperlink w:anchor="_Toc243463668" w:history="1">
             <w:r>
               <w:rPr>
                 <w:rStyle w:val="Hipervnculo"/>
@@ -1531,7 +1531,7 @@
               <w:rPr>
                 <w:noProof/>
               </w:rPr>
-              <w:instrText xml:space="preserve"> PAGEREF _Toc243463393 \h </w:instrText>
+              <w:instrText xml:space="preserve"> PAGEREF _Toc243463668 \h </w:instrText>
             </w:r>
             <w:r>
               <w:rPr>
@@ -1571,7 +1571,7 @@
               <w:szCs w:val="22"/>
             </w:rPr>
           </w:pPr>
-          <w:hyperlink w:anchor="_Toc243463394" w:history="1">
+          <w:hyperlink w:anchor="_Toc243463669" w:history="1">
             <w:r>
               <w:rPr>
                 <w:rStyle w:val="Hipervnculo"/>
@@ -1595,7 +1595,7 @@
               <w:rPr>
                 <w:noProof/>
               </w:rPr>
-              <w:instrText xml:space="preserve"> PAGEREF _Toc243463394 \h </w:instrText>
+              <w:instrText xml:space="preserve"> PAGEREF _Toc243463669 \h </w:instrText>
             </w:r>
             <w:r>
               <w:rPr>
@@ -1635,7 +1635,7 @@
               <w:szCs w:val="22"/>
             </w:rPr>
           </w:pPr>
-          <w:hyperlink w:anchor="_Toc243463395" w:history="1">
+          <w:hyperlink w:anchor="_Toc243463670" w:history="1">
             <w:r>
               <w:rPr>
                 <w:rStyle w:val="Hipervnculo"/>
@@ -1659,7 +1659,7 @@
               <w:rPr>
                 <w:noProof/>
               </w:rPr>
-              <w:instrText xml:space="preserve"> PAGEREF _Toc243463395 \h </w:instrText>
+              <w:instrText xml:space="preserve"> PAGEREF _Toc243463670 \h </w:instrText>
             </w:r>
             <w:r>
               <w:rPr>
@@ -1699,7 +1699,7 @@
               <w:szCs w:val="22"/>
             </w:rPr>
           </w:pPr>
-          <w:hyperlink w:anchor="_Toc243463396" w:history="1">
+          <w:hyperlink w:anchor="_Toc243463671" w:history="1">
             <w:r>
               <w:rPr>
                 <w:rStyle w:val="Hipervnculo"/>
@@ -1723,7 +1723,7 @@
               <w:rPr>
                 <w:noProof/>
               </w:rPr>
-              <w:instrText xml:space="preserve"> PAGEREF _Toc243463396 \h </w:instrText>
+              <w:instrText xml:space="preserve"> PAGEREF _Toc243463671 \h </w:instrText>
             </w:r>
             <w:r>
               <w:rPr>
@@ -1763,7 +1763,7 @@
               <w:szCs w:val="22"/>
             </w:rPr>
           </w:pPr>
-          <w:hyperlink w:anchor="_Toc243463397" w:history="1">
+          <w:hyperlink w:anchor="_Toc243463672" w:history="1">
             <w:r>
               <w:rPr>
                 <w:rStyle w:val="Hipervnculo"/>
@@ -1787,7 +1787,7 @@
               <w:rPr>
                 <w:noProof/>
               </w:rPr>
-              <w:instrText xml:space="preserve"> PAGEREF _Toc243463397 \h </w:instrText>
+              <w:instrText xml:space="preserve"> PAGEREF _Toc243463672 \h </w:instrText>
             </w:r>
             <w:r>
               <w:rPr>
@@ -1827,7 +1827,7 @@
               <w:szCs w:val="22"/>
             </w:rPr>
           </w:pPr>
-          <w:hyperlink w:anchor="_Toc243463398" w:history="1">
+          <w:hyperlink w:anchor="_Toc243463673" w:history="1">
             <w:r>
               <w:rPr>
                 <w:rStyle w:val="Hipervnculo"/>
@@ -1851,7 +1851,7 @@
               <w:rPr>
                 <w:noProof/>
               </w:rPr>
-              <w:instrText xml:space="preserve"> PAGEREF _Toc243463398 \h </w:instrText>
+              <w:instrText xml:space="preserve"> PAGEREF _Toc243463673 \h </w:instrText>
             </w:r>
             <w:r>
               <w:rPr>
@@ -1891,7 +1891,7 @@
               <w:szCs w:val="22"/>
             </w:rPr>
           </w:pPr>
-          <w:hyperlink w:anchor="_Toc243463399" w:history="1">
+          <w:hyperlink w:anchor="_Toc243463674" w:history="1">
             <w:r>
               <w:rPr>
                 <w:rStyle w:val="Hipervnculo"/>
@@ -1915,7 +1915,7 @@
               <w:rPr>
                 <w:noProof/>
               </w:rPr>
-              <w:instrText xml:space="preserve"> PAGEREF _Toc243463399 \h </w:instrText>
+              <w:instrText xml:space="preserve"> PAGEREF _Toc243463674 \h </w:instrText>
             </w:r>
             <w:r>
               <w:rPr>
@@ -1955,7 +1955,7 @@
               <w:szCs w:val="22"/>
             </w:rPr>
           </w:pPr>
-          <w:hyperlink w:anchor="_Toc243463400" w:history="1">
+          <w:hyperlink w:anchor="_Toc243463675" w:history="1">
             <w:r>
               <w:rPr>
                 <w:rStyle w:val="Hipervnculo"/>
@@ -1979,7 +1979,7 @@
               <w:rPr>
                 <w:noProof/>
               </w:rPr>
-              <w:instrText xml:space="preserve"> PAGEREF _Toc243463400 \h </w:instrText>
+              <w:instrText xml:space="preserve"> PAGEREF _Toc243463675 \h </w:instrText>
             </w:r>
             <w:r>
               <w:rPr>
@@ -2019,7 +2019,7 @@
               <w:szCs w:val="22"/>
             </w:rPr>
           </w:pPr>
-          <w:hyperlink w:anchor="_Toc243463401" w:history="1">
+          <w:hyperlink w:anchor="_Toc243463676" w:history="1">
             <w:r>
               <w:rPr>
                 <w:rStyle w:val="Hipervnculo"/>
@@ -2043,7 +2043,7 @@
               <w:rPr>
                 <w:noProof/>
               </w:rPr>
-              <w:instrText xml:space="preserve"> PAGEREF _Toc243463401 \h </w:instrText>
+              <w:instrText xml:space="preserve"> PAGEREF _Toc243463676 \h </w:instrText>
             </w:r>
             <w:r>
               <w:rPr>
@@ -2083,7 +2083,7 @@
               <w:szCs w:val="22"/>
             </w:rPr>
           </w:pPr>
-          <w:hyperlink w:anchor="_Toc243463402" w:history="1">
+          <w:hyperlink w:anchor="_Toc243463677" w:history="1">
             <w:r>
               <w:rPr>
                 <w:rStyle w:val="Hipervnculo"/>
@@ -2107,7 +2107,7 @@
               <w:rPr>
                 <w:noProof/>
               </w:rPr>
-              <w:instrText xml:space="preserve"> PAGEREF _Toc243463402 \h </w:instrText>
+              <w:instrText xml:space="preserve"> PAGEREF _Toc243463677 \h </w:instrText>
             </w:r>
             <w:r>
               <w:rPr>
@@ -2147,7 +2147,7 @@
               <w:szCs w:val="22"/>
             </w:rPr>
           </w:pPr>
-          <w:hyperlink w:anchor="_Toc243463403" w:history="1">
+          <w:hyperlink w:anchor="_Toc243463678" w:history="1">
             <w:r>
               <w:rPr>
                 <w:rStyle w:val="Hipervnculo"/>
@@ -2171,7 +2171,7 @@
               <w:rPr>
                 <w:noProof/>
               </w:rPr>
-              <w:instrText xml:space="preserve"> PAGEREF _Toc243463403 \h </w:instrText>
+              <w:instrText xml:space="preserve"> PAGEREF _Toc243463678 \h </w:instrText>
             </w:r>
             <w:r>
               <w:rPr>
@@ -2210,7 +2210,7 @@
         <w:pStyle w:val="Ttulo1"/>
         <w:pageBreakBefore/>
       </w:pPr>
-      <w:bookmarkStart w:id="0" w:name="_Toc243463374"/>
+      <w:bookmarkStart w:id="0" w:name="_Toc243463649"/>
       <w:r>
         <w:lastRenderedPageBreak/>
         <w:t>1. Introducción</w:t>
@@ -2324,7 +2324,7 @@
       <w:pPr>
         <w:pStyle w:val="Ttulo1"/>
       </w:pPr>
-      <w:bookmarkStart w:id="1" w:name="_Toc243463375"/>
+      <w:bookmarkStart w:id="1" w:name="_Toc243463650"/>
       <w:r>
         <w:t>2. Caso de estudio: CapacitaPro S.A.S.</w:t>
       </w:r>
@@ -2346,7 +2346,7 @@
       <w:pPr>
         <w:pStyle w:val="Ttulo2"/>
       </w:pPr>
-      <w:bookmarkStart w:id="2" w:name="_Toc243463376"/>
+      <w:bookmarkStart w:id="2" w:name="_Toc243463651"/>
       <w:r>
         <w:t>2.1 Situac</w:t>
       </w:r>
@@ -2403,7 +2403,7 @@
           <w:left w:w="10" w:type="dxa"/>
           <w:right w:w="10" w:type="dxa"/>
         </w:tblCellMar>
-        <w:tblLook w:val="0000" w:firstRow="0" w:lastRow="0" w:firstColumn="0" w:lastColumn="0" w:noHBand="0" w:noVBand="0"/>
+        <w:tblLook w:val="04A0" w:firstRow="1" w:lastRow="0" w:firstColumn="1" w:lastColumn="0" w:noHBand="0" w:noVBand="1"/>
       </w:tblPr>
       <w:tblGrid>
         <w:gridCol w:w="2721"/>
@@ -2857,7 +2857,7 @@
       <w:pPr>
         <w:pStyle w:val="Ttulo2"/>
       </w:pPr>
-      <w:bookmarkStart w:id="3" w:name="_Toc243463377"/>
+      <w:bookmarkStart w:id="3" w:name="_Toc243463652"/>
       <w:r>
         <w:t>2.2 Lo que pide la gerencia</w:t>
       </w:r>
@@ -2961,7 +2961,7 @@
       <w:pPr>
         <w:pStyle w:val="Ttulo2"/>
       </w:pPr>
-      <w:bookmarkStart w:id="4" w:name="_Toc243463378"/>
+      <w:bookmarkStart w:id="4" w:name="_Toc243463653"/>
       <w:r>
         <w:t>2.3 Alcance del prototipo</w:t>
       </w:r>
@@ -2986,7 +2986,7 @@
       <w:pPr>
         <w:pStyle w:val="Ttulo1"/>
       </w:pPr>
-      <w:bookmarkStart w:id="5" w:name="_Toc243463379"/>
+      <w:bookmarkStart w:id="5" w:name="_Toc243463654"/>
       <w:r>
         <w:t>3. Análisis de requisitos</w:t>
       </w:r>
@@ -2996,7 +2996,7 @@
       <w:pPr>
         <w:pStyle w:val="Ttulo2"/>
       </w:pPr>
-      <w:bookmarkStart w:id="6" w:name="_Toc243463380"/>
+      <w:bookmarkStart w:id="6" w:name="_Toc243463655"/>
       <w:r>
         <w:t>3.1 Técnicas empleadas</w:t>
       </w:r>
@@ -3041,7 +3041,7 @@
           <w:left w:w="10" w:type="dxa"/>
           <w:right w:w="10" w:type="dxa"/>
         </w:tblCellMar>
-        <w:tblLook w:val="0000" w:firstRow="0" w:lastRow="0" w:firstColumn="0" w:lastColumn="0" w:noHBand="0" w:noVBand="0"/>
+        <w:tblLook w:val="04A0" w:firstRow="1" w:lastRow="0" w:firstColumn="1" w:lastColumn="0" w:noHBand="0" w:noVBand="1"/>
       </w:tblPr>
       <w:tblGrid>
         <w:gridCol w:w="2721"/>
@@ -3487,7 +3487,7 @@
       <w:pPr>
         <w:pStyle w:val="Ttulo2"/>
       </w:pPr>
-      <w:bookmarkStart w:id="7" w:name="_Toc243463381"/>
+      <w:bookmarkStart w:id="7" w:name="_Toc243463656"/>
       <w:r>
         <w:lastRenderedPageBreak/>
         <w:t>3.2 Requisitos funcionales</w:t>
@@ -3533,7 +3533,7 @@
           <w:left w:w="10" w:type="dxa"/>
           <w:right w:w="10" w:type="dxa"/>
         </w:tblCellMar>
-        <w:tblLook w:val="0000" w:firstRow="0" w:lastRow="0" w:firstColumn="0" w:lastColumn="0" w:noHBand="0" w:noVBand="0"/>
+        <w:tblLook w:val="04A0" w:firstRow="1" w:lastRow="0" w:firstColumn="1" w:lastColumn="0" w:noHBand="0" w:noVBand="1"/>
       </w:tblPr>
       <w:tblGrid>
         <w:gridCol w:w="764"/>
@@ -5480,7 +5480,7 @@
       <w:pPr>
         <w:pStyle w:val="Ttulo2"/>
       </w:pPr>
-      <w:bookmarkStart w:id="8" w:name="_Toc243463382"/>
+      <w:bookmarkStart w:id="8" w:name="_Toc243463657"/>
       <w:r>
         <w:t>3.3 Requisitos no funcionales como escenarios de calidad</w:t>
       </w:r>
@@ -5525,7 +5525,7 @@
           <w:left w:w="10" w:type="dxa"/>
           <w:right w:w="10" w:type="dxa"/>
         </w:tblCellMar>
-        <w:tblLook w:val="0000" w:firstRow="0" w:lastRow="0" w:firstColumn="0" w:lastColumn="0" w:noHBand="0" w:noVBand="0"/>
+        <w:tblLook w:val="04A0" w:firstRow="1" w:lastRow="0" w:firstColumn="1" w:lastColumn="0" w:noHBand="0" w:noVBand="1"/>
       </w:tblPr>
       <w:tblGrid>
         <w:gridCol w:w="859"/>
@@ -6979,7 +6979,7 @@
       <w:pPr>
         <w:pStyle w:val="Ttulo1"/>
       </w:pPr>
-      <w:bookmarkStart w:id="9" w:name="_Toc243463383"/>
+      <w:bookmarkStart w:id="9" w:name="_Toc243463658"/>
       <w:r>
         <w:t>4. Arquitectura propuesta</w:t>
       </w:r>
@@ -6989,7 +6989,7 @@
       <w:pPr>
         <w:pStyle w:val="Ttulo2"/>
       </w:pPr>
-      <w:bookmarkStart w:id="10" w:name="_Toc243463384"/>
+      <w:bookmarkStart w:id="10" w:name="_Toc243463659"/>
       <w:r>
         <w:t>4.1 Estilo arquitectónico</w:t>
       </w:r>
@@ -7051,7 +7051,7 @@
           <w:noProof/>
         </w:rPr>
         <w:drawing>
-          <wp:inline distT="0" distB="0" distL="0" distR="0" wp14:anchorId="051A222E" wp14:editId="569DF482">
+          <wp:inline distT="0" distB="0" distL="0" distR="0" wp14:anchorId="13954672" wp14:editId="60BC4965">
             <wp:extent cx="4610100" cy="3305175"/>
             <wp:effectExtent l="0" t="0" r="0" b="0"/>
             <wp:docPr id="1" name="Imagen 1"/>
@@ -7125,7 +7125,7 @@
       <w:pPr>
         <w:pStyle w:val="Ttulo2"/>
       </w:pPr>
-      <w:bookmarkStart w:id="11" w:name="_Toc243463385"/>
+      <w:bookmarkStart w:id="11" w:name="_Toc243463660"/>
       <w:r>
         <w:lastRenderedPageBreak/>
         <w:t>4.2 Componentes y responsabilidades</w:t>
@@ -7171,7 +7171,7 @@
           <w:left w:w="10" w:type="dxa"/>
           <w:right w:w="10" w:type="dxa"/>
         </w:tblCellMar>
-        <w:tblLook w:val="0000" w:firstRow="0" w:lastRow="0" w:firstColumn="0" w:lastColumn="0" w:noHBand="0" w:noVBand="0"/>
+        <w:tblLook w:val="04A0" w:firstRow="1" w:lastRow="0" w:firstColumn="1" w:lastColumn="0" w:noHBand="0" w:noVBand="1"/>
       </w:tblPr>
       <w:tblGrid>
         <w:gridCol w:w="1737"/>
@@ -7971,7 +7971,7 @@
       <w:pPr>
         <w:pStyle w:val="Ttulo2"/>
       </w:pPr>
-      <w:bookmarkStart w:id="12" w:name="_Toc243463386"/>
+      <w:bookmarkStart w:id="12" w:name="_Toc243463661"/>
       <w:r>
         <w:t>4.3 Relación con los principios de la unidad</w:t>
       </w:r>
@@ -8112,7 +8112,7 @@
       <w:pPr>
         <w:pStyle w:val="Ttulo2"/>
       </w:pPr>
-      <w:bookmarkStart w:id="13" w:name="_Toc243463387"/>
+      <w:bookmarkStart w:id="13" w:name="_Toc243463662"/>
       <w:r>
         <w:t>4.4 Decisiones y compromisos</w:t>
       </w:r>
@@ -8139,15 +8139,7 @@
           <w:sz w:val="18"/>
           <w:szCs w:val="18"/>
         </w:rPr>
-        <w:t xml:space="preserve"> Dec</w:t>
-      </w:r>
-      <w:r>
-        <w:rPr>
-          <w:color w:val="5B6B70"/>
-          <w:sz w:val="18"/>
-          <w:szCs w:val="18"/>
-        </w:rPr>
-        <w:t>isiones arquitectónicas y sus compromisos</w:t>
+        <w:t xml:space="preserve"> Decisiones arquitectónicas y sus compromisos</w:t>
       </w:r>
     </w:p>
     <w:tbl>
@@ -8165,7 +8157,7 @@
           <w:left w:w="10" w:type="dxa"/>
           <w:right w:w="10" w:type="dxa"/>
         </w:tblCellMar>
-        <w:tblLook w:val="0000" w:firstRow="0" w:lastRow="0" w:firstColumn="0" w:lastColumn="0" w:noHBand="0" w:noVBand="0"/>
+        <w:tblLook w:val="04A0" w:firstRow="1" w:lastRow="0" w:firstColumn="1" w:lastColumn="0" w:noHBand="0" w:noVBand="1"/>
       </w:tblPr>
       <w:tblGrid>
         <w:gridCol w:w="2456"/>
@@ -8699,7 +8691,7 @@
       <w:pPr>
         <w:pStyle w:val="Ttulo1"/>
       </w:pPr>
-      <w:bookmarkStart w:id="14" w:name="_Toc243463388"/>
+      <w:bookmarkStart w:id="14" w:name="_Toc243463663"/>
       <w:r>
         <w:lastRenderedPageBreak/>
         <w:t>5. Diseño de la arquitectura mediante UML</w:t>
@@ -8730,7 +8722,7 @@
       <w:pPr>
         <w:pStyle w:val="Ttulo2"/>
       </w:pPr>
-      <w:bookmarkStart w:id="15" w:name="_Toc243463389"/>
+      <w:bookmarkStart w:id="15" w:name="_Toc243463664"/>
       <w:r>
         <w:t>5.1 Diagrama de casos de uso</w:t>
       </w:r>
@@ -8747,7 +8739,7 @@
           <w:noProof/>
         </w:rPr>
         <w:drawing>
-          <wp:inline distT="0" distB="0" distL="0" distR="0" wp14:anchorId="04BA091B" wp14:editId="6FFBF72B">
+          <wp:inline distT="0" distB="0" distL="0" distR="0" wp14:anchorId="32589A8F" wp14:editId="0C2E24E3">
             <wp:extent cx="5762625" cy="4638675"/>
             <wp:effectExtent l="0" t="0" r="0" b="0"/>
             <wp:docPr id="2" name="Imagen 2"/>
@@ -8859,7 +8851,7 @@
       <w:pPr>
         <w:pStyle w:val="Ttulo2"/>
       </w:pPr>
-      <w:bookmarkStart w:id="16" w:name="_Toc243463390"/>
+      <w:bookmarkStart w:id="16" w:name="_Toc243463665"/>
       <w:r>
         <w:lastRenderedPageBreak/>
         <w:t>5.2 Diagrama de clases</w:t>
@@ -8877,7 +8869,7 @@
           <w:noProof/>
         </w:rPr>
         <w:drawing>
-          <wp:inline distT="0" distB="0" distL="0" distR="0" wp14:anchorId="30462CD3" wp14:editId="0F326C67">
+          <wp:inline distT="0" distB="0" distL="0" distR="0" wp14:anchorId="6149D023" wp14:editId="67C2A6FA">
             <wp:extent cx="5762625" cy="5200650"/>
             <wp:effectExtent l="0" t="0" r="0" b="0"/>
             <wp:docPr id="3" name="Imagen 3"/>
@@ -9177,7 +9169,7 @@
       <w:pPr>
         <w:pStyle w:val="Ttulo2"/>
       </w:pPr>
-      <w:bookmarkStart w:id="17" w:name="_Toc243463391"/>
+      <w:bookmarkStart w:id="17" w:name="_Toc243463666"/>
       <w:r>
         <w:lastRenderedPageBreak/>
         <w:t>5.3 Diagrama de secuencia</w:t>
@@ -9195,7 +9187,7 @@
           <w:noProof/>
         </w:rPr>
         <w:drawing>
-          <wp:inline distT="0" distB="0" distL="0" distR="0" wp14:anchorId="1C75656A" wp14:editId="5EC05D9C">
+          <wp:inline distT="0" distB="0" distL="0" distR="0" wp14:anchorId="318CC3FA" wp14:editId="00470AAB">
             <wp:extent cx="5762625" cy="3838575"/>
             <wp:effectExtent l="0" t="0" r="0" b="0"/>
             <wp:docPr id="4" name="Imagen 4"/>
@@ -9379,7 +9371,7 @@
       <w:pPr>
         <w:pStyle w:val="Ttulo2"/>
       </w:pPr>
-      <w:bookmarkStart w:id="18" w:name="_Toc243463392"/>
+      <w:bookmarkStart w:id="18" w:name="_Toc243463667"/>
       <w:r>
         <w:lastRenderedPageBreak/>
         <w:t>5.4 Diagrama de despliegue</w:t>
@@ -9397,7 +9389,7 @@
           <w:noProof/>
         </w:rPr>
         <w:drawing>
-          <wp:inline distT="0" distB="0" distL="0" distR="0" wp14:anchorId="14D41C2A" wp14:editId="28493FB7">
+          <wp:inline distT="0" distB="0" distL="0" distR="0" wp14:anchorId="4070E21E" wp14:editId="459F61E1">
             <wp:extent cx="5476875" cy="4562475"/>
             <wp:effectExtent l="0" t="0" r="0" b="0"/>
             <wp:docPr id="5" name="Imagen 5"/>
@@ -9526,7 +9518,7 @@
       <w:pPr>
         <w:pStyle w:val="Ttulo1"/>
       </w:pPr>
-      <w:bookmarkStart w:id="19" w:name="_Toc243463393"/>
+      <w:bookmarkStart w:id="19" w:name="_Toc243463668"/>
       <w:r>
         <w:t>6. Selección y justificación de patrones de diseño</w:t>
       </w:r>
@@ -9587,7 +9579,7 @@
           <w:left w:w="10" w:type="dxa"/>
           <w:right w:w="10" w:type="dxa"/>
         </w:tblCellMar>
-        <w:tblLook w:val="0000" w:firstRow="0" w:lastRow="0" w:firstColumn="0" w:lastColumn="0" w:noHBand="0" w:noVBand="0"/>
+        <w:tblLook w:val="04A0" w:firstRow="1" w:lastRow="0" w:firstColumn="1" w:lastColumn="0" w:noHBand="0" w:noVBand="1"/>
       </w:tblPr>
       <w:tblGrid>
         <w:gridCol w:w="1991"/>
@@ -11587,7 +11579,7 @@
       <w:pPr>
         <w:pStyle w:val="Ttulo2"/>
       </w:pPr>
-      <w:bookmarkStart w:id="20" w:name="_Toc243463394"/>
+      <w:bookmarkStart w:id="20" w:name="_Toc243463669"/>
       <w:r>
         <w:t>6.1 Justificación de los patrones centrales</w:t>
       </w:r>
@@ -11710,7 +11702,7 @@
       <w:pPr>
         <w:pStyle w:val="Ttulo1"/>
       </w:pPr>
-      <w:bookmarkStart w:id="21" w:name="_Toc243463395"/>
+      <w:bookmarkStart w:id="21" w:name="_Toc243463670"/>
       <w:r>
         <w:t>7. Prototipo funcional en la nube</w:t>
       </w:r>
@@ -11720,7 +11712,7 @@
       <w:pPr>
         <w:pStyle w:val="Ttulo2"/>
       </w:pPr>
-      <w:bookmarkStart w:id="22" w:name="_Toc243463396"/>
+      <w:bookmarkStart w:id="22" w:name="_Toc243463671"/>
       <w:r>
         <w:t>7.1 Tecnologías</w:t>
       </w:r>
@@ -11765,7 +11757,7 @@
           <w:left w:w="10" w:type="dxa"/>
           <w:right w:w="10" w:type="dxa"/>
         </w:tblCellMar>
-        <w:tblLook w:val="0000" w:firstRow="0" w:lastRow="0" w:firstColumn="0" w:lastColumn="0" w:noHBand="0" w:noVBand="0"/>
+        <w:tblLook w:val="04A0" w:firstRow="1" w:lastRow="0" w:firstColumn="1" w:lastColumn="0" w:noHBand="0" w:noVBand="1"/>
       </w:tblPr>
       <w:tblGrid>
         <w:gridCol w:w="2456"/>
@@ -12289,7 +12281,7 @@
         <w:t>Repositorio:</w:t>
       </w:r>
       <w:r>
-        <w:t xml:space="preserve"> https://github.com/augustcco/aulanube · </w:t>
+        <w:t xml:space="preserve"> https://github.com/augustocco/aulanube · </w:t>
       </w:r>
       <w:r>
         <w:rPr>
@@ -12317,7 +12309,7 @@
       <w:pPr>
         <w:pStyle w:val="Ttulo2"/>
       </w:pPr>
-      <w:bookmarkStart w:id="23" w:name="_Toc243463397"/>
+      <w:bookmarkStart w:id="23" w:name="_Toc243463672"/>
       <w:r>
         <w:t>7.2 Despliegue</w:t>
       </w:r>
@@ -12635,7 +12627,7 @@
       <w:pPr>
         <w:pStyle w:val="Ttulo2"/>
       </w:pPr>
-      <w:bookmarkStart w:id="24" w:name="_Toc243463398"/>
+      <w:bookmarkStart w:id="24" w:name="_Toc243463673"/>
       <w:r>
         <w:lastRenderedPageBreak/>
         <w:t>7.3 Funcionalidad</w:t>
@@ -12653,7 +12645,7 @@
           <w:noProof/>
         </w:rPr>
         <w:drawing>
-          <wp:inline distT="0" distB="0" distL="0" distR="0" wp14:anchorId="1D1E1BC3" wp14:editId="271BB7DF">
+          <wp:inline distT="0" distB="0" distL="0" distR="0" wp14:anchorId="0E7AD9D2" wp14:editId="1A03020B">
             <wp:extent cx="4152900" cy="2495550"/>
             <wp:effectExtent l="0" t="0" r="0" b="0"/>
             <wp:docPr id="6" name="Imagen 6"/>
@@ -12726,7 +12718,7 @@
           <w:noProof/>
         </w:rPr>
         <w:drawing>
-          <wp:inline distT="0" distB="0" distL="0" distR="0" wp14:anchorId="6D69AA0B" wp14:editId="09AD6581">
+          <wp:inline distT="0" distB="0" distL="0" distR="0" wp14:anchorId="00720EAE" wp14:editId="32A9E2E8">
             <wp:extent cx="4152900" cy="2495550"/>
             <wp:effectExtent l="0" t="0" r="0" b="0"/>
             <wp:docPr id="7" name="Imagen 7"/>
@@ -12799,7 +12791,7 @@
           <w:noProof/>
         </w:rPr>
         <w:drawing>
-          <wp:inline distT="0" distB="0" distL="0" distR="0" wp14:anchorId="5C1BC2EE" wp14:editId="3011FFBA">
+          <wp:inline distT="0" distB="0" distL="0" distR="0" wp14:anchorId="3A72B2E1" wp14:editId="5D45237D">
             <wp:extent cx="4152900" cy="2495550"/>
             <wp:effectExtent l="0" t="0" r="0" b="0"/>
             <wp:docPr id="8" name="Imagen 8"/>
@@ -12907,7 +12899,7 @@
         </w:rPr>
         <w:lastRenderedPageBreak/>
         <w:drawing>
-          <wp:inline distT="0" distB="0" distL="0" distR="0" wp14:anchorId="3D8C3F30" wp14:editId="4860EC41">
+          <wp:inline distT="0" distB="0" distL="0" distR="0" wp14:anchorId="406F47FB" wp14:editId="08292C4C">
             <wp:extent cx="3571875" cy="2524125"/>
             <wp:effectExtent l="0" t="0" r="0" b="0"/>
             <wp:docPr id="9" name="Imagen 9"/>
@@ -12973,7 +12965,7 @@
       <w:pPr>
         <w:pStyle w:val="Ttulo2"/>
       </w:pPr>
-      <w:bookmarkStart w:id="25" w:name="_Toc243463399"/>
+      <w:bookmarkStart w:id="25" w:name="_Toc243463674"/>
       <w:r>
         <w:t>7.4 Evidencia de los patrones</w:t>
       </w:r>
@@ -13033,7 +13025,7 @@
           <w:noProof/>
         </w:rPr>
         <w:drawing>
-          <wp:inline distT="0" distB="0" distL="0" distR="0" wp14:anchorId="49544EF5" wp14:editId="4265E292">
+          <wp:inline distT="0" distB="0" distL="0" distR="0" wp14:anchorId="2E95175B" wp14:editId="28ADDD4B">
             <wp:extent cx="5191125" cy="3114675"/>
             <wp:effectExtent l="0" t="0" r="0" b="0"/>
             <wp:docPr id="10" name="Imagen 10"/>
@@ -13250,7 +13242,7 @@
           <w:noProof/>
         </w:rPr>
         <w:drawing>
-          <wp:inline distT="0" distB="0" distL="0" distR="0" wp14:anchorId="59B1E583" wp14:editId="18BEB0B4">
+          <wp:inline distT="0" distB="0" distL="0" distR="0" wp14:anchorId="310F5AEB" wp14:editId="351FA697">
             <wp:extent cx="5191125" cy="3114675"/>
             <wp:effectExtent l="0" t="0" r="0" b="0"/>
             <wp:docPr id="11" name="Imagen 11"/>
@@ -13614,7 +13606,7 @@
       <w:pPr>
         <w:pStyle w:val="Ttulo2"/>
       </w:pPr>
-      <w:bookmarkStart w:id="26" w:name="_Toc243463400"/>
+      <w:bookmarkStart w:id="26" w:name="_Toc243463675"/>
       <w:r>
         <w:t>7.5 Cumplimiento de los escenarios de calidad</w:t>
       </w:r>
@@ -13659,7 +13651,7 @@
           <w:left w:w="10" w:type="dxa"/>
           <w:right w:w="10" w:type="dxa"/>
         </w:tblCellMar>
-        <w:tblLook w:val="0000" w:firstRow="0" w:lastRow="0" w:firstColumn="0" w:lastColumn="0" w:noHBand="0" w:noVBand="0"/>
+        <w:tblLook w:val="04A0" w:firstRow="1" w:lastRow="0" w:firstColumn="1" w:lastColumn="0" w:noHBand="0" w:noVBand="1"/>
       </w:tblPr>
       <w:tblGrid>
         <w:gridCol w:w="945"/>
@@ -14389,7 +14381,7 @@
       <w:pPr>
         <w:pStyle w:val="Ttulo1"/>
       </w:pPr>
-      <w:bookmarkStart w:id="27" w:name="_Toc243463401"/>
+      <w:bookmarkStart w:id="27" w:name="_Toc243463676"/>
       <w:r>
         <w:t>8</w:t>
       </w:r>
@@ -14514,7 +14506,7 @@
       <w:pPr>
         <w:pStyle w:val="Ttulo2"/>
       </w:pPr>
-      <w:bookmarkStart w:id="28" w:name="_Toc243463402"/>
+      <w:bookmarkStart w:id="28" w:name="_Toc243463677"/>
       <w:r>
         <w:t>Trabajo futuro</w:t>
       </w:r>
@@ -14537,7 +14529,7 @@
         <w:pStyle w:val="Ttulo1"/>
         <w:pageBreakBefore/>
       </w:pPr>
-      <w:bookmarkStart w:id="29" w:name="_Toc243463403"/>
+      <w:bookmarkStart w:id="29" w:name="_Toc243463678"/>
       <w:r>
         <w:lastRenderedPageBreak/>
         <w:t>9. Referencias</w:t>
@@ -15058,204 +15050,204 @@
 <file path=word/numbering.xml><?xml version="1.0" encoding="utf-8"?>
 <w:numbering xmlns:wpc="http://schemas.microsoft.com/office/word/2010/wordprocessingCanvas" xmlns:cx="http://schemas.microsoft.com/office/drawing/2014/chartex" xmlns:cx1="http://schemas.microsoft.com/office/drawing/2015/9/8/chartex" xmlns:cx2="http://schemas.microsoft.com/office/drawing/2015/10/21/chartex" xmlns:cx3="http://schemas.microsoft.com/office/drawing/2016/5/9/chartex" xmlns:cx4="http://schemas.microsoft.com/office/drawing/2016/5/10/chartex" xmlns:cx5="http://schemas.microsoft.com/office/drawing/2016/5/11/chartex" xmlns:cx6="http://schemas.microsoft.com/office/drawing/2016/5/12/chartex" xmlns:cx7="http://schemas.microsoft.com/office/drawing/2016/5/13/chartex" xmlns:cx8="http://schemas.microsoft.com/office/drawing/2016/5/14/chartex" xmlns:mc="http://schemas.openxmlformats.org/markup-compatibility/2006" xmlns:aink="http://schemas.microsoft.com/office/drawing/2016/ink" xmlns:am3d="http://schemas.microsoft.com/office/drawing/2017/model3d" xmlns:o="urn:schemas-microsoft-com:office:office" xmlns:r="http://schemas.openxmlformats.org/officeDocument/2006/relationships" xmlns:m="http://schemas.openxmlformats.org/officeDocument/2006/math" xmlns:v="urn:schemas-microsoft-com:vml" xmlns:wp14="http://schemas.microsoft.com/office/word/2010/wordprocessingDrawing" xmlns:wp="http://schemas.openxmlformats.org/drawingml/2006/wordprocessingDrawing" xmlns:w10="urn:schemas-microsoft-com:office:word" xmlns:w="http://schemas.openxmlformats.org/wordprocessingml/2006/main" xmlns:w14="http://schemas.microsoft.com/office/word/2010/wordml" xmlns:w15="http://schemas.microsoft.com/office/word/2012/wordml" xmlns:w16cex="http://schemas.microsoft.com/office/word/2018/wordml/cex" xmlns:w16cid="http://schemas.microsoft.com/office/word/2016/wordml/cid" xmlns:w16="http://schemas.microsoft.com/office/word/2018/wordml" xmlns:w16sdtdh="http://schemas.microsoft.com/office/word/2020/wordml/sdtdatahash" xmlns:w16se="http://schemas.microsoft.com/office/word/2015/wordml/symex" xmlns:wpg="http://schemas.microsoft.com/office/word/2010/wordprocessingGroup" xmlns:wpi="http://schemas.microsoft.com/office/word/2010/wordprocessingInk" xmlns:wne="http://schemas.microsoft.com/office/word/2006/wordml" xmlns:wps="http://schemas.microsoft.com/office/word/2010/wordprocessingShape" mc:Ignorable="w14 w15 w16se w16cid w16 w16cex w16sdtdh wp14">
   <w:abstractNum w:abstractNumId="0" w15:restartNumberingAfterBreak="0">
-    <w:nsid w:val="0D856A70"/>
+    <w:nsid w:val="235D4C99"/>
     <w:multiLevelType w:val="hybridMultilevel"/>
-    <w:tmpl w:val="1F4AB3D8"/>
-    <w:lvl w:ilvl="0" w:tplc="E4B46ED4">
+    <w:tmpl w:val="AF7473E2"/>
+    <w:lvl w:ilvl="0" w:tplc="419EA734">
       <w:start w:val="1"/>
-      <w:numFmt w:val="bullet"/>
-      <w:lvlText w:val="•"/>
+      <w:numFmt w:val="decimal"/>
+      <w:lvlText w:val="%1."/>
       <w:lvlJc w:val="left"/>
       <w:pPr>
         <w:ind w:left="540" w:hanging="300"/>
       </w:pPr>
     </w:lvl>
-    <w:lvl w:ilvl="1" w:tplc="19DC7C52">
+    <w:lvl w:ilvl="1" w:tplc="E8F207E4">
       <w:numFmt w:val="decimal"/>
       <w:lvlText w:val=""/>
       <w:lvlJc w:val="left"/>
     </w:lvl>
-    <w:lvl w:ilvl="2" w:tplc="EC6A50A4">
+    <w:lvl w:ilvl="2" w:tplc="21AA016A">
       <w:numFmt w:val="decimal"/>
       <w:lvlText w:val=""/>
       <w:lvlJc w:val="left"/>
     </w:lvl>
-    <w:lvl w:ilvl="3" w:tplc="1EC4A41E">
+    <w:lvl w:ilvl="3" w:tplc="B420A98E">
       <w:numFmt w:val="decimal"/>
       <w:lvlText w:val=""/>
       <w:lvlJc w:val="left"/>
     </w:lvl>
-    <w:lvl w:ilvl="4" w:tplc="A672E900">
+    <w:lvl w:ilvl="4" w:tplc="2974BE66">
       <w:numFmt w:val="decimal"/>
       <w:lvlText w:val=""/>
       <w:lvlJc w:val="left"/>
     </w:lvl>
-    <w:lvl w:ilvl="5" w:tplc="49F0E960">
+    <w:lvl w:ilvl="5" w:tplc="CE88C696">
       <w:numFmt w:val="decimal"/>
       <w:lvlText w:val=""/>
       <w:lvlJc w:val="left"/>
     </w:lvl>
-    <w:lvl w:ilvl="6" w:tplc="BEBA7988">
+    <w:lvl w:ilvl="6" w:tplc="1FEE55CA">
       <w:numFmt w:val="decimal"/>
       <w:lvlText w:val=""/>
       <w:lvlJc w:val="left"/>
     </w:lvl>
-    <w:lvl w:ilvl="7" w:tplc="EA6A8570">
+    <w:lvl w:ilvl="7" w:tplc="A99E91AA">
       <w:numFmt w:val="decimal"/>
       <w:lvlText w:val=""/>
       <w:lvlJc w:val="left"/>
     </w:lvl>
-    <w:lvl w:ilvl="8" w:tplc="B8F62408">
+    <w:lvl w:ilvl="8" w:tplc="C3AA01EA">
       <w:numFmt w:val="decimal"/>
       <w:lvlText w:val=""/>
       <w:lvlJc w:val="left"/>
     </w:lvl>
   </w:abstractNum>
   <w:abstractNum w:abstractNumId="1" w15:restartNumberingAfterBreak="0">
-    <w:nsid w:val="13F83539"/>
+    <w:nsid w:val="2F7970A5"/>
     <w:multiLevelType w:val="hybridMultilevel"/>
-    <w:tmpl w:val="3848880C"/>
-    <w:lvl w:ilvl="0" w:tplc="AA92565C">
+    <w:tmpl w:val="99ACECD8"/>
+    <w:lvl w:ilvl="0" w:tplc="AB1018F4">
       <w:start w:val="1"/>
       <w:numFmt w:val="bullet"/>
-      <w:lvlText w:val="●"/>
+      <w:lvlText w:val="•"/>
       <w:lvlJc w:val="left"/>
       <w:pPr>
-        <w:ind w:left="720" w:hanging="360"/>
+        <w:ind w:left="540" w:hanging="300"/>
       </w:pPr>
     </w:lvl>
-    <w:lvl w:ilvl="1" w:tplc="793C807A">
-      <w:start w:val="1"/>
-      <w:numFmt w:val="bullet"/>
-      <w:lvlText w:val="○"/>
-      <w:lvlJc w:val="left"/>
-      <w:pPr>
-        <w:ind w:left="1440" w:hanging="360"/>
-      </w:pPr>
-    </w:lvl>
-    <w:lvl w:ilvl="2" w:tplc="539C1712">
-      <w:start w:val="1"/>
-      <w:numFmt w:val="bullet"/>
-      <w:lvlText w:val="■"/>
-      <w:lvlJc w:val="left"/>
-      <w:pPr>
-        <w:ind w:left="2160" w:hanging="360"/>
-      </w:pPr>
-    </w:lvl>
-    <w:lvl w:ilvl="3" w:tplc="5E94B0A2">
-      <w:start w:val="1"/>
-      <w:numFmt w:val="bullet"/>
-      <w:lvlText w:val="●"/>
-      <w:lvlJc w:val="left"/>
-      <w:pPr>
-        <w:ind w:left="2880" w:hanging="360"/>
-      </w:pPr>
-    </w:lvl>
-    <w:lvl w:ilvl="4" w:tplc="CD86313A">
-      <w:start w:val="1"/>
-      <w:numFmt w:val="bullet"/>
-      <w:lvlText w:val="○"/>
-      <w:lvlJc w:val="left"/>
-      <w:pPr>
-        <w:ind w:left="3600" w:hanging="360"/>
-      </w:pPr>
-    </w:lvl>
-    <w:lvl w:ilvl="5" w:tplc="E3F0FFF4">
-      <w:start w:val="1"/>
-      <w:numFmt w:val="bullet"/>
-      <w:lvlText w:val="■"/>
-      <w:lvlJc w:val="left"/>
-      <w:pPr>
-        <w:ind w:left="4320" w:hanging="360"/>
-      </w:pPr>
-    </w:lvl>
-    <w:lvl w:ilvl="6" w:tplc="BB789750">
-      <w:start w:val="1"/>
-      <w:numFmt w:val="bullet"/>
-      <w:lvlText w:val="●"/>
-      <w:lvlJc w:val="left"/>
-      <w:pPr>
-        <w:ind w:left="5040" w:hanging="360"/>
-      </w:pPr>
-    </w:lvl>
-    <w:lvl w:ilvl="7" w:tplc="727C872A">
-      <w:start w:val="1"/>
-      <w:numFmt w:val="bullet"/>
-      <w:lvlText w:val="●"/>
-      <w:lvlJc w:val="left"/>
-      <w:pPr>
-        <w:ind w:left="5760" w:hanging="360"/>
-      </w:pPr>
-    </w:lvl>
-    <w:lvl w:ilvl="8" w:tplc="F6C2F106">
-      <w:start w:val="1"/>
-      <w:numFmt w:val="bullet"/>
-      <w:lvlText w:val="●"/>
-      <w:lvlJc w:val="left"/>
-      <w:pPr>
-        <w:ind w:left="6480" w:hanging="360"/>
-      </w:pPr>
-    </w:lvl>
-  </w:abstractNum>
-  <w:abstractNum w:abstractNumId="2" w15:restartNumberingAfterBreak="0">
-    <w:nsid w:val="45EE0353"/>
-    <w:multiLevelType w:val="hybridMultilevel"/>
-    <w:tmpl w:val="775EB522"/>
-    <w:lvl w:ilvl="0" w:tplc="72467A4A">
-      <w:start w:val="1"/>
-      <w:numFmt w:val="decimal"/>
-      <w:lvlText w:val="%1."/>
-      <w:lvlJc w:val="left"/>
-      <w:pPr>
-        <w:ind w:left="540" w:hanging="300"/>
-      </w:pPr>
-    </w:lvl>
-    <w:lvl w:ilvl="1" w:tplc="F814AC96">
+    <w:lvl w:ilvl="1" w:tplc="C540E260">
       <w:numFmt w:val="decimal"/>
       <w:lvlText w:val=""/>
       <w:lvlJc w:val="left"/>
     </w:lvl>
-    <w:lvl w:ilvl="2" w:tplc="63D8DD3C">
+    <w:lvl w:ilvl="2" w:tplc="32566242">
       <w:numFmt w:val="decimal"/>
       <w:lvlText w:val=""/>
       <w:lvlJc w:val="left"/>
     </w:lvl>
-    <w:lvl w:ilvl="3" w:tplc="F2CAEC40">
+    <w:lvl w:ilvl="3" w:tplc="E362E5A6">
       <w:numFmt w:val="decimal"/>
       <w:lvlText w:val=""/>
       <w:lvlJc w:val="left"/>
     </w:lvl>
-    <w:lvl w:ilvl="4" w:tplc="DAD4A8B4">
+    <w:lvl w:ilvl="4" w:tplc="A7B8D1E2">
       <w:numFmt w:val="decimal"/>
       <w:lvlText w:val=""/>
       <w:lvlJc w:val="left"/>
     </w:lvl>
-    <w:lvl w:ilvl="5" w:tplc="91D8A61E">
+    <w:lvl w:ilvl="5" w:tplc="820EDD4E">
       <w:numFmt w:val="decimal"/>
       <w:lvlText w:val=""/>
       <w:lvlJc w:val="left"/>
     </w:lvl>
-    <w:lvl w:ilvl="6" w:tplc="4D0AE93A">
+    <w:lvl w:ilvl="6" w:tplc="8FB22E70">
       <w:numFmt w:val="decimal"/>
       <w:lvlText w:val=""/>
       <w:lvlJc w:val="left"/>
     </w:lvl>
-    <w:lvl w:ilvl="7" w:tplc="02444B54">
+    <w:lvl w:ilvl="7" w:tplc="EEBC3940">
       <w:numFmt w:val="decimal"/>
       <w:lvlText w:val=""/>
       <w:lvlJc w:val="left"/>
     </w:lvl>
-    <w:lvl w:ilvl="8" w:tplc="4606AD4C">
+    <w:lvl w:ilvl="8" w:tplc="9D569C7A">
       <w:numFmt w:val="decimal"/>
       <w:lvlText w:val=""/>
       <w:lvlJc w:val="left"/>
     </w:lvl>
   </w:abstractNum>
+  <w:abstractNum w:abstractNumId="2" w15:restartNumberingAfterBreak="0">
+    <w:nsid w:val="4E1429D6"/>
+    <w:multiLevelType w:val="hybridMultilevel"/>
+    <w:tmpl w:val="67DCE942"/>
+    <w:lvl w:ilvl="0" w:tplc="1BE45A5C">
+      <w:start w:val="1"/>
+      <w:numFmt w:val="bullet"/>
+      <w:lvlText w:val="●"/>
+      <w:lvlJc w:val="left"/>
+      <w:pPr>
+        <w:ind w:left="720" w:hanging="360"/>
+      </w:pPr>
+    </w:lvl>
+    <w:lvl w:ilvl="1" w:tplc="D4C65472">
+      <w:start w:val="1"/>
+      <w:numFmt w:val="bullet"/>
+      <w:lvlText w:val="○"/>
+      <w:lvlJc w:val="left"/>
+      <w:pPr>
+        <w:ind w:left="1440" w:hanging="360"/>
+      </w:pPr>
+    </w:lvl>
+    <w:lvl w:ilvl="2" w:tplc="FAB6B990">
+      <w:start w:val="1"/>
+      <w:numFmt w:val="bullet"/>
+      <w:lvlText w:val="■"/>
+      <w:lvlJc w:val="left"/>
+      <w:pPr>
+        <w:ind w:left="2160" w:hanging="360"/>
+      </w:pPr>
+    </w:lvl>
+    <w:lvl w:ilvl="3" w:tplc="4F944784">
+      <w:start w:val="1"/>
+      <w:numFmt w:val="bullet"/>
+      <w:lvlText w:val="●"/>
+      <w:lvlJc w:val="left"/>
+      <w:pPr>
+        <w:ind w:left="2880" w:hanging="360"/>
+      </w:pPr>
+    </w:lvl>
+    <w:lvl w:ilvl="4" w:tplc="F596FB7C">
+      <w:start w:val="1"/>
+      <w:numFmt w:val="bullet"/>
+      <w:lvlText w:val="○"/>
+      <w:lvlJc w:val="left"/>
+      <w:pPr>
+        <w:ind w:left="3600" w:hanging="360"/>
+      </w:pPr>
+    </w:lvl>
+    <w:lvl w:ilvl="5" w:tplc="48F44EBE">
+      <w:start w:val="1"/>
+      <w:numFmt w:val="bullet"/>
+      <w:lvlText w:val="■"/>
+      <w:lvlJc w:val="left"/>
+      <w:pPr>
+        <w:ind w:left="4320" w:hanging="360"/>
+      </w:pPr>
+    </w:lvl>
+    <w:lvl w:ilvl="6" w:tplc="1F1E1E2E">
+      <w:start w:val="1"/>
+      <w:numFmt w:val="bullet"/>
+      <w:lvlText w:val="●"/>
+      <w:lvlJc w:val="left"/>
+      <w:pPr>
+        <w:ind w:left="5040" w:hanging="360"/>
+      </w:pPr>
+    </w:lvl>
+    <w:lvl w:ilvl="7" w:tplc="26981DB2">
+      <w:start w:val="1"/>
+      <w:numFmt w:val="bullet"/>
+      <w:lvlText w:val="●"/>
+      <w:lvlJc w:val="left"/>
+      <w:pPr>
+        <w:ind w:left="5760" w:hanging="360"/>
+      </w:pPr>
+    </w:lvl>
+    <w:lvl w:ilvl="8" w:tplc="A31AC392">
+      <w:start w:val="1"/>
+      <w:numFmt w:val="bullet"/>
+      <w:lvlText w:val="●"/>
+      <w:lvlJc w:val="left"/>
+      <w:pPr>
+        <w:ind w:left="6480" w:hanging="360"/>
+      </w:pPr>
+    </w:lvl>
+  </w:abstractNum>
   <w:abstractNum w:abstractNumId="3" w15:restartNumberingAfterBreak="0">
-    <w:nsid w:val="47C4666E"/>
+    <w:nsid w:val="4FCD3AF5"/>
     <w:multiLevelType w:val="hybridMultilevel"/>
-    <w:tmpl w:val="D2FA5906"/>
-    <w:lvl w:ilvl="0" w:tplc="946C6C64">
+    <w:tmpl w:val="18AA85D2"/>
+    <w:lvl w:ilvl="0" w:tplc="485A335C">
       <w:start w:val="1"/>
       <w:numFmt w:val="decimal"/>
       <w:lvlText w:val="%1."/>
@@ -15264,61 +15256,61 @@
         <w:ind w:left="540" w:hanging="300"/>
       </w:pPr>
     </w:lvl>
-    <w:lvl w:ilvl="1" w:tplc="C114D1C4">
+    <w:lvl w:ilvl="1" w:tplc="D71839CA">
       <w:numFmt w:val="decimal"/>
       <w:lvlText w:val=""/>
       <w:lvlJc w:val="left"/>
     </w:lvl>
-    <w:lvl w:ilvl="2" w:tplc="04244998">
+    <w:lvl w:ilvl="2" w:tplc="738C2CFC">
       <w:numFmt w:val="decimal"/>
       <w:lvlText w:val=""/>
       <w:lvlJc w:val="left"/>
     </w:lvl>
-    <w:lvl w:ilvl="3" w:tplc="CDB2BD98">
+    <w:lvl w:ilvl="3" w:tplc="1A2EE01A">
       <w:numFmt w:val="decimal"/>
       <w:lvlText w:val=""/>
       <w:lvlJc w:val="left"/>
     </w:lvl>
-    <w:lvl w:ilvl="4" w:tplc="E7762EA4">
+    <w:lvl w:ilvl="4" w:tplc="00A86F34">
       <w:numFmt w:val="decimal"/>
       <w:lvlText w:val=""/>
       <w:lvlJc w:val="left"/>
     </w:lvl>
-    <w:lvl w:ilvl="5" w:tplc="B9EAEAB6">
+    <w:lvl w:ilvl="5" w:tplc="BA46C40A">
       <w:numFmt w:val="decimal"/>
       <w:lvlText w:val=""/>
       <w:lvlJc w:val="left"/>
     </w:lvl>
-    <w:lvl w:ilvl="6" w:tplc="08BEBA1A">
+    <w:lvl w:ilvl="6" w:tplc="6D7CCC3C">
       <w:numFmt w:val="decimal"/>
       <w:lvlText w:val=""/>
       <w:lvlJc w:val="left"/>
     </w:lvl>
-    <w:lvl w:ilvl="7" w:tplc="09DCACF4">
+    <w:lvl w:ilvl="7" w:tplc="C0004EBE">
       <w:numFmt w:val="decimal"/>
       <w:lvlText w:val=""/>
       <w:lvlJc w:val="left"/>
     </w:lvl>
-    <w:lvl w:ilvl="8" w:tplc="9522A94E">
+    <w:lvl w:ilvl="8" w:tplc="26A62E80">
       <w:numFmt w:val="decimal"/>
       <w:lvlText w:val=""/>
       <w:lvlJc w:val="left"/>
     </w:lvl>
   </w:abstractNum>
   <w:num w:numId="1">
-    <w:abstractNumId w:val="1"/>
+    <w:abstractNumId w:val="2"/>
     <w:lvlOverride w:ilvl="0">
       <w:startOverride w:val="1"/>
     </w:lvlOverride>
   </w:num>
   <w:num w:numId="2">
-    <w:abstractNumId w:val="2"/>
+    <w:abstractNumId w:val="0"/>
     <w:lvlOverride w:ilvl="0">
       <w:startOverride w:val="1"/>
     </w:lvlOverride>
   </w:num>
   <w:num w:numId="3">
-    <w:abstractNumId w:val="0"/>
+    <w:abstractNumId w:val="1"/>
     <w:lvlOverride w:ilvl="0">
       <w:startOverride w:val="1"/>
     </w:lvlOverride>
@@ -15913,7 +15905,7 @@
     <w:autoRedefine/>
     <w:uiPriority w:val="39"/>
     <w:unhideWhenUsed/>
-    <w:rsid w:val="005D4079"/>
+    <w:rsid w:val="004E30FD"/>
     <w:pPr>
       <w:spacing w:after="100"/>
     </w:pPr>
@@ -15925,7 +15917,7 @@
     <w:autoRedefine/>
     <w:uiPriority w:val="39"/>
     <w:unhideWhenUsed/>
-    <w:rsid w:val="005D4079"/>
+    <w:rsid w:val="004E30FD"/>
     <w:pPr>
       <w:spacing w:after="100"/>
       <w:ind w:left="210"/>

</xml_diff>

<commit_message>
Mejora la lectura de las tablas del informe
Celdas alineadas arriba, interlineado sencillo con margen interno y una
línea gris fina entre filas, sobre el estilo tablaApa.

Co-Authored-By: Claude Opus 5.5 <noreply@anthropic.com>
</commit_message>
<xml_diff>
--- a/docs/informe/Informe-AulaNube.docx
+++ b/docs/informe/Informe-AulaNube.docx
@@ -12,7 +12,7 @@
           <w:noProof/>
         </w:rPr>
         <w:drawing>
-          <wp:inline distT="0" distB="0" distL="0" distR="0" wp14:anchorId="159166AA" wp14:editId="061C3B63">
+          <wp:inline distT="0" distB="0" distL="0" distR="0" wp14:anchorId="03A2F76F" wp14:editId="1DFB0590">
             <wp:extent cx="3143250" cy="857250"/>
             <wp:effectExtent l="0" t="0" r="0" b="0"/>
             <wp:docPr id="1" name="Picture 1"/>
@@ -148,7 +148,7 @@
         <w:pStyle w:val="Ttulo1"/>
         <w:pageBreakBefore/>
       </w:pPr>
-      <w:bookmarkStart w:id="0" w:name="_Toc243486147"/>
+      <w:bookmarkStart w:id="0" w:name="_Toc243486824"/>
       <w:r>
         <w:lastRenderedPageBreak/>
         <w:t>Resumen</w:t>
@@ -183,7 +183,7 @@
         <w:pStyle w:val="Ttulo1"/>
         <w:pageBreakBefore/>
       </w:pPr>
-      <w:bookmarkStart w:id="1" w:name="_Toc243486148"/>
+      <w:bookmarkStart w:id="1" w:name="_Toc243486825"/>
       <w:r>
         <w:lastRenderedPageBreak/>
         <w:t>Tabla de contenido</w:t>
@@ -212,7 +212,7 @@
       <w:r>
         <w:fldChar w:fldCharType="separate"/>
       </w:r>
-      <w:hyperlink w:anchor="_Toc243486147" w:history="1">
+      <w:hyperlink w:anchor="_Toc243486824" w:history="1">
         <w:r>
           <w:rPr>
             <w:rStyle w:val="Hipervnculo"/>
@@ -240,7 +240,7 @@
             <w:noProof/>
             <w:webHidden/>
           </w:rPr>
-          <w:instrText xml:space="preserve"> PAGEREF _Toc243486147 \h </w:instrText>
+          <w:instrText xml:space="preserve"> PAGEREF _Toc243486824 \h </w:instrText>
         </w:r>
         <w:r>
           <w:rPr>
@@ -284,7 +284,7 @@
           <w:lang w:val="es-CO" w:eastAsia="es-CO"/>
         </w:rPr>
       </w:pPr>
-      <w:hyperlink w:anchor="_Toc243486148" w:history="1">
+      <w:hyperlink w:anchor="_Toc243486825" w:history="1">
         <w:r>
           <w:rPr>
             <w:rStyle w:val="Hipervnculo"/>
@@ -312,7 +312,7 @@
             <w:noProof/>
             <w:webHidden/>
           </w:rPr>
-          <w:instrText xml:space="preserve"> PAGEREF _Toc243486148 \h </w:instrText>
+          <w:instrText xml:space="preserve"> PAGEREF _Toc243486825 \h </w:instrText>
         </w:r>
         <w:r>
           <w:rPr>
@@ -356,7 +356,7 @@
           <w:lang w:val="es-CO" w:eastAsia="es-CO"/>
         </w:rPr>
       </w:pPr>
-      <w:hyperlink w:anchor="_Toc243486149" w:history="1">
+      <w:hyperlink w:anchor="_Toc243486826" w:history="1">
         <w:r>
           <w:rPr>
             <w:rStyle w:val="Hipervnculo"/>
@@ -384,7 +384,7 @@
             <w:noProof/>
             <w:webHidden/>
           </w:rPr>
-          <w:instrText xml:space="preserve"> PAGEREF _Toc243486149 \h </w:instrText>
+          <w:instrText xml:space="preserve"> PAGEREF _Toc243486826 \h </w:instrText>
         </w:r>
         <w:r>
           <w:rPr>
@@ -428,7 +428,7 @@
           <w:lang w:val="es-CO" w:eastAsia="es-CO"/>
         </w:rPr>
       </w:pPr>
-      <w:hyperlink w:anchor="_Toc243486150" w:history="1">
+      <w:hyperlink w:anchor="_Toc243486827" w:history="1">
         <w:r>
           <w:rPr>
             <w:rStyle w:val="Hipervnculo"/>
@@ -456,7 +456,7 @@
             <w:noProof/>
             <w:webHidden/>
           </w:rPr>
-          <w:instrText xml:space="preserve"> PAGEREF _Toc243486150 \h </w:instrText>
+          <w:instrText xml:space="preserve"> PAGEREF _Toc243486827 \h </w:instrText>
         </w:r>
         <w:r>
           <w:rPr>
@@ -500,7 +500,7 @@
           <w:lang w:val="es-CO" w:eastAsia="es-CO"/>
         </w:rPr>
       </w:pPr>
-      <w:hyperlink w:anchor="_Toc243486151" w:history="1">
+      <w:hyperlink w:anchor="_Toc243486828" w:history="1">
         <w:r>
           <w:rPr>
             <w:rStyle w:val="Hipervnculo"/>
@@ -528,7 +528,7 @@
             <w:noProof/>
             <w:webHidden/>
           </w:rPr>
-          <w:instrText xml:space="preserve"> PAGEREF _Toc243486151 \h </w:instrText>
+          <w:instrText xml:space="preserve"> PAGEREF _Toc243486828 \h </w:instrText>
         </w:r>
         <w:r>
           <w:rPr>
@@ -572,7 +572,7 @@
           <w:lang w:val="es-CO" w:eastAsia="es-CO"/>
         </w:rPr>
       </w:pPr>
-      <w:hyperlink w:anchor="_Toc243486152" w:history="1">
+      <w:hyperlink w:anchor="_Toc243486829" w:history="1">
         <w:r>
           <w:rPr>
             <w:rStyle w:val="Hipervnculo"/>
@@ -600,7 +600,151 @@
             <w:noProof/>
             <w:webHidden/>
           </w:rPr>
-          <w:instrText xml:space="preserve"> PAGEREF _Toc243486152 \h </w:instrText>
+          <w:instrText xml:space="preserve"> PAGEREF _Toc243486829 \h </w:instrText>
+        </w:r>
+        <w:r>
+          <w:rPr>
+            <w:noProof/>
+            <w:webHidden/>
+          </w:rPr>
+        </w:r>
+        <w:r>
+          <w:rPr>
+            <w:noProof/>
+            <w:webHidden/>
+          </w:rPr>
+          <w:fldChar w:fldCharType="separate"/>
+        </w:r>
+        <w:r>
+          <w:rPr>
+            <w:noProof/>
+            <w:webHidden/>
+          </w:rPr>
+          <w:t>7</w:t>
+        </w:r>
+        <w:r>
+          <w:rPr>
+            <w:noProof/>
+            <w:webHidden/>
+          </w:rPr>
+          <w:fldChar w:fldCharType="end"/>
+        </w:r>
+      </w:hyperlink>
+    </w:p>
+    <w:p>
+      <w:pPr>
+        <w:pStyle w:val="TDC2"/>
+        <w:tabs>
+          <w:tab w:val="right" w:leader="dot" w:pos="9350"/>
+        </w:tabs>
+        <w:rPr>
+          <w:rFonts w:asciiTheme="minorHAnsi" w:eastAsiaTheme="minorEastAsia" w:hAnsiTheme="minorHAnsi"/>
+          <w:noProof/>
+          <w:sz w:val="22"/>
+          <w:lang w:val="es-CO" w:eastAsia="es-CO"/>
+        </w:rPr>
+      </w:pPr>
+      <w:hyperlink w:anchor="_Toc243486830" w:history="1">
+        <w:r>
+          <w:rPr>
+            <w:rStyle w:val="Hipervnculo"/>
+            <w:rFonts w:eastAsiaTheme="majorEastAsia"/>
+            <w:noProof/>
+          </w:rPr>
+          <w:t>Estilo arquitectónico</w:t>
+        </w:r>
+        <w:r>
+          <w:rPr>
+            <w:noProof/>
+            <w:webHidden/>
+          </w:rPr>
+          <w:tab/>
+        </w:r>
+        <w:r>
+          <w:rPr>
+            <w:noProof/>
+            <w:webHidden/>
+          </w:rPr>
+          <w:fldChar w:fldCharType="begin"/>
+        </w:r>
+        <w:r>
+          <w:rPr>
+            <w:noProof/>
+            <w:webHidden/>
+          </w:rPr>
+          <w:instrText xml:space="preserve"> PAGEREF _Toc243486830 \h </w:instrText>
+        </w:r>
+        <w:r>
+          <w:rPr>
+            <w:noProof/>
+            <w:webHidden/>
+          </w:rPr>
+        </w:r>
+        <w:r>
+          <w:rPr>
+            <w:noProof/>
+            <w:webHidden/>
+          </w:rPr>
+          <w:fldChar w:fldCharType="separate"/>
+        </w:r>
+        <w:r>
+          <w:rPr>
+            <w:noProof/>
+            <w:webHidden/>
+          </w:rPr>
+          <w:t>7</w:t>
+        </w:r>
+        <w:r>
+          <w:rPr>
+            <w:noProof/>
+            <w:webHidden/>
+          </w:rPr>
+          <w:fldChar w:fldCharType="end"/>
+        </w:r>
+      </w:hyperlink>
+    </w:p>
+    <w:p>
+      <w:pPr>
+        <w:pStyle w:val="TDC2"/>
+        <w:tabs>
+          <w:tab w:val="right" w:leader="dot" w:pos="9350"/>
+        </w:tabs>
+        <w:rPr>
+          <w:rFonts w:asciiTheme="minorHAnsi" w:eastAsiaTheme="minorEastAsia" w:hAnsiTheme="minorHAnsi"/>
+          <w:noProof/>
+          <w:sz w:val="22"/>
+          <w:lang w:val="es-CO" w:eastAsia="es-CO"/>
+        </w:rPr>
+      </w:pPr>
+      <w:hyperlink w:anchor="_Toc243486831" w:history="1">
+        <w:r>
+          <w:rPr>
+            <w:rStyle w:val="Hipervnculo"/>
+            <w:rFonts w:eastAsiaTheme="majorEastAsia"/>
+            <w:noProof/>
+          </w:rPr>
+          <w:t>Relación con los principios de la unidad</w:t>
+        </w:r>
+        <w:r>
+          <w:rPr>
+            <w:noProof/>
+            <w:webHidden/>
+          </w:rPr>
+          <w:tab/>
+        </w:r>
+        <w:r>
+          <w:rPr>
+            <w:noProof/>
+            <w:webHidden/>
+          </w:rPr>
+          <w:fldChar w:fldCharType="begin"/>
+        </w:r>
+        <w:r>
+          <w:rPr>
+            <w:noProof/>
+            <w:webHidden/>
+          </w:rPr>
+          <w:instrText xml:space="preserve"> PAGEREF _Toc243486831 \h </w:instrText>
         </w:r>
         <w:r>
           <w:rPr>
@@ -633,7 +777,7 @@
     </w:p>
     <w:p>
       <w:pPr>
-        <w:pStyle w:val="TDC2"/>
+        <w:pStyle w:val="TDC1"/>
         <w:tabs>
           <w:tab w:val="right" w:leader="dot" w:pos="9350"/>
         </w:tabs>
@@ -644,14 +788,14 @@
           <w:lang w:val="es-CO" w:eastAsia="es-CO"/>
         </w:rPr>
       </w:pPr>
-      <w:hyperlink w:anchor="_Toc243486153" w:history="1">
+      <w:hyperlink w:anchor="_Toc243486832" w:history="1">
         <w:r>
           <w:rPr>
             <w:rStyle w:val="Hipervnculo"/>
             <w:rFonts w:eastAsiaTheme="majorEastAsia"/>
             <w:noProof/>
           </w:rPr>
-          <w:t>Estilo arquitectónico</w:t>
+          <w:t>Diseño de la arquitectura mediante UML</w:t>
         </w:r>
         <w:r>
           <w:rPr>
@@ -672,7 +816,7 @@
             <w:noProof/>
             <w:webHidden/>
           </w:rPr>
-          <w:instrText xml:space="preserve"> PAGEREF _Toc243486153 \h </w:instrText>
+          <w:instrText xml:space="preserve"> PAGEREF _Toc243486832 \h </w:instrText>
         </w:r>
         <w:r>
           <w:rPr>
@@ -716,14 +860,14 @@
           <w:lang w:val="es-CO" w:eastAsia="es-CO"/>
         </w:rPr>
       </w:pPr>
-      <w:hyperlink w:anchor="_Toc243486154" w:history="1">
+      <w:hyperlink w:anchor="_Toc243486833" w:history="1">
         <w:r>
           <w:rPr>
             <w:rStyle w:val="Hipervnculo"/>
             <w:rFonts w:eastAsiaTheme="majorEastAsia"/>
             <w:noProof/>
           </w:rPr>
-          <w:t>Relación con los principios de la unidad</w:t>
+          <w:t>Diagrama de casos de uso</w:t>
         </w:r>
         <w:r>
           <w:rPr>
@@ -744,7 +888,7 @@
             <w:noProof/>
             <w:webHidden/>
           </w:rPr>
-          <w:instrText xml:space="preserve"> PAGEREF _Toc243486154 \h </w:instrText>
+          <w:instrText xml:space="preserve"> PAGEREF _Toc243486833 \h </w:instrText>
         </w:r>
         <w:r>
           <w:rPr>
@@ -777,7 +921,7 @@
     </w:p>
     <w:p>
       <w:pPr>
-        <w:pStyle w:val="TDC1"/>
+        <w:pStyle w:val="TDC2"/>
         <w:tabs>
           <w:tab w:val="right" w:leader="dot" w:pos="9350"/>
         </w:tabs>
@@ -788,14 +932,14 @@
           <w:lang w:val="es-CO" w:eastAsia="es-CO"/>
         </w:rPr>
       </w:pPr>
-      <w:hyperlink w:anchor="_Toc243486155" w:history="1">
+      <w:hyperlink w:anchor="_Toc243486834" w:history="1">
         <w:r>
           <w:rPr>
             <w:rStyle w:val="Hipervnculo"/>
             <w:rFonts w:eastAsiaTheme="majorEastAsia"/>
             <w:noProof/>
           </w:rPr>
-          <w:t>Diseño de la arquitectura mediante UML</w:t>
+          <w:t>Diagrama de clases</w:t>
         </w:r>
         <w:r>
           <w:rPr>
@@ -816,79 +960,7 @@
             <w:noProof/>
             <w:webHidden/>
           </w:rPr>
-          <w:instrText xml:space="preserve"> PAGEREF _Toc243486155 \h </w:instrText>
-        </w:r>
-        <w:r>
-          <w:rPr>
-            <w:noProof/>
-            <w:webHidden/>
-          </w:rPr>
-        </w:r>
-        <w:r>
-          <w:rPr>
-            <w:noProof/>
-            <w:webHidden/>
-          </w:rPr>
-          <w:fldChar w:fldCharType="separate"/>
-        </w:r>
-        <w:r>
-          <w:rPr>
-            <w:noProof/>
-            <w:webHidden/>
-          </w:rPr>
-          <w:t>9</w:t>
-        </w:r>
-        <w:r>
-          <w:rPr>
-            <w:noProof/>
-            <w:webHidden/>
-          </w:rPr>
-          <w:fldChar w:fldCharType="end"/>
-        </w:r>
-      </w:hyperlink>
-    </w:p>
-    <w:p>
-      <w:pPr>
-        <w:pStyle w:val="TDC2"/>
-        <w:tabs>
-          <w:tab w:val="right" w:leader="dot" w:pos="9350"/>
-        </w:tabs>
-        <w:rPr>
-          <w:rFonts w:asciiTheme="minorHAnsi" w:eastAsiaTheme="minorEastAsia" w:hAnsiTheme="minorHAnsi"/>
-          <w:noProof/>
-          <w:sz w:val="22"/>
-          <w:lang w:val="es-CO" w:eastAsia="es-CO"/>
-        </w:rPr>
-      </w:pPr>
-      <w:hyperlink w:anchor="_Toc243486156" w:history="1">
-        <w:r>
-          <w:rPr>
-            <w:rStyle w:val="Hipervnculo"/>
-            <w:rFonts w:eastAsiaTheme="majorEastAsia"/>
-            <w:noProof/>
-          </w:rPr>
-          <w:t>Diagrama de casos de uso</w:t>
-        </w:r>
-        <w:r>
-          <w:rPr>
-            <w:noProof/>
-            <w:webHidden/>
-          </w:rPr>
-          <w:tab/>
-        </w:r>
-        <w:r>
-          <w:rPr>
-            <w:noProof/>
-            <w:webHidden/>
-          </w:rPr>
-          <w:fldChar w:fldCharType="begin"/>
-        </w:r>
-        <w:r>
-          <w:rPr>
-            <w:noProof/>
-            <w:webHidden/>
-          </w:rPr>
-          <w:instrText xml:space="preserve"> PAGEREF _Toc243486156 \h </w:instrText>
+          <w:instrText xml:space="preserve"> PAGEREF _Toc243486834 \h </w:instrText>
         </w:r>
         <w:r>
           <w:rPr>
@@ -932,14 +1004,14 @@
           <w:lang w:val="es-CO" w:eastAsia="es-CO"/>
         </w:rPr>
       </w:pPr>
-      <w:hyperlink w:anchor="_Toc243486157" w:history="1">
+      <w:hyperlink w:anchor="_Toc243486835" w:history="1">
         <w:r>
           <w:rPr>
             <w:rStyle w:val="Hipervnculo"/>
             <w:rFonts w:eastAsiaTheme="majorEastAsia"/>
             <w:noProof/>
           </w:rPr>
-          <w:t>Diagrama de clases</w:t>
+          <w:t>Diagrama de secuencia</w:t>
         </w:r>
         <w:r>
           <w:rPr>
@@ -960,7 +1032,7 @@
             <w:noProof/>
             <w:webHidden/>
           </w:rPr>
-          <w:instrText xml:space="preserve"> PAGEREF _Toc243486157 \h </w:instrText>
+          <w:instrText xml:space="preserve"> PAGEREF _Toc243486835 \h </w:instrText>
         </w:r>
         <w:r>
           <w:rPr>
@@ -1004,14 +1076,14 @@
           <w:lang w:val="es-CO" w:eastAsia="es-CO"/>
         </w:rPr>
       </w:pPr>
-      <w:hyperlink w:anchor="_Toc243486158" w:history="1">
+      <w:hyperlink w:anchor="_Toc243486836" w:history="1">
         <w:r>
           <w:rPr>
             <w:rStyle w:val="Hipervnculo"/>
             <w:rFonts w:eastAsiaTheme="majorEastAsia"/>
             <w:noProof/>
           </w:rPr>
-          <w:t>Diagrama de secuencia</w:t>
+          <w:t>Diagrama de despliegue</w:t>
         </w:r>
         <w:r>
           <w:rPr>
@@ -1032,7 +1104,7 @@
             <w:noProof/>
             <w:webHidden/>
           </w:rPr>
-          <w:instrText xml:space="preserve"> PAGEREF _Toc243486158 \h </w:instrText>
+          <w:instrText xml:space="preserve"> PAGEREF _Toc243486836 \h </w:instrText>
         </w:r>
         <w:r>
           <w:rPr>
@@ -1065,7 +1137,7 @@
     </w:p>
     <w:p>
       <w:pPr>
-        <w:pStyle w:val="TDC2"/>
+        <w:pStyle w:val="TDC1"/>
         <w:tabs>
           <w:tab w:val="right" w:leader="dot" w:pos="9350"/>
         </w:tabs>
@@ -1076,14 +1148,14 @@
           <w:lang w:val="es-CO" w:eastAsia="es-CO"/>
         </w:rPr>
       </w:pPr>
-      <w:hyperlink w:anchor="_Toc243486159" w:history="1">
+      <w:hyperlink w:anchor="_Toc243486837" w:history="1">
         <w:r>
           <w:rPr>
             <w:rStyle w:val="Hipervnculo"/>
             <w:rFonts w:eastAsiaTheme="majorEastAsia"/>
             <w:noProof/>
           </w:rPr>
-          <w:t>Diagrama de despliegue</w:t>
+          <w:t>Selección y justificación de patrones de diseño</w:t>
         </w:r>
         <w:r>
           <w:rPr>
@@ -1104,7 +1176,79 @@
             <w:noProof/>
             <w:webHidden/>
           </w:rPr>
-          <w:instrText xml:space="preserve"> PAGEREF _Toc243486159 \h </w:instrText>
+          <w:instrText xml:space="preserve"> PAGEREF _Toc243486837 \h </w:instrText>
+        </w:r>
+        <w:r>
+          <w:rPr>
+            <w:noProof/>
+            <w:webHidden/>
+          </w:rPr>
+        </w:r>
+        <w:r>
+          <w:rPr>
+            <w:noProof/>
+            <w:webHidden/>
+          </w:rPr>
+          <w:fldChar w:fldCharType="separate"/>
+        </w:r>
+        <w:r>
+          <w:rPr>
+            <w:noProof/>
+            <w:webHidden/>
+          </w:rPr>
+          <w:t>12</w:t>
+        </w:r>
+        <w:r>
+          <w:rPr>
+            <w:noProof/>
+            <w:webHidden/>
+          </w:rPr>
+          <w:fldChar w:fldCharType="end"/>
+        </w:r>
+      </w:hyperlink>
+    </w:p>
+    <w:p>
+      <w:pPr>
+        <w:pStyle w:val="TDC1"/>
+        <w:tabs>
+          <w:tab w:val="right" w:leader="dot" w:pos="9350"/>
+        </w:tabs>
+        <w:rPr>
+          <w:rFonts w:asciiTheme="minorHAnsi" w:eastAsiaTheme="minorEastAsia" w:hAnsiTheme="minorHAnsi"/>
+          <w:noProof/>
+          <w:sz w:val="22"/>
+          <w:lang w:val="es-CO" w:eastAsia="es-CO"/>
+        </w:rPr>
+      </w:pPr>
+      <w:hyperlink w:anchor="_Toc243486838" w:history="1">
+        <w:r>
+          <w:rPr>
+            <w:rStyle w:val="Hipervnculo"/>
+            <w:rFonts w:eastAsiaTheme="majorEastAsia"/>
+            <w:noProof/>
+          </w:rPr>
+          <w:t>Prototipo funcional en la nube</w:t>
+        </w:r>
+        <w:r>
+          <w:rPr>
+            <w:noProof/>
+            <w:webHidden/>
+          </w:rPr>
+          <w:tab/>
+        </w:r>
+        <w:r>
+          <w:rPr>
+            <w:noProof/>
+            <w:webHidden/>
+          </w:rPr>
+          <w:fldChar w:fldCharType="begin"/>
+        </w:r>
+        <w:r>
+          <w:rPr>
+            <w:noProof/>
+            <w:webHidden/>
+          </w:rPr>
+          <w:instrText xml:space="preserve"> PAGEREF _Toc243486838 \h </w:instrText>
         </w:r>
         <w:r>
           <w:rPr>
@@ -1148,14 +1292,14 @@
           <w:lang w:val="es-CO" w:eastAsia="es-CO"/>
         </w:rPr>
       </w:pPr>
-      <w:hyperlink w:anchor="_Toc243486160" w:history="1">
+      <w:hyperlink w:anchor="_Toc243486839" w:history="1">
         <w:r>
           <w:rPr>
             <w:rStyle w:val="Hipervnculo"/>
             <w:rFonts w:eastAsiaTheme="majorEastAsia"/>
             <w:noProof/>
           </w:rPr>
-          <w:t>Selección y justificación de patrones de diseño</w:t>
+          <w:t>Conclusiones</w:t>
         </w:r>
         <w:r>
           <w:rPr>
@@ -1176,79 +1320,7 @@
             <w:noProof/>
             <w:webHidden/>
           </w:rPr>
-          <w:instrText xml:space="preserve"> PAGEREF _Toc243486160 \h </w:instrText>
-        </w:r>
-        <w:r>
-          <w:rPr>
-            <w:noProof/>
-            <w:webHidden/>
-          </w:rPr>
-        </w:r>
-        <w:r>
-          <w:rPr>
-            <w:noProof/>
-            <w:webHidden/>
-          </w:rPr>
-          <w:fldChar w:fldCharType="separate"/>
-        </w:r>
-        <w:r>
-          <w:rPr>
-            <w:noProof/>
-            <w:webHidden/>
-          </w:rPr>
-          <w:t>13</w:t>
-        </w:r>
-        <w:r>
-          <w:rPr>
-            <w:noProof/>
-            <w:webHidden/>
-          </w:rPr>
-          <w:fldChar w:fldCharType="end"/>
-        </w:r>
-      </w:hyperlink>
-    </w:p>
-    <w:p>
-      <w:pPr>
-        <w:pStyle w:val="TDC1"/>
-        <w:tabs>
-          <w:tab w:val="right" w:leader="dot" w:pos="9350"/>
-        </w:tabs>
-        <w:rPr>
-          <w:rFonts w:asciiTheme="minorHAnsi" w:eastAsiaTheme="minorEastAsia" w:hAnsiTheme="minorHAnsi"/>
-          <w:noProof/>
-          <w:sz w:val="22"/>
-          <w:lang w:val="es-CO" w:eastAsia="es-CO"/>
-        </w:rPr>
-      </w:pPr>
-      <w:hyperlink w:anchor="_Toc243486161" w:history="1">
-        <w:r>
-          <w:rPr>
-            <w:rStyle w:val="Hipervnculo"/>
-            <w:rFonts w:eastAsiaTheme="majorEastAsia"/>
-            <w:noProof/>
-          </w:rPr>
-          <w:t>Prototipo funcional en la nube</w:t>
-        </w:r>
-        <w:r>
-          <w:rPr>
-            <w:noProof/>
-            <w:webHidden/>
-          </w:rPr>
-          <w:tab/>
-        </w:r>
-        <w:r>
-          <w:rPr>
-            <w:noProof/>
-            <w:webHidden/>
-          </w:rPr>
-          <w:fldChar w:fldCharType="begin"/>
-        </w:r>
-        <w:r>
-          <w:rPr>
-            <w:noProof/>
-            <w:webHidden/>
-          </w:rPr>
-          <w:instrText xml:space="preserve"> PAGEREF _Toc243486161 \h </w:instrText>
+          <w:instrText xml:space="preserve"> PAGEREF _Toc243486839 \h </w:instrText>
         </w:r>
         <w:r>
           <w:rPr>
@@ -1292,14 +1364,14 @@
           <w:lang w:val="es-CO" w:eastAsia="es-CO"/>
         </w:rPr>
       </w:pPr>
-      <w:hyperlink w:anchor="_Toc243486162" w:history="1">
+      <w:hyperlink w:anchor="_Toc243486840" w:history="1">
         <w:r>
           <w:rPr>
             <w:rStyle w:val="Hipervnculo"/>
             <w:rFonts w:eastAsiaTheme="majorEastAsia"/>
             <w:noProof/>
           </w:rPr>
-          <w:t>Conclusiones</w:t>
+          <w:t>Referencias</w:t>
         </w:r>
         <w:r>
           <w:rPr>
@@ -1320,7 +1392,7 @@
             <w:noProof/>
             <w:webHidden/>
           </w:rPr>
-          <w:instrText xml:space="preserve"> PAGEREF _Toc243486162 \h </w:instrText>
+          <w:instrText xml:space="preserve"> PAGEREF _Toc243486840 \h </w:instrText>
         </w:r>
         <w:r>
           <w:rPr>
@@ -1352,88 +1424,16 @@
       </w:hyperlink>
     </w:p>
     <w:p>
-      <w:pPr>
-        <w:pStyle w:val="TDC1"/>
-        <w:tabs>
-          <w:tab w:val="right" w:leader="dot" w:pos="9350"/>
-        </w:tabs>
-        <w:rPr>
-          <w:rFonts w:asciiTheme="minorHAnsi" w:eastAsiaTheme="minorEastAsia" w:hAnsiTheme="minorHAnsi"/>
-          <w:noProof/>
-          <w:sz w:val="22"/>
-          <w:lang w:val="es-CO" w:eastAsia="es-CO"/>
-        </w:rPr>
-      </w:pPr>
-      <w:hyperlink w:anchor="_Toc243486163" w:history="1">
-        <w:r>
-          <w:rPr>
-            <w:rStyle w:val="Hipervnculo"/>
-            <w:rFonts w:eastAsiaTheme="majorEastAsia"/>
-            <w:noProof/>
-          </w:rPr>
-          <w:t>Referencias</w:t>
-        </w:r>
-        <w:r>
-          <w:rPr>
-            <w:noProof/>
-            <w:webHidden/>
-          </w:rPr>
-          <w:tab/>
-        </w:r>
-        <w:r>
-          <w:rPr>
-            <w:noProof/>
-            <w:webHidden/>
-          </w:rPr>
-          <w:fldChar w:fldCharType="begin"/>
-        </w:r>
-        <w:r>
-          <w:rPr>
-            <w:noProof/>
-            <w:webHidden/>
-          </w:rPr>
-          <w:instrText xml:space="preserve"> PAGEREF _Toc243486163 \h </w:instrText>
-        </w:r>
-        <w:r>
-          <w:rPr>
-            <w:noProof/>
-            <w:webHidden/>
-          </w:rPr>
-        </w:r>
-        <w:r>
-          <w:rPr>
-            <w:noProof/>
-            <w:webHidden/>
-          </w:rPr>
-          <w:fldChar w:fldCharType="separate"/>
-        </w:r>
-        <w:r>
-          <w:rPr>
-            <w:noProof/>
-            <w:webHidden/>
-          </w:rPr>
-          <w:t>18</w:t>
-        </w:r>
-        <w:r>
-          <w:rPr>
-            <w:noProof/>
-            <w:webHidden/>
-          </w:rPr>
-          <w:fldChar w:fldCharType="end"/>
-        </w:r>
-      </w:hyperlink>
+      <w:r>
+        <w:fldChar w:fldCharType="end"/>
+      </w:r>
     </w:p>
     <w:p>
-      <w:r>
-        <w:fldChar w:fldCharType="end"/>
-      </w:r>
-    </w:p>
-    <w:p>
       <w:pPr>
         <w:pStyle w:val="Ttulo1"/>
         <w:pageBreakBefore/>
       </w:pPr>
-      <w:bookmarkStart w:id="2" w:name="_Toc243486149"/>
+      <w:bookmarkStart w:id="2" w:name="_Toc243486826"/>
       <w:r>
         <w:lastRenderedPageBreak/>
         <w:t>AulaNube: arquitectura de microservicios en la nube para la plataforma de capacitación corporativa de CapacitaPro S.A.</w:t>
@@ -1472,7 +1472,7 @@
       <w:pPr>
         <w:pStyle w:val="Ttulo1"/>
       </w:pPr>
-      <w:bookmarkStart w:id="3" w:name="_Toc243486150"/>
+      <w:bookmarkStart w:id="3" w:name="_Toc243486827"/>
       <w:r>
         <w:t>Caso de estudio: CapacitaPro S.A.S.</w:t>
       </w:r>
@@ -1536,10 +1536,18 @@
         <w:tc>
           <w:tcPr>
             <w:tcW w:w="2808" w:type="dxa"/>
+            <w:tcMar>
+              <w:top w:w="70" w:type="dxa"/>
+              <w:left w:w="100" w:type="dxa"/>
+              <w:bottom w:w="70" w:type="dxa"/>
+              <w:right w:w="100" w:type="dxa"/>
+            </w:tcMar>
+            <w:vAlign w:val="top"/>
           </w:tcPr>
           <w:p>
             <w:pPr>
               <w:keepNext/>
+              <w:spacing w:line="240" w:lineRule="auto"/>
             </w:pPr>
             <w:r>
               <w:rPr>
@@ -1552,10 +1560,18 @@
         <w:tc>
           <w:tcPr>
             <w:tcW w:w="6552" w:type="dxa"/>
+            <w:tcMar>
+              <w:top w:w="70" w:type="dxa"/>
+              <w:left w:w="100" w:type="dxa"/>
+              <w:bottom w:w="70" w:type="dxa"/>
+              <w:right w:w="100" w:type="dxa"/>
+            </w:tcMar>
+            <w:vAlign w:val="top"/>
           </w:tcPr>
           <w:p>
             <w:pPr>
               <w:keepNext/>
+              <w:spacing w:line="240" w:lineRule="auto"/>
             </w:pPr>
             <w:r>
               <w:rPr>
@@ -1573,10 +1589,21 @@
         <w:tc>
           <w:tcPr>
             <w:tcW w:w="2808" w:type="dxa"/>
+            <w:tcBorders>
+              <w:bottom w:val="single" w:sz="4" w:space="0" w:color="BFBFBF"/>
+            </w:tcBorders>
+            <w:tcMar>
+              <w:top w:w="70" w:type="dxa"/>
+              <w:left w:w="100" w:type="dxa"/>
+              <w:bottom w:w="70" w:type="dxa"/>
+              <w:right w:w="100" w:type="dxa"/>
+            </w:tcMar>
+            <w:vAlign w:val="top"/>
           </w:tcPr>
           <w:p>
             <w:pPr>
               <w:keepNext/>
+              <w:spacing w:line="240" w:lineRule="auto"/>
             </w:pPr>
             <w:r>
               <w:t>Picos en los cierres de campaña</w:t>
@@ -1586,10 +1613,21 @@
         <w:tc>
           <w:tcPr>
             <w:tcW w:w="6552" w:type="dxa"/>
+            <w:tcBorders>
+              <w:bottom w:val="single" w:sz="4" w:space="0" w:color="BFBFBF"/>
+            </w:tcBorders>
+            <w:tcMar>
+              <w:top w:w="70" w:type="dxa"/>
+              <w:left w:w="100" w:type="dxa"/>
+              <w:bottom w:w="70" w:type="dxa"/>
+              <w:right w:w="100" w:type="dxa"/>
+            </w:tcMar>
+            <w:vAlign w:val="top"/>
           </w:tcPr>
           <w:p>
             <w:pPr>
               <w:keepNext/>
+              <w:spacing w:line="240" w:lineRule="auto"/>
             </w:pPr>
             <w:r>
               <w:t>Un cierre de 1.100 trabajadores dejó el servidor 40 minutos sin respuesta y afectó a otros siete clientes.</w:t>
@@ -1604,10 +1642,21 @@
         <w:tc>
           <w:tcPr>
             <w:tcW w:w="2808" w:type="dxa"/>
+            <w:tcBorders>
+              <w:bottom w:val="single" w:sz="4" w:space="0" w:color="BFBFBF"/>
+            </w:tcBorders>
+            <w:tcMar>
+              <w:top w:w="70" w:type="dxa"/>
+              <w:left w:w="100" w:type="dxa"/>
+              <w:bottom w:w="70" w:type="dxa"/>
+              <w:right w:w="100" w:type="dxa"/>
+            </w:tcMar>
+            <w:vAlign w:val="top"/>
           </w:tcPr>
           <w:p>
             <w:pPr>
               <w:keepNext/>
+              <w:spacing w:line="240" w:lineRule="auto"/>
             </w:pPr>
             <w:r>
               <w:t>Certificado dentro de la solicitud</w:t>
@@ -1617,10 +1666,21 @@
         <w:tc>
           <w:tcPr>
             <w:tcW w:w="6552" w:type="dxa"/>
+            <w:tcBorders>
+              <w:bottom w:val="single" w:sz="4" w:space="0" w:color="BFBFBF"/>
+            </w:tcBorders>
+            <w:tcMar>
+              <w:top w:w="70" w:type="dxa"/>
+              <w:left w:w="100" w:type="dxa"/>
+              <w:bottom w:w="70" w:type="dxa"/>
+              <w:right w:w="100" w:type="dxa"/>
+            </w:tcMar>
+            <w:vAlign w:val="top"/>
           </w:tcPr>
           <w:p>
             <w:pPr>
               <w:keepNext/>
+              <w:spacing w:line="240" w:lineRule="auto"/>
             </w:pPr>
             <w:r>
               <w:t>Respuestas de 8 a 25 s al terminar un curso; si el usuario cierra la página, el certificado no se genera.</w:t>
@@ -1635,10 +1695,21 @@
         <w:tc>
           <w:tcPr>
             <w:tcW w:w="2808" w:type="dxa"/>
+            <w:tcBorders>
+              <w:bottom w:val="single" w:sz="4" w:space="0" w:color="BFBFBF"/>
+            </w:tcBorders>
+            <w:tcMar>
+              <w:top w:w="70" w:type="dxa"/>
+              <w:left w:w="100" w:type="dxa"/>
+              <w:bottom w:w="70" w:type="dxa"/>
+              <w:right w:w="100" w:type="dxa"/>
+            </w:tcMar>
+            <w:vAlign w:val="top"/>
           </w:tcPr>
           <w:p>
             <w:pPr>
               <w:keepNext/>
+              <w:spacing w:line="240" w:lineRule="auto"/>
             </w:pPr>
             <w:r>
               <w:t>Correo que bloquea la operación</w:t>
@@ -1648,10 +1719,21 @@
         <w:tc>
           <w:tcPr>
             <w:tcW w:w="6552" w:type="dxa"/>
+            <w:tcBorders>
+              <w:bottom w:val="single" w:sz="4" w:space="0" w:color="BFBFBF"/>
+            </w:tcBorders>
+            <w:tcMar>
+              <w:top w:w="70" w:type="dxa"/>
+              <w:left w:w="100" w:type="dxa"/>
+              <w:bottom w:w="70" w:type="dxa"/>
+              <w:right w:w="100" w:type="dxa"/>
+            </w:tcMar>
+            <w:vAlign w:val="top"/>
           </w:tcPr>
           <w:p>
             <w:pPr>
               <w:keepNext/>
+              <w:spacing w:line="240" w:lineRule="auto"/>
             </w:pPr>
             <w:r>
               <w:t>Cursos terminados que no quedan registrados porque el servidor de correo tardó.</w:t>
@@ -1666,10 +1748,21 @@
         <w:tc>
           <w:tcPr>
             <w:tcW w:w="2808" w:type="dxa"/>
+            <w:tcBorders>
+              <w:bottom w:val="single" w:sz="4" w:space="0" w:color="BFBFBF"/>
+            </w:tcBorders>
+            <w:tcMar>
+              <w:top w:w="70" w:type="dxa"/>
+              <w:left w:w="100" w:type="dxa"/>
+              <w:bottom w:w="70" w:type="dxa"/>
+              <w:right w:w="100" w:type="dxa"/>
+            </w:tcMar>
+            <w:vAlign w:val="top"/>
           </w:tcPr>
           <w:p>
             <w:pPr>
               <w:keepNext/>
+              <w:spacing w:line="240" w:lineRule="auto"/>
             </w:pPr>
             <w:r>
               <w:t>M</w:t>
@@ -1682,10 +1775,21 @@
         <w:tc>
           <w:tcPr>
             <w:tcW w:w="6552" w:type="dxa"/>
+            <w:tcBorders>
+              <w:bottom w:val="single" w:sz="4" w:space="0" w:color="BFBFBF"/>
+            </w:tcBorders>
+            <w:tcMar>
+              <w:top w:w="70" w:type="dxa"/>
+              <w:left w:w="100" w:type="dxa"/>
+              <w:bottom w:w="70" w:type="dxa"/>
+              <w:right w:w="100" w:type="dxa"/>
+            </w:tcMar>
+            <w:vAlign w:val="top"/>
           </w:tcPr>
           <w:p>
             <w:pPr>
               <w:keepNext/>
+              <w:spacing w:line="240" w:lineRule="auto"/>
             </w:pPr>
             <w:r>
               <w:t>Cada actualización se aplica 38 veces, cerca del 40 % del tiempo del equipo técnico.</w:t>
@@ -1700,8 +1804,18 @@
         <w:tc>
           <w:tcPr>
             <w:tcW w:w="2808" w:type="dxa"/>
+            <w:tcMar>
+              <w:top w:w="70" w:type="dxa"/>
+              <w:left w:w="100" w:type="dxa"/>
+              <w:bottom w:w="70" w:type="dxa"/>
+              <w:right w:w="100" w:type="dxa"/>
+            </w:tcMar>
+            <w:vAlign w:val="top"/>
           </w:tcPr>
           <w:p>
+            <w:pPr>
+              <w:spacing w:line="240" w:lineRule="auto"/>
+            </w:pPr>
             <w:r>
               <w:t>Sin verificación de certificados</w:t>
             </w:r>
@@ -1710,8 +1824,18 @@
         <w:tc>
           <w:tcPr>
             <w:tcW w:w="6552" w:type="dxa"/>
+            <w:tcMar>
+              <w:top w:w="70" w:type="dxa"/>
+              <w:left w:w="100" w:type="dxa"/>
+              <w:bottom w:w="70" w:type="dxa"/>
+              <w:right w:w="100" w:type="dxa"/>
+            </w:tcMar>
+            <w:vAlign w:val="top"/>
           </w:tcPr>
           <w:p>
+            <w:pPr>
+              <w:spacing w:line="240" w:lineRule="auto"/>
+            </w:pPr>
             <w:r>
               <w:t>Auditores y contratantes piden confirmación por correo, lo que tarda días.</w:t>
             </w:r>
@@ -1758,7 +1882,7 @@
       <w:pPr>
         <w:pStyle w:val="Ttulo1"/>
       </w:pPr>
-      <w:bookmarkStart w:id="4" w:name="_Toc243486151"/>
+      <w:bookmarkStart w:id="4" w:name="_Toc243486828"/>
       <w:r>
         <w:t>Análisis de requisitos</w:t>
       </w:r>
@@ -1772,11 +1896,7 @@
         <w:t xml:space="preserve">Se aplicaron cuatro técnicas: análisis documental del caso; una entrevista simulada en la </w:t>
       </w:r>
       <w:r>
-        <w:t xml:space="preserve">que el equipo representó a la gerencia, a una administradora de empresa cliente y a un colaborador; historias de usuario priorizadas con el método MoSCoW, y escenarios de atributos </w:t>
-      </w:r>
-      <w:r>
-        <w:lastRenderedPageBreak/>
-        <w:t xml:space="preserve">de calidad, que expresan cada requisito no funcional con un estímulo y una </w:t>
+        <w:t xml:space="preserve">que el equipo representó a la gerencia, a una administradora de empresa cliente y a un colaborador; historias de usuario priorizadas con el método MoSCoW, y escenarios de atributos de calidad, que expresan cada requisito no funcional con un estímulo y una </w:t>
       </w:r>
       <w:r>
         <w:t>medida de respuesta verificable (Bass et al., 2012). Las Tablas 2 y 3 presentan el resultado.</w:t>
@@ -1791,6 +1911,7 @@
         <w:rPr>
           <w:b/>
         </w:rPr>
+        <w:lastRenderedPageBreak/>
         <w:t>Tabla 2</w:t>
       </w:r>
     </w:p>
@@ -1826,10 +1947,18 @@
         <w:tc>
           <w:tcPr>
             <w:tcW w:w="1030" w:type="dxa"/>
+            <w:tcMar>
+              <w:top w:w="70" w:type="dxa"/>
+              <w:left w:w="100" w:type="dxa"/>
+              <w:bottom w:w="70" w:type="dxa"/>
+              <w:right w:w="100" w:type="dxa"/>
+            </w:tcMar>
+            <w:vAlign w:val="top"/>
           </w:tcPr>
           <w:p>
             <w:pPr>
               <w:keepNext/>
+              <w:spacing w:line="240" w:lineRule="auto"/>
             </w:pPr>
             <w:r>
               <w:rPr>
@@ -1842,10 +1971,18 @@
         <w:tc>
           <w:tcPr>
             <w:tcW w:w="6926" w:type="dxa"/>
+            <w:tcMar>
+              <w:top w:w="70" w:type="dxa"/>
+              <w:left w:w="100" w:type="dxa"/>
+              <w:bottom w:w="70" w:type="dxa"/>
+              <w:right w:w="100" w:type="dxa"/>
+            </w:tcMar>
+            <w:vAlign w:val="top"/>
           </w:tcPr>
           <w:p>
             <w:pPr>
               <w:keepNext/>
+              <w:spacing w:line="240" w:lineRule="auto"/>
             </w:pPr>
             <w:r>
               <w:rPr>
@@ -1858,10 +1995,18 @@
         <w:tc>
           <w:tcPr>
             <w:tcW w:w="1404" w:type="dxa"/>
+            <w:tcMar>
+              <w:top w:w="70" w:type="dxa"/>
+              <w:left w:w="100" w:type="dxa"/>
+              <w:bottom w:w="70" w:type="dxa"/>
+              <w:right w:w="100" w:type="dxa"/>
+            </w:tcMar>
+            <w:vAlign w:val="top"/>
           </w:tcPr>
           <w:p>
             <w:pPr>
               <w:keepNext/>
+              <w:spacing w:line="240" w:lineRule="auto"/>
             </w:pPr>
             <w:r>
               <w:rPr>
@@ -1879,10 +2024,21 @@
         <w:tc>
           <w:tcPr>
             <w:tcW w:w="1030" w:type="dxa"/>
+            <w:tcBorders>
+              <w:bottom w:val="single" w:sz="4" w:space="0" w:color="BFBFBF"/>
+            </w:tcBorders>
+            <w:tcMar>
+              <w:top w:w="70" w:type="dxa"/>
+              <w:left w:w="100" w:type="dxa"/>
+              <w:bottom w:w="70" w:type="dxa"/>
+              <w:right w:w="100" w:type="dxa"/>
+            </w:tcMar>
+            <w:vAlign w:val="top"/>
           </w:tcPr>
           <w:p>
             <w:pPr>
               <w:keepNext/>
+              <w:spacing w:line="240" w:lineRule="auto"/>
             </w:pPr>
             <w:r>
               <w:t>RF01</w:t>
@@ -1892,10 +2048,21 @@
         <w:tc>
           <w:tcPr>
             <w:tcW w:w="6926" w:type="dxa"/>
+            <w:tcBorders>
+              <w:bottom w:val="single" w:sz="4" w:space="0" w:color="BFBFBF"/>
+            </w:tcBorders>
+            <w:tcMar>
+              <w:top w:w="70" w:type="dxa"/>
+              <w:left w:w="100" w:type="dxa"/>
+              <w:bottom w:w="70" w:type="dxa"/>
+              <w:right w:w="100" w:type="dxa"/>
+            </w:tcMar>
+            <w:vAlign w:val="top"/>
           </w:tcPr>
           <w:p>
             <w:pPr>
               <w:keepNext/>
+              <w:spacing w:line="240" w:lineRule="auto"/>
             </w:pPr>
             <w:r>
               <w:t>Como usuario quiero iniciar sesión para acceder a la plataforma de mi empresa.</w:t>
@@ -1905,10 +2072,21 @@
         <w:tc>
           <w:tcPr>
             <w:tcW w:w="1404" w:type="dxa"/>
+            <w:tcBorders>
+              <w:bottom w:val="single" w:sz="4" w:space="0" w:color="BFBFBF"/>
+            </w:tcBorders>
+            <w:tcMar>
+              <w:top w:w="70" w:type="dxa"/>
+              <w:left w:w="100" w:type="dxa"/>
+              <w:bottom w:w="70" w:type="dxa"/>
+              <w:right w:w="100" w:type="dxa"/>
+            </w:tcMar>
+            <w:vAlign w:val="top"/>
           </w:tcPr>
           <w:p>
             <w:pPr>
               <w:keepNext/>
+              <w:spacing w:line="240" w:lineRule="auto"/>
             </w:pPr>
             <w:r>
               <w:t>Debe</w:t>
@@ -1923,10 +2101,21 @@
         <w:tc>
           <w:tcPr>
             <w:tcW w:w="1030" w:type="dxa"/>
+            <w:tcBorders>
+              <w:bottom w:val="single" w:sz="4" w:space="0" w:color="BFBFBF"/>
+            </w:tcBorders>
+            <w:tcMar>
+              <w:top w:w="70" w:type="dxa"/>
+              <w:left w:w="100" w:type="dxa"/>
+              <w:bottom w:w="70" w:type="dxa"/>
+              <w:right w:w="100" w:type="dxa"/>
+            </w:tcMar>
+            <w:vAlign w:val="top"/>
           </w:tcPr>
           <w:p>
             <w:pPr>
               <w:keepNext/>
+              <w:spacing w:line="240" w:lineRule="auto"/>
             </w:pPr>
             <w:r>
               <w:t>RF02</w:t>
@@ -1936,10 +2125,21 @@
         <w:tc>
           <w:tcPr>
             <w:tcW w:w="6926" w:type="dxa"/>
+            <w:tcBorders>
+              <w:bottom w:val="single" w:sz="4" w:space="0" w:color="BFBFBF"/>
+            </w:tcBorders>
+            <w:tcMar>
+              <w:top w:w="70" w:type="dxa"/>
+              <w:left w:w="100" w:type="dxa"/>
+              <w:bottom w:w="70" w:type="dxa"/>
+              <w:right w:w="100" w:type="dxa"/>
+            </w:tcMar>
+            <w:vAlign w:val="top"/>
           </w:tcPr>
           <w:p>
             <w:pPr>
               <w:keepNext/>
+              <w:spacing w:line="240" w:lineRule="auto"/>
             </w:pPr>
             <w:r>
               <w:t>Como estudiante quiero ver los cursos de mi empresa, inscribirme y avanzar por las lecciones.</w:t>
@@ -1949,10 +2149,21 @@
         <w:tc>
           <w:tcPr>
             <w:tcW w:w="1404" w:type="dxa"/>
+            <w:tcBorders>
+              <w:bottom w:val="single" w:sz="4" w:space="0" w:color="BFBFBF"/>
+            </w:tcBorders>
+            <w:tcMar>
+              <w:top w:w="70" w:type="dxa"/>
+              <w:left w:w="100" w:type="dxa"/>
+              <w:bottom w:w="70" w:type="dxa"/>
+              <w:right w:w="100" w:type="dxa"/>
+            </w:tcMar>
+            <w:vAlign w:val="top"/>
           </w:tcPr>
           <w:p>
             <w:pPr>
               <w:keepNext/>
+              <w:spacing w:line="240" w:lineRule="auto"/>
             </w:pPr>
             <w:r>
               <w:t>Debe</w:t>
@@ -1967,10 +2178,21 @@
         <w:tc>
           <w:tcPr>
             <w:tcW w:w="1030" w:type="dxa"/>
+            <w:tcBorders>
+              <w:bottom w:val="single" w:sz="4" w:space="0" w:color="BFBFBF"/>
+            </w:tcBorders>
+            <w:tcMar>
+              <w:top w:w="70" w:type="dxa"/>
+              <w:left w:w="100" w:type="dxa"/>
+              <w:bottom w:w="70" w:type="dxa"/>
+              <w:right w:w="100" w:type="dxa"/>
+            </w:tcMar>
+            <w:vAlign w:val="top"/>
           </w:tcPr>
           <w:p>
             <w:pPr>
               <w:keepNext/>
+              <w:spacing w:line="240" w:lineRule="auto"/>
             </w:pPr>
             <w:r>
               <w:t>RF03</w:t>
@@ -1980,10 +2202,21 @@
         <w:tc>
           <w:tcPr>
             <w:tcW w:w="6926" w:type="dxa"/>
+            <w:tcBorders>
+              <w:bottom w:val="single" w:sz="4" w:space="0" w:color="BFBFBF"/>
+            </w:tcBorders>
+            <w:tcMar>
+              <w:top w:w="70" w:type="dxa"/>
+              <w:left w:w="100" w:type="dxa"/>
+              <w:bottom w:w="70" w:type="dxa"/>
+              <w:right w:w="100" w:type="dxa"/>
+            </w:tcMar>
+            <w:vAlign w:val="top"/>
           </w:tcPr>
           <w:p>
             <w:pPr>
               <w:keepNext/>
+              <w:spacing w:line="240" w:lineRule="auto"/>
             </w:pPr>
             <w:r>
               <w:t>Como estudiante quiero un certificado PDF con código único al completar un curso.</w:t>
@@ -1993,10 +2226,21 @@
         <w:tc>
           <w:tcPr>
             <w:tcW w:w="1404" w:type="dxa"/>
+            <w:tcBorders>
+              <w:bottom w:val="single" w:sz="4" w:space="0" w:color="BFBFBF"/>
+            </w:tcBorders>
+            <w:tcMar>
+              <w:top w:w="70" w:type="dxa"/>
+              <w:left w:w="100" w:type="dxa"/>
+              <w:bottom w:w="70" w:type="dxa"/>
+              <w:right w:w="100" w:type="dxa"/>
+            </w:tcMar>
+            <w:vAlign w:val="top"/>
           </w:tcPr>
           <w:p>
             <w:pPr>
               <w:keepNext/>
+              <w:spacing w:line="240" w:lineRule="auto"/>
             </w:pPr>
             <w:r>
               <w:t>Debe</w:t>
@@ -2011,10 +2255,21 @@
         <w:tc>
           <w:tcPr>
             <w:tcW w:w="1030" w:type="dxa"/>
+            <w:tcBorders>
+              <w:bottom w:val="single" w:sz="4" w:space="0" w:color="BFBFBF"/>
+            </w:tcBorders>
+            <w:tcMar>
+              <w:top w:w="70" w:type="dxa"/>
+              <w:left w:w="100" w:type="dxa"/>
+              <w:bottom w:w="70" w:type="dxa"/>
+              <w:right w:w="100" w:type="dxa"/>
+            </w:tcMar>
+            <w:vAlign w:val="top"/>
           </w:tcPr>
           <w:p>
             <w:pPr>
               <w:keepNext/>
+              <w:spacing w:line="240" w:lineRule="auto"/>
             </w:pPr>
             <w:r>
               <w:t>RF04</w:t>
@@ -2024,26 +2279,48 @@
         <w:tc>
           <w:tcPr>
             <w:tcW w:w="6926" w:type="dxa"/>
+            <w:tcBorders>
+              <w:bottom w:val="single" w:sz="4" w:space="0" w:color="BFBFBF"/>
+            </w:tcBorders>
+            <w:tcMar>
+              <w:top w:w="70" w:type="dxa"/>
+              <w:left w:w="100" w:type="dxa"/>
+              <w:bottom w:w="70" w:type="dxa"/>
+              <w:right w:w="100" w:type="dxa"/>
+            </w:tcMar>
+            <w:vAlign w:val="top"/>
           </w:tcPr>
           <w:p>
             <w:pPr>
               <w:keepNext/>
+              <w:spacing w:line="240" w:lineRule="auto"/>
             </w:pPr>
             <w:r>
-              <w:t>Como estudiante quiero un aviso al completar el curso</w:t>
+              <w:t xml:space="preserve">Como estudiante quiero un aviso al completar el </w:t>
             </w:r>
             <w:r>
-              <w:t xml:space="preserve"> y cuando el certificado esté listo.</w:t>
+              <w:t>curso y cuando el certificado esté listo.</w:t>
             </w:r>
           </w:p>
         </w:tc>
         <w:tc>
           <w:tcPr>
             <w:tcW w:w="1404" w:type="dxa"/>
+            <w:tcBorders>
+              <w:bottom w:val="single" w:sz="4" w:space="0" w:color="BFBFBF"/>
+            </w:tcBorders>
+            <w:tcMar>
+              <w:top w:w="70" w:type="dxa"/>
+              <w:left w:w="100" w:type="dxa"/>
+              <w:bottom w:w="70" w:type="dxa"/>
+              <w:right w:w="100" w:type="dxa"/>
+            </w:tcMar>
+            <w:vAlign w:val="top"/>
           </w:tcPr>
           <w:p>
             <w:pPr>
               <w:keepNext/>
+              <w:spacing w:line="240" w:lineRule="auto"/>
             </w:pPr>
             <w:r>
               <w:t>Debe</w:t>
@@ -2058,10 +2335,21 @@
         <w:tc>
           <w:tcPr>
             <w:tcW w:w="1030" w:type="dxa"/>
+            <w:tcBorders>
+              <w:bottom w:val="single" w:sz="4" w:space="0" w:color="BFBFBF"/>
+            </w:tcBorders>
+            <w:tcMar>
+              <w:top w:w="70" w:type="dxa"/>
+              <w:left w:w="100" w:type="dxa"/>
+              <w:bottom w:w="70" w:type="dxa"/>
+              <w:right w:w="100" w:type="dxa"/>
+            </w:tcMar>
+            <w:vAlign w:val="top"/>
           </w:tcPr>
           <w:p>
             <w:pPr>
               <w:keepNext/>
+              <w:spacing w:line="240" w:lineRule="auto"/>
             </w:pPr>
             <w:r>
               <w:t>RF05</w:t>
@@ -2071,10 +2359,21 @@
         <w:tc>
           <w:tcPr>
             <w:tcW w:w="6926" w:type="dxa"/>
+            <w:tcBorders>
+              <w:bottom w:val="single" w:sz="4" w:space="0" w:color="BFBFBF"/>
+            </w:tcBorders>
+            <w:tcMar>
+              <w:top w:w="70" w:type="dxa"/>
+              <w:left w:w="100" w:type="dxa"/>
+              <w:bottom w:w="70" w:type="dxa"/>
+              <w:right w:w="100" w:type="dxa"/>
+            </w:tcMar>
+            <w:vAlign w:val="top"/>
           </w:tcPr>
           <w:p>
             <w:pPr>
               <w:keepNext/>
+              <w:spacing w:line="240" w:lineRule="auto"/>
             </w:pPr>
             <w:r>
               <w:t>Como verificador externo quiero consultar un certificado por su código, sin cuenta.</w:t>
@@ -2084,10 +2383,21 @@
         <w:tc>
           <w:tcPr>
             <w:tcW w:w="1404" w:type="dxa"/>
+            <w:tcBorders>
+              <w:bottom w:val="single" w:sz="4" w:space="0" w:color="BFBFBF"/>
+            </w:tcBorders>
+            <w:tcMar>
+              <w:top w:w="70" w:type="dxa"/>
+              <w:left w:w="100" w:type="dxa"/>
+              <w:bottom w:w="70" w:type="dxa"/>
+              <w:right w:w="100" w:type="dxa"/>
+            </w:tcMar>
+            <w:vAlign w:val="top"/>
           </w:tcPr>
           <w:p>
             <w:pPr>
               <w:keepNext/>
+              <w:spacing w:line="240" w:lineRule="auto"/>
             </w:pPr>
             <w:r>
               <w:t>Debe</w:t>
@@ -2102,10 +2412,21 @@
         <w:tc>
           <w:tcPr>
             <w:tcW w:w="1030" w:type="dxa"/>
+            <w:tcBorders>
+              <w:bottom w:val="single" w:sz="4" w:space="0" w:color="BFBFBF"/>
+            </w:tcBorders>
+            <w:tcMar>
+              <w:top w:w="70" w:type="dxa"/>
+              <w:left w:w="100" w:type="dxa"/>
+              <w:bottom w:w="70" w:type="dxa"/>
+              <w:right w:w="100" w:type="dxa"/>
+            </w:tcMar>
+            <w:vAlign w:val="top"/>
           </w:tcPr>
           <w:p>
             <w:pPr>
               <w:keepNext/>
+              <w:spacing w:line="240" w:lineRule="auto"/>
             </w:pPr>
             <w:r>
               <w:t>RF06</w:t>
@@ -2115,10 +2436,21 @@
         <w:tc>
           <w:tcPr>
             <w:tcW w:w="6926" w:type="dxa"/>
+            <w:tcBorders>
+              <w:bottom w:val="single" w:sz="4" w:space="0" w:color="BFBFBF"/>
+            </w:tcBorders>
+            <w:tcMar>
+              <w:top w:w="70" w:type="dxa"/>
+              <w:left w:w="100" w:type="dxa"/>
+              <w:bottom w:w="70" w:type="dxa"/>
+              <w:right w:w="100" w:type="dxa"/>
+            </w:tcMar>
+            <w:vAlign w:val="top"/>
           </w:tcPr>
           <w:p>
             <w:pPr>
               <w:keepNext/>
+              <w:spacing w:line="240" w:lineRule="auto"/>
             </w:pPr>
             <w:r>
               <w:t>Como administrador quiero crear cursos, registrar colaboradores y ver su avance.</w:t>
@@ -2128,10 +2460,21 @@
         <w:tc>
           <w:tcPr>
             <w:tcW w:w="1404" w:type="dxa"/>
+            <w:tcBorders>
+              <w:bottom w:val="single" w:sz="4" w:space="0" w:color="BFBFBF"/>
+            </w:tcBorders>
+            <w:tcMar>
+              <w:top w:w="70" w:type="dxa"/>
+              <w:left w:w="100" w:type="dxa"/>
+              <w:bottom w:w="70" w:type="dxa"/>
+              <w:right w:w="100" w:type="dxa"/>
+            </w:tcMar>
+            <w:vAlign w:val="top"/>
           </w:tcPr>
           <w:p>
             <w:pPr>
               <w:keepNext/>
+              <w:spacing w:line="240" w:lineRule="auto"/>
             </w:pPr>
             <w:r>
               <w:t>Debe</w:t>
@@ -2146,10 +2489,21 @@
         <w:tc>
           <w:tcPr>
             <w:tcW w:w="1030" w:type="dxa"/>
+            <w:tcBorders>
+              <w:bottom w:val="single" w:sz="4" w:space="0" w:color="BFBFBF"/>
+            </w:tcBorders>
+            <w:tcMar>
+              <w:top w:w="70" w:type="dxa"/>
+              <w:left w:w="100" w:type="dxa"/>
+              <w:bottom w:w="70" w:type="dxa"/>
+              <w:right w:w="100" w:type="dxa"/>
+            </w:tcMar>
+            <w:vAlign w:val="top"/>
           </w:tcPr>
           <w:p>
             <w:pPr>
               <w:keepNext/>
+              <w:spacing w:line="240" w:lineRule="auto"/>
             </w:pPr>
             <w:r>
               <w:t>RF07</w:t>
@@ -2159,26 +2513,48 @@
         <w:tc>
           <w:tcPr>
             <w:tcW w:w="6926" w:type="dxa"/>
+            <w:tcBorders>
+              <w:bottom w:val="single" w:sz="4" w:space="0" w:color="BFBFBF"/>
+            </w:tcBorders>
+            <w:tcMar>
+              <w:top w:w="70" w:type="dxa"/>
+              <w:left w:w="100" w:type="dxa"/>
+              <w:bottom w:w="70" w:type="dxa"/>
+              <w:right w:w="100" w:type="dxa"/>
+            </w:tcMar>
+            <w:vAlign w:val="top"/>
           </w:tcPr>
           <w:p>
             <w:pPr>
               <w:keepNext/>
+              <w:spacing w:line="240" w:lineRule="auto"/>
             </w:pPr>
             <w:r>
-              <w:t xml:space="preserve">Como </w:t>
+              <w:t>Como administrad</w:t>
             </w:r>
             <w:r>
-              <w:t>administrador quiero cerrar una campaña masiva sin degradar la plataforma.</w:t>
+              <w:t>or quiero cerrar una campaña masiva sin degradar la plataforma.</w:t>
             </w:r>
           </w:p>
         </w:tc>
         <w:tc>
           <w:tcPr>
             <w:tcW w:w="1404" w:type="dxa"/>
+            <w:tcBorders>
+              <w:bottom w:val="single" w:sz="4" w:space="0" w:color="BFBFBF"/>
+            </w:tcBorders>
+            <w:tcMar>
+              <w:top w:w="70" w:type="dxa"/>
+              <w:left w:w="100" w:type="dxa"/>
+              <w:bottom w:w="70" w:type="dxa"/>
+              <w:right w:w="100" w:type="dxa"/>
+            </w:tcMar>
+            <w:vAlign w:val="top"/>
           </w:tcPr>
           <w:p>
             <w:pPr>
               <w:keepNext/>
+              <w:spacing w:line="240" w:lineRule="auto"/>
             </w:pPr>
             <w:r>
               <w:t>Debe</w:t>
@@ -2193,8 +2569,18 @@
         <w:tc>
           <w:tcPr>
             <w:tcW w:w="1030" w:type="dxa"/>
+            <w:tcMar>
+              <w:top w:w="70" w:type="dxa"/>
+              <w:left w:w="100" w:type="dxa"/>
+              <w:bottom w:w="70" w:type="dxa"/>
+              <w:right w:w="100" w:type="dxa"/>
+            </w:tcMar>
+            <w:vAlign w:val="top"/>
           </w:tcPr>
           <w:p>
+            <w:pPr>
+              <w:spacing w:line="240" w:lineRule="auto"/>
+            </w:pPr>
             <w:r>
               <w:t>RF08</w:t>
             </w:r>
@@ -2203,8 +2589,18 @@
         <w:tc>
           <w:tcPr>
             <w:tcW w:w="6926" w:type="dxa"/>
+            <w:tcMar>
+              <w:top w:w="70" w:type="dxa"/>
+              <w:left w:w="100" w:type="dxa"/>
+              <w:bottom w:w="70" w:type="dxa"/>
+              <w:right w:w="100" w:type="dxa"/>
+            </w:tcMar>
+            <w:vAlign w:val="top"/>
           </w:tcPr>
           <w:p>
+            <w:pPr>
+              <w:spacing w:line="240" w:lineRule="auto"/>
+            </w:pPr>
             <w:r>
               <w:t>Como equipo técnico quiero ver la salud de los servicios y la cola de eventos.</w:t>
             </w:r>
@@ -2213,8 +2609,18 @@
         <w:tc>
           <w:tcPr>
             <w:tcW w:w="1404" w:type="dxa"/>
+            <w:tcMar>
+              <w:top w:w="70" w:type="dxa"/>
+              <w:left w:w="100" w:type="dxa"/>
+              <w:bottom w:w="70" w:type="dxa"/>
+              <w:right w:w="100" w:type="dxa"/>
+            </w:tcMar>
+            <w:vAlign w:val="top"/>
           </w:tcPr>
           <w:p>
+            <w:pPr>
+              <w:spacing w:line="240" w:lineRule="auto"/>
+            </w:pPr>
             <w:r>
               <w:t>Debería</w:t>
             </w:r>
@@ -2261,13 +2667,13 @@
         <w:rPr>
           <w:i/>
         </w:rPr>
-        <w:t xml:space="preserve">Requisitos </w:t>
+        <w:t xml:space="preserve">Requisitos no </w:t>
       </w:r>
       <w:r>
         <w:rPr>
           <w:i/>
         </w:rPr>
-        <w:t>no funcionales expresados como escenarios de calidad</w:t>
+        <w:t>funcionales expresados como escenarios de calidad</w:t>
       </w:r>
     </w:p>
     <w:tbl>
@@ -2291,10 +2697,18 @@
         <w:tc>
           <w:tcPr>
             <w:tcW w:w="1123" w:type="dxa"/>
+            <w:tcMar>
+              <w:top w:w="70" w:type="dxa"/>
+              <w:left w:w="100" w:type="dxa"/>
+              <w:bottom w:w="70" w:type="dxa"/>
+              <w:right w:w="100" w:type="dxa"/>
+            </w:tcMar>
+            <w:vAlign w:val="top"/>
           </w:tcPr>
           <w:p>
             <w:pPr>
               <w:keepNext/>
+              <w:spacing w:line="240" w:lineRule="auto"/>
             </w:pPr>
             <w:r>
               <w:rPr>
@@ -2307,10 +2721,18 @@
         <w:tc>
           <w:tcPr>
             <w:tcW w:w="2059" w:type="dxa"/>
+            <w:tcMar>
+              <w:top w:w="70" w:type="dxa"/>
+              <w:left w:w="100" w:type="dxa"/>
+              <w:bottom w:w="70" w:type="dxa"/>
+              <w:right w:w="100" w:type="dxa"/>
+            </w:tcMar>
+            <w:vAlign w:val="top"/>
           </w:tcPr>
           <w:p>
             <w:pPr>
               <w:keepNext/>
+              <w:spacing w:line="240" w:lineRule="auto"/>
             </w:pPr>
             <w:r>
               <w:rPr>
@@ -2323,10 +2745,18 @@
         <w:tc>
           <w:tcPr>
             <w:tcW w:w="6178" w:type="dxa"/>
+            <w:tcMar>
+              <w:top w:w="70" w:type="dxa"/>
+              <w:left w:w="100" w:type="dxa"/>
+              <w:bottom w:w="70" w:type="dxa"/>
+              <w:right w:w="100" w:type="dxa"/>
+            </w:tcMar>
+            <w:vAlign w:val="top"/>
           </w:tcPr>
           <w:p>
             <w:pPr>
               <w:keepNext/>
+              <w:spacing w:line="240" w:lineRule="auto"/>
             </w:pPr>
             <w:r>
               <w:rPr>
@@ -2344,10 +2774,21 @@
         <w:tc>
           <w:tcPr>
             <w:tcW w:w="1123" w:type="dxa"/>
+            <w:tcBorders>
+              <w:bottom w:val="single" w:sz="4" w:space="0" w:color="BFBFBF"/>
+            </w:tcBorders>
+            <w:tcMar>
+              <w:top w:w="70" w:type="dxa"/>
+              <w:left w:w="100" w:type="dxa"/>
+              <w:bottom w:w="70" w:type="dxa"/>
+              <w:right w:w="100" w:type="dxa"/>
+            </w:tcMar>
+            <w:vAlign w:val="top"/>
           </w:tcPr>
           <w:p>
             <w:pPr>
               <w:keepNext/>
+              <w:spacing w:line="240" w:lineRule="auto"/>
             </w:pPr>
             <w:r>
               <w:t>RNF01</w:t>
@@ -2357,10 +2798,21 @@
         <w:tc>
           <w:tcPr>
             <w:tcW w:w="2059" w:type="dxa"/>
+            <w:tcBorders>
+              <w:bottom w:val="single" w:sz="4" w:space="0" w:color="BFBFBF"/>
+            </w:tcBorders>
+            <w:tcMar>
+              <w:top w:w="70" w:type="dxa"/>
+              <w:left w:w="100" w:type="dxa"/>
+              <w:bottom w:w="70" w:type="dxa"/>
+              <w:right w:w="100" w:type="dxa"/>
+            </w:tcMar>
+            <w:vAlign w:val="top"/>
           </w:tcPr>
           <w:p>
             <w:pPr>
               <w:keepNext/>
+              <w:spacing w:line="240" w:lineRule="auto"/>
             </w:pPr>
             <w:r>
               <w:t>Escalabilidad</w:t>
@@ -2370,10 +2822,21 @@
         <w:tc>
           <w:tcPr>
             <w:tcW w:w="6178" w:type="dxa"/>
+            <w:tcBorders>
+              <w:bottom w:val="single" w:sz="4" w:space="0" w:color="BFBFBF"/>
+            </w:tcBorders>
+            <w:tcMar>
+              <w:top w:w="70" w:type="dxa"/>
+              <w:left w:w="100" w:type="dxa"/>
+              <w:bottom w:w="70" w:type="dxa"/>
+              <w:right w:w="100" w:type="dxa"/>
+            </w:tcMar>
+            <w:vAlign w:val="top"/>
           </w:tcPr>
           <w:p>
             <w:pPr>
               <w:keepNext/>
+              <w:spacing w:line="240" w:lineRule="auto"/>
             </w:pPr>
             <w:r>
               <w:t>150 cursos terminados en un minuto: respuesta &lt; 1 s y todos los certificados emitidos.</w:t>
@@ -2388,10 +2851,21 @@
         <w:tc>
           <w:tcPr>
             <w:tcW w:w="1123" w:type="dxa"/>
+            <w:tcBorders>
+              <w:bottom w:val="single" w:sz="4" w:space="0" w:color="BFBFBF"/>
+            </w:tcBorders>
+            <w:tcMar>
+              <w:top w:w="70" w:type="dxa"/>
+              <w:left w:w="100" w:type="dxa"/>
+              <w:bottom w:w="70" w:type="dxa"/>
+              <w:right w:w="100" w:type="dxa"/>
+            </w:tcMar>
+            <w:vAlign w:val="top"/>
           </w:tcPr>
           <w:p>
             <w:pPr>
               <w:keepNext/>
+              <w:spacing w:line="240" w:lineRule="auto"/>
             </w:pPr>
             <w:r>
               <w:t>RNF02</w:t>
@@ -2401,10 +2875,21 @@
         <w:tc>
           <w:tcPr>
             <w:tcW w:w="2059" w:type="dxa"/>
+            <w:tcBorders>
+              <w:bottom w:val="single" w:sz="4" w:space="0" w:color="BFBFBF"/>
+            </w:tcBorders>
+            <w:tcMar>
+              <w:top w:w="70" w:type="dxa"/>
+              <w:left w:w="100" w:type="dxa"/>
+              <w:bottom w:w="70" w:type="dxa"/>
+              <w:right w:w="100" w:type="dxa"/>
+            </w:tcMar>
+            <w:vAlign w:val="top"/>
           </w:tcPr>
           <w:p>
             <w:pPr>
               <w:keepNext/>
+              <w:spacing w:line="240" w:lineRule="auto"/>
             </w:pPr>
             <w:r>
               <w:t>Rendimiento</w:t>
@@ -2414,10 +2899,21 @@
         <w:tc>
           <w:tcPr>
             <w:tcW w:w="6178" w:type="dxa"/>
+            <w:tcBorders>
+              <w:bottom w:val="single" w:sz="4" w:space="0" w:color="BFBFBF"/>
+            </w:tcBorders>
+            <w:tcMar>
+              <w:top w:w="70" w:type="dxa"/>
+              <w:left w:w="100" w:type="dxa"/>
+              <w:bottom w:w="70" w:type="dxa"/>
+              <w:right w:w="100" w:type="dxa"/>
+            </w:tcMar>
+            <w:vAlign w:val="top"/>
           </w:tcPr>
           <w:p>
             <w:pPr>
               <w:keepNext/>
+              <w:spacing w:line="240" w:lineRule="auto"/>
             </w:pPr>
             <w:r>
               <w:t xml:space="preserve">Respuesta &lt; 500 ms al </w:t>
@@ -2435,10 +2931,21 @@
         <w:tc>
           <w:tcPr>
             <w:tcW w:w="1123" w:type="dxa"/>
+            <w:tcBorders>
+              <w:bottom w:val="single" w:sz="4" w:space="0" w:color="BFBFBF"/>
+            </w:tcBorders>
+            <w:tcMar>
+              <w:top w:w="70" w:type="dxa"/>
+              <w:left w:w="100" w:type="dxa"/>
+              <w:bottom w:w="70" w:type="dxa"/>
+              <w:right w:w="100" w:type="dxa"/>
+            </w:tcMar>
+            <w:vAlign w:val="top"/>
           </w:tcPr>
           <w:p>
             <w:pPr>
               <w:keepNext/>
+              <w:spacing w:line="240" w:lineRule="auto"/>
             </w:pPr>
             <w:r>
               <w:t>RNF03</w:t>
@@ -2448,10 +2955,21 @@
         <w:tc>
           <w:tcPr>
             <w:tcW w:w="2059" w:type="dxa"/>
+            <w:tcBorders>
+              <w:bottom w:val="single" w:sz="4" w:space="0" w:color="BFBFBF"/>
+            </w:tcBorders>
+            <w:tcMar>
+              <w:top w:w="70" w:type="dxa"/>
+              <w:left w:w="100" w:type="dxa"/>
+              <w:bottom w:w="70" w:type="dxa"/>
+              <w:right w:w="100" w:type="dxa"/>
+            </w:tcMar>
+            <w:vAlign w:val="top"/>
           </w:tcPr>
           <w:p>
             <w:pPr>
               <w:keepNext/>
+              <w:spacing w:line="240" w:lineRule="auto"/>
             </w:pPr>
             <w:r>
               <w:t>Disponibilidad</w:t>
@@ -2461,10 +2979,21 @@
         <w:tc>
           <w:tcPr>
             <w:tcW w:w="6178" w:type="dxa"/>
+            <w:tcBorders>
+              <w:bottom w:val="single" w:sz="4" w:space="0" w:color="BFBFBF"/>
+            </w:tcBorders>
+            <w:tcMar>
+              <w:top w:w="70" w:type="dxa"/>
+              <w:left w:w="100" w:type="dxa"/>
+              <w:bottom w:w="70" w:type="dxa"/>
+              <w:right w:w="100" w:type="dxa"/>
+            </w:tcMar>
+            <w:vAlign w:val="top"/>
           </w:tcPr>
           <w:p>
             <w:pPr>
               <w:keepNext/>
+              <w:spacing w:line="240" w:lineRule="auto"/>
             </w:pPr>
             <w:r>
               <w:t>Con certificados caído, los demás servicios responden y el gateway contesta en &lt; 300 ms.</w:t>
@@ -2479,10 +3008,21 @@
         <w:tc>
           <w:tcPr>
             <w:tcW w:w="1123" w:type="dxa"/>
+            <w:tcBorders>
+              <w:bottom w:val="single" w:sz="4" w:space="0" w:color="BFBFBF"/>
+            </w:tcBorders>
+            <w:tcMar>
+              <w:top w:w="70" w:type="dxa"/>
+              <w:left w:w="100" w:type="dxa"/>
+              <w:bottom w:w="70" w:type="dxa"/>
+              <w:right w:w="100" w:type="dxa"/>
+            </w:tcMar>
+            <w:vAlign w:val="top"/>
           </w:tcPr>
           <w:p>
             <w:pPr>
               <w:keepNext/>
+              <w:spacing w:line="240" w:lineRule="auto"/>
             </w:pPr>
             <w:r>
               <w:t>RNF04</w:t>
@@ -2492,10 +3032,21 @@
         <w:tc>
           <w:tcPr>
             <w:tcW w:w="2059" w:type="dxa"/>
+            <w:tcBorders>
+              <w:bottom w:val="single" w:sz="4" w:space="0" w:color="BFBFBF"/>
+            </w:tcBorders>
+            <w:tcMar>
+              <w:top w:w="70" w:type="dxa"/>
+              <w:left w:w="100" w:type="dxa"/>
+              <w:bottom w:w="70" w:type="dxa"/>
+              <w:right w:w="100" w:type="dxa"/>
+            </w:tcMar>
+            <w:vAlign w:val="top"/>
           </w:tcPr>
           <w:p>
             <w:pPr>
               <w:keepNext/>
+              <w:spacing w:line="240" w:lineRule="auto"/>
             </w:pPr>
             <w:r>
               <w:t>Confiabilidad</w:t>
@@ -2505,16 +3056,27 @@
         <w:tc>
           <w:tcPr>
             <w:tcW w:w="6178" w:type="dxa"/>
+            <w:tcBorders>
+              <w:bottom w:val="single" w:sz="4" w:space="0" w:color="BFBFBF"/>
+            </w:tcBorders>
+            <w:tcMar>
+              <w:top w:w="70" w:type="dxa"/>
+              <w:left w:w="100" w:type="dxa"/>
+              <w:bottom w:w="70" w:type="dxa"/>
+              <w:right w:w="100" w:type="dxa"/>
+            </w:tcMar>
+            <w:vAlign w:val="top"/>
           </w:tcPr>
           <w:p>
             <w:pPr>
               <w:keepNext/>
+              <w:spacing w:line="240" w:lineRule="auto"/>
             </w:pPr>
             <w:r>
-              <w:t>Si Redis o un trabajador fallan, no se pierden certificados ni se dupl</w:t>
+              <w:t xml:space="preserve">Si Redis o un trabajador fallan, no se pierden </w:t>
             </w:r>
             <w:r>
-              <w:t>ican.</w:t>
+              <w:t>certificados ni se duplican.</w:t>
             </w:r>
           </w:p>
         </w:tc>
@@ -2526,10 +3088,21 @@
         <w:tc>
           <w:tcPr>
             <w:tcW w:w="1123" w:type="dxa"/>
+            <w:tcBorders>
+              <w:bottom w:val="single" w:sz="4" w:space="0" w:color="BFBFBF"/>
+            </w:tcBorders>
+            <w:tcMar>
+              <w:top w:w="70" w:type="dxa"/>
+              <w:left w:w="100" w:type="dxa"/>
+              <w:bottom w:w="70" w:type="dxa"/>
+              <w:right w:w="100" w:type="dxa"/>
+            </w:tcMar>
+            <w:vAlign w:val="top"/>
           </w:tcPr>
           <w:p>
             <w:pPr>
               <w:keepNext/>
+              <w:spacing w:line="240" w:lineRule="auto"/>
             </w:pPr>
             <w:r>
               <w:t>RNF05</w:t>
@@ -2539,10 +3112,21 @@
         <w:tc>
           <w:tcPr>
             <w:tcW w:w="2059" w:type="dxa"/>
+            <w:tcBorders>
+              <w:bottom w:val="single" w:sz="4" w:space="0" w:color="BFBFBF"/>
+            </w:tcBorders>
+            <w:tcMar>
+              <w:top w:w="70" w:type="dxa"/>
+              <w:left w:w="100" w:type="dxa"/>
+              <w:bottom w:w="70" w:type="dxa"/>
+              <w:right w:w="100" w:type="dxa"/>
+            </w:tcMar>
+            <w:vAlign w:val="top"/>
           </w:tcPr>
           <w:p>
             <w:pPr>
               <w:keepNext/>
+              <w:spacing w:line="240" w:lineRule="auto"/>
             </w:pPr>
             <w:r>
               <w:t>Seguridad</w:t>
@@ -2552,10 +3136,21 @@
         <w:tc>
           <w:tcPr>
             <w:tcW w:w="6178" w:type="dxa"/>
+            <w:tcBorders>
+              <w:bottom w:val="single" w:sz="4" w:space="0" w:color="BFBFBF"/>
+            </w:tcBorders>
+            <w:tcMar>
+              <w:top w:w="70" w:type="dxa"/>
+              <w:left w:w="100" w:type="dxa"/>
+              <w:bottom w:w="70" w:type="dxa"/>
+              <w:right w:w="100" w:type="dxa"/>
+            </w:tcMar>
+            <w:vAlign w:val="top"/>
           </w:tcPr>
           <w:p>
             <w:pPr>
               <w:keepNext/>
+              <w:spacing w:line="240" w:lineRule="auto"/>
             </w:pPr>
             <w:r>
               <w:t>Una empresa no lee datos de otra; los servicios internos no son accesibles desde fuera.</w:t>
@@ -2570,10 +3165,21 @@
         <w:tc>
           <w:tcPr>
             <w:tcW w:w="1123" w:type="dxa"/>
+            <w:tcBorders>
+              <w:bottom w:val="single" w:sz="4" w:space="0" w:color="BFBFBF"/>
+            </w:tcBorders>
+            <w:tcMar>
+              <w:top w:w="70" w:type="dxa"/>
+              <w:left w:w="100" w:type="dxa"/>
+              <w:bottom w:w="70" w:type="dxa"/>
+              <w:right w:w="100" w:type="dxa"/>
+            </w:tcMar>
+            <w:vAlign w:val="top"/>
           </w:tcPr>
           <w:p>
             <w:pPr>
               <w:keepNext/>
+              <w:spacing w:line="240" w:lineRule="auto"/>
             </w:pPr>
             <w:r>
               <w:t>RNF06</w:t>
@@ -2583,10 +3189,21 @@
         <w:tc>
           <w:tcPr>
             <w:tcW w:w="2059" w:type="dxa"/>
+            <w:tcBorders>
+              <w:bottom w:val="single" w:sz="4" w:space="0" w:color="BFBFBF"/>
+            </w:tcBorders>
+            <w:tcMar>
+              <w:top w:w="70" w:type="dxa"/>
+              <w:left w:w="100" w:type="dxa"/>
+              <w:bottom w:w="70" w:type="dxa"/>
+              <w:right w:w="100" w:type="dxa"/>
+            </w:tcMar>
+            <w:vAlign w:val="top"/>
           </w:tcPr>
           <w:p>
             <w:pPr>
               <w:keepNext/>
+              <w:spacing w:line="240" w:lineRule="auto"/>
             </w:pPr>
             <w:r>
               <w:t>Equidad</w:t>
@@ -2596,10 +3213,21 @@
         <w:tc>
           <w:tcPr>
             <w:tcW w:w="6178" w:type="dxa"/>
+            <w:tcBorders>
+              <w:bottom w:val="single" w:sz="4" w:space="0" w:color="BFBFBF"/>
+            </w:tcBorders>
+            <w:tcMar>
+              <w:top w:w="70" w:type="dxa"/>
+              <w:left w:w="100" w:type="dxa"/>
+              <w:bottom w:w="70" w:type="dxa"/>
+              <w:right w:w="100" w:type="dxa"/>
+            </w:tcMar>
+            <w:vAlign w:val="top"/>
           </w:tcPr>
           <w:p>
             <w:pPr>
               <w:keepNext/>
+              <w:spacing w:line="240" w:lineRule="auto"/>
             </w:pPr>
             <w:r>
               <w:t>Una empresa que supera 20 solicitudes por segundo recibe 429 sin afectar a las demás.</w:t>
@@ -2614,10 +3242,21 @@
         <w:tc>
           <w:tcPr>
             <w:tcW w:w="1123" w:type="dxa"/>
+            <w:tcBorders>
+              <w:bottom w:val="single" w:sz="4" w:space="0" w:color="BFBFBF"/>
+            </w:tcBorders>
+            <w:tcMar>
+              <w:top w:w="70" w:type="dxa"/>
+              <w:left w:w="100" w:type="dxa"/>
+              <w:bottom w:w="70" w:type="dxa"/>
+              <w:right w:w="100" w:type="dxa"/>
+            </w:tcMar>
+            <w:vAlign w:val="top"/>
           </w:tcPr>
           <w:p>
             <w:pPr>
               <w:keepNext/>
+              <w:spacing w:line="240" w:lineRule="auto"/>
             </w:pPr>
             <w:r>
               <w:t>RNF07</w:t>
@@ -2627,10 +3266,21 @@
         <w:tc>
           <w:tcPr>
             <w:tcW w:w="2059" w:type="dxa"/>
+            <w:tcBorders>
+              <w:bottom w:val="single" w:sz="4" w:space="0" w:color="BFBFBF"/>
+            </w:tcBorders>
+            <w:tcMar>
+              <w:top w:w="70" w:type="dxa"/>
+              <w:left w:w="100" w:type="dxa"/>
+              <w:bottom w:w="70" w:type="dxa"/>
+              <w:right w:w="100" w:type="dxa"/>
+            </w:tcMar>
+            <w:vAlign w:val="top"/>
           </w:tcPr>
           <w:p>
             <w:pPr>
               <w:keepNext/>
+              <w:spacing w:line="240" w:lineRule="auto"/>
             </w:pPr>
             <w:r>
               <w:t>Modificabilidad</w:t>
@@ -2640,16 +3290,24 @@
         <w:tc>
           <w:tcPr>
             <w:tcW w:w="6178" w:type="dxa"/>
+            <w:tcBorders>
+              <w:bottom w:val="single" w:sz="4" w:space="0" w:color="BFBFBF"/>
+            </w:tcBorders>
+            <w:tcMar>
+              <w:top w:w="70" w:type="dxa"/>
+              <w:left w:w="100" w:type="dxa"/>
+              <w:bottom w:w="70" w:type="dxa"/>
+              <w:right w:w="100" w:type="dxa"/>
+            </w:tcMar>
+            <w:vAlign w:val="top"/>
           </w:tcPr>
           <w:p>
             <w:pPr>
               <w:keepNext/>
+              <w:spacing w:line="240" w:lineRule="auto"/>
             </w:pPr>
             <w:r>
-              <w:t xml:space="preserve">Cambiar el envío de </w:t>
-            </w:r>
-            <w:r>
-              <w:t>avisos solo modifica el servicio de notificaciones.</w:t>
+              <w:t>Cambiar el envío de avisos solo modifica el servicio de notificaciones.</w:t>
             </w:r>
           </w:p>
         </w:tc>
@@ -2661,8 +3319,18 @@
         <w:tc>
           <w:tcPr>
             <w:tcW w:w="1123" w:type="dxa"/>
+            <w:tcMar>
+              <w:top w:w="70" w:type="dxa"/>
+              <w:left w:w="100" w:type="dxa"/>
+              <w:bottom w:w="70" w:type="dxa"/>
+              <w:right w:w="100" w:type="dxa"/>
+            </w:tcMar>
+            <w:vAlign w:val="top"/>
           </w:tcPr>
           <w:p>
+            <w:pPr>
+              <w:spacing w:line="240" w:lineRule="auto"/>
+            </w:pPr>
             <w:r>
               <w:t>RNF08</w:t>
             </w:r>
@@ -2671,8 +3339,18 @@
         <w:tc>
           <w:tcPr>
             <w:tcW w:w="2059" w:type="dxa"/>
+            <w:tcMar>
+              <w:top w:w="70" w:type="dxa"/>
+              <w:left w:w="100" w:type="dxa"/>
+              <w:bottom w:w="70" w:type="dxa"/>
+              <w:right w:w="100" w:type="dxa"/>
+            </w:tcMar>
+            <w:vAlign w:val="top"/>
           </w:tcPr>
           <w:p>
+            <w:pPr>
+              <w:spacing w:line="240" w:lineRule="auto"/>
+            </w:pPr>
             <w:r>
               <w:t>Costo</w:t>
             </w:r>
@@ -2681,8 +3359,18 @@
         <w:tc>
           <w:tcPr>
             <w:tcW w:w="6178" w:type="dxa"/>
+            <w:tcMar>
+              <w:top w:w="70" w:type="dxa"/>
+              <w:left w:w="100" w:type="dxa"/>
+              <w:bottom w:w="70" w:type="dxa"/>
+              <w:right w:w="100" w:type="dxa"/>
+            </w:tcMar>
+            <w:vAlign w:val="top"/>
           </w:tcPr>
           <w:p>
+            <w:pPr>
+              <w:spacing w:line="240" w:lineRule="auto"/>
+            </w:pPr>
             <w:r>
               <w:t>La infraestructura del piloto se mantiene en la capa gratuita del proveedor.</w:t>
             </w:r>
@@ -2705,16 +3393,21 @@
         <w:rPr>
           <w:sz w:val="20"/>
         </w:rPr>
-        <w:t>Elaboración propia con el formato de escenarios de calidad de Bass et al. (2012).</w:t>
+        <w:t xml:space="preserve">Elaboración propia con el formato de escenarios de calidad de Bass et </w:t>
+      </w:r>
+      <w:r>
+        <w:rPr>
+          <w:sz w:val="20"/>
+        </w:rPr>
+        <w:t>al. (2012).</w:t>
       </w:r>
     </w:p>
     <w:p>
       <w:pPr>
         <w:pStyle w:val="Ttulo1"/>
       </w:pPr>
-      <w:bookmarkStart w:id="5" w:name="_Toc243486152"/>
-      <w:r>
-        <w:lastRenderedPageBreak/>
+      <w:bookmarkStart w:id="5" w:name="_Toc243486829"/>
+      <w:r>
         <w:t>Arquitectura propuesta</w:t>
       </w:r>
       <w:bookmarkEnd w:id="5"/>
@@ -2723,12 +3416,9 @@
       <w:pPr>
         <w:pStyle w:val="Ttulo2"/>
       </w:pPr>
-      <w:bookmarkStart w:id="6" w:name="_Toc243486153"/>
-      <w:r>
-        <w:t>Es</w:t>
-      </w:r>
-      <w:r>
-        <w:t>tilo arquitectónico</w:t>
+      <w:bookmarkStart w:id="6" w:name="_Toc243486830"/>
+      <w:r>
+        <w:t>Estilo arquitectónico</w:t>
       </w:r>
       <w:bookmarkEnd w:id="6"/>
     </w:p>
@@ -2737,13 +3427,13 @@
         <w:pStyle w:val="parrafoApa"/>
       </w:pPr>
       <w:r>
-        <w:t xml:space="preserve">Se eligió una arquitectura de microservicios con comunicación híbrida: REST síncrono para lo que el usuario consulta de inmediato y eventos asíncronos para lo que puede ocurrir después, como emitir el certificado y avisar. Los </w:t>
-      </w:r>
-      <w:r>
-        <w:t>escenarios RNF01 y RNF03 exigen escalar y aislar fallos por partes; un monolito modular, aunque más sencillo, escala y falla como una sola unidad, que es precisamente el problema de CapacitaPro (Red Hat, 2023; Redwerk, 2025). La Figura 1 muestra la web, el</w:t>
-      </w:r>
-      <w:r>
-        <w:t xml:space="preserve"> API Gateway como única entrada y cuatro servicios con base de datos propia: identidad, cursos, certificados y notificaciones.</w:t>
+        <w:t>Se eligió una arquitectura de microservicios con comunicación híbrida: REST síncrono para lo que el usuario consulta de inmediato y eventos asíncronos para lo que puede ocurrir después, como emitir e</w:t>
+      </w:r>
+      <w:r>
+        <w:t>l certificado y avisar. Los escenarios RNF01 y RNF03 exigen escalar y aislar fallos por partes; un monolito modular, aunque más sencillo, escala y falla como una sola unidad, que es precisamente el problema de CapacitaPro (Red Hat, 2023; Redwerk, 2025). La</w:t>
+      </w:r>
+      <w:r>
+        <w:t xml:space="preserve"> Figura 1 muestra la web, el API Gateway como única entrada y cuatro servicios con base de datos propia: identidad, cursos, certificados y notificaciones.</w:t>
       </w:r>
     </w:p>
     <w:p>
@@ -2755,6 +3445,7 @@
         <w:rPr>
           <w:b/>
         </w:rPr>
+        <w:lastRenderedPageBreak/>
         <w:t>Figura 1</w:t>
       </w:r>
     </w:p>
@@ -2780,7 +3471,7 @@
           <w:noProof/>
         </w:rPr>
         <w:drawing>
-          <wp:inline distT="0" distB="0" distL="0" distR="0" wp14:anchorId="041EFE37" wp14:editId="340B2EC4">
+          <wp:inline distT="0" distB="0" distL="0" distR="0" wp14:anchorId="42112D8B" wp14:editId="280D0B3C">
             <wp:extent cx="4389120" cy="3149445"/>
             <wp:effectExtent l="0" t="0" r="0" b="0"/>
             <wp:docPr id="2" name="Picture 2"/>
@@ -2831,22 +3522,21 @@
         <w:rPr>
           <w:sz w:val="20"/>
         </w:rPr>
-        <w:t>Elaboración propia. Las flechas continuas son llamadas REST; las p</w:t>
+        <w:t>Elaboración propia. Las flechas contin</w:t>
       </w:r>
       <w:r>
         <w:rPr>
           <w:sz w:val="20"/>
         </w:rPr>
-        <w:t>unteadas, eventos en Redis Streams.</w:t>
+        <w:t>uas son llamadas REST; las punteadas, eventos en Redis Streams.</w:t>
       </w:r>
     </w:p>
     <w:p>
       <w:pPr>
         <w:pStyle w:val="Ttulo2"/>
       </w:pPr>
-      <w:bookmarkStart w:id="7" w:name="_Toc243486154"/>
-      <w:r>
-        <w:lastRenderedPageBreak/>
+      <w:bookmarkStart w:id="7" w:name="_Toc243486831"/>
+      <w:r>
         <w:t>Relación con los principios de la unidad</w:t>
       </w:r>
       <w:bookmarkEnd w:id="7"/>
@@ -2874,7 +3564,10 @@
         <w:t>bajo acoplamiento</w:t>
       </w:r>
       <w:r>
-        <w:t xml:space="preserve"> porque los servicios no se llaman entre sí: cursos publica </w:t>
+        <w:t xml:space="preserve"> porque los servicios no se llaman entre sí: cursos pu</w:t>
+      </w:r>
+      <w:r>
+        <w:t xml:space="preserve">blica </w:t>
       </w:r>
       <w:r>
         <w:rPr>
@@ -2884,10 +3577,7 @@
         <w:t>curso.completado</w:t>
       </w:r>
       <w:r>
-        <w:t xml:space="preserve"> sin s</w:t>
-      </w:r>
-      <w:r>
-        <w:t xml:space="preserve">aber quién lo consume, de modo que agregar facturación no exige modificarlo. Y se respeta el </w:t>
+        <w:t xml:space="preserve"> sin saber quién lo consume, de modo que agregar facturación no exige modificarlo. Y se respeta el </w:t>
       </w:r>
       <w:r>
         <w:rPr>
@@ -2896,19 +3586,22 @@
         <w:t>ocultamiento de información</w:t>
       </w:r>
       <w:r>
-        <w:t xml:space="preserve"> de Parnas (1972): la base de cada servicio es un detalle interno, por lo que trasladar los PDF a un almacenamiento de objetos no afecta</w:t>
-      </w:r>
-      <w:r>
-        <w:t>ría a otro módulo. Como compromisos se aceptaron la consistencia eventual del certificado, una sola instancia de PostgreSQL con cuatro bases separadas y Redis Streams en lugar de un bróker dedicado.</w:t>
+        <w:t xml:space="preserve"> de Parnas (1972): la base de cada servicio es un detalle interno, por lo que trasladar los PDF a un almacen</w:t>
+      </w:r>
+      <w:r>
+        <w:t>amiento de objetos no afectaría a otro módulo. Como compromisos se aceptaron la consistencia eventual del certificado, una sola instancia de PostgreSQL con cuatro bases separadas y Redis Streams en lugar de un bróker dedicado.</w:t>
       </w:r>
     </w:p>
     <w:p>
       <w:pPr>
         <w:pStyle w:val="Ttulo1"/>
       </w:pPr>
-      <w:bookmarkStart w:id="8" w:name="_Toc243486155"/>
-      <w:r>
-        <w:t>Diseño de la arquitectura mediante UML</w:t>
+      <w:bookmarkStart w:id="8" w:name="_Toc243486832"/>
+      <w:r>
+        <w:t>Diseño de la arquitectura med</w:t>
+      </w:r>
+      <w:r>
+        <w:t>iante UML</w:t>
       </w:r>
       <w:bookmarkEnd w:id="8"/>
     </w:p>
@@ -2917,10 +3610,7 @@
         <w:pStyle w:val="parrafoApa"/>
       </w:pPr>
       <w:r>
-        <w:t>Los diagramas se e</w:t>
-      </w:r>
-      <w:r>
-        <w:t xml:space="preserve">laboraron en PlantUML con la especificación UML 2.5.1 (Object Management Group, 2017); su código fuente está en la carpeta </w:t>
+        <w:t xml:space="preserve">Los diagramas se elaboraron en PlantUML con la especificación UML 2.5.1 (Object Management Group, 2017); su código fuente está en la carpeta </w:t>
       </w:r>
       <w:r>
         <w:rPr>
@@ -2937,7 +3627,7 @@
       <w:pPr>
         <w:pStyle w:val="Ttulo2"/>
       </w:pPr>
-      <w:bookmarkStart w:id="9" w:name="_Toc243486156"/>
+      <w:bookmarkStart w:id="9" w:name="_Toc243486833"/>
       <w:r>
         <w:lastRenderedPageBreak/>
         <w:t>Diagrama de casos de uso</w:t>
@@ -2978,7 +3668,7 @@
           <w:noProof/>
         </w:rPr>
         <w:drawing>
-          <wp:inline distT="0" distB="0" distL="0" distR="0" wp14:anchorId="2C0DE42E" wp14:editId="2BF77D6C">
+          <wp:inline distT="0" distB="0" distL="0" distR="0" wp14:anchorId="1774B931" wp14:editId="73F14FB5">
             <wp:extent cx="5224812" cy="4206240"/>
             <wp:effectExtent l="0" t="0" r="0" b="0"/>
             <wp:docPr id="3" name="Picture 3"/>
@@ -3037,20 +3727,17 @@
         <w:pStyle w:val="parrafoApa"/>
       </w:pPr>
       <w:r>
-        <w:t>Particip</w:t>
-      </w:r>
-      <w:r>
-        <w:t>an el estudiante, el administrador de la empresa, un verificador externo sin cuenta y el sistema. «Completar curso» incluye «Emitir certificado», que a su vez incluye «Recibir avisos». Es relevante porque la emisión la dispara un evento y no una persona, l</w:t>
-      </w:r>
-      <w:r>
-        <w:t>o que la señala como asíncrona, y porque el verificador obliga a una ruta pública controlada en el gateway.</w:t>
+        <w:t>Participan el estudiante, el administrador de la empresa, un verificador externo sin cuenta y el sistema. «Completar curso» incluye «Emitir certificado», que a su vez incluye «Recibir avisos». Es relevante porque la emisión la dis</w:t>
+      </w:r>
+      <w:r>
+        <w:t>para un evento y no una persona, lo que la señala como asíncrona, y porque el verificador obliga a una ruta pública controlada en el gateway.</w:t>
       </w:r>
     </w:p>
     <w:p>
       <w:pPr>
         <w:pStyle w:val="Ttulo2"/>
       </w:pPr>
-      <w:bookmarkStart w:id="10" w:name="_Toc243486157"/>
+      <w:bookmarkStart w:id="10" w:name="_Toc243486834"/>
       <w:r>
         <w:lastRenderedPageBreak/>
         <w:t>Diagrama de clases</w:t>
@@ -3091,7 +3778,7 @@
           <w:noProof/>
         </w:rPr>
         <w:drawing>
-          <wp:inline distT="0" distB="0" distL="0" distR="0" wp14:anchorId="5093615D" wp14:editId="410B116A">
+          <wp:inline distT="0" distB="0" distL="0" distR="0" wp14:anchorId="0B8BDAD4" wp14:editId="0F56A51A">
             <wp:extent cx="4865321" cy="4389119"/>
             <wp:effectExtent l="0" t="0" r="0" b="0"/>
             <wp:docPr id="4" name="Picture 4"/>
@@ -3142,7 +3829,13 @@
         <w:rPr>
           <w:sz w:val="20"/>
         </w:rPr>
-        <w:t>Elaboración propia. Cada paquete corresponde a un servicio y a su base de datos.</w:t>
+        <w:t xml:space="preserve">Elaboración propia. Cada paquete corresponde a </w:t>
+      </w:r>
+      <w:r>
+        <w:rPr>
+          <w:sz w:val="20"/>
+        </w:rPr>
+        <w:t>un servicio y a su base de datos.</w:t>
       </w:r>
     </w:p>
     <w:p>
@@ -3160,17 +3853,17 @@
         <w:t>RepositorioCursos</w:t>
       </w:r>
       <w:r>
-        <w:t xml:space="preserve"> impone el filtro por empresa, y las restricciones únicas de certificado y notificación evi</w:t>
-      </w:r>
-      <w:r>
-        <w:t>tan duplicados cuando un evento llega dos veces.</w:t>
+        <w:t xml:space="preserve"> impone el filtro por empresa, y las restricciones únicas</w:t>
+      </w:r>
+      <w:r>
+        <w:t xml:space="preserve"> de certificado y notificación evitan duplicados cuando un evento llega dos veces.</w:t>
       </w:r>
     </w:p>
     <w:p>
       <w:pPr>
         <w:pStyle w:val="Ttulo2"/>
       </w:pPr>
-      <w:bookmarkStart w:id="11" w:name="_Toc243486158"/>
+      <w:bookmarkStart w:id="11" w:name="_Toc243486835"/>
       <w:r>
         <w:lastRenderedPageBreak/>
         <w:t>Diagrama de secuencia</w:t>
@@ -3211,7 +3904,7 @@
           <w:noProof/>
         </w:rPr>
         <w:drawing>
-          <wp:inline distT="0" distB="0" distL="0" distR="0" wp14:anchorId="60A7E72C" wp14:editId="245C70C2">
+          <wp:inline distT="0" distB="0" distL="0" distR="0" wp14:anchorId="0A087EC3" wp14:editId="02F3A7AE">
             <wp:extent cx="5943600" cy="3956013"/>
             <wp:effectExtent l="0" t="0" r="0" b="0"/>
             <wp:docPr id="5" name="Picture 5"/>
@@ -3300,7 +3993,7 @@
       <w:pPr>
         <w:pStyle w:val="Ttulo2"/>
       </w:pPr>
-      <w:bookmarkStart w:id="12" w:name="_Toc243486159"/>
+      <w:bookmarkStart w:id="12" w:name="_Toc243486836"/>
       <w:r>
         <w:lastRenderedPageBreak/>
         <w:t>Diagrama de despliegue</w:t>
@@ -3341,7 +4034,7 @@
           <w:noProof/>
         </w:rPr>
         <w:drawing>
-          <wp:inline distT="0" distB="0" distL="0" distR="0" wp14:anchorId="095E79ED" wp14:editId="08783C76">
+          <wp:inline distT="0" distB="0" distL="0" distR="0" wp14:anchorId="58747176" wp14:editId="06319F01">
             <wp:extent cx="5120640" cy="4265231"/>
             <wp:effectExtent l="0" t="0" r="0" b="0"/>
             <wp:docPr id="6" name="Picture 6"/>
@@ -3416,7 +4109,7 @@
       <w:pPr>
         <w:pStyle w:val="Ttulo1"/>
       </w:pPr>
-      <w:bookmarkStart w:id="13" w:name="_Toc243486160"/>
+      <w:bookmarkStart w:id="13" w:name="_Toc243486837"/>
       <w:r>
         <w:t>Selección y justificación de patrones de diseño</w:t>
       </w:r>
@@ -3457,13 +4150,7 @@
         <w:rPr>
           <w:i/>
         </w:rPr>
-        <w:t>Pat</w:t>
-      </w:r>
-      <w:r>
-        <w:rPr>
-          <w:i/>
-        </w:rPr>
-        <w:t>rones de diseño seleccionados</w:t>
+        <w:t>Patrones de diseño seleccionados</w:t>
       </w:r>
     </w:p>
     <w:tbl>
@@ -3487,10 +4174,18 @@
         <w:tc>
           <w:tcPr>
             <w:tcW w:w="2808" w:type="dxa"/>
+            <w:tcMar>
+              <w:top w:w="70" w:type="dxa"/>
+              <w:left w:w="100" w:type="dxa"/>
+              <w:bottom w:w="70" w:type="dxa"/>
+              <w:right w:w="100" w:type="dxa"/>
+            </w:tcMar>
+            <w:vAlign w:val="top"/>
           </w:tcPr>
           <w:p>
             <w:pPr>
               <w:keepNext/>
+              <w:spacing w:line="240" w:lineRule="auto"/>
             </w:pPr>
             <w:r>
               <w:rPr>
@@ -3503,10 +4198,18 @@
         <w:tc>
           <w:tcPr>
             <w:tcW w:w="5616" w:type="dxa"/>
+            <w:tcMar>
+              <w:top w:w="70" w:type="dxa"/>
+              <w:left w:w="100" w:type="dxa"/>
+              <w:bottom w:w="70" w:type="dxa"/>
+              <w:right w:w="100" w:type="dxa"/>
+            </w:tcMar>
+            <w:vAlign w:val="top"/>
           </w:tcPr>
           <w:p>
             <w:pPr>
               <w:keepNext/>
+              <w:spacing w:line="240" w:lineRule="auto"/>
             </w:pPr>
             <w:r>
               <w:rPr>
@@ -3519,10 +4222,18 @@
         <w:tc>
           <w:tcPr>
             <w:tcW w:w="936" w:type="dxa"/>
+            <w:tcMar>
+              <w:top w:w="70" w:type="dxa"/>
+              <w:left w:w="100" w:type="dxa"/>
+              <w:bottom w:w="70" w:type="dxa"/>
+              <w:right w:w="100" w:type="dxa"/>
+            </w:tcMar>
+            <w:vAlign w:val="top"/>
           </w:tcPr>
           <w:p>
             <w:pPr>
               <w:keepNext/>
+              <w:spacing w:line="240" w:lineRule="auto"/>
             </w:pPr>
             <w:r>
               <w:rPr>
@@ -3540,10 +4251,21 @@
         <w:tc>
           <w:tcPr>
             <w:tcW w:w="2808" w:type="dxa"/>
+            <w:tcBorders>
+              <w:bottom w:val="single" w:sz="4" w:space="0" w:color="BFBFBF"/>
+            </w:tcBorders>
+            <w:tcMar>
+              <w:top w:w="70" w:type="dxa"/>
+              <w:left w:w="100" w:type="dxa"/>
+              <w:bottom w:w="70" w:type="dxa"/>
+              <w:right w:w="100" w:type="dxa"/>
+            </w:tcMar>
+            <w:vAlign w:val="top"/>
           </w:tcPr>
           <w:p>
             <w:pPr>
               <w:keepNext/>
+              <w:spacing w:line="240" w:lineRule="auto"/>
             </w:pPr>
             <w:r>
               <w:t>API Gateway</w:t>
@@ -3553,10 +4275,21 @@
         <w:tc>
           <w:tcPr>
             <w:tcW w:w="5616" w:type="dxa"/>
+            <w:tcBorders>
+              <w:bottom w:val="single" w:sz="4" w:space="0" w:color="BFBFBF"/>
+            </w:tcBorders>
+            <w:tcMar>
+              <w:top w:w="70" w:type="dxa"/>
+              <w:left w:w="100" w:type="dxa"/>
+              <w:bottom w:w="70" w:type="dxa"/>
+              <w:right w:w="100" w:type="dxa"/>
+            </w:tcMar>
+            <w:vAlign w:val="top"/>
           </w:tcPr>
           <w:p>
             <w:pPr>
               <w:keepNext/>
+              <w:spacing w:line="240" w:lineRule="auto"/>
             </w:pPr>
             <w:r>
               <w:t>Única entrada; valida el token y reenvía la identidad del usuario.</w:t>
@@ -3566,10 +4299,21 @@
         <w:tc>
           <w:tcPr>
             <w:tcW w:w="936" w:type="dxa"/>
+            <w:tcBorders>
+              <w:bottom w:val="single" w:sz="4" w:space="0" w:color="BFBFBF"/>
+            </w:tcBorders>
+            <w:tcMar>
+              <w:top w:w="70" w:type="dxa"/>
+              <w:left w:w="100" w:type="dxa"/>
+              <w:bottom w:w="70" w:type="dxa"/>
+              <w:right w:w="100" w:type="dxa"/>
+            </w:tcMar>
+            <w:vAlign w:val="top"/>
           </w:tcPr>
           <w:p>
             <w:pPr>
               <w:keepNext/>
+              <w:spacing w:line="240" w:lineRule="auto"/>
             </w:pPr>
             <w:r>
               <w:t>05</w:t>
@@ -3584,10 +4328,21 @@
         <w:tc>
           <w:tcPr>
             <w:tcW w:w="2808" w:type="dxa"/>
+            <w:tcBorders>
+              <w:bottom w:val="single" w:sz="4" w:space="0" w:color="BFBFBF"/>
+            </w:tcBorders>
+            <w:tcMar>
+              <w:top w:w="70" w:type="dxa"/>
+              <w:left w:w="100" w:type="dxa"/>
+              <w:bottom w:w="70" w:type="dxa"/>
+              <w:right w:w="100" w:type="dxa"/>
+            </w:tcMar>
+            <w:vAlign w:val="top"/>
           </w:tcPr>
           <w:p>
             <w:pPr>
               <w:keepNext/>
+              <w:spacing w:line="240" w:lineRule="auto"/>
             </w:pPr>
             <w:r>
               <w:t>Database per Service</w:t>
@@ -3597,10 +4352,21 @@
         <w:tc>
           <w:tcPr>
             <w:tcW w:w="5616" w:type="dxa"/>
+            <w:tcBorders>
+              <w:bottom w:val="single" w:sz="4" w:space="0" w:color="BFBFBF"/>
+            </w:tcBorders>
+            <w:tcMar>
+              <w:top w:w="70" w:type="dxa"/>
+              <w:left w:w="100" w:type="dxa"/>
+              <w:bottom w:w="70" w:type="dxa"/>
+              <w:right w:w="100" w:type="dxa"/>
+            </w:tcMar>
+            <w:vAlign w:val="top"/>
           </w:tcPr>
           <w:p>
             <w:pPr>
               <w:keepNext/>
+              <w:spacing w:line="240" w:lineRule="auto"/>
             </w:pPr>
             <w:r>
               <w:t>Una base y un usuario por servicio.</w:t>
@@ -3610,10 +4376,21 @@
         <w:tc>
           <w:tcPr>
             <w:tcW w:w="936" w:type="dxa"/>
+            <w:tcBorders>
+              <w:bottom w:val="single" w:sz="4" w:space="0" w:color="BFBFBF"/>
+            </w:tcBorders>
+            <w:tcMar>
+              <w:top w:w="70" w:type="dxa"/>
+              <w:left w:w="100" w:type="dxa"/>
+              <w:bottom w:w="70" w:type="dxa"/>
+              <w:right w:w="100" w:type="dxa"/>
+            </w:tcMar>
+            <w:vAlign w:val="top"/>
           </w:tcPr>
           <w:p>
             <w:pPr>
               <w:keepNext/>
+              <w:spacing w:line="240" w:lineRule="auto"/>
             </w:pPr>
             <w:r>
               <w:t>07</w:t>
@@ -3628,10 +4405,21 @@
         <w:tc>
           <w:tcPr>
             <w:tcW w:w="2808" w:type="dxa"/>
+            <w:tcBorders>
+              <w:bottom w:val="single" w:sz="4" w:space="0" w:color="BFBFBF"/>
+            </w:tcBorders>
+            <w:tcMar>
+              <w:top w:w="70" w:type="dxa"/>
+              <w:left w:w="100" w:type="dxa"/>
+              <w:bottom w:w="70" w:type="dxa"/>
+              <w:right w:w="100" w:type="dxa"/>
+            </w:tcMar>
+            <w:vAlign w:val="top"/>
           </w:tcPr>
           <w:p>
             <w:pPr>
               <w:keepNext/>
+              <w:spacing w:line="240" w:lineRule="auto"/>
             </w:pPr>
             <w:r>
               <w:t>Publisher/Subscriber</w:t>
@@ -3641,26 +4429,48 @@
         <w:tc>
           <w:tcPr>
             <w:tcW w:w="5616" w:type="dxa"/>
+            <w:tcBorders>
+              <w:bottom w:val="single" w:sz="4" w:space="0" w:color="BFBFBF"/>
+            </w:tcBorders>
+            <w:tcMar>
+              <w:top w:w="70" w:type="dxa"/>
+              <w:left w:w="100" w:type="dxa"/>
+              <w:bottom w:w="70" w:type="dxa"/>
+              <w:right w:w="100" w:type="dxa"/>
+            </w:tcMar>
+            <w:vAlign w:val="top"/>
           </w:tcPr>
           <w:p>
             <w:pPr>
               <w:keepNext/>
+              <w:spacing w:line="240" w:lineRule="auto"/>
             </w:pPr>
             <w:r>
-              <w:t xml:space="preserve">Un flujo de Redis por </w:t>
+              <w:t xml:space="preserve">Un flujo de Redis </w:t>
             </w:r>
             <w:r>
-              <w:t>publicador y un grupo por suscriptor.</w:t>
+              <w:t>por publicador y un grupo por suscriptor.</w:t>
             </w:r>
           </w:p>
         </w:tc>
         <w:tc>
           <w:tcPr>
             <w:tcW w:w="936" w:type="dxa"/>
+            <w:tcBorders>
+              <w:bottom w:val="single" w:sz="4" w:space="0" w:color="BFBFBF"/>
+            </w:tcBorders>
+            <w:tcMar>
+              <w:top w:w="70" w:type="dxa"/>
+              <w:left w:w="100" w:type="dxa"/>
+              <w:bottom w:w="70" w:type="dxa"/>
+              <w:right w:w="100" w:type="dxa"/>
+            </w:tcMar>
+            <w:vAlign w:val="top"/>
           </w:tcPr>
           <w:p>
             <w:pPr>
               <w:keepNext/>
+              <w:spacing w:line="240" w:lineRule="auto"/>
             </w:pPr>
             <w:r>
               <w:t>07</w:t>
@@ -3675,10 +4485,21 @@
         <w:tc>
           <w:tcPr>
             <w:tcW w:w="2808" w:type="dxa"/>
+            <w:tcBorders>
+              <w:bottom w:val="single" w:sz="4" w:space="0" w:color="BFBFBF"/>
+            </w:tcBorders>
+            <w:tcMar>
+              <w:top w:w="70" w:type="dxa"/>
+              <w:left w:w="100" w:type="dxa"/>
+              <w:bottom w:w="70" w:type="dxa"/>
+              <w:right w:w="100" w:type="dxa"/>
+            </w:tcMar>
+            <w:vAlign w:val="top"/>
           </w:tcPr>
           <w:p>
             <w:pPr>
               <w:keepNext/>
+              <w:spacing w:line="240" w:lineRule="auto"/>
             </w:pPr>
             <w:r>
               <w:t>Transactional Outbox</w:t>
@@ -3688,10 +4509,21 @@
         <w:tc>
           <w:tcPr>
             <w:tcW w:w="5616" w:type="dxa"/>
+            <w:tcBorders>
+              <w:bottom w:val="single" w:sz="4" w:space="0" w:color="BFBFBF"/>
+            </w:tcBorders>
+            <w:tcMar>
+              <w:top w:w="70" w:type="dxa"/>
+              <w:left w:w="100" w:type="dxa"/>
+              <w:bottom w:w="70" w:type="dxa"/>
+              <w:right w:w="100" w:type="dxa"/>
+            </w:tcMar>
+            <w:vAlign w:val="top"/>
           </w:tcPr>
           <w:p>
             <w:pPr>
               <w:keepNext/>
+              <w:spacing w:line="240" w:lineRule="auto"/>
             </w:pPr>
             <w:r>
               <w:t>El evento se guarda con el cambio y se publica después.</w:t>
@@ -3701,10 +4533,21 @@
         <w:tc>
           <w:tcPr>
             <w:tcW w:w="936" w:type="dxa"/>
+            <w:tcBorders>
+              <w:bottom w:val="single" w:sz="4" w:space="0" w:color="BFBFBF"/>
+            </w:tcBorders>
+            <w:tcMar>
+              <w:top w:w="70" w:type="dxa"/>
+              <w:left w:w="100" w:type="dxa"/>
+              <w:bottom w:w="70" w:type="dxa"/>
+              <w:right w:w="100" w:type="dxa"/>
+            </w:tcMar>
+            <w:vAlign w:val="top"/>
           </w:tcPr>
           <w:p>
             <w:pPr>
               <w:keepNext/>
+              <w:spacing w:line="240" w:lineRule="auto"/>
             </w:pPr>
             <w:r>
               <w:t>04</w:t>
@@ -3719,10 +4562,21 @@
         <w:tc>
           <w:tcPr>
             <w:tcW w:w="2808" w:type="dxa"/>
+            <w:tcBorders>
+              <w:bottom w:val="single" w:sz="4" w:space="0" w:color="BFBFBF"/>
+            </w:tcBorders>
+            <w:tcMar>
+              <w:top w:w="70" w:type="dxa"/>
+              <w:left w:w="100" w:type="dxa"/>
+              <w:bottom w:w="70" w:type="dxa"/>
+              <w:right w:w="100" w:type="dxa"/>
+            </w:tcMar>
+            <w:vAlign w:val="top"/>
           </w:tcPr>
           <w:p>
             <w:pPr>
               <w:keepNext/>
+              <w:spacing w:line="240" w:lineRule="auto"/>
             </w:pPr>
             <w:r>
               <w:t>Queue-Based Load Leveling</w:t>
@@ -3732,10 +4586,21 @@
         <w:tc>
           <w:tcPr>
             <w:tcW w:w="5616" w:type="dxa"/>
+            <w:tcBorders>
+              <w:bottom w:val="single" w:sz="4" w:space="0" w:color="BFBFBF"/>
+            </w:tcBorders>
+            <w:tcMar>
+              <w:top w:w="70" w:type="dxa"/>
+              <w:left w:w="100" w:type="dxa"/>
+              <w:bottom w:w="70" w:type="dxa"/>
+              <w:right w:w="100" w:type="dxa"/>
+            </w:tcMar>
+            <w:vAlign w:val="top"/>
           </w:tcPr>
           <w:p>
             <w:pPr>
               <w:keepNext/>
+              <w:spacing w:line="240" w:lineRule="auto"/>
             </w:pPr>
             <w:r>
               <w:t>La campaña responde 202; la cola absorbe el pico.</w:t>
@@ -3745,10 +4610,21 @@
         <w:tc>
           <w:tcPr>
             <w:tcW w:w="936" w:type="dxa"/>
+            <w:tcBorders>
+              <w:bottom w:val="single" w:sz="4" w:space="0" w:color="BFBFBF"/>
+            </w:tcBorders>
+            <w:tcMar>
+              <w:top w:w="70" w:type="dxa"/>
+              <w:left w:w="100" w:type="dxa"/>
+              <w:bottom w:w="70" w:type="dxa"/>
+              <w:right w:w="100" w:type="dxa"/>
+            </w:tcMar>
+            <w:vAlign w:val="top"/>
           </w:tcPr>
           <w:p>
             <w:pPr>
               <w:keepNext/>
+              <w:spacing w:line="240" w:lineRule="auto"/>
             </w:pPr>
             <w:r>
               <w:t>01</w:t>
@@ -3763,10 +4639,21 @@
         <w:tc>
           <w:tcPr>
             <w:tcW w:w="2808" w:type="dxa"/>
+            <w:tcBorders>
+              <w:bottom w:val="single" w:sz="4" w:space="0" w:color="BFBFBF"/>
+            </w:tcBorders>
+            <w:tcMar>
+              <w:top w:w="70" w:type="dxa"/>
+              <w:left w:w="100" w:type="dxa"/>
+              <w:bottom w:w="70" w:type="dxa"/>
+              <w:right w:w="100" w:type="dxa"/>
+            </w:tcMar>
+            <w:vAlign w:val="top"/>
           </w:tcPr>
           <w:p>
             <w:pPr>
               <w:keepNext/>
+              <w:spacing w:line="240" w:lineRule="auto"/>
             </w:pPr>
             <w:r>
               <w:t>Competing Consumers</w:t>
@@ -3776,26 +4663,48 @@
         <w:tc>
           <w:tcPr>
             <w:tcW w:w="5616" w:type="dxa"/>
+            <w:tcBorders>
+              <w:bottom w:val="single" w:sz="4" w:space="0" w:color="BFBFBF"/>
+            </w:tcBorders>
+            <w:tcMar>
+              <w:top w:w="70" w:type="dxa"/>
+              <w:left w:w="100" w:type="dxa"/>
+              <w:bottom w:w="70" w:type="dxa"/>
+              <w:right w:w="100" w:type="dxa"/>
+            </w:tcMar>
+            <w:vAlign w:val="top"/>
           </w:tcPr>
           <w:p>
             <w:pPr>
               <w:keepNext/>
+              <w:spacing w:line="240" w:lineRule="auto"/>
             </w:pPr>
             <w:r>
-              <w:t>Varias réplicas comparten la cola</w:t>
+              <w:t xml:space="preserve">Varias réplicas comparten la </w:t>
             </w:r>
             <w:r>
-              <w:t xml:space="preserve"> de certificados.</w:t>
+              <w:t>cola de certificados.</w:t>
             </w:r>
           </w:p>
         </w:tc>
         <w:tc>
           <w:tcPr>
             <w:tcW w:w="936" w:type="dxa"/>
+            <w:tcBorders>
+              <w:bottom w:val="single" w:sz="4" w:space="0" w:color="BFBFBF"/>
+            </w:tcBorders>
+            <w:tcMar>
+              <w:top w:w="70" w:type="dxa"/>
+              <w:left w:w="100" w:type="dxa"/>
+              <w:bottom w:w="70" w:type="dxa"/>
+              <w:right w:w="100" w:type="dxa"/>
+            </w:tcMar>
+            <w:vAlign w:val="top"/>
           </w:tcPr>
           <w:p>
             <w:pPr>
               <w:keepNext/>
+              <w:spacing w:line="240" w:lineRule="auto"/>
             </w:pPr>
             <w:r>
               <w:t>01</w:t>
@@ -3810,10 +4719,21 @@
         <w:tc>
           <w:tcPr>
             <w:tcW w:w="2808" w:type="dxa"/>
+            <w:tcBorders>
+              <w:bottom w:val="single" w:sz="4" w:space="0" w:color="BFBFBF"/>
+            </w:tcBorders>
+            <w:tcMar>
+              <w:top w:w="70" w:type="dxa"/>
+              <w:left w:w="100" w:type="dxa"/>
+              <w:bottom w:w="70" w:type="dxa"/>
+              <w:right w:w="100" w:type="dxa"/>
+            </w:tcMar>
+            <w:vAlign w:val="top"/>
           </w:tcPr>
           <w:p>
             <w:pPr>
               <w:keepNext/>
+              <w:spacing w:line="240" w:lineRule="auto"/>
             </w:pPr>
             <w:r>
               <w:t>Circuit Breaker</w:t>
@@ -3823,10 +4743,21 @@
         <w:tc>
           <w:tcPr>
             <w:tcW w:w="5616" w:type="dxa"/>
+            <w:tcBorders>
+              <w:bottom w:val="single" w:sz="4" w:space="0" w:color="BFBFBF"/>
+            </w:tcBorders>
+            <w:tcMar>
+              <w:top w:w="70" w:type="dxa"/>
+              <w:left w:w="100" w:type="dxa"/>
+              <w:bottom w:w="70" w:type="dxa"/>
+              <w:right w:w="100" w:type="dxa"/>
+            </w:tcMar>
+            <w:vAlign w:val="top"/>
           </w:tcPr>
           <w:p>
             <w:pPr>
               <w:keepNext/>
+              <w:spacing w:line="240" w:lineRule="auto"/>
             </w:pPr>
             <w:r>
               <w:t>Tras tres fallos el circuito se abre 15 s y responde de inmediato.</w:t>
@@ -3836,10 +4767,21 @@
         <w:tc>
           <w:tcPr>
             <w:tcW w:w="936" w:type="dxa"/>
+            <w:tcBorders>
+              <w:bottom w:val="single" w:sz="4" w:space="0" w:color="BFBFBF"/>
+            </w:tcBorders>
+            <w:tcMar>
+              <w:top w:w="70" w:type="dxa"/>
+              <w:left w:w="100" w:type="dxa"/>
+              <w:bottom w:w="70" w:type="dxa"/>
+              <w:right w:w="100" w:type="dxa"/>
+            </w:tcMar>
+            <w:vAlign w:val="top"/>
           </w:tcPr>
           <w:p>
             <w:pPr>
               <w:keepNext/>
+              <w:spacing w:line="240" w:lineRule="auto"/>
             </w:pPr>
             <w:r>
               <w:t>03</w:t>
@@ -3854,10 +4796,21 @@
         <w:tc>
           <w:tcPr>
             <w:tcW w:w="2808" w:type="dxa"/>
+            <w:tcBorders>
+              <w:bottom w:val="single" w:sz="4" w:space="0" w:color="BFBFBF"/>
+            </w:tcBorders>
+            <w:tcMar>
+              <w:top w:w="70" w:type="dxa"/>
+              <w:left w:w="100" w:type="dxa"/>
+              <w:bottom w:w="70" w:type="dxa"/>
+              <w:right w:w="100" w:type="dxa"/>
+            </w:tcMar>
+            <w:vAlign w:val="top"/>
           </w:tcPr>
           <w:p>
             <w:pPr>
               <w:keepNext/>
+              <w:spacing w:line="240" w:lineRule="auto"/>
             </w:pPr>
             <w:r>
               <w:t>Rate Limiting</w:t>
@@ -3867,10 +4820,21 @@
         <w:tc>
           <w:tcPr>
             <w:tcW w:w="5616" w:type="dxa"/>
+            <w:tcBorders>
+              <w:bottom w:val="single" w:sz="4" w:space="0" w:color="BFBFBF"/>
+            </w:tcBorders>
+            <w:tcMar>
+              <w:top w:w="70" w:type="dxa"/>
+              <w:left w:w="100" w:type="dxa"/>
+              <w:bottom w:w="70" w:type="dxa"/>
+              <w:right w:w="100" w:type="dxa"/>
+            </w:tcMar>
+            <w:vAlign w:val="top"/>
           </w:tcPr>
           <w:p>
             <w:pPr>
               <w:keepNext/>
+              <w:spacing w:line="240" w:lineRule="auto"/>
             </w:pPr>
             <w:r>
               <w:t>20 solicitudes por segundo por empresa.</w:t>
@@ -3880,10 +4844,21 @@
         <w:tc>
           <w:tcPr>
             <w:tcW w:w="936" w:type="dxa"/>
+            <w:tcBorders>
+              <w:bottom w:val="single" w:sz="4" w:space="0" w:color="BFBFBF"/>
+            </w:tcBorders>
+            <w:tcMar>
+              <w:top w:w="70" w:type="dxa"/>
+              <w:left w:w="100" w:type="dxa"/>
+              <w:bottom w:w="70" w:type="dxa"/>
+              <w:right w:w="100" w:type="dxa"/>
+            </w:tcMar>
+            <w:vAlign w:val="top"/>
           </w:tcPr>
           <w:p>
             <w:pPr>
               <w:keepNext/>
+              <w:spacing w:line="240" w:lineRule="auto"/>
             </w:pPr>
             <w:r>
               <w:t>06</w:t>
@@ -3898,8 +4873,18 @@
         <w:tc>
           <w:tcPr>
             <w:tcW w:w="2808" w:type="dxa"/>
+            <w:tcMar>
+              <w:top w:w="70" w:type="dxa"/>
+              <w:left w:w="100" w:type="dxa"/>
+              <w:bottom w:w="70" w:type="dxa"/>
+              <w:right w:w="100" w:type="dxa"/>
+            </w:tcMar>
+            <w:vAlign w:val="top"/>
           </w:tcPr>
           <w:p>
+            <w:pPr>
+              <w:spacing w:line="240" w:lineRule="auto"/>
+            </w:pPr>
             <w:r>
               <w:t>Repository</w:t>
             </w:r>
@@ -3908,8 +4893,18 @@
         <w:tc>
           <w:tcPr>
             <w:tcW w:w="5616" w:type="dxa"/>
+            <w:tcMar>
+              <w:top w:w="70" w:type="dxa"/>
+              <w:left w:w="100" w:type="dxa"/>
+              <w:bottom w:w="70" w:type="dxa"/>
+              <w:right w:w="100" w:type="dxa"/>
+            </w:tcMar>
+            <w:vAlign w:val="top"/>
           </w:tcPr>
           <w:p>
+            <w:pPr>
+              <w:spacing w:line="240" w:lineRule="auto"/>
+            </w:pPr>
             <w:r>
               <w:t>Filtro por empresa en un solo lugar (Fowler, 2002).</w:t>
             </w:r>
@@ -3918,8 +4913,18 @@
         <w:tc>
           <w:tcPr>
             <w:tcW w:w="936" w:type="dxa"/>
+            <w:tcMar>
+              <w:top w:w="70" w:type="dxa"/>
+              <w:left w:w="100" w:type="dxa"/>
+              <w:bottom w:w="70" w:type="dxa"/>
+              <w:right w:w="100" w:type="dxa"/>
+            </w:tcMar>
+            <w:vAlign w:val="top"/>
           </w:tcPr>
           <w:p>
+            <w:pPr>
+              <w:spacing w:line="240" w:lineRule="auto"/>
+            </w:pPr>
             <w:r>
               <w:t>05</w:t>
             </w:r>
@@ -3950,24 +4955,20 @@
         <w:pStyle w:val="parrafoApa"/>
       </w:pPr>
       <w:r>
-        <w:t xml:space="preserve">Circuit Breaker responde al correo que bloqueaba la finalización del curso: convierte un fallo lento en uno rápido antes de que agote las conexiones del llamador </w:t>
-      </w:r>
-      <w:r>
-        <w:t xml:space="preserve">(Nygard, 2018). La bandeja de salida resuelve que guardar y publicar no pueden ser atómicos, y la idempotencia de los consumidores cubre la entrega «al menos una vez» (Richardson, 2018). Se descartaron Saga, </w:t>
-      </w:r>
-      <w:r>
-        <w:lastRenderedPageBreak/>
-        <w:t>porque ningún flujo exige deshacer pasos en vari</w:t>
-      </w:r>
-      <w:r>
-        <w:t>os servicios, y un service mesh, que excede los nodos de 1 OCPU.</w:t>
+        <w:t xml:space="preserve">Circuit Breaker responde al correo que bloqueaba la finalización del curso: convierte un fallo lento en uno rápido antes de que agote las conexiones del </w:t>
+      </w:r>
+      <w:r>
+        <w:t>llamador (Nygard, 2018). La bandeja de salida resuelve que guardar y publicar no pueden ser atómicos, y la idempotencia de los consumidores cubre la entrega «al menos una vez» (Richardson, 2018). Se descartaron Saga, porque ningún flujo exige deshacer paso</w:t>
+      </w:r>
+      <w:r>
+        <w:t>s en varios servicios, y un service mesh, que excede los nodos de 1 OCPU.</w:t>
       </w:r>
     </w:p>
     <w:p>
       <w:pPr>
         <w:pStyle w:val="Ttulo1"/>
       </w:pPr>
-      <w:bookmarkStart w:id="14" w:name="_Toc243486161"/>
+      <w:bookmarkStart w:id="14" w:name="_Toc243486838"/>
       <w:r>
         <w:t>Prototipo funcional en la nube</w:t>
       </w:r>
@@ -3978,10 +4979,14 @@
         <w:pStyle w:val="parrafoApa"/>
       </w:pPr>
       <w:r>
-        <w:t>Los servicios están escritos en Python con FastAPI; la interfaz se sirve con nginx; los datos residen en PostgreSQL 16 y los eventos en Redis 7.4. El sistema co</w:t>
-      </w:r>
-      <w:r>
-        <w:t>rre en local con Docker Compose y en la nube con cinco manifiestos de Kubernetes. Las 28 pruebas automatizadas pasan en x86 y en arm64, y una prueba de humo recorre el flujo completo contra el despliegue.</w:t>
+        <w:t>Los servicios están escritos en Python con FastAPI; la interfaz se sirve con nginx; los datos residen en PostgreSQL 16 y los eventos en Redis 7.4. El s</w:t>
+      </w:r>
+      <w:r>
+        <w:t xml:space="preserve">istema corre en local con Docker </w:t>
+      </w:r>
+      <w:r>
+        <w:lastRenderedPageBreak/>
+        <w:t>Compose y en la nube con cinco manifiestos de Kubernetes. Las 28 pruebas automatizadas pasan en x86 y en arm64, y una prueba de humo recorre el flujo completo contra el despliegue.</w:t>
       </w:r>
     </w:p>
     <w:p>
@@ -3989,13 +4994,13 @@
         <w:pStyle w:val="parrafoApa"/>
       </w:pPr>
       <w:r>
-        <w:t>En una campaña de 200 participantes el servicio res</w:t>
-      </w:r>
-      <w:r>
-        <w:t>pondió en menos de 300 ms y dos réplicas vaciaron la cola a unos 6,5 certificados por segundo (Figura 6). Con certificados apagado, el gateway respondió en unos 110 ms con el circuito abierto mientras los cursos seguían funcionando (Figura 7), y un curso c</w:t>
-      </w:r>
-      <w:r>
-        <w:t>ompletado durante la caída recibió su certificado nueve segundos después de recuperar el servicio.</w:t>
+        <w:t>En una campaña de 200 participantes el ser</w:t>
+      </w:r>
+      <w:r>
+        <w:t>vicio respondió en menos de 300 ms y dos réplicas vaciaron la cola a unos 6,5 certificados por segundo (Figura 6). Con certificados apagado, el gateway respondió en unos 110 ms con el circuito abierto mientras los cursos seguían funcionando (Figura 7), y u</w:t>
+      </w:r>
+      <w:r>
+        <w:t>n curso completado durante la caída recibió su certificado nueve segundos después de recuperar el servicio.</w:t>
       </w:r>
     </w:p>
     <w:p>
@@ -4007,7 +5012,6 @@
         <w:rPr>
           <w:b/>
         </w:rPr>
-        <w:lastRenderedPageBreak/>
         <w:t>Figura 6</w:t>
       </w:r>
     </w:p>
@@ -4033,7 +5037,7 @@
           <w:noProof/>
         </w:rPr>
         <w:drawing>
-          <wp:inline distT="0" distB="0" distL="0" distR="0" wp14:anchorId="07B439A9" wp14:editId="2814C41D">
+          <wp:inline distT="0" distB="0" distL="0" distR="0" wp14:anchorId="38AD9965" wp14:editId="76E27BB9">
             <wp:extent cx="5120640" cy="3073883"/>
             <wp:effectExtent l="0" t="0" r="0" b="0"/>
             <wp:docPr id="7" name="Picture 7"/>
@@ -4084,13 +5088,13 @@
         <w:rPr>
           <w:sz w:val="20"/>
         </w:rPr>
-        <w:t xml:space="preserve">Captura del 21 de octubre de 2026 en el despliegue de Oracle Cloud </w:t>
+        <w:t>Captura del 21 de octubre de 2026 en el despliegue de Oracle Cloud I</w:t>
       </w:r>
       <w:r>
         <w:rPr>
           <w:sz w:val="20"/>
         </w:rPr>
-        <w:t>Infrastructure.</w:t>
+        <w:t>nfrastructure.</w:t>
       </w:r>
     </w:p>
     <w:p>
@@ -4102,6 +5106,7 @@
         <w:rPr>
           <w:b/>
         </w:rPr>
+        <w:lastRenderedPageBreak/>
         <w:t>Figura 7</w:t>
       </w:r>
     </w:p>
@@ -4127,7 +5132,7 @@
           <w:noProof/>
         </w:rPr>
         <w:drawing>
-          <wp:inline distT="0" distB="0" distL="0" distR="0" wp14:anchorId="3FB45D75" wp14:editId="057231F1">
+          <wp:inline distT="0" distB="0" distL="0" distR="0" wp14:anchorId="69B165B6" wp14:editId="5597DA8C">
             <wp:extent cx="5120640" cy="3073883"/>
             <wp:effectExtent l="0" t="0" r="0" b="0"/>
             <wp:docPr id="8" name="Picture 8"/>
@@ -4190,7 +5195,6 @@
         <w:rPr>
           <w:b/>
         </w:rPr>
-        <w:lastRenderedPageBreak/>
         <w:t>Tabla 5</w:t>
       </w:r>
     </w:p>
@@ -4226,10 +5230,18 @@
         <w:tc>
           <w:tcPr>
             <w:tcW w:w="1310" w:type="dxa"/>
+            <w:tcMar>
+              <w:top w:w="70" w:type="dxa"/>
+              <w:left w:w="100" w:type="dxa"/>
+              <w:bottom w:w="70" w:type="dxa"/>
+              <w:right w:w="100" w:type="dxa"/>
+            </w:tcMar>
+            <w:vAlign w:val="top"/>
           </w:tcPr>
           <w:p>
             <w:pPr>
               <w:keepNext/>
+              <w:spacing w:line="240" w:lineRule="auto"/>
             </w:pPr>
             <w:r>
               <w:rPr>
@@ -4242,10 +5254,18 @@
         <w:tc>
           <w:tcPr>
             <w:tcW w:w="3744" w:type="dxa"/>
+            <w:tcMar>
+              <w:top w:w="70" w:type="dxa"/>
+              <w:left w:w="100" w:type="dxa"/>
+              <w:bottom w:w="70" w:type="dxa"/>
+              <w:right w:w="100" w:type="dxa"/>
+            </w:tcMar>
+            <w:vAlign w:val="top"/>
           </w:tcPr>
           <w:p>
             <w:pPr>
               <w:keepNext/>
+              <w:spacing w:line="240" w:lineRule="auto"/>
             </w:pPr>
             <w:r>
               <w:rPr>
@@ -4258,10 +5278,18 @@
         <w:tc>
           <w:tcPr>
             <w:tcW w:w="4306" w:type="dxa"/>
+            <w:tcMar>
+              <w:top w:w="70" w:type="dxa"/>
+              <w:left w:w="100" w:type="dxa"/>
+              <w:bottom w:w="70" w:type="dxa"/>
+              <w:right w:w="100" w:type="dxa"/>
+            </w:tcMar>
+            <w:vAlign w:val="top"/>
           </w:tcPr>
           <w:p>
             <w:pPr>
               <w:keepNext/>
+              <w:spacing w:line="240" w:lineRule="auto"/>
             </w:pPr>
             <w:r>
               <w:rPr>
@@ -4279,10 +5307,21 @@
         <w:tc>
           <w:tcPr>
             <w:tcW w:w="1310" w:type="dxa"/>
+            <w:tcBorders>
+              <w:bottom w:val="single" w:sz="4" w:space="0" w:color="BFBFBF"/>
+            </w:tcBorders>
+            <w:tcMar>
+              <w:top w:w="70" w:type="dxa"/>
+              <w:left w:w="100" w:type="dxa"/>
+              <w:bottom w:w="70" w:type="dxa"/>
+              <w:right w:w="100" w:type="dxa"/>
+            </w:tcMar>
+            <w:vAlign w:val="top"/>
           </w:tcPr>
           <w:p>
             <w:pPr>
               <w:keepNext/>
+              <w:spacing w:line="240" w:lineRule="auto"/>
             </w:pPr>
             <w:r>
               <w:t>RNF01</w:t>
@@ -4292,10 +5331,21 @@
         <w:tc>
           <w:tcPr>
             <w:tcW w:w="3744" w:type="dxa"/>
+            <w:tcBorders>
+              <w:bottom w:val="single" w:sz="4" w:space="0" w:color="BFBFBF"/>
+            </w:tcBorders>
+            <w:tcMar>
+              <w:top w:w="70" w:type="dxa"/>
+              <w:left w:w="100" w:type="dxa"/>
+              <w:bottom w:w="70" w:type="dxa"/>
+              <w:right w:w="100" w:type="dxa"/>
+            </w:tcMar>
+            <w:vAlign w:val="top"/>
           </w:tcPr>
           <w:p>
             <w:pPr>
               <w:keepNext/>
+              <w:spacing w:line="240" w:lineRule="auto"/>
             </w:pPr>
             <w:r>
               <w:t>Campaña masiva &lt; 1 s</w:t>
@@ -4305,10 +5355,21 @@
         <w:tc>
           <w:tcPr>
             <w:tcW w:w="4306" w:type="dxa"/>
+            <w:tcBorders>
+              <w:bottom w:val="single" w:sz="4" w:space="0" w:color="BFBFBF"/>
+            </w:tcBorders>
+            <w:tcMar>
+              <w:top w:w="70" w:type="dxa"/>
+              <w:left w:w="100" w:type="dxa"/>
+              <w:bottom w:w="70" w:type="dxa"/>
+              <w:right w:w="100" w:type="dxa"/>
+            </w:tcMar>
+            <w:vAlign w:val="top"/>
           </w:tcPr>
           <w:p>
             <w:pPr>
               <w:keepNext/>
+              <w:spacing w:line="240" w:lineRule="auto"/>
             </w:pPr>
             <w:r>
               <w:t>195–300 ms; 200 certificados sin fallos</w:t>
@@ -4323,10 +5384,21 @@
         <w:tc>
           <w:tcPr>
             <w:tcW w:w="1310" w:type="dxa"/>
+            <w:tcBorders>
+              <w:bottom w:val="single" w:sz="4" w:space="0" w:color="BFBFBF"/>
+            </w:tcBorders>
+            <w:tcMar>
+              <w:top w:w="70" w:type="dxa"/>
+              <w:left w:w="100" w:type="dxa"/>
+              <w:bottom w:w="70" w:type="dxa"/>
+              <w:right w:w="100" w:type="dxa"/>
+            </w:tcMar>
+            <w:vAlign w:val="top"/>
           </w:tcPr>
           <w:p>
             <w:pPr>
               <w:keepNext/>
+              <w:spacing w:line="240" w:lineRule="auto"/>
             </w:pPr>
             <w:r>
               <w:t>RNF02</w:t>
@@ -4336,10 +5408,21 @@
         <w:tc>
           <w:tcPr>
             <w:tcW w:w="3744" w:type="dxa"/>
+            <w:tcBorders>
+              <w:bottom w:val="single" w:sz="4" w:space="0" w:color="BFBFBF"/>
+            </w:tcBorders>
+            <w:tcMar>
+              <w:top w:w="70" w:type="dxa"/>
+              <w:left w:w="100" w:type="dxa"/>
+              <w:bottom w:w="70" w:type="dxa"/>
+              <w:right w:w="100" w:type="dxa"/>
+            </w:tcMar>
+            <w:vAlign w:val="top"/>
           </w:tcPr>
           <w:p>
             <w:pPr>
               <w:keepNext/>
+              <w:spacing w:line="240" w:lineRule="auto"/>
             </w:pPr>
             <w:r>
               <w:t>Respuesta &lt; 500 ms</w:t>
@@ -4349,10 +5432,21 @@
         <w:tc>
           <w:tcPr>
             <w:tcW w:w="4306" w:type="dxa"/>
+            <w:tcBorders>
+              <w:bottom w:val="single" w:sz="4" w:space="0" w:color="BFBFBF"/>
+            </w:tcBorders>
+            <w:tcMar>
+              <w:top w:w="70" w:type="dxa"/>
+              <w:left w:w="100" w:type="dxa"/>
+              <w:bottom w:w="70" w:type="dxa"/>
+              <w:right w:w="100" w:type="dxa"/>
+            </w:tcMar>
+            <w:vAlign w:val="top"/>
           </w:tcPr>
           <w:p>
             <w:pPr>
               <w:keepNext/>
+              <w:spacing w:line="240" w:lineRule="auto"/>
             </w:pPr>
             <w:r>
               <w:t>Unos 150 ms; certificado en 1–2 s</w:t>
@@ -4367,10 +5461,21 @@
         <w:tc>
           <w:tcPr>
             <w:tcW w:w="1310" w:type="dxa"/>
+            <w:tcBorders>
+              <w:bottom w:val="single" w:sz="4" w:space="0" w:color="BFBFBF"/>
+            </w:tcBorders>
+            <w:tcMar>
+              <w:top w:w="70" w:type="dxa"/>
+              <w:left w:w="100" w:type="dxa"/>
+              <w:bottom w:w="70" w:type="dxa"/>
+              <w:right w:w="100" w:type="dxa"/>
+            </w:tcMar>
+            <w:vAlign w:val="top"/>
           </w:tcPr>
           <w:p>
             <w:pPr>
               <w:keepNext/>
+              <w:spacing w:line="240" w:lineRule="auto"/>
             </w:pPr>
             <w:r>
               <w:t>RNF03</w:t>
@@ -4380,10 +5485,21 @@
         <w:tc>
           <w:tcPr>
             <w:tcW w:w="3744" w:type="dxa"/>
+            <w:tcBorders>
+              <w:bottom w:val="single" w:sz="4" w:space="0" w:color="BFBFBF"/>
+            </w:tcBorders>
+            <w:tcMar>
+              <w:top w:w="70" w:type="dxa"/>
+              <w:left w:w="100" w:type="dxa"/>
+              <w:bottom w:w="70" w:type="dxa"/>
+              <w:right w:w="100" w:type="dxa"/>
+            </w:tcMar>
+            <w:vAlign w:val="top"/>
           </w:tcPr>
           <w:p>
             <w:pPr>
               <w:keepNext/>
+              <w:spacing w:line="240" w:lineRule="auto"/>
             </w:pPr>
             <w:r>
               <w:t>&lt; 300 ms con un servicio caído</w:t>
@@ -4393,10 +5509,21 @@
         <w:tc>
           <w:tcPr>
             <w:tcW w:w="4306" w:type="dxa"/>
+            <w:tcBorders>
+              <w:bottom w:val="single" w:sz="4" w:space="0" w:color="BFBFBF"/>
+            </w:tcBorders>
+            <w:tcMar>
+              <w:top w:w="70" w:type="dxa"/>
+              <w:left w:w="100" w:type="dxa"/>
+              <w:bottom w:w="70" w:type="dxa"/>
+              <w:right w:w="100" w:type="dxa"/>
+            </w:tcMar>
+            <w:vAlign w:val="top"/>
           </w:tcPr>
           <w:p>
             <w:pPr>
               <w:keepNext/>
+              <w:spacing w:line="240" w:lineRule="auto"/>
             </w:pPr>
             <w:r>
               <w:t>110–150 ms con el circuito abierto</w:t>
@@ -4411,10 +5538,21 @@
         <w:tc>
           <w:tcPr>
             <w:tcW w:w="1310" w:type="dxa"/>
+            <w:tcBorders>
+              <w:bottom w:val="single" w:sz="4" w:space="0" w:color="BFBFBF"/>
+            </w:tcBorders>
+            <w:tcMar>
+              <w:top w:w="70" w:type="dxa"/>
+              <w:left w:w="100" w:type="dxa"/>
+              <w:bottom w:w="70" w:type="dxa"/>
+              <w:right w:w="100" w:type="dxa"/>
+            </w:tcMar>
+            <w:vAlign w:val="top"/>
           </w:tcPr>
           <w:p>
             <w:pPr>
               <w:keepNext/>
+              <w:spacing w:line="240" w:lineRule="auto"/>
             </w:pPr>
             <w:r>
               <w:t>RNF04</w:t>
@@ -4424,10 +5562,21 @@
         <w:tc>
           <w:tcPr>
             <w:tcW w:w="3744" w:type="dxa"/>
+            <w:tcBorders>
+              <w:bottom w:val="single" w:sz="4" w:space="0" w:color="BFBFBF"/>
+            </w:tcBorders>
+            <w:tcMar>
+              <w:top w:w="70" w:type="dxa"/>
+              <w:left w:w="100" w:type="dxa"/>
+              <w:bottom w:w="70" w:type="dxa"/>
+              <w:right w:w="100" w:type="dxa"/>
+            </w:tcMar>
+            <w:vAlign w:val="top"/>
           </w:tcPr>
           <w:p>
             <w:pPr>
               <w:keepNext/>
+              <w:spacing w:line="240" w:lineRule="auto"/>
             </w:pPr>
             <w:r>
               <w:t>Ningún certificado perdido</w:t>
@@ -4437,10 +5586,21 @@
         <w:tc>
           <w:tcPr>
             <w:tcW w:w="4306" w:type="dxa"/>
+            <w:tcBorders>
+              <w:bottom w:val="single" w:sz="4" w:space="0" w:color="BFBFBF"/>
+            </w:tcBorders>
+            <w:tcMar>
+              <w:top w:w="70" w:type="dxa"/>
+              <w:left w:w="100" w:type="dxa"/>
+              <w:bottom w:w="70" w:type="dxa"/>
+              <w:right w:w="100" w:type="dxa"/>
+            </w:tcMar>
+            <w:vAlign w:val="top"/>
           </w:tcPr>
           <w:p>
             <w:pPr>
               <w:keepNext/>
+              <w:spacing w:line="240" w:lineRule="auto"/>
             </w:pPr>
             <w:r>
               <w:t xml:space="preserve">Evento </w:t>
@@ -4458,8 +5618,18 @@
         <w:tc>
           <w:tcPr>
             <w:tcW w:w="1310" w:type="dxa"/>
+            <w:tcMar>
+              <w:top w:w="70" w:type="dxa"/>
+              <w:left w:w="100" w:type="dxa"/>
+              <w:bottom w:w="70" w:type="dxa"/>
+              <w:right w:w="100" w:type="dxa"/>
+            </w:tcMar>
+            <w:vAlign w:val="top"/>
           </w:tcPr>
           <w:p>
+            <w:pPr>
+              <w:spacing w:line="240" w:lineRule="auto"/>
+            </w:pPr>
             <w:r>
               <w:t>RNF08</w:t>
             </w:r>
@@ -4468,8 +5638,18 @@
         <w:tc>
           <w:tcPr>
             <w:tcW w:w="3744" w:type="dxa"/>
+            <w:tcMar>
+              <w:top w:w="70" w:type="dxa"/>
+              <w:left w:w="100" w:type="dxa"/>
+              <w:bottom w:w="70" w:type="dxa"/>
+              <w:right w:w="100" w:type="dxa"/>
+            </w:tcMar>
+            <w:vAlign w:val="top"/>
           </w:tcPr>
           <w:p>
+            <w:pPr>
+              <w:spacing w:line="240" w:lineRule="auto"/>
+            </w:pPr>
             <w:r>
               <w:t>Capa gratuita</w:t>
             </w:r>
@@ -4478,8 +5658,18 @@
         <w:tc>
           <w:tcPr>
             <w:tcW w:w="4306" w:type="dxa"/>
+            <w:tcMar>
+              <w:top w:w="70" w:type="dxa"/>
+              <w:left w:w="100" w:type="dxa"/>
+              <w:bottom w:w="70" w:type="dxa"/>
+              <w:right w:w="100" w:type="dxa"/>
+            </w:tcMar>
+            <w:vAlign w:val="top"/>
           </w:tcPr>
           <w:p>
+            <w:pPr>
+              <w:spacing w:line="240" w:lineRule="auto"/>
+            </w:pPr>
             <w:r>
               <w:t>Dos nodos de 1 OCPU dentro de Always Free</w:t>
             </w:r>
@@ -4509,7 +5699,7 @@
       <w:pPr>
         <w:pStyle w:val="Ttulo1"/>
       </w:pPr>
-      <w:bookmarkStart w:id="15" w:name="_Toc243486162"/>
+      <w:bookmarkStart w:id="15" w:name="_Toc243486839"/>
       <w:r>
         <w:t>Conclusiones</w:t>
       </w:r>
@@ -4520,10 +5710,10 @@
         <w:pStyle w:val="parrafoApa"/>
       </w:pPr>
       <w:r>
-        <w:t xml:space="preserve">Los problemas de CapacitaPro eran de arquitectura y no de código: al </w:t>
-      </w:r>
-      <w:r>
-        <w:t>cambiar la estructura, los síntomas desaparecieron sin optimizar la lógica de negocio, lo que confirma que las decisiones estructurales tempranas determinan la calidad del sistema (Bass et al., 2012).</w:t>
+        <w:t xml:space="preserve">Los problemas de CapacitaPro eran de arquitectura y no de </w:t>
+      </w:r>
+      <w:r>
+        <w:t>código: al cambiar la estructura, los síntomas desaparecieron sin optimizar la lógica de negocio, lo que confirma que las decisiones estructurales tempranas determinan la calidad del sistema (Bass et al., 2012).</w:t>
       </w:r>
     </w:p>
     <w:p>
@@ -4531,6 +5721,7 @@
         <w:pStyle w:val="parrafoApa"/>
       </w:pPr>
       <w:r>
+        <w:lastRenderedPageBreak/>
         <w:t xml:space="preserve">Expresar los requisitos no funcionales como </w:t>
       </w:r>
       <w:r>
@@ -4545,7 +5736,7 @@
         <w:pStyle w:val="Ttulo1"/>
         <w:pageBreakBefore/>
       </w:pPr>
-      <w:bookmarkStart w:id="16" w:name="_Toc243486163"/>
+      <w:bookmarkStart w:id="16" w:name="_Toc243486840"/>
       <w:r>
         <w:lastRenderedPageBreak/>
         <w:t>Referencias</w:t>

</xml_diff>

<commit_message>
Corrige referencias y citas del informe tras verificar las fuentes
- Blas et al. (2019) es un artículo de RISTI n.º 35 con DOI, no unas actas.
- El artículo de Redwerk es de Kinashchuk (2020), no de 2025.
- Fechas exactas de Microsoft y Red Hat.
- La definición de arquitectura se atribuye a IEEE 1471 / ISO 42010 vía la guía.
- Ajusta lo atribuido a Blas et al. y a Fowler a lo que dicen las fuentes.
- Las URL con guiones bajos ya no se convierten en cursiva.

Co-Authored-By: Claude Opus 5.5 <noreply@anthropic.com>
</commit_message>
<xml_diff>
--- a/docs/informe/Informe-AulaNube.docx
+++ b/docs/informe/Informe-AulaNube.docx
@@ -12,7 +12,7 @@
           <w:noProof/>
         </w:rPr>
         <w:drawing>
-          <wp:inline distT="0" distB="0" distL="0" distR="0" wp14:anchorId="03A2F76F" wp14:editId="1DFB0590">
+          <wp:inline distT="0" distB="0" distL="0" distR="0" wp14:anchorId="6E61DE26" wp14:editId="3B943C95">
             <wp:extent cx="3143250" cy="857250"/>
             <wp:effectExtent l="0" t="0" r="0" b="0"/>
             <wp:docPr id="1" name="Picture 1"/>
@@ -148,7 +148,7 @@
         <w:pStyle w:val="Ttulo1"/>
         <w:pageBreakBefore/>
       </w:pPr>
-      <w:bookmarkStart w:id="0" w:name="_Toc243486824"/>
+      <w:bookmarkStart w:id="0" w:name="_Toc243492201"/>
       <w:r>
         <w:lastRenderedPageBreak/>
         <w:t>Resumen</w:t>
@@ -183,7 +183,7 @@
         <w:pStyle w:val="Ttulo1"/>
         <w:pageBreakBefore/>
       </w:pPr>
-      <w:bookmarkStart w:id="1" w:name="_Toc243486825"/>
+      <w:bookmarkStart w:id="1" w:name="_Toc243492202"/>
       <w:r>
         <w:lastRenderedPageBreak/>
         <w:t>Tabla de contenido</w:t>
@@ -212,7 +212,7 @@
       <w:r>
         <w:fldChar w:fldCharType="separate"/>
       </w:r>
-      <w:hyperlink w:anchor="_Toc243486824" w:history="1">
+      <w:hyperlink w:anchor="_Toc243492201" w:history="1">
         <w:r>
           <w:rPr>
             <w:rStyle w:val="Hipervnculo"/>
@@ -240,7 +240,7 @@
             <w:noProof/>
             <w:webHidden/>
           </w:rPr>
-          <w:instrText xml:space="preserve"> PAGEREF _Toc243486824 \h </w:instrText>
+          <w:instrText xml:space="preserve"> PAGEREF _Toc243492201 \h </w:instrText>
         </w:r>
         <w:r>
           <w:rPr>
@@ -284,7 +284,7 @@
           <w:lang w:val="es-CO" w:eastAsia="es-CO"/>
         </w:rPr>
       </w:pPr>
-      <w:hyperlink w:anchor="_Toc243486825" w:history="1">
+      <w:hyperlink w:anchor="_Toc243492202" w:history="1">
         <w:r>
           <w:rPr>
             <w:rStyle w:val="Hipervnculo"/>
@@ -312,7 +312,7 @@
             <w:noProof/>
             <w:webHidden/>
           </w:rPr>
-          <w:instrText xml:space="preserve"> PAGEREF _Toc243486825 \h </w:instrText>
+          <w:instrText xml:space="preserve"> PAGEREF _Toc243492202 \h </w:instrText>
         </w:r>
         <w:r>
           <w:rPr>
@@ -356,7 +356,7 @@
           <w:lang w:val="es-CO" w:eastAsia="es-CO"/>
         </w:rPr>
       </w:pPr>
-      <w:hyperlink w:anchor="_Toc243486826" w:history="1">
+      <w:hyperlink w:anchor="_Toc243492203" w:history="1">
         <w:r>
           <w:rPr>
             <w:rStyle w:val="Hipervnculo"/>
@@ -384,7 +384,7 @@
             <w:noProof/>
             <w:webHidden/>
           </w:rPr>
-          <w:instrText xml:space="preserve"> PAGEREF _Toc243486826 \h </w:instrText>
+          <w:instrText xml:space="preserve"> PAGEREF _Toc243492203 \h </w:instrText>
         </w:r>
         <w:r>
           <w:rPr>
@@ -428,7 +428,7 @@
           <w:lang w:val="es-CO" w:eastAsia="es-CO"/>
         </w:rPr>
       </w:pPr>
-      <w:hyperlink w:anchor="_Toc243486827" w:history="1">
+      <w:hyperlink w:anchor="_Toc243492204" w:history="1">
         <w:r>
           <w:rPr>
             <w:rStyle w:val="Hipervnculo"/>
@@ -456,7 +456,7 @@
             <w:noProof/>
             <w:webHidden/>
           </w:rPr>
-          <w:instrText xml:space="preserve"> PAGEREF _Toc243486827 \h </w:instrText>
+          <w:instrText xml:space="preserve"> PAGEREF _Toc243492204 \h </w:instrText>
         </w:r>
         <w:r>
           <w:rPr>
@@ -500,7 +500,7 @@
           <w:lang w:val="es-CO" w:eastAsia="es-CO"/>
         </w:rPr>
       </w:pPr>
-      <w:hyperlink w:anchor="_Toc243486828" w:history="1">
+      <w:hyperlink w:anchor="_Toc243492205" w:history="1">
         <w:r>
           <w:rPr>
             <w:rStyle w:val="Hipervnculo"/>
@@ -528,7 +528,7 @@
             <w:noProof/>
             <w:webHidden/>
           </w:rPr>
-          <w:instrText xml:space="preserve"> PAGEREF _Toc243486828 \h </w:instrText>
+          <w:instrText xml:space="preserve"> PAGEREF _Toc243492205 \h </w:instrText>
         </w:r>
         <w:r>
           <w:rPr>
@@ -572,7 +572,7 @@
           <w:lang w:val="es-CO" w:eastAsia="es-CO"/>
         </w:rPr>
       </w:pPr>
-      <w:hyperlink w:anchor="_Toc243486829" w:history="1">
+      <w:hyperlink w:anchor="_Toc243492206" w:history="1">
         <w:r>
           <w:rPr>
             <w:rStyle w:val="Hipervnculo"/>
@@ -600,7 +600,7 @@
             <w:noProof/>
             <w:webHidden/>
           </w:rPr>
-          <w:instrText xml:space="preserve"> PAGEREF _Toc243486829 \h </w:instrText>
+          <w:instrText xml:space="preserve"> PAGEREF _Toc243492206 \h </w:instrText>
         </w:r>
         <w:r>
           <w:rPr>
@@ -644,7 +644,7 @@
           <w:lang w:val="es-CO" w:eastAsia="es-CO"/>
         </w:rPr>
       </w:pPr>
-      <w:hyperlink w:anchor="_Toc243486830" w:history="1">
+      <w:hyperlink w:anchor="_Toc243492207" w:history="1">
         <w:r>
           <w:rPr>
             <w:rStyle w:val="Hipervnculo"/>
@@ -672,7 +672,7 @@
             <w:noProof/>
             <w:webHidden/>
           </w:rPr>
-          <w:instrText xml:space="preserve"> PAGEREF _Toc243486830 \h </w:instrText>
+          <w:instrText xml:space="preserve"> PAGEREF _Toc243492207 \h </w:instrText>
         </w:r>
         <w:r>
           <w:rPr>
@@ -716,7 +716,7 @@
           <w:lang w:val="es-CO" w:eastAsia="es-CO"/>
         </w:rPr>
       </w:pPr>
-      <w:hyperlink w:anchor="_Toc243486831" w:history="1">
+      <w:hyperlink w:anchor="_Toc243492208" w:history="1">
         <w:r>
           <w:rPr>
             <w:rStyle w:val="Hipervnculo"/>
@@ -744,7 +744,7 @@
             <w:noProof/>
             <w:webHidden/>
           </w:rPr>
-          <w:instrText xml:space="preserve"> PAGEREF _Toc243486831 \h </w:instrText>
+          <w:instrText xml:space="preserve"> PAGEREF _Toc243492208 \h </w:instrText>
         </w:r>
         <w:r>
           <w:rPr>
@@ -788,7 +788,7 @@
           <w:lang w:val="es-CO" w:eastAsia="es-CO"/>
         </w:rPr>
       </w:pPr>
-      <w:hyperlink w:anchor="_Toc243486832" w:history="1">
+      <w:hyperlink w:anchor="_Toc243492209" w:history="1">
         <w:r>
           <w:rPr>
             <w:rStyle w:val="Hipervnculo"/>
@@ -816,7 +816,7 @@
             <w:noProof/>
             <w:webHidden/>
           </w:rPr>
-          <w:instrText xml:space="preserve"> PAGEREF _Toc243486832 \h </w:instrText>
+          <w:instrText xml:space="preserve"> PAGEREF _Toc243492209 \h </w:instrText>
         </w:r>
         <w:r>
           <w:rPr>
@@ -860,7 +860,7 @@
           <w:lang w:val="es-CO" w:eastAsia="es-CO"/>
         </w:rPr>
       </w:pPr>
-      <w:hyperlink w:anchor="_Toc243486833" w:history="1">
+      <w:hyperlink w:anchor="_Toc243492210" w:history="1">
         <w:r>
           <w:rPr>
             <w:rStyle w:val="Hipervnculo"/>
@@ -888,7 +888,7 @@
             <w:noProof/>
             <w:webHidden/>
           </w:rPr>
-          <w:instrText xml:space="preserve"> PAGEREF _Toc243486833 \h </w:instrText>
+          <w:instrText xml:space="preserve"> PAGEREF _Toc243492210 \h </w:instrText>
         </w:r>
         <w:r>
           <w:rPr>
@@ -932,7 +932,7 @@
           <w:lang w:val="es-CO" w:eastAsia="es-CO"/>
         </w:rPr>
       </w:pPr>
-      <w:hyperlink w:anchor="_Toc243486834" w:history="1">
+      <w:hyperlink w:anchor="_Toc243492211" w:history="1">
         <w:r>
           <w:rPr>
             <w:rStyle w:val="Hipervnculo"/>
@@ -960,7 +960,7 @@
             <w:noProof/>
             <w:webHidden/>
           </w:rPr>
-          <w:instrText xml:space="preserve"> PAGEREF _Toc243486834 \h </w:instrText>
+          <w:instrText xml:space="preserve"> PAGEREF _Toc243492211 \h </w:instrText>
         </w:r>
         <w:r>
           <w:rPr>
@@ -1004,7 +1004,7 @@
           <w:lang w:val="es-CO" w:eastAsia="es-CO"/>
         </w:rPr>
       </w:pPr>
-      <w:hyperlink w:anchor="_Toc243486835" w:history="1">
+      <w:hyperlink w:anchor="_Toc243492212" w:history="1">
         <w:r>
           <w:rPr>
             <w:rStyle w:val="Hipervnculo"/>
@@ -1032,7 +1032,7 @@
             <w:noProof/>
             <w:webHidden/>
           </w:rPr>
-          <w:instrText xml:space="preserve"> PAGEREF _Toc243486835 \h </w:instrText>
+          <w:instrText xml:space="preserve"> PAGEREF _Toc243492212 \h </w:instrText>
         </w:r>
         <w:r>
           <w:rPr>
@@ -1076,7 +1076,7 @@
           <w:lang w:val="es-CO" w:eastAsia="es-CO"/>
         </w:rPr>
       </w:pPr>
-      <w:hyperlink w:anchor="_Toc243486836" w:history="1">
+      <w:hyperlink w:anchor="_Toc243492213" w:history="1">
         <w:r>
           <w:rPr>
             <w:rStyle w:val="Hipervnculo"/>
@@ -1104,7 +1104,7 @@
             <w:noProof/>
             <w:webHidden/>
           </w:rPr>
-          <w:instrText xml:space="preserve"> PAGEREF _Toc243486836 \h </w:instrText>
+          <w:instrText xml:space="preserve"> PAGEREF _Toc243492213 \h </w:instrText>
         </w:r>
         <w:r>
           <w:rPr>
@@ -1148,7 +1148,7 @@
           <w:lang w:val="es-CO" w:eastAsia="es-CO"/>
         </w:rPr>
       </w:pPr>
-      <w:hyperlink w:anchor="_Toc243486837" w:history="1">
+      <w:hyperlink w:anchor="_Toc243492214" w:history="1">
         <w:r>
           <w:rPr>
             <w:rStyle w:val="Hipervnculo"/>
@@ -1176,7 +1176,7 @@
             <w:noProof/>
             <w:webHidden/>
           </w:rPr>
-          <w:instrText xml:space="preserve"> PAGEREF _Toc243486837 \h </w:instrText>
+          <w:instrText xml:space="preserve"> PAGEREF _Toc243492214 \h </w:instrText>
         </w:r>
         <w:r>
           <w:rPr>
@@ -1220,7 +1220,7 @@
           <w:lang w:val="es-CO" w:eastAsia="es-CO"/>
         </w:rPr>
       </w:pPr>
-      <w:hyperlink w:anchor="_Toc243486838" w:history="1">
+      <w:hyperlink w:anchor="_Toc243492215" w:history="1">
         <w:r>
           <w:rPr>
             <w:rStyle w:val="Hipervnculo"/>
@@ -1248,7 +1248,7 @@
             <w:noProof/>
             <w:webHidden/>
           </w:rPr>
-          <w:instrText xml:space="preserve"> PAGEREF _Toc243486838 \h </w:instrText>
+          <w:instrText xml:space="preserve"> PAGEREF _Toc243492215 \h </w:instrText>
         </w:r>
         <w:r>
           <w:rPr>
@@ -1268,7 +1268,7 @@
             <w:noProof/>
             <w:webHidden/>
           </w:rPr>
-          <w:t>13</w:t>
+          <w:t>14</w:t>
         </w:r>
         <w:r>
           <w:rPr>
@@ -1292,7 +1292,7 @@
           <w:lang w:val="es-CO" w:eastAsia="es-CO"/>
         </w:rPr>
       </w:pPr>
-      <w:hyperlink w:anchor="_Toc243486839" w:history="1">
+      <w:hyperlink w:anchor="_Toc243492216" w:history="1">
         <w:r>
           <w:rPr>
             <w:rStyle w:val="Hipervnculo"/>
@@ -1320,7 +1320,7 @@
             <w:noProof/>
             <w:webHidden/>
           </w:rPr>
-          <w:instrText xml:space="preserve"> PAGEREF _Toc243486839 \h </w:instrText>
+          <w:instrText xml:space="preserve"> PAGEREF _Toc243492216 \h </w:instrText>
         </w:r>
         <w:r>
           <w:rPr>
@@ -1364,7 +1364,7 @@
           <w:lang w:val="es-CO" w:eastAsia="es-CO"/>
         </w:rPr>
       </w:pPr>
-      <w:hyperlink w:anchor="_Toc243486840" w:history="1">
+      <w:hyperlink w:anchor="_Toc243492217" w:history="1">
         <w:r>
           <w:rPr>
             <w:rStyle w:val="Hipervnculo"/>
@@ -1392,7 +1392,7 @@
             <w:noProof/>
             <w:webHidden/>
           </w:rPr>
-          <w:instrText xml:space="preserve"> PAGEREF _Toc243486840 \h </w:instrText>
+          <w:instrText xml:space="preserve"> PAGEREF _Toc243492217 \h </w:instrText>
         </w:r>
         <w:r>
           <w:rPr>
@@ -1433,7 +1433,7 @@
         <w:pStyle w:val="Ttulo1"/>
         <w:pageBreakBefore/>
       </w:pPr>
-      <w:bookmarkStart w:id="2" w:name="_Toc243486826"/>
+      <w:bookmarkStart w:id="2" w:name="_Toc243492203"/>
       <w:r>
         <w:lastRenderedPageBreak/>
         <w:t>AulaNube: arquitectura de microservicios en la nube para la plataforma de capacitación corporativa de CapacitaPro S.A.</w:t>
@@ -1448,10 +1448,10 @@
         <w:pStyle w:val="parrafoApa"/>
       </w:pPr>
       <w:r>
-        <w:t>La arquitectura de software es la organización fundamental de un sistema, expresada en sus componentes, sus relaciones y los principios que guían su diseño y evolución (Bass et al., 2012). Como estas decisiones se toman temprano y son costosas de revert</w:t>
-      </w:r>
-      <w:r>
-        <w:t>ir, deben responder a los atributos de calidad que el negocio necesita y no solo a la funcionalidad (Tecnológica del Oriente, 2026).</w:t>
+        <w:t>Según la norma IEEE 1471-2000, adoptada después como ISO/IEC 42010, la arquitectura de software es la organización fundamental de un sistema, manifestada en sus componentes, las relaciones entre ellos y con su entorno, y los principios que guían su dise</w:t>
+      </w:r>
+      <w:r>
+        <w:t>ño y evolución (Tecnológica del Oriente, 2026). Como estas decisiones se toman al inicio y cambiarlas después es costoso y riesgoso, deben responder a los atributos de calidad que el negocio necesita y no solo a la funcionalidad (Bass et al., 2012).</w:t>
       </w:r>
     </w:p>
     <w:p>
@@ -1459,20 +1459,20 @@
         <w:pStyle w:val="parrafoApa"/>
       </w:pPr>
       <w:r>
-        <w:t>El informe presenta la solución del equipo para CapacitaPro S.A.S.: el caso y sus requisitos, la arquitectura propuesta, su</w:t>
-      </w:r>
-      <w:r>
-        <w:t xml:space="preserve"> modelado en UML, los patrones de diseño seleccionados y el prototipo desplegado en la nube con las pruebas que comprueban cada decisión. El código fuente y los diagramas están en https://github.com/augustocco/aulanube, y la aplicación funciona en https://</w:t>
-      </w:r>
-      <w:r>
-        <w:t>aulanube.149-130-191-139.sslip.io.</w:t>
+        <w:t>El inf</w:t>
+      </w:r>
+      <w:r>
+        <w:t>orme presenta la solución del equipo para CapacitaPro S.A.S.: el caso y sus requisitos, la arquitectura propuesta, su modelado en UML, los patrones de diseño seleccionados y el prototipo desplegado en la nube con las pruebas que comprueban cada decisión. E</w:t>
+      </w:r>
+      <w:r>
+        <w:t>l código fuente y los diagramas están en https://github.com/augustocco/aulanube, y la aplicación funciona en https://aulanube.149-130-191-139.sslip.io.</w:t>
       </w:r>
     </w:p>
     <w:p>
       <w:pPr>
         <w:pStyle w:val="Ttulo1"/>
       </w:pPr>
-      <w:bookmarkStart w:id="3" w:name="_Toc243486827"/>
+      <w:bookmarkStart w:id="3" w:name="_Toc243492204"/>
       <w:r>
         <w:t>Caso de estudio: CapacitaPro S.A.S.</w:t>
       </w:r>
@@ -1483,13 +1483,13 @@
         <w:pStyle w:val="parrafoApa"/>
       </w:pPr>
       <w:r>
-        <w:t xml:space="preserve">CapacitaPro S.A.S. es una empresa ficticia de Bucaramanga que diseña y administra cursos virtuales que la ley o los contratos hacen obligatorios: inducción al SG-SST, trabajo seguro en </w:t>
-      </w:r>
-      <w:r>
-        <w:t xml:space="preserve">alturas, protección de datos personales y atención humanizada en salud. Atiende a 38 empresas cliente y unos 14.000 usuarios; cada cliente tiene su propia instalación de WordPress con un plugin de LMS, repartidas en cinco servidores. La Tabla 1 resume los </w:t>
-      </w:r>
-      <w:r>
-        <w:t>problemas de ese modelo.</w:t>
+        <w:t>CapacitaPro S.A.S. es una empresa ficticia de Bucaramanga que diseña</w:t>
+      </w:r>
+      <w:r>
+        <w:t xml:space="preserve"> y administra cursos virtuales que la ley o los contratos hacen obligatorios: inducción al SG-SST, trabajo seguro en alturas, protección de datos personales y atención humanizada en salud. Atiende a 38 empresas cliente y unos 14.000 usuarios; cada cliente </w:t>
+      </w:r>
+      <w:r>
+        <w:t>tiene su propia instalación de WordPress con un plugin de LMS, repartidas en cinco servidores. La Tabla 1 resume los problemas de ese modelo.</w:t>
       </w:r>
     </w:p>
     <w:p>
@@ -1630,7 +1630,10 @@
               <w:spacing w:line="240" w:lineRule="auto"/>
             </w:pPr>
             <w:r>
-              <w:t>Un cierre de 1.100 trabajadores dejó el servidor 40 minutos sin respuesta y afectó a otros siete clientes.</w:t>
+              <w:t xml:space="preserve">Un </w:t>
+            </w:r>
+            <w:r>
+              <w:t>cierre de 1.100 trabajadores dejó el servidor 40 minutos sin respuesta y afectó a otros siete clientes.</w:t>
             </w:r>
           </w:p>
         </w:tc>
@@ -1712,7 +1715,10 @@
               <w:spacing w:line="240" w:lineRule="auto"/>
             </w:pPr>
             <w:r>
-              <w:t>Correo que bloquea la operación</w:t>
+              <w:t>Correo qu</w:t>
+            </w:r>
+            <w:r>
+              <w:t>e bloquea la operación</w:t>
             </w:r>
           </w:p>
         </w:tc>
@@ -1765,10 +1771,7 @@
               <w:spacing w:line="240" w:lineRule="auto"/>
             </w:pPr>
             <w:r>
-              <w:t>M</w:t>
-            </w:r>
-            <w:r>
-              <w:t>antenimiento multiplicado</w:t>
+              <w:t>Mantenimiento multiplicado</w:t>
             </w:r>
           </w:p>
         </w:tc>
@@ -1817,7 +1820,10 @@
               <w:spacing w:line="240" w:lineRule="auto"/>
             </w:pPr>
             <w:r>
-              <w:t>Sin verificación de certificados</w:t>
+              <w:t xml:space="preserve">Sin verificación de </w:t>
+            </w:r>
+            <w:r>
+              <w:t>certificados</w:t>
             </w:r>
           </w:p>
         </w:tc>
@@ -1858,13 +1864,7 @@
         <w:rPr>
           <w:sz w:val="20"/>
         </w:rPr>
-        <w:t xml:space="preserve">Elaboración propia a </w:t>
-      </w:r>
-      <w:r>
-        <w:rPr>
-          <w:sz w:val="20"/>
-        </w:rPr>
-        <w:t>partir del caso de estudio.</w:t>
+        <w:t>Elaboración propia a partir del caso de estudio.</w:t>
       </w:r>
     </w:p>
     <w:p>
@@ -1872,17 +1872,20 @@
         <w:pStyle w:val="parrafoApa"/>
       </w:pPr>
       <w:r>
-        <w:t>La gerencia pide una sola plataforma multiempresa en la que cada cliente vea solo su información, que el cierre de campaña de un cliente no afecte a los demás, certificados verificables por terceros, que la caída de una parte no</w:t>
-      </w:r>
-      <w:r>
-        <w:t xml:space="preserve"> detenga el resto, crecer por partes, bajo costo durante el piloto y cumplir la Ley 1581 de 2012 (Congreso de la República de Colombia, 2012).</w:t>
+        <w:t xml:space="preserve">La gerencia pide una sola plataforma multiempresa en la que cada cliente vea solo su información, que el cierre </w:t>
+      </w:r>
+      <w:r>
+        <w:t>de campaña de un cliente no afecte a los demás, certificados verificables por terceros, que la caída de una parte no detenga el resto, crecer por partes, bajo costo durante el piloto y cumplir la Ley 1581 de 2012 (Congreso de la República de Colombia, 2012</w:t>
+      </w:r>
+      <w:r>
+        <w:t>).</w:t>
       </w:r>
     </w:p>
     <w:p>
       <w:pPr>
         <w:pStyle w:val="Ttulo1"/>
       </w:pPr>
-      <w:bookmarkStart w:id="4" w:name="_Toc243486828"/>
+      <w:bookmarkStart w:id="4" w:name="_Toc243492205"/>
       <w:r>
         <w:t>Análisis de requisitos</w:t>
       </w:r>
@@ -1893,13 +1896,10 @@
         <w:pStyle w:val="parrafoApa"/>
       </w:pPr>
       <w:r>
-        <w:t xml:space="preserve">Se aplicaron cuatro técnicas: análisis documental del caso; una entrevista simulada en la </w:t>
-      </w:r>
-      <w:r>
-        <w:t xml:space="preserve">que el equipo representó a la gerencia, a una administradora de empresa cliente y a un colaborador; historias de usuario priorizadas con el método MoSCoW, y escenarios de atributos de calidad, que expresan cada requisito no funcional con un estímulo y una </w:t>
-      </w:r>
-      <w:r>
-        <w:t>medida de respuesta verificable (Bass et al., 2012). Las Tablas 2 y 3 presentan el resultado.</w:t>
+        <w:t xml:space="preserve">Se aplicaron cuatro técnicas: análisis documental del caso; una entrevista simulada en la que el equipo representó a la gerencia, a una administradora de empresa cliente y a un colaborador; historias de usuario priorizadas con el </w:t>
+      </w:r>
+      <w:r>
+        <w:t>método MoSCoW, y escenarios de atributos de calidad, que expresan cada requisito no funcional con un estímulo y una medida de respuesta verificable (Bass et al., 2012). Las Tablas 2 y 3 presentan el resultado.</w:t>
       </w:r>
     </w:p>
     <w:p>
@@ -2219,7 +2219,10 @@
               <w:spacing w:line="240" w:lineRule="auto"/>
             </w:pPr>
             <w:r>
-              <w:t>Como estudiante quiero un certificado PDF con código único al completar un curso.</w:t>
+              <w:t xml:space="preserve">Como estudiante </w:t>
+            </w:r>
+            <w:r>
+              <w:t>quiero un certificado PDF con código único al completar un curso.</w:t>
             </w:r>
           </w:p>
         </w:tc>
@@ -2296,10 +2299,7 @@
               <w:spacing w:line="240" w:lineRule="auto"/>
             </w:pPr>
             <w:r>
-              <w:t xml:space="preserve">Como estudiante quiero un aviso al completar el </w:t>
-            </w:r>
-            <w:r>
-              <w:t>curso y cuando el certificado esté listo.</w:t>
+              <w:t>Como estudiante quiero un aviso al completar el curso y cuando el certificado esté listo.</w:t>
             </w:r>
           </w:p>
         </w:tc>
@@ -2376,7 +2376,10 @@
               <w:spacing w:line="240" w:lineRule="auto"/>
             </w:pPr>
             <w:r>
-              <w:t>Como verificador externo quiero consultar un certificado por su código, sin cuenta.</w:t>
+              <w:t>Como verificador externo quiero consultar un certificado por su código, sin cu</w:t>
+            </w:r>
+            <w:r>
+              <w:t>enta.</w:t>
             </w:r>
           </w:p>
         </w:tc>
@@ -2530,10 +2533,7 @@
               <w:spacing w:line="240" w:lineRule="auto"/>
             </w:pPr>
             <w:r>
-              <w:t>Como administrad</w:t>
-            </w:r>
-            <w:r>
-              <w:t>or quiero cerrar una campaña masiva sin degradar la plataforma.</w:t>
+              <w:t>Como administrador quiero cerrar una campaña masiva sin degradar la plataforma.</w:t>
             </w:r>
           </w:p>
         </w:tc>
@@ -2602,7 +2602,10 @@
               <w:spacing w:line="240" w:lineRule="auto"/>
             </w:pPr>
             <w:r>
-              <w:t>Como equipo técnico quiero ver la salud de los servicios y la cola de eventos.</w:t>
+              <w:t xml:space="preserve">Como equipo técnico quiero ver la salud de los </w:t>
+            </w:r>
+            <w:r>
+              <w:t>servicios y la cola de eventos.</w:t>
             </w:r>
           </w:p>
         </w:tc>
@@ -2667,13 +2670,7 @@
         <w:rPr>
           <w:i/>
         </w:rPr>
-        <w:t xml:space="preserve">Requisitos no </w:t>
-      </w:r>
-      <w:r>
-        <w:rPr>
-          <w:i/>
-        </w:rPr>
-        <w:t>funcionales expresados como escenarios de calidad</w:t>
+        <w:t>Requisitos no funcionales expresados como escenarios de calidad</w:t>
       </w:r>
     </w:p>
     <w:tbl>
@@ -2839,7 +2836,10 @@
               <w:spacing w:line="240" w:lineRule="auto"/>
             </w:pPr>
             <w:r>
-              <w:t>150 cursos terminados en un minuto: respuesta &lt; 1 s y todos los certificados emitidos.</w:t>
+              <w:t xml:space="preserve">150 </w:t>
+            </w:r>
+            <w:r>
+              <w:t>cursos terminados en un minuto: respuesta &lt; 1 s y todos los certificados emitidos.</w:t>
             </w:r>
           </w:p>
         </w:tc>
@@ -2916,10 +2916,7 @@
               <w:spacing w:line="240" w:lineRule="auto"/>
             </w:pPr>
             <w:r>
-              <w:t xml:space="preserve">Respuesta &lt; 500 ms al </w:t>
-            </w:r>
-            <w:r>
-              <w:t>completar el curso; certificado disponible en &lt; 10 s.</w:t>
+              <w:t>Respuesta &lt; 500 ms al completar el curso; certificado disponible en &lt; 10 s.</w:t>
             </w:r>
           </w:p>
         </w:tc>
@@ -2996,7 +2993,10 @@
               <w:spacing w:line="240" w:lineRule="auto"/>
             </w:pPr>
             <w:r>
-              <w:t>Con certificados caído, los demás servicios responden y el gateway contesta en &lt; 300 ms.</w:t>
+              <w:t xml:space="preserve">Con certificados caído, los demás servicios </w:t>
+            </w:r>
+            <w:r>
+              <w:t>responden y el gateway contesta en &lt; 300 ms.</w:t>
             </w:r>
           </w:p>
         </w:tc>
@@ -3073,10 +3073,7 @@
               <w:spacing w:line="240" w:lineRule="auto"/>
             </w:pPr>
             <w:r>
-              <w:t xml:space="preserve">Si Redis o un trabajador fallan, no se pierden </w:t>
-            </w:r>
-            <w:r>
-              <w:t>certificados ni se duplican.</w:t>
+              <w:t>Si Redis o un trabajador fallan, no se pierden certificados ni se duplican.</w:t>
             </w:r>
           </w:p>
         </w:tc>
@@ -3206,7 +3203,10 @@
               <w:spacing w:line="240" w:lineRule="auto"/>
             </w:pPr>
             <w:r>
-              <w:t>Equidad</w:t>
+              <w:t>Eq</w:t>
+            </w:r>
+            <w:r>
+              <w:t>uidad</w:t>
             </w:r>
           </w:p>
         </w:tc>
@@ -3372,7 +3372,10 @@
               <w:spacing w:line="240" w:lineRule="auto"/>
             </w:pPr>
             <w:r>
-              <w:t>La infraestructura del piloto se mantiene en la capa gratuita del proveedor.</w:t>
+              <w:t xml:space="preserve">La infraestructura del piloto se mantiene en la capa </w:t>
+            </w:r>
+            <w:r>
+              <w:t>gratuita del proveedor.</w:t>
             </w:r>
           </w:p>
         </w:tc>
@@ -3393,20 +3396,14 @@
         <w:rPr>
           <w:sz w:val="20"/>
         </w:rPr>
-        <w:t xml:space="preserve">Elaboración propia con el formato de escenarios de calidad de Bass et </w:t>
-      </w:r>
-      <w:r>
-        <w:rPr>
-          <w:sz w:val="20"/>
-        </w:rPr>
-        <w:t>al. (2012).</w:t>
+        <w:t>Elaboración propia con el formato de escenarios de calidad de Bass et al. (2012).</w:t>
       </w:r>
     </w:p>
     <w:p>
       <w:pPr>
         <w:pStyle w:val="Ttulo1"/>
       </w:pPr>
-      <w:bookmarkStart w:id="5" w:name="_Toc243486829"/>
+      <w:bookmarkStart w:id="5" w:name="_Toc243492206"/>
       <w:r>
         <w:t>Arquitectura propuesta</w:t>
       </w:r>
@@ -3416,7 +3413,7 @@
       <w:pPr>
         <w:pStyle w:val="Ttulo2"/>
       </w:pPr>
-      <w:bookmarkStart w:id="6" w:name="_Toc243486830"/>
+      <w:bookmarkStart w:id="6" w:name="_Toc243492207"/>
       <w:r>
         <w:t>Estilo arquitectónico</w:t>
       </w:r>
@@ -3427,13 +3424,16 @@
         <w:pStyle w:val="parrafoApa"/>
       </w:pPr>
       <w:r>
-        <w:t>Se eligió una arquitectura de microservicios con comunicación híbrida: REST síncrono para lo que el usuario consulta de inmediato y eventos asíncronos para lo que puede ocurrir después, como emitir e</w:t>
-      </w:r>
-      <w:r>
-        <w:t>l certificado y avisar. Los escenarios RNF01 y RNF03 exigen escalar y aislar fallos por partes; un monolito modular, aunque más sencillo, escala y falla como una sola unidad, que es precisamente el problema de CapacitaPro (Red Hat, 2023; Redwerk, 2025). La</w:t>
-      </w:r>
-      <w:r>
-        <w:t xml:space="preserve"> Figura 1 muestra la web, el API Gateway como única entrada y cuatro servicios con base de datos propia: identidad, cursos, certificados y notificaciones.</w:t>
+        <w:t>Se eligió una arquitectura de microservicios con comunicación híbrida: REST síncrono para lo que e</w:t>
+      </w:r>
+      <w:r>
+        <w:t>l usuario consulta de inmediato y eventos asíncronos para lo que puede ocurrir después, como emitir el certificado y avisar. Los escenarios RNF01 y RNF03 exigen escalar y aislar fallos por partes; un monolito modular, aunque más sencillo, escala y falla co</w:t>
+      </w:r>
+      <w:r>
+        <w:t>mo una sola unidad, que es precisamente el problema de CapacitaPro (Kinashchuk, 2020; Red Hat, 2023). La Figura 1 muestra la web, el API Gateway como única entrada y cuatro servicios con base de datos propia: identidad, cursos, certificados y notificacione</w:t>
+      </w:r>
+      <w:r>
+        <w:t>s.</w:t>
       </w:r>
     </w:p>
     <w:p>
@@ -3471,7 +3471,7 @@
           <w:noProof/>
         </w:rPr>
         <w:drawing>
-          <wp:inline distT="0" distB="0" distL="0" distR="0" wp14:anchorId="42112D8B" wp14:editId="280D0B3C">
+          <wp:inline distT="0" distB="0" distL="0" distR="0" wp14:anchorId="40E505CF" wp14:editId="2D1C9C55">
             <wp:extent cx="4389120" cy="3149445"/>
             <wp:effectExtent l="0" t="0" r="0" b="0"/>
             <wp:docPr id="2" name="Picture 2"/>
@@ -3522,20 +3522,14 @@
         <w:rPr>
           <w:sz w:val="20"/>
         </w:rPr>
-        <w:t>Elaboración propia. Las flechas contin</w:t>
-      </w:r>
-      <w:r>
-        <w:rPr>
-          <w:sz w:val="20"/>
-        </w:rPr>
-        <w:t>uas son llamadas REST; las punteadas, eventos en Redis Streams.</w:t>
+        <w:t>Elaboración propia. Las flechas continuas son llamadas REST; las punteadas, eventos en Redis Streams.</w:t>
       </w:r>
     </w:p>
     <w:p>
       <w:pPr>
         <w:pStyle w:val="Ttulo2"/>
       </w:pPr>
-      <w:bookmarkStart w:id="7" w:name="_Toc243486831"/>
+      <w:bookmarkStart w:id="7" w:name="_Toc243492208"/>
       <w:r>
         <w:t>Relación con los principios de la unidad</w:t>
       </w:r>
@@ -3555,7 +3549,10 @@
         <w:t>alta cohesión</w:t>
       </w:r>
       <w:r>
-        <w:t xml:space="preserve"> porque cada servicio agrupa un solo concepto del dominio. Hay </w:t>
+        <w:t xml:space="preserve"> porque cada servicio agrupa u</w:t>
+      </w:r>
+      <w:r>
+        <w:t xml:space="preserve">n solo concepto del dominio. Hay </w:t>
       </w:r>
       <w:r>
         <w:rPr>
@@ -3564,10 +3561,7 @@
         <w:t>bajo acoplamiento</w:t>
       </w:r>
       <w:r>
-        <w:t xml:space="preserve"> porque los servicios no se llaman entre sí: cursos pu</w:t>
-      </w:r>
-      <w:r>
-        <w:t xml:space="preserve">blica </w:t>
+        <w:t xml:space="preserve"> porque los servicios no se llaman entre sí: cursos publica </w:t>
       </w:r>
       <w:r>
         <w:rPr>
@@ -3586,22 +3580,22 @@
         <w:t>ocultamiento de información</w:t>
       </w:r>
       <w:r>
-        <w:t xml:space="preserve"> de Parnas (1972): la base de cada servicio es un detalle interno, por lo que trasladar los PDF a un almacen</w:t>
-      </w:r>
-      <w:r>
-        <w:t>amiento de objetos no afectaría a otro módulo. Como compromisos se aceptaron la consistencia eventual del certificado, una sola instancia de PostgreSQL con cuatro bases separadas y Redis Streams en lugar de un bróker dedicado.</w:t>
+        <w:t xml:space="preserve"> de </w:t>
+      </w:r>
+      <w:r>
+        <w:t xml:space="preserve">Parnas (1972): la base de cada servicio es un detalle interno, por lo que trasladar los PDF a un almacenamiento de objetos no afectaría a otro módulo. Como compromisos se aceptaron la consistencia eventual del certificado, una sola instancia de PostgreSQL </w:t>
+      </w:r>
+      <w:r>
+        <w:t>con cuatro bases separadas y Redis Streams en lugar de un bróker dedicado.</w:t>
       </w:r>
     </w:p>
     <w:p>
       <w:pPr>
         <w:pStyle w:val="Ttulo1"/>
       </w:pPr>
-      <w:bookmarkStart w:id="8" w:name="_Toc243486832"/>
-      <w:r>
-        <w:t>Diseño de la arquitectura med</w:t>
-      </w:r>
-      <w:r>
-        <w:t>iante UML</w:t>
+      <w:bookmarkStart w:id="8" w:name="_Toc243492209"/>
+      <w:r>
+        <w:t>Diseño de la arquitectura mediante UML</w:t>
       </w:r>
       <w:bookmarkEnd w:id="8"/>
     </w:p>
@@ -3617,7 +3611,14 @@
           <w:rFonts w:ascii="Consolas" w:hAnsi="Consolas"/>
           <w:sz w:val="21"/>
         </w:rPr>
-        <w:t>docs/uml</w:t>
+        <w:t>d</w:t>
+      </w:r>
+      <w:r>
+        <w:rPr>
+          <w:rFonts w:ascii="Consolas" w:hAnsi="Consolas"/>
+          <w:sz w:val="21"/>
+        </w:rPr>
+        <w:t>ocs/uml</w:t>
       </w:r>
       <w:r>
         <w:t xml:space="preserve"> del repositorio.</w:t>
@@ -3627,7 +3628,7 @@
       <w:pPr>
         <w:pStyle w:val="Ttulo2"/>
       </w:pPr>
-      <w:bookmarkStart w:id="9" w:name="_Toc243486833"/>
+      <w:bookmarkStart w:id="9" w:name="_Toc243492210"/>
       <w:r>
         <w:lastRenderedPageBreak/>
         <w:t>Diagrama de casos de uso</w:t>
@@ -3668,7 +3669,7 @@
           <w:noProof/>
         </w:rPr>
         <w:drawing>
-          <wp:inline distT="0" distB="0" distL="0" distR="0" wp14:anchorId="1774B931" wp14:editId="73F14FB5">
+          <wp:inline distT="0" distB="0" distL="0" distR="0" wp14:anchorId="3DA64351" wp14:editId="2E715D7B">
             <wp:extent cx="5224812" cy="4206240"/>
             <wp:effectExtent l="0" t="0" r="0" b="0"/>
             <wp:docPr id="3" name="Picture 3"/>
@@ -3727,20 +3728,23 @@
         <w:pStyle w:val="parrafoApa"/>
       </w:pPr>
       <w:r>
-        <w:t>Participan el estudiante, el administrador de la empresa, un verificador externo sin cuenta y el sistema. «Completar curso» incluye «Emitir certificado», que a su vez incluye «Recibir avisos». Es relevante porque la emisión la dis</w:t>
-      </w:r>
-      <w:r>
-        <w:t>para un evento y no una persona, lo que la señala como asíncrona, y porque el verificador obliga a una ruta pública controlada en el gateway.</w:t>
+        <w:t xml:space="preserve">Participan el estudiante, el administrador de la empresa, un verificador externo sin cuenta y el sistema. «Completar curso» </w:t>
+      </w:r>
+      <w:r>
+        <w:t>incluye «Emitir certificado», que a su vez incluye «Recibir avisos». Es relevante porque la emisión la dispara un evento y no una persona, lo que la señala como asíncrona, y porque el verificador obliga a una ruta pública controlada en el gateway.</w:t>
       </w:r>
     </w:p>
     <w:p>
       <w:pPr>
         <w:pStyle w:val="Ttulo2"/>
       </w:pPr>
-      <w:bookmarkStart w:id="10" w:name="_Toc243486834"/>
+      <w:bookmarkStart w:id="10" w:name="_Toc243492211"/>
       <w:r>
         <w:lastRenderedPageBreak/>
-        <w:t>Diagrama de clases</w:t>
+        <w:t>Diagrama</w:t>
+      </w:r>
+      <w:r>
+        <w:t xml:space="preserve"> de clases</w:t>
       </w:r>
       <w:bookmarkEnd w:id="10"/>
     </w:p>
@@ -3778,7 +3782,7 @@
           <w:noProof/>
         </w:rPr>
         <w:drawing>
-          <wp:inline distT="0" distB="0" distL="0" distR="0" wp14:anchorId="0B8BDAD4" wp14:editId="0F56A51A">
+          <wp:inline distT="0" distB="0" distL="0" distR="0" wp14:anchorId="4E1C1678" wp14:editId="2696CAD1">
             <wp:extent cx="4865321" cy="4389119"/>
             <wp:effectExtent l="0" t="0" r="0" b="0"/>
             <wp:docPr id="4" name="Picture 4"/>
@@ -3829,13 +3833,7 @@
         <w:rPr>
           <w:sz w:val="20"/>
         </w:rPr>
-        <w:t xml:space="preserve">Elaboración propia. Cada paquete corresponde a </w:t>
-      </w:r>
-      <w:r>
-        <w:rPr>
-          <w:sz w:val="20"/>
-        </w:rPr>
-        <w:t>un servicio y a su base de datos.</w:t>
+        <w:t>Elaboración propia. Cada paquete corresponde a un servicio y a su base de datos.</w:t>
       </w:r>
     </w:p>
     <w:p>
@@ -3843,7 +3841,10 @@
         <w:pStyle w:val="parrafoApa"/>
       </w:pPr>
       <w:r>
-        <w:t xml:space="preserve">Ninguna asociación cruza un paquete: entre servicios solo hay referencias lógicas o eventos, lo que comprueba la decisión de una base por servicio. </w:t>
+        <w:t>Ninguna asociación cruza un paquete: entre servicios solo hay referencias lógicas o eventos, lo que comprueba la dec</w:t>
+      </w:r>
+      <w:r>
+        <w:t xml:space="preserve">isión de una base por servicio. </w:t>
       </w:r>
       <w:r>
         <w:rPr>
@@ -3853,17 +3854,14 @@
         <w:t>RepositorioCursos</w:t>
       </w:r>
       <w:r>
-        <w:t xml:space="preserve"> impone el filtro por empresa, y las restricciones únicas</w:t>
-      </w:r>
-      <w:r>
-        <w:t xml:space="preserve"> de certificado y notificación evitan duplicados cuando un evento llega dos veces.</w:t>
+        <w:t xml:space="preserve"> impone el filtro por empresa, y las restricciones únicas de certificado y notificación evitan duplicados cuando un evento llega dos veces.</w:t>
       </w:r>
     </w:p>
     <w:p>
       <w:pPr>
         <w:pStyle w:val="Ttulo2"/>
       </w:pPr>
-      <w:bookmarkStart w:id="11" w:name="_Toc243486835"/>
+      <w:bookmarkStart w:id="11" w:name="_Toc243492212"/>
       <w:r>
         <w:lastRenderedPageBreak/>
         <w:t>Diagrama de secuencia</w:t>
@@ -3890,7 +3888,13 @@
         <w:rPr>
           <w:i/>
         </w:rPr>
-        <w:t>Secuencia para completar un curso y obtener el certificado</w:t>
+        <w:t xml:space="preserve">Secuencia para completar un curso y </w:t>
+      </w:r>
+      <w:r>
+        <w:rPr>
+          <w:i/>
+        </w:rPr>
+        <w:t>obtener el certificado</w:t>
       </w:r>
     </w:p>
     <w:p>
@@ -3904,7 +3908,7 @@
           <w:noProof/>
         </w:rPr>
         <w:drawing>
-          <wp:inline distT="0" distB="0" distL="0" distR="0" wp14:anchorId="0A087EC3" wp14:editId="02F3A7AE">
+          <wp:inline distT="0" distB="0" distL="0" distR="0" wp14:anchorId="01EF89DF" wp14:editId="5D88F099">
             <wp:extent cx="5943600" cy="3956013"/>
             <wp:effectExtent l="0" t="0" r="0" b="0"/>
             <wp:docPr id="5" name="Picture 5"/>
@@ -3983,17 +3987,14 @@
         <w:t>certificado.emitido</w:t>
       </w:r>
       <w:r>
-        <w:t>. Así el</w:t>
-      </w:r>
-      <w:r>
-        <w:t xml:space="preserve"> usuario no espera (RNF02), el pico queda en la cola (RNF01) y ningún evento se pierde si Redis falla (RNF04).</w:t>
+        <w:t>. Así el usuario no espera (RNF02), el pico queda en la cola (RNF01) y ningún evento se pierde si Redis falla (RNF04).</w:t>
       </w:r>
     </w:p>
     <w:p>
       <w:pPr>
         <w:pStyle w:val="Ttulo2"/>
       </w:pPr>
-      <w:bookmarkStart w:id="12" w:name="_Toc243486836"/>
+      <w:bookmarkStart w:id="12" w:name="_Toc243492213"/>
       <w:r>
         <w:lastRenderedPageBreak/>
         <w:t>Diagrama de despliegue</w:t>
@@ -4009,7 +4010,13 @@
         <w:rPr>
           <w:b/>
         </w:rPr>
-        <w:t>Figura 5</w:t>
+        <w:t>F</w:t>
+      </w:r>
+      <w:r>
+        <w:rPr>
+          <w:b/>
+        </w:rPr>
+        <w:t>igura 5</w:t>
       </w:r>
     </w:p>
     <w:p>
@@ -4034,7 +4041,7 @@
           <w:noProof/>
         </w:rPr>
         <w:drawing>
-          <wp:inline distT="0" distB="0" distL="0" distR="0" wp14:anchorId="58747176" wp14:editId="06319F01">
+          <wp:inline distT="0" distB="0" distL="0" distR="0" wp14:anchorId="69830D73" wp14:editId="63A7ECE3">
             <wp:extent cx="5120640" cy="4265231"/>
             <wp:effectExtent l="0" t="0" r="0" b="0"/>
             <wp:docPr id="6" name="Picture 6"/>
@@ -4085,13 +4092,7 @@
         <w:rPr>
           <w:sz w:val="20"/>
         </w:rPr>
-        <w:t>Elaboración propia a partir de los manifies</w:t>
-      </w:r>
-      <w:r>
-        <w:rPr>
-          <w:sz w:val="20"/>
-        </w:rPr>
-        <w:t>tos de Kubernetes y de la ubicación de los pods observada el 21 de octubre de 2026.</w:t>
+        <w:t>Elaboración propia a partir de los manifiestos de Kubernetes y de la ubicación de los pods observada el 21 de octubre de 2026.</w:t>
       </w:r>
     </w:p>
     <w:p>
@@ -4099,19 +4100,22 @@
         <w:pStyle w:val="parrafoApa"/>
       </w:pPr>
       <w:r>
-        <w:t>Dos instancias Ampere A1 de 1 OCPU y 6 GB forman un clúster K3s en la capa gratuita de Oracle (s. f.). Traefik termina TLS; la web y el gateway tienen una réplica por nodo;</w:t>
-      </w:r>
-      <w:r>
-        <w:t xml:space="preserve"> certificados escala de dos a cuatro réplicas, y las políticas de red solo permiten el camino web, gateway, servicios y datos.</w:t>
+        <w:t>Dos instancias Ampere A1 de 1 OCPU y 6 GB forman un</w:t>
+      </w:r>
+      <w:r>
+        <w:t xml:space="preserve"> clúster K3s en la capa gratuita de Oracle (s. f.). Traefik termina TLS; la web y el gateway tienen una réplica por nodo; certificados escala de dos a cuatro réplicas, y las políticas de red solo permiten el camino web, gateway, servicios y datos.</w:t>
       </w:r>
     </w:p>
     <w:p>
       <w:pPr>
         <w:pStyle w:val="Ttulo1"/>
       </w:pPr>
-      <w:bookmarkStart w:id="13" w:name="_Toc243486837"/>
-      <w:r>
-        <w:t>Selección y justificación de patrones de diseño</w:t>
+      <w:bookmarkStart w:id="13" w:name="_Toc243492214"/>
+      <w:r>
+        <w:t>Selecció</w:t>
+      </w:r>
+      <w:r>
+        <w:t>n y justificación de patrones de diseño</w:t>
       </w:r>
       <w:bookmarkEnd w:id="13"/>
     </w:p>
@@ -4120,14 +4124,14 @@
         <w:pStyle w:val="parrafoApa"/>
       </w:pPr>
       <w:r>
-        <w:t>Los patrones se seleccionaron a partir de los escenarios de calidad y del catálog</w:t>
-      </w:r>
-      <w:r>
-        <w:t xml:space="preserve">o de patrones para la nube de Microsoft (s. f.) y Richardson (2018). Blas et al. (2019) señalan que </w:t>
+        <w:t xml:space="preserve">Los patrones se seleccionaron a partir de los escenarios de calidad y del catálogo de patrones para la nube de Microsoft (2026) y de Richardson (2018). Siguiendo a Blas et al. </w:t>
       </w:r>
       <w:r>
         <w:lastRenderedPageBreak/>
-        <w:t>deben modelarse y verificarse como parte de la arquitectura; por eso cada uno aparece en los diagramas y se comprueba en el prototipo (Tabla 4).</w:t>
+        <w:t>(2019), que proponen modelar los patrone</w:t>
+      </w:r>
+      <w:r>
+        <w:t>s de diseño para la nube dentro del diseño arquitectónico y verificar que se apliquen correctamente, cada patrón aparece en los diagramas y se comprueba en el prototipo (Tabla 4).</w:t>
       </w:r>
     </w:p>
     <w:p>
@@ -4215,7 +4219,13 @@
               <w:rPr>
                 <w:b/>
               </w:rPr>
-              <w:t>Aplicación en AulaNube</w:t>
+              <w:t xml:space="preserve">Aplicación en </w:t>
+            </w:r>
+            <w:r>
+              <w:rPr>
+                <w:b/>
+              </w:rPr>
+              <w:t>AulaNube</w:t>
             </w:r>
           </w:p>
         </w:tc>
@@ -4446,10 +4456,7 @@
               <w:spacing w:line="240" w:lineRule="auto"/>
             </w:pPr>
             <w:r>
-              <w:t xml:space="preserve">Un flujo de Redis </w:t>
-            </w:r>
-            <w:r>
-              <w:t>por publicador y un grupo por suscriptor.</w:t>
+              <w:t>Un flujo de Redis por publicador y un grupo por suscriptor.</w:t>
             </w:r>
           </w:p>
         </w:tc>
@@ -4680,10 +4687,7 @@
               <w:spacing w:line="240" w:lineRule="auto"/>
             </w:pPr>
             <w:r>
-              <w:t xml:space="preserve">Varias réplicas comparten la </w:t>
-            </w:r>
-            <w:r>
-              <w:t>cola de certificados.</w:t>
+              <w:t>Varias réplicas comparten la cola de certificados.</w:t>
             </w:r>
           </w:p>
         </w:tc>
@@ -4760,7 +4764,10 @@
               <w:spacing w:line="240" w:lineRule="auto"/>
             </w:pPr>
             <w:r>
-              <w:t>Tras tres fallos el circuito se abre 15 s y responde de inmediato.</w:t>
+              <w:t>Tras</w:t>
+            </w:r>
+            <w:r>
+              <w:t xml:space="preserve"> tres fallos el circuito se abre 15 s y responde de inmediato.</w:t>
             </w:r>
           </w:p>
         </w:tc>
@@ -4906,7 +4913,7 @@
               <w:spacing w:line="240" w:lineRule="auto"/>
             </w:pPr>
             <w:r>
-              <w:t>Filtro por empresa en un solo lugar (Fowler, 2002).</w:t>
+              <w:t>Encapsula el acceso a datos (Fowler, 2002) y aplica el filtro por empresa en un solo lugar.</w:t>
             </w:r>
           </w:p>
         </w:tc>
@@ -4968,8 +4975,9 @@
       <w:pPr>
         <w:pStyle w:val="Ttulo1"/>
       </w:pPr>
-      <w:bookmarkStart w:id="14" w:name="_Toc243486838"/>
-      <w:r>
+      <w:bookmarkStart w:id="14" w:name="_Toc243492215"/>
+      <w:r>
+        <w:lastRenderedPageBreak/>
         <w:t>Prototipo funcional en la nube</w:t>
       </w:r>
       <w:bookmarkEnd w:id="14"/>
@@ -4982,11 +4990,7 @@
         <w:t>Los servicios están escritos en Python con FastAPI; la interfaz se sirve con nginx; los datos residen en PostgreSQL 16 y los eventos en Redis 7.4. El s</w:t>
       </w:r>
       <w:r>
-        <w:t xml:space="preserve">istema corre en local con Docker </w:t>
-      </w:r>
-      <w:r>
-        <w:lastRenderedPageBreak/>
-        <w:t>Compose y en la nube con cinco manifiestos de Kubernetes. Las 28 pruebas automatizadas pasan en x86 y en arm64, y una prueba de humo recorre el flujo completo contra el despliegue.</w:t>
+        <w:t>istema corre en local con Docker Compose y en la nube con cinco manifiestos de Kubernetes. Las 28 pruebas automatizadas pasan en x86 y en arm64, y una prueba de humo recorre el flujo completo contra el despliegue.</w:t>
       </w:r>
     </w:p>
     <w:p>
@@ -5037,7 +5041,7 @@
           <w:noProof/>
         </w:rPr>
         <w:drawing>
-          <wp:inline distT="0" distB="0" distL="0" distR="0" wp14:anchorId="38AD9965" wp14:editId="76E27BB9">
+          <wp:inline distT="0" distB="0" distL="0" distR="0" wp14:anchorId="3C37A0D3" wp14:editId="3D2188C2">
             <wp:extent cx="5120640" cy="3073883"/>
             <wp:effectExtent l="0" t="0" r="0" b="0"/>
             <wp:docPr id="7" name="Picture 7"/>
@@ -5132,7 +5136,7 @@
           <w:noProof/>
         </w:rPr>
         <w:drawing>
-          <wp:inline distT="0" distB="0" distL="0" distR="0" wp14:anchorId="69B165B6" wp14:editId="5597DA8C">
+          <wp:inline distT="0" distB="0" distL="0" distR="0" wp14:anchorId="4A88469A" wp14:editId="690970C3">
             <wp:extent cx="5120640" cy="3073883"/>
             <wp:effectExtent l="0" t="0" r="0" b="0"/>
             <wp:docPr id="8" name="Picture 8"/>
@@ -5699,7 +5703,7 @@
       <w:pPr>
         <w:pStyle w:val="Ttulo1"/>
       </w:pPr>
-      <w:bookmarkStart w:id="15" w:name="_Toc243486839"/>
+      <w:bookmarkStart w:id="15" w:name="_Toc243492216"/>
       <w:r>
         <w:t>Conclusiones</w:t>
       </w:r>
@@ -5736,7 +5740,7 @@
         <w:pStyle w:val="Ttulo1"/>
         <w:pageBreakBefore/>
       </w:pPr>
-      <w:bookmarkStart w:id="16" w:name="_Toc243486840"/>
+      <w:bookmarkStart w:id="16" w:name="_Toc243492217"/>
       <w:r>
         <w:lastRenderedPageBreak/>
         <w:t>Referencias</w:t>
@@ -5767,22 +5771,19 @@
         <w:ind w:left="720" w:hanging="720"/>
       </w:pPr>
       <w:r>
-        <w:t xml:space="preserve">Blas, M. J., Leone, H. P., &amp; Gonnet, S. M. (2019). Modelado y verificación de patrones de diseño de arquitectura de software para entornos de computación en la nube. En </w:t>
+        <w:t xml:space="preserve">Blas, M. J., Leone, H., &amp; Gonnet, S. (2019). Modelado y verificación de patrones de diseño de arquitectura de software para entornos de computación en la nube. </w:t>
       </w:r>
       <w:r>
         <w:rPr>
           <w:i/>
         </w:rPr>
-        <w:t>Proceedings del Congreso Nacional de Ingeniería Informática</w:t>
-      </w:r>
-      <w:r>
-        <w:rPr>
-          <w:i/>
-        </w:rPr>
-        <w:t>/Sistemas de Información</w:t>
-      </w:r>
-      <w:r>
-        <w:t>.</w:t>
+        <w:t>RISTI: Revista Ibérica de Sistemas e Tecnologias de Informação</w:t>
+      </w:r>
+      <w:r>
+        <w:t>, (35)</w:t>
+      </w:r>
+      <w:r>
+        <w:t>, 1–17. https://doi.org/10.17013/risti.35.1-17</w:t>
       </w:r>
     </w:p>
     <w:p>
@@ -5800,10 +5801,10 @@
         <w:t>Ley Estatutaria 1581 de 2012: Por la cual se dictan disposiciones generales para la protección de datos personales</w:t>
       </w:r>
       <w:r>
-        <w:t>. Diario Oficial n.º 48.587. https://www.funcionpublica</w:t>
-      </w:r>
-      <w:r>
-        <w:t>.gov.co/eva/gestornormativo/norma.php?i=49981</w:t>
+        <w:t>. Diario Oficial n.º 48.587. https</w:t>
+      </w:r>
+      <w:r>
+        <w:t>://www.funcionpublica.gov.co/eva/gestornormativo/norma.php?i=49981</w:t>
       </w:r>
     </w:p>
     <w:p>
@@ -5830,7 +5831,28 @@
         <w:ind w:left="720" w:hanging="720"/>
       </w:pPr>
       <w:r>
-        <w:t xml:space="preserve">Microsoft. (s. f.). </w:t>
+        <w:t xml:space="preserve">Kinashchuk, O. (2020, 23 de abril). </w:t>
+      </w:r>
+      <w:r>
+        <w:rPr>
+          <w:i/>
+        </w:rPr>
+        <w:t>Arquitectura monolítica frente a la de microservicios para .Net</w:t>
+      </w:r>
+      <w:r>
+        <w:t xml:space="preserve">. </w:t>
+      </w:r>
+      <w:r>
+        <w:t>Redwerk. https://redwerk.es/blog/arquitectura-monolitica-vs-microservicios/</w:t>
+      </w:r>
+    </w:p>
+    <w:p>
+      <w:pPr>
+        <w:pStyle w:val="parrafoApa"/>
+        <w:ind w:left="720" w:hanging="720"/>
+      </w:pPr>
+      <w:r>
+        <w:t xml:space="preserve">Microsoft. (2026, 3 de mayo). </w:t>
       </w:r>
       <w:r>
         <w:rPr>
@@ -5839,10 +5861,7 @@
         <w:t>Cloud design patterns</w:t>
       </w:r>
       <w:r>
-        <w:t xml:space="preserve">. Azure Architecture Center. Recuperado el 20 de octubre de 2026, de </w:t>
-      </w:r>
-      <w:r>
-        <w:t>https://learn.microsoft.com/en-us/azure/architecture/patterns/</w:t>
+        <w:t>. Azure Architecture Center. https://learn.microsoft.com/en-us/azure/architecture/patterns/</w:t>
       </w:r>
     </w:p>
     <w:p>
@@ -5857,31 +5876,31 @@
         <w:rPr>
           <w:i/>
         </w:rPr>
-        <w:t>Release it! Design and deploy production-ready software</w:t>
-      </w:r>
-      <w:r>
-        <w:t xml:space="preserve"> (2.ª ed.). Pragmatic Bookshelf.</w:t>
-      </w:r>
-    </w:p>
-    <w:p>
-      <w:pPr>
-        <w:pStyle w:val="parrafoApa"/>
-        <w:ind w:left="720" w:hanging="720"/>
-      </w:pPr>
-      <w:r>
-        <w:t xml:space="preserve">Object Management Group. (2017). </w:t>
+        <w:t>Release it! Des</w:t>
       </w:r>
       <w:r>
         <w:rPr>
           <w:i/>
         </w:rPr>
-        <w:t>OMG Unified Modeling Language (OMG UML), version 2</w:t>
+        <w:t>ign and deploy production-ready software</w:t>
+      </w:r>
+      <w:r>
+        <w:t xml:space="preserve"> (2.ª ed.). Pragmatic Bookshelf.</w:t>
+      </w:r>
+    </w:p>
+    <w:p>
+      <w:pPr>
+        <w:pStyle w:val="parrafoApa"/>
+        <w:ind w:left="720" w:hanging="720"/>
+      </w:pPr>
+      <w:r>
+        <w:t xml:space="preserve">Object Management Group. (2017). </w:t>
       </w:r>
       <w:r>
         <w:rPr>
           <w:i/>
         </w:rPr>
-        <w:t>.5.1</w:t>
+        <w:t>OMG Unified Modeling Language (OMG UML), version 2.5.1</w:t>
       </w:r>
       <w:r>
         <w:t>. https://www.omg.org/spec/UML/2.5.1</w:t>
@@ -5902,34 +5921,32 @@
         <w:t>Always Free resources</w:t>
       </w:r>
       <w:r>
-        <w:t>. Oracle Cloud Infrastructure Documentation. Recuperado el 20 de octubre de 2026, de https://docs.oracle.com/en-us/iaas/Content/FreeTier/freetier</w:t>
+        <w:t>. Oracle Cloud Infras</w:t>
+      </w:r>
+      <w:r>
+        <w:t>tructure Documentation. Recuperado el 20 de octubre de 2026, de https://docs.oracle.com/en-us/iaas/Content/FreeTier/freetier_topic-Always_Free_Resources.htm</w:t>
+      </w:r>
+    </w:p>
+    <w:p>
+      <w:pPr>
+        <w:pStyle w:val="parrafoApa"/>
+        <w:ind w:left="720" w:hanging="720"/>
+      </w:pPr>
+      <w:r>
+        <w:lastRenderedPageBreak/>
+        <w:t xml:space="preserve">Parnas, D. L. (1972). On the criteria to be used in decomposing systems into modules. </w:t>
       </w:r>
       <w:r>
         <w:rPr>
           <w:i/>
         </w:rPr>
-        <w:t>topic-Always</w:t>
-      </w:r>
-      <w:r>
-        <w:t>Free_Resources.htm</w:t>
-      </w:r>
-    </w:p>
-    <w:p>
-      <w:pPr>
-        <w:pStyle w:val="parrafoApa"/>
-        <w:ind w:left="720" w:hanging="720"/>
-      </w:pPr>
-      <w:r>
-        <w:t>P</w:t>
-      </w:r>
-      <w:r>
-        <w:t xml:space="preserve">arnas, D. L. (1972). On the criteria to be used in decomposing systems into modules. </w:t>
+        <w:t>Communication</w:t>
       </w:r>
       <w:r>
         <w:rPr>
           <w:i/>
         </w:rPr>
-        <w:t>Communications of the ACM, 15</w:t>
+        <w:t>s of the ACM, 15</w:t>
       </w:r>
       <w:r>
         <w:t>(12), 1053–1058. https://doi.org/10.1145/361598.361623</w:t>
@@ -5941,62 +5958,34 @@
         <w:ind w:left="720" w:hanging="720"/>
       </w:pPr>
       <w:r>
-        <w:lastRenderedPageBreak/>
-        <w:t xml:space="preserve">Red Hat. (2023). </w:t>
+        <w:t xml:space="preserve">Red Hat. (2023, 1 de mayo). </w:t>
       </w:r>
       <w:r>
         <w:rPr>
           <w:i/>
         </w:rPr>
-        <w:t>¿Qué son los microservicios? Ventajas de la arquitectura de microservi</w:t>
+        <w:t>¿Qué son los microservicios? Ventajas de la arquitectura de microservicios</w:t>
+      </w:r>
+      <w:r>
+        <w:t>. https://www.redhat.com/es/topics/microservices/what-are-microservices</w:t>
+      </w:r>
+    </w:p>
+    <w:p>
+      <w:pPr>
+        <w:pStyle w:val="parrafoApa"/>
+        <w:ind w:left="720" w:hanging="720"/>
+      </w:pPr>
+      <w:r>
+        <w:t>Richardson,</w:t>
+      </w:r>
+      <w:r>
+        <w:t xml:space="preserve"> C. (2018). </w:t>
       </w:r>
       <w:r>
         <w:rPr>
           <w:i/>
         </w:rPr>
-        <w:t>cios</w:t>
-      </w:r>
-      <w:r>
-        <w:t>. https://www.redhat.com/es/topics/microservices/what-are-microservices</w:t>
-      </w:r>
-    </w:p>
-    <w:p>
-      <w:pPr>
-        <w:pStyle w:val="parrafoApa"/>
-        <w:ind w:left="720" w:hanging="720"/>
-      </w:pPr>
-      <w:r>
-        <w:t xml:space="preserve">Redwerk. (2025). </w:t>
-      </w:r>
-      <w:r>
-        <w:rPr>
-          <w:i/>
-        </w:rPr>
-        <w:t>Arquitectura monolítica frente a la de microservicios para .NET</w:t>
-      </w:r>
-      <w:r>
-        <w:t>. https://redwerk.es/blog/arquitectura-monolitica-vs-microservicios/</w:t>
-      </w:r>
-    </w:p>
-    <w:p>
-      <w:pPr>
-        <w:pStyle w:val="parrafoApa"/>
-        <w:ind w:left="720" w:hanging="720"/>
-      </w:pPr>
-      <w:r>
-        <w:t xml:space="preserve">Richardson, C. (2018). </w:t>
-      </w:r>
-      <w:r>
-        <w:rPr>
-          <w:i/>
-        </w:rPr>
-        <w:t>Microser</w:t>
-      </w:r>
-      <w:r>
-        <w:rPr>
-          <w:i/>
-        </w:rPr>
-        <w:t>vices patterns: With examples in Java</w:t>
+        <w:t>Microservices patterns: With examples in Java</w:t>
       </w:r>
       <w:r>
         <w:t>. Manning.</w:t>
@@ -6017,10 +6006,10 @@
         <w:t>Arquitectura de software: Principios, patrones y evaluación. Unidad 1: Principios de arquitectura de software</w:t>
       </w:r>
       <w:r>
-        <w:t xml:space="preserve"> [Material del curso Arquitectura de Software]. Institución de Edu</w:t>
-      </w:r>
-      <w:r>
-        <w:t>cación Superior Tecnológica del Oriente.</w:t>
+        <w:t xml:space="preserve"> [Material del curso Arquitectura de Software]</w:t>
+      </w:r>
+      <w:r>
+        <w:t>. Institución de Educación Superior Tecnológica del Oriente.</w:t>
       </w:r>
     </w:p>
     <w:sectPr>

</xml_diff>

<commit_message>
Ajusta la entrega a trabajo individual
Portada del informe con un solo autor y la línea del video, como en los
informes individuales anteriores; presentación y guion en primera persona
del singular; el README y los documentos ya no mencionan un equipo autor.

Co-Authored-By: Claude Opus 5.5 <noreply@anthropic.com>
</commit_message>
<xml_diff>
--- a/docs/informe/Informe-AulaNube.docx
+++ b/docs/informe/Informe-AulaNube.docx
@@ -12,7 +12,7 @@
           <w:noProof/>
         </w:rPr>
         <w:drawing>
-          <wp:inline distT="0" distB="0" distL="0" distR="0" wp14:anchorId="6E61DE26" wp14:editId="3B943C95">
+          <wp:inline distT="0" distB="0" distL="0" distR="0" wp14:anchorId="10449095" wp14:editId="316B586E">
             <wp:extent cx="3143250" cy="857250"/>
             <wp:effectExtent l="0" t="0" r="0" b="0"/>
             <wp:docPr id="1" name="Picture 1"/>
@@ -72,42 +72,7 @@
         <w:jc w:val="center"/>
       </w:pPr>
       <w:r>
-        <w:rPr>
-          <w:b/>
-        </w:rPr>
-        <w:t>[GRUPO N]</w:t>
-      </w:r>
-    </w:p>
-    <w:p>
-      <w:pPr>
-        <w:jc w:val="center"/>
-      </w:pPr>
-      <w:r>
         <w:t>Augusto César Cañola Ortiz</w:t>
-      </w:r>
-    </w:p>
-    <w:p>
-      <w:pPr>
-        <w:jc w:val="center"/>
-      </w:pPr>
-      <w:r>
-        <w:t>[Nombre del integrante]</w:t>
-      </w:r>
-    </w:p>
-    <w:p>
-      <w:pPr>
-        <w:jc w:val="center"/>
-      </w:pPr>
-      <w:r>
-        <w:t>[Nombre del integrante]</w:t>
-      </w:r>
-    </w:p>
-    <w:p>
-      <w:pPr>
-        <w:jc w:val="center"/>
-      </w:pPr>
-      <w:r>
-        <w:t>[Nombre del integrante]</w:t>
       </w:r>
     </w:p>
     <w:p/>
@@ -143,12 +108,21 @@
         <w:t>Octubre de 2026</w:t>
       </w:r>
     </w:p>
+    <w:p/>
+    <w:p>
+      <w:pPr>
+        <w:jc w:val="center"/>
+      </w:pPr>
+      <w:r>
+        <w:t>Video de presentación del informe: [enlace de YouTube]</w:t>
+      </w:r>
+    </w:p>
     <w:p>
       <w:pPr>
         <w:pStyle w:val="Ttulo1"/>
         <w:pageBreakBefore/>
       </w:pPr>
-      <w:bookmarkStart w:id="0" w:name="_Toc243492201"/>
+      <w:bookmarkStart w:id="0" w:name="_Toc243593627"/>
       <w:r>
         <w:lastRenderedPageBreak/>
         <w:t>Resumen</w:t>
@@ -160,22 +134,19 @@
         <w:pStyle w:val="parrafoApa"/>
       </w:pPr>
       <w:r>
-        <w:t>Este informe presenta la arquitectura propuesta para CapacitaPro S.A.S., empresa ficticia que ofrece capaci</w:t>
+        <w:t>Este informe presenta la arquitectura propuesta para CapacitaPro S.A.S., empresa ficticia que ofrece capacitación virtual obligatoria a 38 empresa</w:t>
       </w:r>
       <w:r>
-        <w:t>tación virtual obligatoria a 38 empresas cliente con una instalación de WordPress por cliente, modelo que colapsa en los cierres de campaña, hace esperar al usuario mientras se genera el certificado y multiplica el mantenimiento. A partir del análisis de r</w:t>
+        <w:t>s cliente con una instalación de WordPress por cliente, modelo que colapsa en los cierres de campaña, hace esperar al usuario mientras se genera el certificado y multiplica el mantenimiento. A partir del análisis de requisitos se formularon diez escenarios</w:t>
       </w:r>
       <w:r>
-        <w:t>equisitos se formularon diez escenarios de calidad medibles que orientaron el diseño de AulaNube, una plataforma multiempresa basada en microservicios, con un API Gateway, una base de datos por servicio y eventos asíncronos en Redis Streams. La arquitectur</w:t>
+        <w:t xml:space="preserve"> de calidad medibles que orientaron el diseño de AulaNube, una plataforma multiempresa basada en microservicios, con un API Gateway, una base de datos por servicio y eventos asíncronos en Redis Streams. La arquitectura se documentó con diagramas UML de cas</w:t>
       </w:r>
       <w:r>
-        <w:t>a se documentó con diagramas UML de casos de uso, clases, secuencia y despliegue, y se justificaron patrones de diseño para la nube como Transactional Outbox, Queue-Based Load Leveling, Competing Consumers y Circuit Breaker. El prototipo se desplegó en Ora</w:t>
+        <w:t>os de uso, clases, secuencia y despliegue, y se justificaron patrones de diseño para la nube como Transactional Outbox, Queue-Based Load Leveling, Competing Consumers y Circuit Breaker. El prototipo se desplegó en Oracle Cloud Infrastructure, sobre un clús</w:t>
       </w:r>
       <w:r>
-        <w:t>cle Cloud Infrastructure, sobre un clúster K3s de dos nodos Ampere A1 de la capa gratuita, y las mediciones confirmaron los escenarios: una campaña masiva responde en menos de 300 ms, el gateway responde en 110 ms con un servicio caído y ningún certificado</w:t>
-      </w:r>
-      <w:r>
-        <w:t xml:space="preserve"> se pierde cuando falla el trabajador.</w:t>
+        <w:t>ter K3s de dos nodos Ampere A1 de la capa gratuita, y las mediciones confirmaron los escenarios: una campaña masiva responde en menos de 300 ms, el gateway responde en 110 ms con un servicio caído y ningún certificado se pierde cuando falla el trabajador.</w:t>
       </w:r>
     </w:p>
     <w:p>
@@ -183,7 +154,7 @@
         <w:pStyle w:val="Ttulo1"/>
         <w:pageBreakBefore/>
       </w:pPr>
-      <w:bookmarkStart w:id="1" w:name="_Toc243492202"/>
+      <w:bookmarkStart w:id="1" w:name="_Toc243593628"/>
       <w:r>
         <w:lastRenderedPageBreak/>
         <w:t>Tabla de contenido</w:t>
@@ -212,7 +183,7 @@
       <w:r>
         <w:fldChar w:fldCharType="separate"/>
       </w:r>
-      <w:hyperlink w:anchor="_Toc243492201" w:history="1">
+      <w:hyperlink w:anchor="_Toc243593627" w:history="1">
         <w:r>
           <w:rPr>
             <w:rStyle w:val="Hipervnculo"/>
@@ -240,7 +211,7 @@
             <w:noProof/>
             <w:webHidden/>
           </w:rPr>
-          <w:instrText xml:space="preserve"> PAGEREF _Toc243492201 \h </w:instrText>
+          <w:instrText xml:space="preserve"> PAGEREF _Toc243593627 \h </w:instrText>
         </w:r>
         <w:r>
           <w:rPr>
@@ -284,7 +255,7 @@
           <w:lang w:val="es-CO" w:eastAsia="es-CO"/>
         </w:rPr>
       </w:pPr>
-      <w:hyperlink w:anchor="_Toc243492202" w:history="1">
+      <w:hyperlink w:anchor="_Toc243593628" w:history="1">
         <w:r>
           <w:rPr>
             <w:rStyle w:val="Hipervnculo"/>
@@ -312,7 +283,7 @@
             <w:noProof/>
             <w:webHidden/>
           </w:rPr>
-          <w:instrText xml:space="preserve"> PAGEREF _Toc243492202 \h </w:instrText>
+          <w:instrText xml:space="preserve"> PAGEREF _Toc243593628 \h </w:instrText>
         </w:r>
         <w:r>
           <w:rPr>
@@ -356,7 +327,7 @@
           <w:lang w:val="es-CO" w:eastAsia="es-CO"/>
         </w:rPr>
       </w:pPr>
-      <w:hyperlink w:anchor="_Toc243492203" w:history="1">
+      <w:hyperlink w:anchor="_Toc243593629" w:history="1">
         <w:r>
           <w:rPr>
             <w:rStyle w:val="Hipervnculo"/>
@@ -384,7 +355,7 @@
             <w:noProof/>
             <w:webHidden/>
           </w:rPr>
-          <w:instrText xml:space="preserve"> PAGEREF _Toc243492203 \h </w:instrText>
+          <w:instrText xml:space="preserve"> PAGEREF _Toc243593629 \h </w:instrText>
         </w:r>
         <w:r>
           <w:rPr>
@@ -428,7 +399,7 @@
           <w:lang w:val="es-CO" w:eastAsia="es-CO"/>
         </w:rPr>
       </w:pPr>
-      <w:hyperlink w:anchor="_Toc243492204" w:history="1">
+      <w:hyperlink w:anchor="_Toc243593630" w:history="1">
         <w:r>
           <w:rPr>
             <w:rStyle w:val="Hipervnculo"/>
@@ -456,7 +427,7 @@
             <w:noProof/>
             <w:webHidden/>
           </w:rPr>
-          <w:instrText xml:space="preserve"> PAGEREF _Toc243492204 \h </w:instrText>
+          <w:instrText xml:space="preserve"> PAGEREF _Toc243593630 \h </w:instrText>
         </w:r>
         <w:r>
           <w:rPr>
@@ -500,7 +471,7 @@
           <w:lang w:val="es-CO" w:eastAsia="es-CO"/>
         </w:rPr>
       </w:pPr>
-      <w:hyperlink w:anchor="_Toc243492205" w:history="1">
+      <w:hyperlink w:anchor="_Toc243593631" w:history="1">
         <w:r>
           <w:rPr>
             <w:rStyle w:val="Hipervnculo"/>
@@ -528,7 +499,7 @@
             <w:noProof/>
             <w:webHidden/>
           </w:rPr>
-          <w:instrText xml:space="preserve"> PAGEREF _Toc243492205 \h </w:instrText>
+          <w:instrText xml:space="preserve"> PAGEREF _Toc243593631 \h </w:instrText>
         </w:r>
         <w:r>
           <w:rPr>
@@ -572,7 +543,7 @@
           <w:lang w:val="es-CO" w:eastAsia="es-CO"/>
         </w:rPr>
       </w:pPr>
-      <w:hyperlink w:anchor="_Toc243492206" w:history="1">
+      <w:hyperlink w:anchor="_Toc243593632" w:history="1">
         <w:r>
           <w:rPr>
             <w:rStyle w:val="Hipervnculo"/>
@@ -600,7 +571,7 @@
             <w:noProof/>
             <w:webHidden/>
           </w:rPr>
-          <w:instrText xml:space="preserve"> PAGEREF _Toc243492206 \h </w:instrText>
+          <w:instrText xml:space="preserve"> PAGEREF _Toc243593632 \h </w:instrText>
         </w:r>
         <w:r>
           <w:rPr>
@@ -644,7 +615,7 @@
           <w:lang w:val="es-CO" w:eastAsia="es-CO"/>
         </w:rPr>
       </w:pPr>
-      <w:hyperlink w:anchor="_Toc243492207" w:history="1">
+      <w:hyperlink w:anchor="_Toc243593633" w:history="1">
         <w:r>
           <w:rPr>
             <w:rStyle w:val="Hipervnculo"/>
@@ -672,7 +643,7 @@
             <w:noProof/>
             <w:webHidden/>
           </w:rPr>
-          <w:instrText xml:space="preserve"> PAGEREF _Toc243492207 \h </w:instrText>
+          <w:instrText xml:space="preserve"> PAGEREF _Toc243593633 \h </w:instrText>
         </w:r>
         <w:r>
           <w:rPr>
@@ -716,7 +687,7 @@
           <w:lang w:val="es-CO" w:eastAsia="es-CO"/>
         </w:rPr>
       </w:pPr>
-      <w:hyperlink w:anchor="_Toc243492208" w:history="1">
+      <w:hyperlink w:anchor="_Toc243593634" w:history="1">
         <w:r>
           <w:rPr>
             <w:rStyle w:val="Hipervnculo"/>
@@ -744,7 +715,7 @@
             <w:noProof/>
             <w:webHidden/>
           </w:rPr>
-          <w:instrText xml:space="preserve"> PAGEREF _Toc243492208 \h </w:instrText>
+          <w:instrText xml:space="preserve"> PAGEREF _Toc243593634 \h </w:instrText>
         </w:r>
         <w:r>
           <w:rPr>
@@ -788,7 +759,7 @@
           <w:lang w:val="es-CO" w:eastAsia="es-CO"/>
         </w:rPr>
       </w:pPr>
-      <w:hyperlink w:anchor="_Toc243492209" w:history="1">
+      <w:hyperlink w:anchor="_Toc243593635" w:history="1">
         <w:r>
           <w:rPr>
             <w:rStyle w:val="Hipervnculo"/>
@@ -816,7 +787,7 @@
             <w:noProof/>
             <w:webHidden/>
           </w:rPr>
-          <w:instrText xml:space="preserve"> PAGEREF _Toc243492209 \h </w:instrText>
+          <w:instrText xml:space="preserve"> PAGEREF _Toc243593635 \h </w:instrText>
         </w:r>
         <w:r>
           <w:rPr>
@@ -860,7 +831,7 @@
           <w:lang w:val="es-CO" w:eastAsia="es-CO"/>
         </w:rPr>
       </w:pPr>
-      <w:hyperlink w:anchor="_Toc243492210" w:history="1">
+      <w:hyperlink w:anchor="_Toc243593636" w:history="1">
         <w:r>
           <w:rPr>
             <w:rStyle w:val="Hipervnculo"/>
@@ -888,7 +859,7 @@
             <w:noProof/>
             <w:webHidden/>
           </w:rPr>
-          <w:instrText xml:space="preserve"> PAGEREF _Toc243492210 \h </w:instrText>
+          <w:instrText xml:space="preserve"> PAGEREF _Toc243593636 \h </w:instrText>
         </w:r>
         <w:r>
           <w:rPr>
@@ -932,7 +903,7 @@
           <w:lang w:val="es-CO" w:eastAsia="es-CO"/>
         </w:rPr>
       </w:pPr>
-      <w:hyperlink w:anchor="_Toc243492211" w:history="1">
+      <w:hyperlink w:anchor="_Toc243593637" w:history="1">
         <w:r>
           <w:rPr>
             <w:rStyle w:val="Hipervnculo"/>
@@ -960,7 +931,7 @@
             <w:noProof/>
             <w:webHidden/>
           </w:rPr>
-          <w:instrText xml:space="preserve"> PAGEREF _Toc243492211 \h </w:instrText>
+          <w:instrText xml:space="preserve"> PAGEREF _Toc243593637 \h </w:instrText>
         </w:r>
         <w:r>
           <w:rPr>
@@ -1004,7 +975,7 @@
           <w:lang w:val="es-CO" w:eastAsia="es-CO"/>
         </w:rPr>
       </w:pPr>
-      <w:hyperlink w:anchor="_Toc243492212" w:history="1">
+      <w:hyperlink w:anchor="_Toc243593638" w:history="1">
         <w:r>
           <w:rPr>
             <w:rStyle w:val="Hipervnculo"/>
@@ -1032,7 +1003,7 @@
             <w:noProof/>
             <w:webHidden/>
           </w:rPr>
-          <w:instrText xml:space="preserve"> PAGEREF _Toc243492212 \h </w:instrText>
+          <w:instrText xml:space="preserve"> PAGEREF _Toc243593638 \h </w:instrText>
         </w:r>
         <w:r>
           <w:rPr>
@@ -1076,7 +1047,7 @@
           <w:lang w:val="es-CO" w:eastAsia="es-CO"/>
         </w:rPr>
       </w:pPr>
-      <w:hyperlink w:anchor="_Toc243492213" w:history="1">
+      <w:hyperlink w:anchor="_Toc243593639" w:history="1">
         <w:r>
           <w:rPr>
             <w:rStyle w:val="Hipervnculo"/>
@@ -1104,7 +1075,7 @@
             <w:noProof/>
             <w:webHidden/>
           </w:rPr>
-          <w:instrText xml:space="preserve"> PAGEREF _Toc243492213 \h </w:instrText>
+          <w:instrText xml:space="preserve"> PAGEREF _Toc243593639 \h </w:instrText>
         </w:r>
         <w:r>
           <w:rPr>
@@ -1148,7 +1119,7 @@
           <w:lang w:val="es-CO" w:eastAsia="es-CO"/>
         </w:rPr>
       </w:pPr>
-      <w:hyperlink w:anchor="_Toc243492214" w:history="1">
+      <w:hyperlink w:anchor="_Toc243593640" w:history="1">
         <w:r>
           <w:rPr>
             <w:rStyle w:val="Hipervnculo"/>
@@ -1176,7 +1147,7 @@
             <w:noProof/>
             <w:webHidden/>
           </w:rPr>
-          <w:instrText xml:space="preserve"> PAGEREF _Toc243492214 \h </w:instrText>
+          <w:instrText xml:space="preserve"> PAGEREF _Toc243593640 \h </w:instrText>
         </w:r>
         <w:r>
           <w:rPr>
@@ -1220,7 +1191,7 @@
           <w:lang w:val="es-CO" w:eastAsia="es-CO"/>
         </w:rPr>
       </w:pPr>
-      <w:hyperlink w:anchor="_Toc243492215" w:history="1">
+      <w:hyperlink w:anchor="_Toc243593641" w:history="1">
         <w:r>
           <w:rPr>
             <w:rStyle w:val="Hipervnculo"/>
@@ -1248,7 +1219,7 @@
             <w:noProof/>
             <w:webHidden/>
           </w:rPr>
-          <w:instrText xml:space="preserve"> PAGEREF _Toc243492215 \h </w:instrText>
+          <w:instrText xml:space="preserve"> PAGEREF _Toc243593641 \h </w:instrText>
         </w:r>
         <w:r>
           <w:rPr>
@@ -1292,7 +1263,7 @@
           <w:lang w:val="es-CO" w:eastAsia="es-CO"/>
         </w:rPr>
       </w:pPr>
-      <w:hyperlink w:anchor="_Toc243492216" w:history="1">
+      <w:hyperlink w:anchor="_Toc243593642" w:history="1">
         <w:r>
           <w:rPr>
             <w:rStyle w:val="Hipervnculo"/>
@@ -1320,7 +1291,7 @@
             <w:noProof/>
             <w:webHidden/>
           </w:rPr>
-          <w:instrText xml:space="preserve"> PAGEREF _Toc243492216 \h </w:instrText>
+          <w:instrText xml:space="preserve"> PAGEREF _Toc243593642 \h </w:instrText>
         </w:r>
         <w:r>
           <w:rPr>
@@ -1364,7 +1335,7 @@
           <w:lang w:val="es-CO" w:eastAsia="es-CO"/>
         </w:rPr>
       </w:pPr>
-      <w:hyperlink w:anchor="_Toc243492217" w:history="1">
+      <w:hyperlink w:anchor="_Toc243593643" w:history="1">
         <w:r>
           <w:rPr>
             <w:rStyle w:val="Hipervnculo"/>
@@ -1392,7 +1363,7 @@
             <w:noProof/>
             <w:webHidden/>
           </w:rPr>
-          <w:instrText xml:space="preserve"> PAGEREF _Toc243492217 \h </w:instrText>
+          <w:instrText xml:space="preserve"> PAGEREF _Toc243593643 \h </w:instrText>
         </w:r>
         <w:r>
           <w:rPr>
@@ -1433,13 +1404,10 @@
         <w:pStyle w:val="Ttulo1"/>
         <w:pageBreakBefore/>
       </w:pPr>
-      <w:bookmarkStart w:id="2" w:name="_Toc243492203"/>
+      <w:bookmarkStart w:id="2" w:name="_Toc243593629"/>
       <w:r>
         <w:lastRenderedPageBreak/>
-        <w:t>AulaNube: arquitectura de microservicios en la nube para la plataforma de capacitación corporativa de CapacitaPro S.A.</w:t>
-      </w:r>
-      <w:r>
-        <w:t>S.</w:t>
+        <w:t>AulaNube: arquitectura de microservicios en la nube para la plataforma de capacitación corporativa de CapacitaPro S.A.S.</w:t>
       </w:r>
       <w:bookmarkEnd w:id="2"/>
     </w:p>
@@ -1448,10 +1416,13 @@
         <w:pStyle w:val="parrafoApa"/>
       </w:pPr>
       <w:r>
-        <w:t>Según la norma IEEE 1471-2000, adoptada después como ISO/IEC 42010, la arquitectura de software es la organización fundamental de un sistema, manifestada en sus componentes, las relaciones entre ellos y con su entorno, y los principios que guían su dise</w:t>
+        <w:t>Según la norma IEEE 1471-2000, adopt</w:t>
       </w:r>
       <w:r>
-        <w:t>ño y evolución (Tecnológica del Oriente, 2026). Como estas decisiones se toman al inicio y cambiarlas después es costoso y riesgoso, deben responder a los atributos de calidad que el negocio necesita y no solo a la funcionalidad (Bass et al., 2012).</w:t>
+        <w:t>ada después como ISO/IEC 42010, la arquitectura de software es la organización fundamental de un sistema, manifestada en sus componentes, las relaciones entre ellos y con su entorno, y los principios que guían su diseño y evolución (Tecnológica del Oriente</w:t>
+      </w:r>
+      <w:r>
+        <w:t>, 2026). Como estas decisiones se toman al inicio y cambiarlas después es costoso y riesgoso, deben responder a los atributos de calidad que el negocio necesita y no solo a la funcionalidad (Bass et al., 2012).</w:t>
       </w:r>
     </w:p>
     <w:p>
@@ -1459,20 +1430,20 @@
         <w:pStyle w:val="parrafoApa"/>
       </w:pPr>
       <w:r>
-        <w:t>El inf</w:t>
+        <w:t>El informe presenta la solución propuesta par</w:t>
       </w:r>
       <w:r>
-        <w:t>orme presenta la solución del equipo para CapacitaPro S.A.S.: el caso y sus requisitos, la arquitectura propuesta, su modelado en UML, los patrones de diseño seleccionados y el prototipo desplegado en la nube con las pruebas que comprueban cada decisión. E</w:t>
+        <w:t>a CapacitaPro S.A.S.: el caso y sus requisitos, la arquitectura propuesta, su modelado en UML, los patrones de diseño seleccionados y el prototipo desplegado en la nube con las pruebas que comprueban cada decisión. El código fuente y los diagramas están en</w:t>
       </w:r>
       <w:r>
-        <w:t>l código fuente y los diagramas están en https://github.com/augustocco/aulanube, y la aplicación funciona en https://aulanube.149-130-191-139.sslip.io.</w:t>
+        <w:t xml:space="preserve"> https://github.com/augustocco/aulanube, y la aplicación funciona en https://aulanube.149-130-191-139.sslip.io.</w:t>
       </w:r>
     </w:p>
     <w:p>
       <w:pPr>
         <w:pStyle w:val="Ttulo1"/>
       </w:pPr>
-      <w:bookmarkStart w:id="3" w:name="_Toc243492204"/>
+      <w:bookmarkStart w:id="3" w:name="_Toc243593630"/>
       <w:r>
         <w:t>Caso de estudio: CapacitaPro S.A.S.</w:t>
       </w:r>
@@ -1483,13 +1454,13 @@
         <w:pStyle w:val="parrafoApa"/>
       </w:pPr>
       <w:r>
-        <w:t>CapacitaPro S.A.S. es una empresa ficticia de Bucaramanga que diseña</w:t>
+        <w:t>CapacitaPro S.A.S. es una empresa ficticia de Bucaramanga que diseña y administra cursos virtuales que la le</w:t>
       </w:r>
       <w:r>
-        <w:t xml:space="preserve"> y administra cursos virtuales que la ley o los contratos hacen obligatorios: inducción al SG-SST, trabajo seguro en alturas, protección de datos personales y atención humanizada en salud. Atiende a 38 empresas cliente y unos 14.000 usuarios; cada cliente </w:t>
+        <w:t>y o los contratos hacen obligatorios: inducción al SG-SST, trabajo seguro en alturas, protección de datos personales y atención humanizada en salud. Atiende a 38 empresas cliente y unos 14.000 usuarios; cada cliente tiene su propia instalación de WordPress</w:t>
       </w:r>
       <w:r>
-        <w:t>tiene su propia instalación de WordPress con un plugin de LMS, repartidas en cinco servidores. La Tabla 1 resume los problemas de ese modelo.</w:t>
+        <w:t xml:space="preserve"> con un plugin de LMS, repartidas en cinco servidores. La Tabla 1 resume los problemas de ese modelo.</w:t>
       </w:r>
     </w:p>
     <w:p>
@@ -1630,10 +1601,10 @@
               <w:spacing w:line="240" w:lineRule="auto"/>
             </w:pPr>
             <w:r>
-              <w:t xml:space="preserve">Un </w:t>
+              <w:t xml:space="preserve">Un cierre de 1.100 trabajadores dejó el </w:t>
             </w:r>
             <w:r>
-              <w:t>cierre de 1.100 trabajadores dejó el servidor 40 minutos sin respuesta y afectó a otros siete clientes.</w:t>
+              <w:t>servidor 40 minutos sin respuesta y afectó a otros siete clientes.</w:t>
             </w:r>
           </w:p>
         </w:tc>
@@ -1715,10 +1686,7 @@
               <w:spacing w:line="240" w:lineRule="auto"/>
             </w:pPr>
             <w:r>
-              <w:t>Correo qu</w:t>
-            </w:r>
-            <w:r>
-              <w:t>e bloquea la operación</w:t>
+              <w:t>Correo que bloquea la operación</w:t>
             </w:r>
           </w:p>
         </w:tc>
@@ -1742,7 +1710,10 @@
               <w:spacing w:line="240" w:lineRule="auto"/>
             </w:pPr>
             <w:r>
-              <w:t>Cursos terminados que no quedan registrados porque el servidor de correo tardó.</w:t>
+              <w:t>Cursos termina</w:t>
+            </w:r>
+            <w:r>
+              <w:t>dos que no quedan registrados porque el servidor de correo tardó.</w:t>
             </w:r>
           </w:p>
         </w:tc>
@@ -1820,10 +1791,7 @@
               <w:spacing w:line="240" w:lineRule="auto"/>
             </w:pPr>
             <w:r>
-              <w:t xml:space="preserve">Sin verificación de </w:t>
-            </w:r>
-            <w:r>
-              <w:t>certificados</w:t>
+              <w:t>Sin verificación de certificados</w:t>
             </w:r>
           </w:p>
         </w:tc>
@@ -1843,7 +1811,10 @@
               <w:spacing w:line="240" w:lineRule="auto"/>
             </w:pPr>
             <w:r>
-              <w:t>Auditores y contratantes piden confirmación por correo, lo que tarda días.</w:t>
+              <w:t xml:space="preserve">Auditores y contratantes piden </w:t>
+            </w:r>
+            <w:r>
+              <w:t>confirmación por correo, lo que tarda días.</w:t>
             </w:r>
           </w:p>
         </w:tc>
@@ -1872,20 +1843,17 @@
         <w:pStyle w:val="parrafoApa"/>
       </w:pPr>
       <w:r>
-        <w:t xml:space="preserve">La gerencia pide una sola plataforma multiempresa en la que cada cliente vea solo su información, que el cierre </w:t>
+        <w:t>La gerencia pide una sola plataforma multiempresa en la que cada cliente vea solo su información, que el cierre de campaña de un cliente no afecte a los dem</w:t>
       </w:r>
       <w:r>
-        <w:t>de campaña de un cliente no afecte a los demás, certificados verificables por terceros, que la caída de una parte no detenga el resto, crecer por partes, bajo costo durante el piloto y cumplir la Ley 1581 de 2012 (Congreso de la República de Colombia, 2012</w:t>
-      </w:r>
-      <w:r>
-        <w:t>).</w:t>
+        <w:t>ás, certificados verificables por terceros, que la caída de una parte no detenga el resto, crecer por partes, bajo costo durante el piloto y cumplir la Ley 1581 de 2012 (Congreso de la República de Colombia, 2012).</w:t>
       </w:r>
     </w:p>
     <w:p>
       <w:pPr>
         <w:pStyle w:val="Ttulo1"/>
       </w:pPr>
-      <w:bookmarkStart w:id="4" w:name="_Toc243492205"/>
+      <w:bookmarkStart w:id="4" w:name="_Toc243593631"/>
       <w:r>
         <w:t>Análisis de requisitos</w:t>
       </w:r>
@@ -1896,10 +1864,13 @@
         <w:pStyle w:val="parrafoApa"/>
       </w:pPr>
       <w:r>
-        <w:t xml:space="preserve">Se aplicaron cuatro técnicas: análisis documental del caso; una entrevista simulada en la que el equipo representó a la gerencia, a una administradora de empresa cliente y a un colaborador; historias de usuario priorizadas con el </w:t>
+        <w:t>Se aplicaron cuatr</w:t>
       </w:r>
       <w:r>
-        <w:t>método MoSCoW, y escenarios de atributos de calidad, que expresan cada requisito no funcional con un estímulo y una medida de respuesta verificable (Bass et al., 2012). Las Tablas 2 y 3 presentan el resultado.</w:t>
+        <w:t>o técnicas: análisis documental del caso; una entrevista simulada con tres interesados (la gerencia, una administradora de empresa cliente y un colaborador); historias de usuario priorizadas con el método MoSCoW, y escenarios de atributos de calidad, que e</w:t>
+      </w:r>
+      <w:r>
+        <w:t>xpresan cada requisito no funcional con un estímulo y una medida de respuesta verificable (Bass et al., 2012). Las Tablas 2 y 3 presentan el resultado.</w:t>
       </w:r>
     </w:p>
     <w:p>
@@ -2065,7 +2036,10 @@
               <w:spacing w:line="240" w:lineRule="auto"/>
             </w:pPr>
             <w:r>
-              <w:t>Como usuario quiero iniciar sesión para acceder a la plataforma de mi empresa.</w:t>
+              <w:t xml:space="preserve">Como usuario quiero iniciar </w:t>
+            </w:r>
+            <w:r>
+              <w:t>sesión para acceder a la plataforma de mi empresa.</w:t>
             </w:r>
           </w:p>
         </w:tc>
@@ -2219,10 +2193,7 @@
               <w:spacing w:line="240" w:lineRule="auto"/>
             </w:pPr>
             <w:r>
-              <w:t xml:space="preserve">Como estudiante </w:t>
-            </w:r>
-            <w:r>
-              <w:t>quiero un certificado PDF con código único al completar un curso.</w:t>
+              <w:t>Como estudiante quiero un certificado PDF con código único al completar un curso.</w:t>
             </w:r>
           </w:p>
         </w:tc>
@@ -2376,10 +2347,7 @@
               <w:spacing w:line="240" w:lineRule="auto"/>
             </w:pPr>
             <w:r>
-              <w:t>Como verificador externo quiero consultar un certificado por su código, sin cu</w:t>
-            </w:r>
-            <w:r>
-              <w:t>enta.</w:t>
+              <w:t>Como verificador externo quiero consultar un certificado por su código, sin cuenta.</w:t>
             </w:r>
           </w:p>
         </w:tc>
@@ -2456,7 +2424,10 @@
               <w:spacing w:line="240" w:lineRule="auto"/>
             </w:pPr>
             <w:r>
-              <w:t>Como administrador quiero crear cursos, registrar colaboradores y ver su avance.</w:t>
+              <w:t>Como administrador quiero crear cursos, registrar</w:t>
+            </w:r>
+            <w:r>
+              <w:t xml:space="preserve"> colaboradores y ver su avance.</w:t>
             </w:r>
           </w:p>
         </w:tc>
@@ -2602,10 +2573,7 @@
               <w:spacing w:line="240" w:lineRule="auto"/>
             </w:pPr>
             <w:r>
-              <w:t xml:space="preserve">Como equipo técnico quiero ver la salud de los </w:t>
-            </w:r>
-            <w:r>
-              <w:t>servicios y la cola de eventos.</w:t>
+              <w:t>Como equipo técnico quiero ver la salud de los servicios y la cola de eventos.</w:t>
             </w:r>
           </w:p>
         </w:tc>
@@ -2646,7 +2614,13 @@
         <w:rPr>
           <w:sz w:val="20"/>
         </w:rPr>
-        <w:t>Cada requisito se traza a un caso de uso de la Figura 2.</w:t>
+        <w:t xml:space="preserve">Cada requisito se traza a </w:t>
+      </w:r>
+      <w:r>
+        <w:rPr>
+          <w:sz w:val="20"/>
+        </w:rPr>
+        <w:t>un caso de uso de la Figura 2.</w:t>
       </w:r>
     </w:p>
     <w:p>
@@ -2836,10 +2810,10 @@
               <w:spacing w:line="240" w:lineRule="auto"/>
             </w:pPr>
             <w:r>
-              <w:t xml:space="preserve">150 </w:t>
+              <w:t xml:space="preserve">150 cursos terminados en un minuto: respuesta &lt; 1 s y todos los </w:t>
             </w:r>
             <w:r>
-              <w:t>cursos terminados en un minuto: respuesta &lt; 1 s y todos los certificados emitidos.</w:t>
+              <w:t>certificados emitidos.</w:t>
             </w:r>
           </w:p>
         </w:tc>
@@ -2993,10 +2967,7 @@
               <w:spacing w:line="240" w:lineRule="auto"/>
             </w:pPr>
             <w:r>
-              <w:t xml:space="preserve">Con certificados caído, los demás servicios </w:t>
-            </w:r>
-            <w:r>
-              <w:t>responden y el gateway contesta en &lt; 300 ms.</w:t>
+              <w:t>Con certificados caído, los demás servicios responden y el gateway contesta en &lt; 300 ms.</w:t>
             </w:r>
           </w:p>
         </w:tc>
@@ -3203,10 +3174,7 @@
               <w:spacing w:line="240" w:lineRule="auto"/>
             </w:pPr>
             <w:r>
-              <w:t>Eq</w:t>
-            </w:r>
-            <w:r>
-              <w:t>uidad</w:t>
+              <w:t>Equidad</w:t>
             </w:r>
           </w:p>
         </w:tc>
@@ -3230,7 +3198,10 @@
               <w:spacing w:line="240" w:lineRule="auto"/>
             </w:pPr>
             <w:r>
-              <w:t>Una empresa que supera 20 solicitudes por segundo recibe 429 sin afectar a las demás.</w:t>
+              <w:t>Una empresa que supera 20 solicitudes por segu</w:t>
+            </w:r>
+            <w:r>
+              <w:t>ndo recibe 429 sin afectar a las demás.</w:t>
             </w:r>
           </w:p>
         </w:tc>
@@ -3372,10 +3343,7 @@
               <w:spacing w:line="240" w:lineRule="auto"/>
             </w:pPr>
             <w:r>
-              <w:t xml:space="preserve">La infraestructura del piloto se mantiene en la capa </w:t>
-            </w:r>
-            <w:r>
-              <w:t>gratuita del proveedor.</w:t>
+              <w:t>La infraestructura del piloto se mantiene en la capa gratuita del proveedor.</w:t>
             </w:r>
           </w:p>
         </w:tc>
@@ -3396,14 +3364,20 @@
         <w:rPr>
           <w:sz w:val="20"/>
         </w:rPr>
-        <w:t>Elaboración propia con el formato de escenarios de calidad de Bass et al. (2012).</w:t>
+        <w:t xml:space="preserve">Elaboración propia </w:t>
+      </w:r>
+      <w:r>
+        <w:rPr>
+          <w:sz w:val="20"/>
+        </w:rPr>
+        <w:t>con el formato de escenarios de calidad de Bass et al. (2012).</w:t>
       </w:r>
     </w:p>
     <w:p>
       <w:pPr>
         <w:pStyle w:val="Ttulo1"/>
       </w:pPr>
-      <w:bookmarkStart w:id="5" w:name="_Toc243492206"/>
+      <w:bookmarkStart w:id="5" w:name="_Toc243593632"/>
       <w:r>
         <w:t>Arquitectura propuesta</w:t>
       </w:r>
@@ -3413,7 +3387,7 @@
       <w:pPr>
         <w:pStyle w:val="Ttulo2"/>
       </w:pPr>
-      <w:bookmarkStart w:id="6" w:name="_Toc243492207"/>
+      <w:bookmarkStart w:id="6" w:name="_Toc243593633"/>
       <w:r>
         <w:t>Estilo arquitectónico</w:t>
       </w:r>
@@ -3424,16 +3398,13 @@
         <w:pStyle w:val="parrafoApa"/>
       </w:pPr>
       <w:r>
-        <w:t>Se eligió una arquitectura de microservicios con comunicación híbrida: REST síncrono para lo que e</w:t>
+        <w:t>Se eligió una arquitectura de microservicios con comunicación híbrida: REST síncrono para lo que el usuario consulta de inmediato y eventos asíncron</w:t>
       </w:r>
       <w:r>
-        <w:t>l usuario consulta de inmediato y eventos asíncronos para lo que puede ocurrir después, como emitir el certificado y avisar. Los escenarios RNF01 y RNF03 exigen escalar y aislar fallos por partes; un monolito modular, aunque más sencillo, escala y falla co</w:t>
+        <w:t>os para lo que puede ocurrir después, como emitir el certificado y avisar. Los escenarios RNF01 y RNF03 exigen escalar y aislar fallos por partes; un monolito modular, aunque más sencillo, escala y falla como una sola unidad, que es precisamente el problem</w:t>
       </w:r>
       <w:r>
-        <w:t>mo una sola unidad, que es precisamente el problema de CapacitaPro (Kinashchuk, 2020; Red Hat, 2023). La Figura 1 muestra la web, el API Gateway como única entrada y cuatro servicios con base de datos propia: identidad, cursos, certificados y notificacione</w:t>
-      </w:r>
-      <w:r>
-        <w:t>s.</w:t>
+        <w:t>a de CapacitaPro (Kinashchuk, 2020; Red Hat, 2023). La Figura 1 muestra la web, el API Gateway como única entrada y cuatro servicios con base de datos propia: identidad, cursos, certificados y notificaciones.</w:t>
       </w:r>
     </w:p>
     <w:p>
@@ -3457,7 +3428,13 @@
         <w:rPr>
           <w:i/>
         </w:rPr>
-        <w:t>Vista de componentes y conectores de AulaNube</w:t>
+        <w:t>Vista de componentes y conectores de A</w:t>
+      </w:r>
+      <w:r>
+        <w:rPr>
+          <w:i/>
+        </w:rPr>
+        <w:t>ulaNube</w:t>
       </w:r>
     </w:p>
     <w:p>
@@ -3471,7 +3448,7 @@
           <w:noProof/>
         </w:rPr>
         <w:drawing>
-          <wp:inline distT="0" distB="0" distL="0" distR="0" wp14:anchorId="40E505CF" wp14:editId="2D1C9C55">
+          <wp:inline distT="0" distB="0" distL="0" distR="0" wp14:anchorId="7E2C458E" wp14:editId="03755160">
             <wp:extent cx="4389120" cy="3149445"/>
             <wp:effectExtent l="0" t="0" r="0" b="0"/>
             <wp:docPr id="2" name="Picture 2"/>
@@ -3529,7 +3506,7 @@
       <w:pPr>
         <w:pStyle w:val="Ttulo2"/>
       </w:pPr>
-      <w:bookmarkStart w:id="7" w:name="_Toc243492208"/>
+      <w:bookmarkStart w:id="7" w:name="_Toc243593634"/>
       <w:r>
         <w:t>Relación con los principios de la unidad</w:t>
       </w:r>
@@ -3549,10 +3526,7 @@
         <w:t>alta cohesión</w:t>
       </w:r>
       <w:r>
-        <w:t xml:space="preserve"> porque cada servicio agrupa u</w:t>
-      </w:r>
-      <w:r>
-        <w:t xml:space="preserve">n solo concepto del dominio. Hay </w:t>
+        <w:t xml:space="preserve"> porque cada servicio agrupa un solo concepto del dominio. Hay </w:t>
       </w:r>
       <w:r>
         <w:rPr>
@@ -3580,20 +3554,20 @@
         <w:t>ocultamiento de información</w:t>
       </w:r>
       <w:r>
-        <w:t xml:space="preserve"> de </w:t>
+        <w:t xml:space="preserve"> de Parnas (1972): la base de cada servicio es un deta</w:t>
       </w:r>
       <w:r>
-        <w:t xml:space="preserve">Parnas (1972): la base de cada servicio es un detalle interno, por lo que trasladar los PDF a un almacenamiento de objetos no afectaría a otro módulo. Como compromisos se aceptaron la consistencia eventual del certificado, una sola instancia de PostgreSQL </w:t>
+        <w:t>lle interno, por lo que trasladar los PDF a un almacenamiento de objetos no afectaría a otro módulo. Como compromisos se aceptaron la consistencia eventual del certificado, una sola instancia de PostgreSQL con cuatro bases separadas y Redis Streams en luga</w:t>
       </w:r>
       <w:r>
-        <w:t>con cuatro bases separadas y Redis Streams en lugar de un bróker dedicado.</w:t>
+        <w:t>r de un bróker dedicado.</w:t>
       </w:r>
     </w:p>
     <w:p>
       <w:pPr>
         <w:pStyle w:val="Ttulo1"/>
       </w:pPr>
-      <w:bookmarkStart w:id="8" w:name="_Toc243492209"/>
+      <w:bookmarkStart w:id="8" w:name="_Toc243593635"/>
       <w:r>
         <w:t>Diseño de la arquitectura mediante UML</w:t>
       </w:r>
@@ -3611,14 +3585,7 @@
           <w:rFonts w:ascii="Consolas" w:hAnsi="Consolas"/>
           <w:sz w:val="21"/>
         </w:rPr>
-        <w:t>d</w:t>
-      </w:r>
-      <w:r>
-        <w:rPr>
-          <w:rFonts w:ascii="Consolas" w:hAnsi="Consolas"/>
-          <w:sz w:val="21"/>
-        </w:rPr>
-        <w:t>ocs/uml</w:t>
+        <w:t>docs/uml</w:t>
       </w:r>
       <w:r>
         <w:t xml:space="preserve"> del repositorio.</w:t>
@@ -3628,7 +3595,7 @@
       <w:pPr>
         <w:pStyle w:val="Ttulo2"/>
       </w:pPr>
-      <w:bookmarkStart w:id="9" w:name="_Toc243492210"/>
+      <w:bookmarkStart w:id="9" w:name="_Toc243593636"/>
       <w:r>
         <w:lastRenderedPageBreak/>
         <w:t>Diagrama de casos de uso</w:t>
@@ -3669,7 +3636,7 @@
           <w:noProof/>
         </w:rPr>
         <w:drawing>
-          <wp:inline distT="0" distB="0" distL="0" distR="0" wp14:anchorId="3DA64351" wp14:editId="2E715D7B">
+          <wp:inline distT="0" distB="0" distL="0" distR="0" wp14:anchorId="46BF7BDC" wp14:editId="3AFF724D">
             <wp:extent cx="5224812" cy="4206240"/>
             <wp:effectExtent l="0" t="0" r="0" b="0"/>
             <wp:docPr id="3" name="Picture 3"/>
@@ -3728,23 +3695,20 @@
         <w:pStyle w:val="parrafoApa"/>
       </w:pPr>
       <w:r>
-        <w:t xml:space="preserve">Participan el estudiante, el administrador de la empresa, un verificador externo sin cuenta y el sistema. «Completar curso» </w:t>
+        <w:t xml:space="preserve">Participan el estudiante, el administrador de la empresa, un verificador externo sin cuenta y el sistema. «Completar curso» incluye «Emitir certificado», que a su vez incluye </w:t>
       </w:r>
       <w:r>
-        <w:t>incluye «Emitir certificado», que a su vez incluye «Recibir avisos». Es relevante porque la emisión la dispara un evento y no una persona, lo que la señala como asíncrona, y porque el verificador obliga a una ruta pública controlada en el gateway.</w:t>
+        <w:t>«Recibir avisos». Es relevante porque la emisión la dispara un evento y no una persona, lo que la señala como asíncrona, y porque el verificador obliga a una ruta pública controlada en el gateway.</w:t>
       </w:r>
     </w:p>
     <w:p>
       <w:pPr>
         <w:pStyle w:val="Ttulo2"/>
       </w:pPr>
-      <w:bookmarkStart w:id="10" w:name="_Toc243492211"/>
+      <w:bookmarkStart w:id="10" w:name="_Toc243593637"/>
       <w:r>
         <w:lastRenderedPageBreak/>
-        <w:t>Diagrama</w:t>
-      </w:r>
-      <w:r>
-        <w:t xml:space="preserve"> de clases</w:t>
+        <w:t>Diagrama de clases</w:t>
       </w:r>
       <w:bookmarkEnd w:id="10"/>
     </w:p>
@@ -3782,7 +3746,7 @@
           <w:noProof/>
         </w:rPr>
         <w:drawing>
-          <wp:inline distT="0" distB="0" distL="0" distR="0" wp14:anchorId="4E1C1678" wp14:editId="2696CAD1">
+          <wp:inline distT="0" distB="0" distL="0" distR="0" wp14:anchorId="74D0C378" wp14:editId="07E7C816">
             <wp:extent cx="4865321" cy="4389119"/>
             <wp:effectExtent l="0" t="0" r="0" b="0"/>
             <wp:docPr id="4" name="Picture 4"/>
@@ -3841,10 +3805,7 @@
         <w:pStyle w:val="parrafoApa"/>
       </w:pPr>
       <w:r>
-        <w:t>Ninguna asociación cruza un paquete: entre servicios solo hay referencias lógicas o eventos, lo que comprueba la dec</w:t>
-      </w:r>
-      <w:r>
-        <w:t xml:space="preserve">isión de una base por servicio. </w:t>
+        <w:t xml:space="preserve">Ninguna asociación cruza un paquete: entre servicios solo hay referencias lógicas o eventos, lo que comprueba la decisión de una base por servicio. </w:t>
       </w:r>
       <w:r>
         <w:rPr>
@@ -3854,14 +3815,17 @@
         <w:t>RepositorioCursos</w:t>
       </w:r>
       <w:r>
-        <w:t xml:space="preserve"> impone el filtro por empresa, y las restricciones únicas de certificado y notificación evitan duplicados cuando un evento llega dos veces.</w:t>
+        <w:t xml:space="preserve"> i</w:t>
+      </w:r>
+      <w:r>
+        <w:t>mpone el filtro por empresa, y las restricciones únicas de certificado y notificación evitan duplicados cuando un evento llega dos veces.</w:t>
       </w:r>
     </w:p>
     <w:p>
       <w:pPr>
         <w:pStyle w:val="Ttulo2"/>
       </w:pPr>
-      <w:bookmarkStart w:id="11" w:name="_Toc243492212"/>
+      <w:bookmarkStart w:id="11" w:name="_Toc243593638"/>
       <w:r>
         <w:lastRenderedPageBreak/>
         <w:t>Diagrama de secuencia</w:t>
@@ -3888,13 +3852,7 @@
         <w:rPr>
           <w:i/>
         </w:rPr>
-        <w:t xml:space="preserve">Secuencia para completar un curso y </w:t>
-      </w:r>
-      <w:r>
-        <w:rPr>
-          <w:i/>
-        </w:rPr>
-        <w:t>obtener el certificado</w:t>
+        <w:t>Secuencia para completar un curso y obtener el certificado</w:t>
       </w:r>
     </w:p>
     <w:p>
@@ -3908,7 +3866,7 @@
           <w:noProof/>
         </w:rPr>
         <w:drawing>
-          <wp:inline distT="0" distB="0" distL="0" distR="0" wp14:anchorId="01EF89DF" wp14:editId="5D88F099">
+          <wp:inline distT="0" distB="0" distL="0" distR="0" wp14:anchorId="61F3A046" wp14:editId="5A5884AE">
             <wp:extent cx="5943600" cy="3956013"/>
             <wp:effectExtent l="0" t="0" r="0" b="0"/>
             <wp:docPr id="5" name="Picture 5"/>
@@ -3987,14 +3945,17 @@
         <w:t>certificado.emitido</w:t>
       </w:r>
       <w:r>
-        <w:t>. Así el usuario no espera (RNF02), el pico queda en la cola (RNF01) y ningún evento se pierde si Redis falla (RNF04).</w:t>
+        <w:t>. Así el</w:t>
+      </w:r>
+      <w:r>
+        <w:t xml:space="preserve"> usuario no espera (RNF02), el pico queda en la cola (RNF01) y ningún evento se pierde si Redis falla (RNF04).</w:t>
       </w:r>
     </w:p>
     <w:p>
       <w:pPr>
         <w:pStyle w:val="Ttulo2"/>
       </w:pPr>
-      <w:bookmarkStart w:id="12" w:name="_Toc243492213"/>
+      <w:bookmarkStart w:id="12" w:name="_Toc243593639"/>
       <w:r>
         <w:lastRenderedPageBreak/>
         <w:t>Diagrama de despliegue</w:t>
@@ -4010,13 +3971,7 @@
         <w:rPr>
           <w:b/>
         </w:rPr>
-        <w:t>F</w:t>
-      </w:r>
-      <w:r>
-        <w:rPr>
-          <w:b/>
-        </w:rPr>
-        <w:t>igura 5</w:t>
+        <w:t>Figura 5</w:t>
       </w:r>
     </w:p>
     <w:p>
@@ -4041,7 +3996,7 @@
           <w:noProof/>
         </w:rPr>
         <w:drawing>
-          <wp:inline distT="0" distB="0" distL="0" distR="0" wp14:anchorId="69830D73" wp14:editId="63A7ECE3">
+          <wp:inline distT="0" distB="0" distL="0" distR="0" wp14:anchorId="10E6EC98" wp14:editId="060F2D7B">
             <wp:extent cx="5120640" cy="4265231"/>
             <wp:effectExtent l="0" t="0" r="0" b="0"/>
             <wp:docPr id="6" name="Picture 6"/>
@@ -4092,7 +4047,13 @@
         <w:rPr>
           <w:sz w:val="20"/>
         </w:rPr>
-        <w:t>Elaboración propia a partir de los manifiestos de Kubernetes y de la ubicación de los pods observada el 21 de octubre de 2026.</w:t>
+        <w:t xml:space="preserve">Elaboración propia a partir de los </w:t>
+      </w:r>
+      <w:r>
+        <w:rPr>
+          <w:sz w:val="20"/>
+        </w:rPr>
+        <w:t>manifiestos de Kubernetes y de la ubicación de los pods observada el 21 de octubre de 2026.</w:t>
       </w:r>
     </w:p>
     <w:p>
@@ -4100,22 +4061,19 @@
         <w:pStyle w:val="parrafoApa"/>
       </w:pPr>
       <w:r>
-        <w:t>Dos instancias Ampere A1 de 1 OCPU y 6 GB forman un</w:t>
+        <w:t>Dos instancias Ampere A1 de 1 OCPU y 6 GB forman un clúster K3s en la capa gratuita de Oracle (s. f.). Traefik termina TLS; la web y el gateway tienen una réplica p</w:t>
       </w:r>
       <w:r>
-        <w:t xml:space="preserve"> clúster K3s en la capa gratuita de Oracle (s. f.). Traefik termina TLS; la web y el gateway tienen una réplica por nodo; certificados escala de dos a cuatro réplicas, y las políticas de red solo permiten el camino web, gateway, servicios y datos.</w:t>
+        <w:t>or nodo; certificados escala de dos a cuatro réplicas, y las políticas de red solo permiten el camino web, gateway, servicios y datos.</w:t>
       </w:r>
     </w:p>
     <w:p>
       <w:pPr>
         <w:pStyle w:val="Ttulo1"/>
       </w:pPr>
-      <w:bookmarkStart w:id="13" w:name="_Toc243492214"/>
+      <w:bookmarkStart w:id="13" w:name="_Toc243593640"/>
       <w:r>
-        <w:t>Selecció</w:t>
-      </w:r>
-      <w:r>
-        <w:t>n y justificación de patrones de diseño</w:t>
+        <w:t>Selección y justificación de patrones de diseño</w:t>
       </w:r>
       <w:bookmarkEnd w:id="13"/>
     </w:p>
@@ -4124,14 +4082,17 @@
         <w:pStyle w:val="parrafoApa"/>
       </w:pPr>
       <w:r>
-        <w:t xml:space="preserve">Los patrones se seleccionaron a partir de los escenarios de calidad y del catálogo de patrones para la nube de Microsoft (2026) y de Richardson (2018). Siguiendo a Blas et al. </w:t>
+        <w:t>Los patrones se seleccionaron a partir de los escenarios de calidad y del</w:t>
+      </w:r>
+      <w:r>
+        <w:t xml:space="preserve"> catálogo de patrones para la nube de Microsoft (2026) y de Richardson (2018). Siguiendo a Blas et al. </w:t>
       </w:r>
       <w:r>
         <w:lastRenderedPageBreak/>
-        <w:t>(2019), que proponen modelar los patrone</w:t>
+        <w:t xml:space="preserve">(2019), que proponen modelar los patrones de diseño para la nube dentro del diseño arquitectónico y verificar que se apliquen correctamente, cada patrón </w:t>
       </w:r>
       <w:r>
-        <w:t>s de diseño para la nube dentro del diseño arquitectónico y verificar que se apliquen correctamente, cada patrón aparece en los diagramas y se comprueba en el prototipo (Tabla 4).</w:t>
+        <w:t>aparece en los diagramas y se comprueba en el prototipo (Tabla 4).</w:t>
       </w:r>
     </w:p>
     <w:p>
@@ -4219,13 +4180,7 @@
               <w:rPr>
                 <w:b/>
               </w:rPr>
-              <w:t xml:space="preserve">Aplicación en </w:t>
-            </w:r>
-            <w:r>
-              <w:rPr>
-                <w:b/>
-              </w:rPr>
-              <w:t>AulaNube</w:t>
+              <w:t>Aplicación en AulaNube</w:t>
             </w:r>
           </w:p>
         </w:tc>
@@ -4379,7 +4334,10 @@
               <w:spacing w:line="240" w:lineRule="auto"/>
             </w:pPr>
             <w:r>
-              <w:t>Una base y un usuario por servicio.</w:t>
+              <w:t xml:space="preserve">Una </w:t>
+            </w:r>
+            <w:r>
+              <w:t>base y un usuario por servicio.</w:t>
             </w:r>
           </w:p>
         </w:tc>
@@ -4610,7 +4568,10 @@
               <w:spacing w:line="240" w:lineRule="auto"/>
             </w:pPr>
             <w:r>
-              <w:t>La campaña responde 202; la cola absorbe el pico.</w:t>
+              <w:t xml:space="preserve">La campaña responde 202; </w:t>
+            </w:r>
+            <w:r>
+              <w:t>la cola absorbe el pico.</w:t>
             </w:r>
           </w:p>
         </w:tc>
@@ -4764,10 +4725,7 @@
               <w:spacing w:line="240" w:lineRule="auto"/>
             </w:pPr>
             <w:r>
-              <w:t>Tras</w:t>
-            </w:r>
-            <w:r>
-              <w:t xml:space="preserve"> tres fallos el circuito se abre 15 s y responde de inmediato.</w:t>
+              <w:t>Tras tres fallos el circuito se abre 15 s y responde de inmediato.</w:t>
             </w:r>
           </w:p>
         </w:tc>
@@ -4962,20 +4920,20 @@
         <w:pStyle w:val="parrafoApa"/>
       </w:pPr>
       <w:r>
-        <w:t xml:space="preserve">Circuit Breaker responde al correo que bloqueaba la finalización del curso: convierte un fallo lento en uno rápido antes de que agote las conexiones del </w:t>
+        <w:t xml:space="preserve">Circuit Breaker responde al correo que bloqueaba </w:t>
       </w:r>
       <w:r>
-        <w:t>llamador (Nygard, 2018). La bandeja de salida resuelve que guardar y publicar no pueden ser atómicos, y la idempotencia de los consumidores cubre la entrega «al menos una vez» (Richardson, 2018). Se descartaron Saga, porque ningún flujo exige deshacer paso</w:t>
+        <w:t>la finalización del curso: convierte un fallo lento en uno rápido antes de que agote las conexiones del llamador (Nygard, 2018). La bandeja de salida resuelve que guardar y publicar no pueden ser atómicos, y la idempotencia de los consumidores cubre la ent</w:t>
       </w:r>
       <w:r>
-        <w:t>s en varios servicios, y un service mesh, que excede los nodos de 1 OCPU.</w:t>
+        <w:t>rega «al menos una vez» (Richardson, 2018). Se descartaron Saga, porque ningún flujo exige deshacer pasos en varios servicios, y un service mesh, que excede los nodos de 1 OCPU.</w:t>
       </w:r>
     </w:p>
     <w:p>
       <w:pPr>
         <w:pStyle w:val="Ttulo1"/>
       </w:pPr>
-      <w:bookmarkStart w:id="14" w:name="_Toc243492215"/>
+      <w:bookmarkStart w:id="14" w:name="_Toc243593641"/>
       <w:r>
         <w:lastRenderedPageBreak/>
         <w:t>Prototipo funcional en la nube</w:t>
@@ -4987,10 +4945,13 @@
         <w:pStyle w:val="parrafoApa"/>
       </w:pPr>
       <w:r>
-        <w:t>Los servicios están escritos en Python con FastAPI; la interfaz se sirve con nginx; los datos residen en PostgreSQL 16 y los eventos en Redis 7.4. El s</w:t>
+        <w:t xml:space="preserve">Los servicios están escritos en Python con </w:t>
       </w:r>
       <w:r>
-        <w:t>istema corre en local con Docker Compose y en la nube con cinco manifiestos de Kubernetes. Las 28 pruebas automatizadas pasan en x86 y en arm64, y una prueba de humo recorre el flujo completo contra el despliegue.</w:t>
+        <w:t>FastAPI; la interfaz se sirve con nginx; los datos residen en PostgreSQL 16 y los eventos en Redis 7.4. El sistema corre en local con Docker Compose y en la nube con cinco manifiestos de Kubernetes. Las 28 pruebas automatizadas pasan en x86 y en arm64, y u</w:t>
+      </w:r>
+      <w:r>
+        <w:t>na prueba de humo recorre el flujo completo contra el despliegue.</w:t>
       </w:r>
     </w:p>
     <w:p>
@@ -4998,13 +4959,10 @@
         <w:pStyle w:val="parrafoApa"/>
       </w:pPr>
       <w:r>
-        <w:t>En una campaña de 200 participantes el ser</w:t>
+        <w:t>En una campaña de 200 participantes el servicio respondió en menos de 300 ms y dos réplicas vaciaron la cola a unos 6,5 certificados por segundo (Figura 6). Con certificados apagado, el gate</w:t>
       </w:r>
       <w:r>
-        <w:t>vicio respondió en menos de 300 ms y dos réplicas vaciaron la cola a unos 6,5 certificados por segundo (Figura 6). Con certificados apagado, el gateway respondió en unos 110 ms con el circuito abierto mientras los cursos seguían funcionando (Figura 7), y u</w:t>
-      </w:r>
-      <w:r>
-        <w:t>n curso completado durante la caída recibió su certificado nueve segundos después de recuperar el servicio.</w:t>
+        <w:t>way respondió en unos 110 ms con el circuito abierto mientras los cursos seguían funcionando (Figura 7), y un curso completado durante la caída recibió su certificado nueve segundos después de recuperar el servicio.</w:t>
       </w:r>
     </w:p>
     <w:p>
@@ -5027,7 +4985,13 @@
         <w:rPr>
           <w:i/>
         </w:rPr>
-        <w:t>Panel de arquitectura durante una campaña de 200 participantes</w:t>
+        <w:t xml:space="preserve">Panel de </w:t>
+      </w:r>
+      <w:r>
+        <w:rPr>
+          <w:i/>
+        </w:rPr>
+        <w:t>arquitectura durante una campaña de 200 participantes</w:t>
       </w:r>
     </w:p>
     <w:p>
@@ -5041,7 +5005,7 @@
           <w:noProof/>
         </w:rPr>
         <w:drawing>
-          <wp:inline distT="0" distB="0" distL="0" distR="0" wp14:anchorId="3C37A0D3" wp14:editId="3D2188C2">
+          <wp:inline distT="0" distB="0" distL="0" distR="0" wp14:anchorId="0F508C3F" wp14:editId="20210815">
             <wp:extent cx="5120640" cy="3073883"/>
             <wp:effectExtent l="0" t="0" r="0" b="0"/>
             <wp:docPr id="7" name="Picture 7"/>
@@ -5092,13 +5056,7 @@
         <w:rPr>
           <w:sz w:val="20"/>
         </w:rPr>
-        <w:t>Captura del 21 de octubre de 2026 en el despliegue de Oracle Cloud I</w:t>
-      </w:r>
-      <w:r>
-        <w:rPr>
-          <w:sz w:val="20"/>
-        </w:rPr>
-        <w:t>nfrastructure.</w:t>
+        <w:t>Captura del 21 de octubre de 2026 en el despliegue de Oracle Cloud Infrastructure.</w:t>
       </w:r>
     </w:p>
     <w:p>
@@ -5136,7 +5094,7 @@
           <w:noProof/>
         </w:rPr>
         <w:drawing>
-          <wp:inline distT="0" distB="0" distL="0" distR="0" wp14:anchorId="4A88469A" wp14:editId="690970C3">
+          <wp:inline distT="0" distB="0" distL="0" distR="0" wp14:anchorId="2E3FD423" wp14:editId="61BA19A1">
             <wp:extent cx="5120640" cy="3073883"/>
             <wp:effectExtent l="0" t="0" r="0" b="0"/>
             <wp:docPr id="8" name="Picture 8"/>
@@ -5187,7 +5145,13 @@
         <w:rPr>
           <w:sz w:val="20"/>
         </w:rPr>
-        <w:t>Captura del 21 de octubre de 2026. Los demás servicios permanecen disponibles.</w:t>
+        <w:t>Captura del 21 de octubre de 2026. Los demás ser</w:t>
+      </w:r>
+      <w:r>
+        <w:rPr>
+          <w:sz w:val="20"/>
+        </w:rPr>
+        <w:t>vicios permanecen disponibles.</w:t>
       </w:r>
     </w:p>
     <w:p>
@@ -5453,7 +5417,10 @@
               <w:spacing w:line="240" w:lineRule="auto"/>
             </w:pPr>
             <w:r>
-              <w:t>Unos 150 ms; certificado en 1–2 s</w:t>
+              <w:t xml:space="preserve">Unos 150 ms; </w:t>
+            </w:r>
+            <w:r>
+              <w:t>certificado en 1–2 s</w:t>
             </w:r>
           </w:p>
         </w:tc>
@@ -5607,10 +5574,7 @@
               <w:spacing w:line="240" w:lineRule="auto"/>
             </w:pPr>
             <w:r>
-              <w:t xml:space="preserve">Evento </w:t>
-            </w:r>
-            <w:r>
-              <w:t>procesado al recuperar el servicio</w:t>
+              <w:t>Evento procesado al recuperar el servicio</w:t>
             </w:r>
           </w:p>
         </w:tc>
@@ -5703,7 +5667,7 @@
       <w:pPr>
         <w:pStyle w:val="Ttulo1"/>
       </w:pPr>
-      <w:bookmarkStart w:id="15" w:name="_Toc243492216"/>
+      <w:bookmarkStart w:id="15" w:name="_Toc243593642"/>
       <w:r>
         <w:t>Conclusiones</w:t>
       </w:r>
@@ -5714,10 +5678,10 @@
         <w:pStyle w:val="parrafoApa"/>
       </w:pPr>
       <w:r>
-        <w:t xml:space="preserve">Los problemas de CapacitaPro eran de arquitectura y no de </w:t>
+        <w:t>Los problemas de CapacitaPro eran de arquitectura y no de código: al cambiar la estructura, los síntomas desaparecieron sin optimizar la lógica de negocio, lo que confirma qu</w:t>
       </w:r>
       <w:r>
-        <w:t>código: al cambiar la estructura, los síntomas desaparecieron sin optimizar la lógica de negocio, lo que confirma que las decisiones estructurales tempranas determinan la calidad del sistema (Bass et al., 2012).</w:t>
+        <w:t>e las decisiones estructurales tempranas determinan la calidad del sistema (Bass et al., 2012).</w:t>
       </w:r>
     </w:p>
     <w:p>
@@ -5726,13 +5690,13 @@
       </w:pPr>
       <w:r>
         <w:lastRenderedPageBreak/>
-        <w:t xml:space="preserve">Expresar los requisitos no funcionales como </w:t>
+        <w:t>Expresar los requisitos no funcionales como escenarios medibles permitió elegir los patrones con criterio y comprobarlos, y la cohesión, el acoplamiento y el oc</w:t>
       </w:r>
       <w:r>
-        <w:t>escenarios medibles permitió elegir los patrones con criterio y comprobarlos, y la cohesión, el acoplamiento y el ocultamiento de información se volvieron decisiones verificables. La asincronía tiene costos que deben hacerse explícitos, como la consistenci</w:t>
+        <w:t>ultamiento de información se volvieron decisiones verificables. La asincronía tiene costos que deben hacerse explícitos, como la consistencia eventual y los consumidores idempotentes. Por último, el prototipo completo opera en la capa gratuita de Oracle co</w:t>
       </w:r>
       <w:r>
-        <w:t>a eventual y los consumidores idempotentes. Por último, el prototipo completo opera en la capa gratuita de Oracle con TLS, escalado automático y segmentación de red.</w:t>
+        <w:t>n TLS, escalado automático y segmentación de red.</w:t>
       </w:r>
     </w:p>
     <w:p>
@@ -5740,7 +5704,7 @@
         <w:pStyle w:val="Ttulo1"/>
         <w:pageBreakBefore/>
       </w:pPr>
-      <w:bookmarkStart w:id="16" w:name="_Toc243492217"/>
+      <w:bookmarkStart w:id="16" w:name="_Toc243593643"/>
       <w:r>
         <w:lastRenderedPageBreak/>
         <w:t>Referencias</w:t>
@@ -5771,7 +5735,10 @@
         <w:ind w:left="720" w:hanging="720"/>
       </w:pPr>
       <w:r>
-        <w:t xml:space="preserve">Blas, M. J., Leone, H., &amp; Gonnet, S. (2019). Modelado y verificación de patrones de diseño de arquitectura de software para entornos de computación en la nube. </w:t>
+        <w:t>Blas, M. J., Leone, H., &amp; Gonnet, S. (2019). Modelado y verificación de patrones de dise</w:t>
+      </w:r>
+      <w:r>
+        <w:t xml:space="preserve">ño de arquitectura de software para entornos de computación en la nube. </w:t>
       </w:r>
       <w:r>
         <w:rPr>
@@ -5780,10 +5747,7 @@
         <w:t>RISTI: Revista Ibérica de Sistemas e Tecnologias de Informação</w:t>
       </w:r>
       <w:r>
-        <w:t>, (35)</w:t>
-      </w:r>
-      <w:r>
-        <w:t>, 1–17. https://doi.org/10.17013/risti.35.1-17</w:t>
+        <w:t>, (35), 1–17. https://doi.org/10.17013/risti.35.1-17</w:t>
       </w:r>
     </w:p>
     <w:p>
@@ -5798,13 +5762,16 @@
         <w:rPr>
           <w:i/>
         </w:rPr>
-        <w:t>Ley Estatutaria 1581 de 2012: Por la cual se dictan disposiciones generales para la protección de datos personales</w:t>
+        <w:t>Ley Esta</w:t>
       </w:r>
       <w:r>
-        <w:t>. Diario Oficial n.º 48.587. https</w:t>
+        <w:rPr>
+          <w:i/>
+        </w:rPr>
+        <w:t>tutaria 1581 de 2012: Por la cual se dictan disposiciones generales para la protección de datos personales</w:t>
       </w:r>
       <w:r>
-        <w:t>://www.funcionpublica.gov.co/eva/gestornormativo/norma.php?i=49981</w:t>
+        <w:t>. Diario Oficial n.º 48.587. https://www.funcionpublica.gov.co/eva/gestornormativo/norma.php?i=49981</w:t>
       </w:r>
     </w:p>
     <w:p>
@@ -5819,7 +5786,13 @@
         <w:rPr>
           <w:i/>
         </w:rPr>
-        <w:t>Patterns of enterprise application architecture</w:t>
+        <w:t>Patterns of enterprise applica</w:t>
+      </w:r>
+      <w:r>
+        <w:rPr>
+          <w:i/>
+        </w:rPr>
+        <w:t>tion architecture</w:t>
       </w:r>
       <w:r>
         <w:t>. Addison-Wesley.</w:t>
@@ -5840,10 +5813,7 @@
         <w:t>Arquitectura monolítica frente a la de microservicios para .Net</w:t>
       </w:r>
       <w:r>
-        <w:t xml:space="preserve">. </w:t>
-      </w:r>
-      <w:r>
-        <w:t>Redwerk. https://redwerk.es/blog/arquitectura-monolitica-vs-microservicios/</w:t>
+        <w:t>. Redwerk. https://redwerk.es/blog/arquitectura-monolitica-vs-microservicios/</w:t>
       </w:r>
     </w:p>
     <w:p>
@@ -5858,7 +5828,13 @@
         <w:rPr>
           <w:i/>
         </w:rPr>
-        <w:t>Cloud design patterns</w:t>
+        <w:t xml:space="preserve">Cloud </w:t>
+      </w:r>
+      <w:r>
+        <w:rPr>
+          <w:i/>
+        </w:rPr>
+        <w:t>design patterns</w:t>
       </w:r>
       <w:r>
         <w:t>. Azure Architecture Center. https://learn.microsoft.com/en-us/azure/architecture/patterns/</w:t>
@@ -5876,13 +5852,7 @@
         <w:rPr>
           <w:i/>
         </w:rPr>
-        <w:t>Release it! Des</w:t>
-      </w:r>
-      <w:r>
-        <w:rPr>
-          <w:i/>
-        </w:rPr>
-        <w:t>ign and deploy production-ready software</w:t>
+        <w:t>Release it! Design and deploy production-ready software</w:t>
       </w:r>
       <w:r>
         <w:t xml:space="preserve"> (2.ª ed.). Pragmatic Bookshelf.</w:t>
@@ -5900,7 +5870,13 @@
         <w:rPr>
           <w:i/>
         </w:rPr>
-        <w:t>OMG Unified Modeling Language (OMG UML), version 2.5.1</w:t>
+        <w:t>OMG Un</w:t>
+      </w:r>
+      <w:r>
+        <w:rPr>
+          <w:i/>
+        </w:rPr>
+        <w:t>ified Modeling Language (OMG UML), version 2.5.1</w:t>
       </w:r>
       <w:r>
         <w:t>. https://www.omg.org/spec/UML/2.5.1</w:t>
@@ -5921,10 +5897,10 @@
         <w:t>Always Free resources</w:t>
       </w:r>
       <w:r>
-        <w:t>. Oracle Cloud Infras</w:t>
+        <w:t>. Oracle Cloud Infrastructure Documentation. Recuperado el 20 de octubre de 2026, de https://docs.oracle.com/en-us/iaas/Content/FreeT</w:t>
       </w:r>
       <w:r>
-        <w:t>tructure Documentation. Recuperado el 20 de octubre de 2026, de https://docs.oracle.com/en-us/iaas/Content/FreeTier/freetier_topic-Always_Free_Resources.htm</w:t>
+        <w:t>ier/freetier_topic-Always_Free_Resources.htm</w:t>
       </w:r>
     </w:p>
     <w:p>
@@ -5940,13 +5916,7 @@
         <w:rPr>
           <w:i/>
         </w:rPr>
-        <w:t>Communication</w:t>
-      </w:r>
-      <w:r>
-        <w:rPr>
-          <w:i/>
-        </w:rPr>
-        <w:t>s of the ACM, 15</w:t>
+        <w:t>Communications of the ACM, 15</w:t>
       </w:r>
       <w:r>
         <w:t>(12), 1053–1058. https://doi.org/10.1145/361598.361623</w:t>
@@ -5964,7 +5934,13 @@
         <w:rPr>
           <w:i/>
         </w:rPr>
-        <w:t>¿Qué son los microservicios? Ventajas de la arquitectura de microservicios</w:t>
+        <w:t xml:space="preserve">¿Qué son los </w:t>
+      </w:r>
+      <w:r>
+        <w:rPr>
+          <w:i/>
+        </w:rPr>
+        <w:t>microservicios? Ventajas de la arquitectura de microservicios</w:t>
       </w:r>
       <w:r>
         <w:t>. https://www.redhat.com/es/topics/microservices/what-are-microservices</w:t>
@@ -5976,10 +5952,7 @@
         <w:ind w:left="720" w:hanging="720"/>
       </w:pPr>
       <w:r>
-        <w:t>Richardson,</w:t>
-      </w:r>
-      <w:r>
-        <w:t xml:space="preserve"> C. (2018). </w:t>
+        <w:t xml:space="preserve">Richardson, C. (2018). </w:t>
       </w:r>
       <w:r>
         <w:rPr>
@@ -6003,13 +5976,16 @@
         <w:rPr>
           <w:i/>
         </w:rPr>
-        <w:t>Arquitectura de software: Principios, patrones y evaluación. Unidad 1: Principios de arquitectura de software</w:t>
+        <w:t>Arquitectur</w:t>
       </w:r>
       <w:r>
-        <w:t xml:space="preserve"> [Material del curso Arquitectura de Software]</w:t>
+        <w:rPr>
+          <w:i/>
+        </w:rPr>
+        <w:t>a de software: Principios, patrones y evaluación. Unidad 1: Principios de arquitectura de software</w:t>
       </w:r>
       <w:r>
-        <w:t>. Institución de Educación Superior Tecnológica del Oriente.</w:t>
+        <w:t xml:space="preserve"> [Material del curso Arquitectura de Software]. Institución de Educación Superior Tecnológica del Oriente.</w:t>
       </w:r>
     </w:p>
     <w:sectPr>

</xml_diff>

<commit_message>
Agrega el enlace del video de YouTube
En la portada del informe, la diapositiva final, el guion y el README.

Co-Authored-By: Claude Opus 5.5 <noreply@anthropic.com>
</commit_message>
<xml_diff>
--- a/docs/informe/Informe-AulaNube.docx
+++ b/docs/informe/Informe-AulaNube.docx
@@ -12,7 +12,7 @@
           <w:noProof/>
         </w:rPr>
         <w:drawing>
-          <wp:inline distT="0" distB="0" distL="0" distR="0" wp14:anchorId="10449095" wp14:editId="316B586E">
+          <wp:inline distT="0" distB="0" distL="0" distR="0" wp14:anchorId="3E7C219E" wp14:editId="3B229087">
             <wp:extent cx="3143250" cy="857250"/>
             <wp:effectExtent l="0" t="0" r="0" b="0"/>
             <wp:docPr id="1" name="Picture 1"/>
@@ -114,7 +114,7 @@
         <w:jc w:val="center"/>
       </w:pPr>
       <w:r>
-        <w:t>Video de presentación del informe: [enlace de YouTube]</w:t>
+        <w:t>Video de presentación del informe: https://youtu.be/MIRqI7KDZq0</w:t>
       </w:r>
     </w:p>
     <w:p>
@@ -122,7 +122,7 @@
         <w:pStyle w:val="Ttulo1"/>
         <w:pageBreakBefore/>
       </w:pPr>
-      <w:bookmarkStart w:id="0" w:name="_Toc243593627"/>
+      <w:bookmarkStart w:id="0" w:name="_Toc244006389"/>
       <w:r>
         <w:lastRenderedPageBreak/>
         <w:t>Resumen</w:t>
@@ -134,19 +134,22 @@
         <w:pStyle w:val="parrafoApa"/>
       </w:pPr>
       <w:r>
-        <w:t>Este informe presenta la arquitectura propuesta para CapacitaPro S.A.S., empresa ficticia que ofrece capacitación virtual obligatoria a 38 empresa</w:t>
+        <w:t>Este informe presenta la arquitectura propuesta para CapacitaPro S.A.S., empresa ficticia que ofrece capacitación virtual obligatoria a 3</w:t>
       </w:r>
       <w:r>
-        <w:t>s cliente con una instalación de WordPress por cliente, modelo que colapsa en los cierres de campaña, hace esperar al usuario mientras se genera el certificado y multiplica el mantenimiento. A partir del análisis de requisitos se formularon diez escenarios</w:t>
+        <w:t>8 empresas cliente con una instalación de WordPress por cliente, modelo que colapsa en los cierres de campaña, hace esperar al usuario mientras se genera el certificado y multiplica el mantenimiento. A partir del análisis de requisitos se formularon diez e</w:t>
       </w:r>
       <w:r>
-        <w:t xml:space="preserve"> de calidad medibles que orientaron el diseño de AulaNube, una plataforma multiempresa basada en microservicios, con un API Gateway, una base de datos por servicio y eventos asíncronos en Redis Streams. La arquitectura se documentó con diagramas UML de cas</w:t>
+        <w:t>scenarios de calidad medibles que orientaron el diseño de AulaNube, una plataforma multiempresa basada en microservicios, con un API Gateway, una base de datos por servicio y eventos asíncronos en Redis Streams. La arquitectura se documentó con diagramas U</w:t>
       </w:r>
       <w:r>
-        <w:t>os de uso, clases, secuencia y despliegue, y se justificaron patrones de diseño para la nube como Transactional Outbox, Queue-Based Load Leveling, Competing Consumers y Circuit Breaker. El prototipo se desplegó en Oracle Cloud Infrastructure, sobre un clús</w:t>
+        <w:t>ML de casos de uso, clases, secuencia y despliegue, y se justificaron patrones de diseño para la nube como Transactional Outbox, Queue-Based Load Leveling, Competing Consumers y Circuit Breaker. El prototipo se desplegó en Oracle Cloud Infrastructure, sobr</w:t>
       </w:r>
       <w:r>
-        <w:t>ter K3s de dos nodos Ampere A1 de la capa gratuita, y las mediciones confirmaron los escenarios: una campaña masiva responde en menos de 300 ms, el gateway responde en 110 ms con un servicio caído y ningún certificado se pierde cuando falla el trabajador.</w:t>
+        <w:t>e un clúster K3s de dos nodos Ampere A1 de la capa gratuita, y las mediciones confirmaron los escenarios: una campaña masiva responde en menos de 300 ms, el gateway responde en 110 ms con un servicio caído y ningún certificado se pierde cuando falla el tra</w:t>
+      </w:r>
+      <w:r>
+        <w:t>bajador.</w:t>
       </w:r>
     </w:p>
     <w:p>
@@ -154,7 +157,7 @@
         <w:pStyle w:val="Ttulo1"/>
         <w:pageBreakBefore/>
       </w:pPr>
-      <w:bookmarkStart w:id="1" w:name="_Toc243593628"/>
+      <w:bookmarkStart w:id="1" w:name="_Toc244006390"/>
       <w:r>
         <w:lastRenderedPageBreak/>
         <w:t>Tabla de contenido</w:t>
@@ -183,7 +186,7 @@
       <w:r>
         <w:fldChar w:fldCharType="separate"/>
       </w:r>
-      <w:hyperlink w:anchor="_Toc243593627" w:history="1">
+      <w:hyperlink w:anchor="_Toc244006389" w:history="1">
         <w:r>
           <w:rPr>
             <w:rStyle w:val="Hipervnculo"/>
@@ -211,7 +214,7 @@
             <w:noProof/>
             <w:webHidden/>
           </w:rPr>
-          <w:instrText xml:space="preserve"> PAGEREF _Toc243593627 \h </w:instrText>
+          <w:instrText xml:space="preserve"> PAGEREF _Toc244006389 \h </w:instrText>
         </w:r>
         <w:r>
           <w:rPr>
@@ -255,7 +258,7 @@
           <w:lang w:val="es-CO" w:eastAsia="es-CO"/>
         </w:rPr>
       </w:pPr>
-      <w:hyperlink w:anchor="_Toc243593628" w:history="1">
+      <w:hyperlink w:anchor="_Toc244006390" w:history="1">
         <w:r>
           <w:rPr>
             <w:rStyle w:val="Hipervnculo"/>
@@ -283,7 +286,7 @@
             <w:noProof/>
             <w:webHidden/>
           </w:rPr>
-          <w:instrText xml:space="preserve"> PAGEREF _Toc243593628 \h </w:instrText>
+          <w:instrText xml:space="preserve"> PAGEREF _Toc244006390 \h </w:instrText>
         </w:r>
         <w:r>
           <w:rPr>
@@ -327,7 +330,7 @@
           <w:lang w:val="es-CO" w:eastAsia="es-CO"/>
         </w:rPr>
       </w:pPr>
-      <w:hyperlink w:anchor="_Toc243593629" w:history="1">
+      <w:hyperlink w:anchor="_Toc244006391" w:history="1">
         <w:r>
           <w:rPr>
             <w:rStyle w:val="Hipervnculo"/>
@@ -355,7 +358,7 @@
             <w:noProof/>
             <w:webHidden/>
           </w:rPr>
-          <w:instrText xml:space="preserve"> PAGEREF _Toc243593629 \h </w:instrText>
+          <w:instrText xml:space="preserve"> PAGEREF _Toc244006391 \h </w:instrText>
         </w:r>
         <w:r>
           <w:rPr>
@@ -399,7 +402,7 @@
           <w:lang w:val="es-CO" w:eastAsia="es-CO"/>
         </w:rPr>
       </w:pPr>
-      <w:hyperlink w:anchor="_Toc243593630" w:history="1">
+      <w:hyperlink w:anchor="_Toc244006392" w:history="1">
         <w:r>
           <w:rPr>
             <w:rStyle w:val="Hipervnculo"/>
@@ -427,7 +430,7 @@
             <w:noProof/>
             <w:webHidden/>
           </w:rPr>
-          <w:instrText xml:space="preserve"> PAGEREF _Toc243593630 \h </w:instrText>
+          <w:instrText xml:space="preserve"> PAGEREF _Toc244006392 \h </w:instrText>
         </w:r>
         <w:r>
           <w:rPr>
@@ -471,7 +474,7 @@
           <w:lang w:val="es-CO" w:eastAsia="es-CO"/>
         </w:rPr>
       </w:pPr>
-      <w:hyperlink w:anchor="_Toc243593631" w:history="1">
+      <w:hyperlink w:anchor="_Toc244006393" w:history="1">
         <w:r>
           <w:rPr>
             <w:rStyle w:val="Hipervnculo"/>
@@ -499,7 +502,7 @@
             <w:noProof/>
             <w:webHidden/>
           </w:rPr>
-          <w:instrText xml:space="preserve"> PAGEREF _Toc243593631 \h </w:instrText>
+          <w:instrText xml:space="preserve"> PAGEREF _Toc244006393 \h </w:instrText>
         </w:r>
         <w:r>
           <w:rPr>
@@ -543,7 +546,7 @@
           <w:lang w:val="es-CO" w:eastAsia="es-CO"/>
         </w:rPr>
       </w:pPr>
-      <w:hyperlink w:anchor="_Toc243593632" w:history="1">
+      <w:hyperlink w:anchor="_Toc244006394" w:history="1">
         <w:r>
           <w:rPr>
             <w:rStyle w:val="Hipervnculo"/>
@@ -571,7 +574,7 @@
             <w:noProof/>
             <w:webHidden/>
           </w:rPr>
-          <w:instrText xml:space="preserve"> PAGEREF _Toc243593632 \h </w:instrText>
+          <w:instrText xml:space="preserve"> PAGEREF _Toc244006394 \h </w:instrText>
         </w:r>
         <w:r>
           <w:rPr>
@@ -615,7 +618,7 @@
           <w:lang w:val="es-CO" w:eastAsia="es-CO"/>
         </w:rPr>
       </w:pPr>
-      <w:hyperlink w:anchor="_Toc243593633" w:history="1">
+      <w:hyperlink w:anchor="_Toc244006395" w:history="1">
         <w:r>
           <w:rPr>
             <w:rStyle w:val="Hipervnculo"/>
@@ -643,7 +646,7 @@
             <w:noProof/>
             <w:webHidden/>
           </w:rPr>
-          <w:instrText xml:space="preserve"> PAGEREF _Toc243593633 \h </w:instrText>
+          <w:instrText xml:space="preserve"> PAGEREF _Toc244006395 \h </w:instrText>
         </w:r>
         <w:r>
           <w:rPr>
@@ -687,7 +690,7 @@
           <w:lang w:val="es-CO" w:eastAsia="es-CO"/>
         </w:rPr>
       </w:pPr>
-      <w:hyperlink w:anchor="_Toc243593634" w:history="1">
+      <w:hyperlink w:anchor="_Toc244006396" w:history="1">
         <w:r>
           <w:rPr>
             <w:rStyle w:val="Hipervnculo"/>
@@ -715,7 +718,7 @@
             <w:noProof/>
             <w:webHidden/>
           </w:rPr>
-          <w:instrText xml:space="preserve"> PAGEREF _Toc243593634 \h </w:instrText>
+          <w:instrText xml:space="preserve"> PAGEREF _Toc244006396 \h </w:instrText>
         </w:r>
         <w:r>
           <w:rPr>
@@ -759,7 +762,7 @@
           <w:lang w:val="es-CO" w:eastAsia="es-CO"/>
         </w:rPr>
       </w:pPr>
-      <w:hyperlink w:anchor="_Toc243593635" w:history="1">
+      <w:hyperlink w:anchor="_Toc244006397" w:history="1">
         <w:r>
           <w:rPr>
             <w:rStyle w:val="Hipervnculo"/>
@@ -787,7 +790,7 @@
             <w:noProof/>
             <w:webHidden/>
           </w:rPr>
-          <w:instrText xml:space="preserve"> PAGEREF _Toc243593635 \h </w:instrText>
+          <w:instrText xml:space="preserve"> PAGEREF _Toc244006397 \h </w:instrText>
         </w:r>
         <w:r>
           <w:rPr>
@@ -831,7 +834,7 @@
           <w:lang w:val="es-CO" w:eastAsia="es-CO"/>
         </w:rPr>
       </w:pPr>
-      <w:hyperlink w:anchor="_Toc243593636" w:history="1">
+      <w:hyperlink w:anchor="_Toc244006398" w:history="1">
         <w:r>
           <w:rPr>
             <w:rStyle w:val="Hipervnculo"/>
@@ -859,7 +862,7 @@
             <w:noProof/>
             <w:webHidden/>
           </w:rPr>
-          <w:instrText xml:space="preserve"> PAGEREF _Toc243593636 \h </w:instrText>
+          <w:instrText xml:space="preserve"> PAGEREF _Toc244006398 \h </w:instrText>
         </w:r>
         <w:r>
           <w:rPr>
@@ -903,7 +906,7 @@
           <w:lang w:val="es-CO" w:eastAsia="es-CO"/>
         </w:rPr>
       </w:pPr>
-      <w:hyperlink w:anchor="_Toc243593637" w:history="1">
+      <w:hyperlink w:anchor="_Toc244006399" w:history="1">
         <w:r>
           <w:rPr>
             <w:rStyle w:val="Hipervnculo"/>
@@ -931,7 +934,7 @@
             <w:noProof/>
             <w:webHidden/>
           </w:rPr>
-          <w:instrText xml:space="preserve"> PAGEREF _Toc243593637 \h </w:instrText>
+          <w:instrText xml:space="preserve"> PAGEREF _Toc244006399 \h </w:instrText>
         </w:r>
         <w:r>
           <w:rPr>
@@ -975,7 +978,7 @@
           <w:lang w:val="es-CO" w:eastAsia="es-CO"/>
         </w:rPr>
       </w:pPr>
-      <w:hyperlink w:anchor="_Toc243593638" w:history="1">
+      <w:hyperlink w:anchor="_Toc244006400" w:history="1">
         <w:r>
           <w:rPr>
             <w:rStyle w:val="Hipervnculo"/>
@@ -1003,7 +1006,7 @@
             <w:noProof/>
             <w:webHidden/>
           </w:rPr>
-          <w:instrText xml:space="preserve"> PAGEREF _Toc243593638 \h </w:instrText>
+          <w:instrText xml:space="preserve"> PAGEREF _Toc244006400 \h </w:instrText>
         </w:r>
         <w:r>
           <w:rPr>
@@ -1047,7 +1050,7 @@
           <w:lang w:val="es-CO" w:eastAsia="es-CO"/>
         </w:rPr>
       </w:pPr>
-      <w:hyperlink w:anchor="_Toc243593639" w:history="1">
+      <w:hyperlink w:anchor="_Toc244006401" w:history="1">
         <w:r>
           <w:rPr>
             <w:rStyle w:val="Hipervnculo"/>
@@ -1075,7 +1078,7 @@
             <w:noProof/>
             <w:webHidden/>
           </w:rPr>
-          <w:instrText xml:space="preserve"> PAGEREF _Toc243593639 \h </w:instrText>
+          <w:instrText xml:space="preserve"> PAGEREF _Toc244006401 \h </w:instrText>
         </w:r>
         <w:r>
           <w:rPr>
@@ -1119,7 +1122,7 @@
           <w:lang w:val="es-CO" w:eastAsia="es-CO"/>
         </w:rPr>
       </w:pPr>
-      <w:hyperlink w:anchor="_Toc243593640" w:history="1">
+      <w:hyperlink w:anchor="_Toc244006402" w:history="1">
         <w:r>
           <w:rPr>
             <w:rStyle w:val="Hipervnculo"/>
@@ -1147,7 +1150,7 @@
             <w:noProof/>
             <w:webHidden/>
           </w:rPr>
-          <w:instrText xml:space="preserve"> PAGEREF _Toc243593640 \h </w:instrText>
+          <w:instrText xml:space="preserve"> PAGEREF _Toc244006402 \h </w:instrText>
         </w:r>
         <w:r>
           <w:rPr>
@@ -1191,7 +1194,7 @@
           <w:lang w:val="es-CO" w:eastAsia="es-CO"/>
         </w:rPr>
       </w:pPr>
-      <w:hyperlink w:anchor="_Toc243593641" w:history="1">
+      <w:hyperlink w:anchor="_Toc244006403" w:history="1">
         <w:r>
           <w:rPr>
             <w:rStyle w:val="Hipervnculo"/>
@@ -1219,7 +1222,7 @@
             <w:noProof/>
             <w:webHidden/>
           </w:rPr>
-          <w:instrText xml:space="preserve"> PAGEREF _Toc243593641 \h </w:instrText>
+          <w:instrText xml:space="preserve"> PAGEREF _Toc244006403 \h </w:instrText>
         </w:r>
         <w:r>
           <w:rPr>
@@ -1263,7 +1266,7 @@
           <w:lang w:val="es-CO" w:eastAsia="es-CO"/>
         </w:rPr>
       </w:pPr>
-      <w:hyperlink w:anchor="_Toc243593642" w:history="1">
+      <w:hyperlink w:anchor="_Toc244006404" w:history="1">
         <w:r>
           <w:rPr>
             <w:rStyle w:val="Hipervnculo"/>
@@ -1291,7 +1294,7 @@
             <w:noProof/>
             <w:webHidden/>
           </w:rPr>
-          <w:instrText xml:space="preserve"> PAGEREF _Toc243593642 \h </w:instrText>
+          <w:instrText xml:space="preserve"> PAGEREF _Toc244006404 \h </w:instrText>
         </w:r>
         <w:r>
           <w:rPr>
@@ -1335,7 +1338,7 @@
           <w:lang w:val="es-CO" w:eastAsia="es-CO"/>
         </w:rPr>
       </w:pPr>
-      <w:hyperlink w:anchor="_Toc243593643" w:history="1">
+      <w:hyperlink w:anchor="_Toc244006405" w:history="1">
         <w:r>
           <w:rPr>
             <w:rStyle w:val="Hipervnculo"/>
@@ -1363,7 +1366,7 @@
             <w:noProof/>
             <w:webHidden/>
           </w:rPr>
-          <w:instrText xml:space="preserve"> PAGEREF _Toc243593643 \h </w:instrText>
+          <w:instrText xml:space="preserve"> PAGEREF _Toc244006405 \h </w:instrText>
         </w:r>
         <w:r>
           <w:rPr>
@@ -1404,7 +1407,7 @@
         <w:pStyle w:val="Ttulo1"/>
         <w:pageBreakBefore/>
       </w:pPr>
-      <w:bookmarkStart w:id="2" w:name="_Toc243593629"/>
+      <w:bookmarkStart w:id="2" w:name="_Toc244006391"/>
       <w:r>
         <w:lastRenderedPageBreak/>
         <w:t>AulaNube: arquitectura de microservicios en la nube para la plataforma de capacitación corporativa de CapacitaPro S.A.S.</w:t>
@@ -1416,13 +1419,13 @@
         <w:pStyle w:val="parrafoApa"/>
       </w:pPr>
       <w:r>
-        <w:t>Según la norma IEEE 1471-2000, adopt</w:t>
+        <w:t>Según la norma IEEE 1471-20</w:t>
       </w:r>
       <w:r>
-        <w:t>ada después como ISO/IEC 42010, la arquitectura de software es la organización fundamental de un sistema, manifestada en sus componentes, las relaciones entre ellos y con su entorno, y los principios que guían su diseño y evolución (Tecnológica del Oriente</w:t>
+        <w:t>00, adoptada después como ISO/IEC 42010, la arquitectura de software es la organización fundamental de un sistema, manifestada en sus componentes, las relaciones entre ellos y con su entorno, y los principios que guían su diseño y evolución (Tecnológica de</w:t>
       </w:r>
       <w:r>
-        <w:t>, 2026). Como estas decisiones se toman al inicio y cambiarlas después es costoso y riesgoso, deben responder a los atributos de calidad que el negocio necesita y no solo a la funcionalidad (Bass et al., 2012).</w:t>
+        <w:t>l Oriente, 2026). Como estas decisiones se toman al inicio y cambiarlas después es costoso y riesgoso, deben responder a los atributos de calidad que el negocio necesita y no solo a la funcionalidad (Bass et al., 2012).</w:t>
       </w:r>
     </w:p>
     <w:p>
@@ -1430,20 +1433,20 @@
         <w:pStyle w:val="parrafoApa"/>
       </w:pPr>
       <w:r>
-        <w:t>El informe presenta la solución propuesta par</w:t>
+        <w:t>El informe presenta la solución prop</w:t>
       </w:r>
       <w:r>
-        <w:t>a CapacitaPro S.A.S.: el caso y sus requisitos, la arquitectura propuesta, su modelado en UML, los patrones de diseño seleccionados y el prototipo desplegado en la nube con las pruebas que comprueban cada decisión. El código fuente y los diagramas están en</w:t>
+        <w:t>uesta para CapacitaPro S.A.S.: el caso y sus requisitos, la arquitectura propuesta, su modelado en UML, los patrones de diseño seleccionados y el prototipo desplegado en la nube con las pruebas que comprueban cada decisión. El código fuente y los diagramas</w:t>
       </w:r>
       <w:r>
-        <w:t xml:space="preserve"> https://github.com/augustocco/aulanube, y la aplicación funciona en https://aulanube.149-130-191-139.sslip.io.</w:t>
+        <w:t xml:space="preserve"> están en https://github.com/augustocco/aulanube, y la aplicación funciona en https://aulanube.149-130-191-139.sslip.io.</w:t>
       </w:r>
     </w:p>
     <w:p>
       <w:pPr>
         <w:pStyle w:val="Ttulo1"/>
       </w:pPr>
-      <w:bookmarkStart w:id="3" w:name="_Toc243593630"/>
+      <w:bookmarkStart w:id="3" w:name="_Toc244006392"/>
       <w:r>
         <w:t>Caso de estudio: CapacitaPro S.A.S.</w:t>
       </w:r>
@@ -1454,13 +1457,13 @@
         <w:pStyle w:val="parrafoApa"/>
       </w:pPr>
       <w:r>
-        <w:t>CapacitaPro S.A.S. es una empresa ficticia de Bucaramanga que diseña y administra cursos virtuales que la le</w:t>
+        <w:t xml:space="preserve">CapacitaPro S.A.S. es una empresa ficticia de Bucaramanga que diseña y administra cursos virtuales </w:t>
       </w:r>
       <w:r>
-        <w:t>y o los contratos hacen obligatorios: inducción al SG-SST, trabajo seguro en alturas, protección de datos personales y atención humanizada en salud. Atiende a 38 empresas cliente y unos 14.000 usuarios; cada cliente tiene su propia instalación de WordPress</w:t>
+        <w:t xml:space="preserve">que la ley o los contratos hacen obligatorios: inducción al SG-SST, trabajo seguro en alturas, protección de datos personales y atención humanizada en salud. Atiende a 38 empresas cliente y unos 14.000 usuarios; cada cliente tiene su propia instalación de </w:t>
       </w:r>
       <w:r>
-        <w:t xml:space="preserve"> con un plugin de LMS, repartidas en cinco servidores. La Tabla 1 resume los problemas de ese modelo.</w:t>
+        <w:t>WordPress con un plugin de LMS, repartidas en cinco servidores. La Tabla 1 resume los problemas de ese modelo.</w:t>
       </w:r>
     </w:p>
     <w:p>
@@ -1601,10 +1604,10 @@
               <w:spacing w:line="240" w:lineRule="auto"/>
             </w:pPr>
             <w:r>
-              <w:t xml:space="preserve">Un cierre de 1.100 trabajadores dejó el </w:t>
+              <w:t xml:space="preserve">Un cierre de 1.100 </w:t>
             </w:r>
             <w:r>
-              <w:t>servidor 40 minutos sin respuesta y afectó a otros siete clientes.</w:t>
+              <w:t>trabajadores dejó el servidor 40 minutos sin respuesta y afectó a otros siete clientes.</w:t>
             </w:r>
           </w:p>
         </w:tc>
@@ -1686,7 +1689,10 @@
               <w:spacing w:line="240" w:lineRule="auto"/>
             </w:pPr>
             <w:r>
-              <w:t>Correo que bloquea la operación</w:t>
+              <w:t>Correo que bloquea la ope</w:t>
+            </w:r>
+            <w:r>
+              <w:t>ración</w:t>
             </w:r>
           </w:p>
         </w:tc>
@@ -1710,10 +1716,7 @@
               <w:spacing w:line="240" w:lineRule="auto"/>
             </w:pPr>
             <w:r>
-              <w:t>Cursos termina</w:t>
-            </w:r>
-            <w:r>
-              <w:t>dos que no quedan registrados porque el servidor de correo tardó.</w:t>
+              <w:t>Cursos terminados que no quedan registrados porque el servidor de correo tardó.</w:t>
             </w:r>
           </w:p>
         </w:tc>
@@ -1811,10 +1814,10 @@
               <w:spacing w:line="240" w:lineRule="auto"/>
             </w:pPr>
             <w:r>
-              <w:t xml:space="preserve">Auditores y contratantes piden </w:t>
+              <w:t xml:space="preserve">Auditores y </w:t>
             </w:r>
             <w:r>
-              <w:t>confirmación por correo, lo que tarda días.</w:t>
+              <w:t>contratantes piden confirmación por correo, lo que tarda días.</w:t>
             </w:r>
           </w:p>
         </w:tc>
@@ -1843,17 +1846,17 @@
         <w:pStyle w:val="parrafoApa"/>
       </w:pPr>
       <w:r>
-        <w:t>La gerencia pide una sola plataforma multiempresa en la que cada cliente vea solo su información, que el cierre de campaña de un cliente no afecte a los dem</w:t>
+        <w:t xml:space="preserve">La gerencia pide una sola plataforma multiempresa en la que cada cliente vea solo su información, que el cierre de campaña de un cliente </w:t>
       </w:r>
       <w:r>
-        <w:t>ás, certificados verificables por terceros, que la caída de una parte no detenga el resto, crecer por partes, bajo costo durante el piloto y cumplir la Ley 1581 de 2012 (Congreso de la República de Colombia, 2012).</w:t>
+        <w:t>no afecte a los demás, certificados verificables por terceros, que la caída de una parte no detenga el resto, crecer por partes, bajo costo durante el piloto y cumplir la Ley 1581 de 2012 (Congreso de la República de Colombia, 2012).</w:t>
       </w:r>
     </w:p>
     <w:p>
       <w:pPr>
         <w:pStyle w:val="Ttulo1"/>
       </w:pPr>
-      <w:bookmarkStart w:id="4" w:name="_Toc243593631"/>
+      <w:bookmarkStart w:id="4" w:name="_Toc244006393"/>
       <w:r>
         <w:t>Análisis de requisitos</w:t>
       </w:r>
@@ -1864,13 +1867,10 @@
         <w:pStyle w:val="parrafoApa"/>
       </w:pPr>
       <w:r>
-        <w:t>Se aplicaron cuatr</w:t>
+        <w:t>Se aplicaron cuatro técnicas: análisis documental del caso; una entrevista simulada con tres interesados (la gerencia, una administradora de empresa cliente y un colaborador); historias de usuario priorizadas con el método MoSCoW, y escenarios de atributo</w:t>
       </w:r>
       <w:r>
-        <w:t>o técnicas: análisis documental del caso; una entrevista simulada con tres interesados (la gerencia, una administradora de empresa cliente y un colaborador); historias de usuario priorizadas con el método MoSCoW, y escenarios de atributos de calidad, que e</w:t>
-      </w:r>
-      <w:r>
-        <w:t>xpresan cada requisito no funcional con un estímulo y una medida de respuesta verificable (Bass et al., 2012). Las Tablas 2 y 3 presentan el resultado.</w:t>
+        <w:t>s de calidad, que expresan cada requisito no funcional con un estímulo y una medida de respuesta verificable (Bass et al., 2012). Las Tablas 2 y 3 presentan el resultado.</w:t>
       </w:r>
     </w:p>
     <w:p>
@@ -2036,10 +2036,10 @@
               <w:spacing w:line="240" w:lineRule="auto"/>
             </w:pPr>
             <w:r>
-              <w:t xml:space="preserve">Como usuario quiero iniciar </w:t>
+              <w:t xml:space="preserve">Como </w:t>
             </w:r>
             <w:r>
-              <w:t>sesión para acceder a la plataforma de mi empresa.</w:t>
+              <w:t>usuario quiero iniciar sesión para acceder a la plataforma de mi empresa.</w:t>
             </w:r>
           </w:p>
         </w:tc>
@@ -2193,7 +2193,10 @@
               <w:spacing w:line="240" w:lineRule="auto"/>
             </w:pPr>
             <w:r>
-              <w:t>Como estudiante quiero un certificado PDF con código único al completar un curso.</w:t>
+              <w:t xml:space="preserve">Como estudiante quiero un certificado PDF con código único al </w:t>
+            </w:r>
+            <w:r>
+              <w:t>completar un curso.</w:t>
             </w:r>
           </w:p>
         </w:tc>
@@ -2424,10 +2427,10 @@
               <w:spacing w:line="240" w:lineRule="auto"/>
             </w:pPr>
             <w:r>
-              <w:t>Como administrador quiero crear cursos, registrar</w:t>
+              <w:t>Como administrador quiero cre</w:t>
             </w:r>
             <w:r>
-              <w:t xml:space="preserve"> colaboradores y ver su avance.</w:t>
+              <w:t>ar cursos, registrar colaboradores y ver su avance.</w:t>
             </w:r>
           </w:p>
         </w:tc>
@@ -2614,13 +2617,13 @@
         <w:rPr>
           <w:sz w:val="20"/>
         </w:rPr>
-        <w:t xml:space="preserve">Cada requisito se traza a </w:t>
+        <w:t xml:space="preserve">Cada </w:t>
       </w:r>
       <w:r>
         <w:rPr>
           <w:sz w:val="20"/>
         </w:rPr>
-        <w:t>un caso de uso de la Figura 2.</w:t>
+        <w:t>requisito se traza a un caso de uso de la Figura 2.</w:t>
       </w:r>
     </w:p>
     <w:p>
@@ -3377,7 +3380,7 @@
       <w:pPr>
         <w:pStyle w:val="Ttulo1"/>
       </w:pPr>
-      <w:bookmarkStart w:id="5" w:name="_Toc243593632"/>
+      <w:bookmarkStart w:id="5" w:name="_Toc244006394"/>
       <w:r>
         <w:t>Arquitectura propuesta</w:t>
       </w:r>
@@ -3387,7 +3390,7 @@
       <w:pPr>
         <w:pStyle w:val="Ttulo2"/>
       </w:pPr>
-      <w:bookmarkStart w:id="6" w:name="_Toc243593633"/>
+      <w:bookmarkStart w:id="6" w:name="_Toc244006395"/>
       <w:r>
         <w:t>Estilo arquitectónico</w:t>
       </w:r>
@@ -3448,7 +3451,7 @@
           <w:noProof/>
         </w:rPr>
         <w:drawing>
-          <wp:inline distT="0" distB="0" distL="0" distR="0" wp14:anchorId="7E2C458E" wp14:editId="03755160">
+          <wp:inline distT="0" distB="0" distL="0" distR="0" wp14:anchorId="380F54A0" wp14:editId="3F2E3FD6">
             <wp:extent cx="4389120" cy="3149445"/>
             <wp:effectExtent l="0" t="0" r="0" b="0"/>
             <wp:docPr id="2" name="Picture 2"/>
@@ -3506,7 +3509,7 @@
       <w:pPr>
         <w:pStyle w:val="Ttulo2"/>
       </w:pPr>
-      <w:bookmarkStart w:id="7" w:name="_Toc243593634"/>
+      <w:bookmarkStart w:id="7" w:name="_Toc244006396"/>
       <w:r>
         <w:t>Relación con los principios de la unidad</w:t>
       </w:r>
@@ -3567,7 +3570,7 @@
       <w:pPr>
         <w:pStyle w:val="Ttulo1"/>
       </w:pPr>
-      <w:bookmarkStart w:id="8" w:name="_Toc243593635"/>
+      <w:bookmarkStart w:id="8" w:name="_Toc244006397"/>
       <w:r>
         <w:t>Diseño de la arquitectura mediante UML</w:t>
       </w:r>
@@ -3595,7 +3598,7 @@
       <w:pPr>
         <w:pStyle w:val="Ttulo2"/>
       </w:pPr>
-      <w:bookmarkStart w:id="9" w:name="_Toc243593636"/>
+      <w:bookmarkStart w:id="9" w:name="_Toc244006398"/>
       <w:r>
         <w:lastRenderedPageBreak/>
         <w:t>Diagrama de casos de uso</w:t>
@@ -3636,7 +3639,7 @@
           <w:noProof/>
         </w:rPr>
         <w:drawing>
-          <wp:inline distT="0" distB="0" distL="0" distR="0" wp14:anchorId="46BF7BDC" wp14:editId="3AFF724D">
+          <wp:inline distT="0" distB="0" distL="0" distR="0" wp14:anchorId="6C53DA0B" wp14:editId="67E0C803">
             <wp:extent cx="5224812" cy="4206240"/>
             <wp:effectExtent l="0" t="0" r="0" b="0"/>
             <wp:docPr id="3" name="Picture 3"/>
@@ -3705,7 +3708,7 @@
       <w:pPr>
         <w:pStyle w:val="Ttulo2"/>
       </w:pPr>
-      <w:bookmarkStart w:id="10" w:name="_Toc243593637"/>
+      <w:bookmarkStart w:id="10" w:name="_Toc244006399"/>
       <w:r>
         <w:lastRenderedPageBreak/>
         <w:t>Diagrama de clases</w:t>
@@ -3746,7 +3749,7 @@
           <w:noProof/>
         </w:rPr>
         <w:drawing>
-          <wp:inline distT="0" distB="0" distL="0" distR="0" wp14:anchorId="74D0C378" wp14:editId="07E7C816">
+          <wp:inline distT="0" distB="0" distL="0" distR="0" wp14:anchorId="35660A36" wp14:editId="26A27B68">
             <wp:extent cx="4865321" cy="4389119"/>
             <wp:effectExtent l="0" t="0" r="0" b="0"/>
             <wp:docPr id="4" name="Picture 4"/>
@@ -3825,7 +3828,7 @@
       <w:pPr>
         <w:pStyle w:val="Ttulo2"/>
       </w:pPr>
-      <w:bookmarkStart w:id="11" w:name="_Toc243593638"/>
+      <w:bookmarkStart w:id="11" w:name="_Toc244006400"/>
       <w:r>
         <w:lastRenderedPageBreak/>
         <w:t>Diagrama de secuencia</w:t>
@@ -3866,7 +3869,7 @@
           <w:noProof/>
         </w:rPr>
         <w:drawing>
-          <wp:inline distT="0" distB="0" distL="0" distR="0" wp14:anchorId="61F3A046" wp14:editId="5A5884AE">
+          <wp:inline distT="0" distB="0" distL="0" distR="0" wp14:anchorId="42650AB1" wp14:editId="3957EDD6">
             <wp:extent cx="5943600" cy="3956013"/>
             <wp:effectExtent l="0" t="0" r="0" b="0"/>
             <wp:docPr id="5" name="Picture 5"/>
@@ -3955,7 +3958,7 @@
       <w:pPr>
         <w:pStyle w:val="Ttulo2"/>
       </w:pPr>
-      <w:bookmarkStart w:id="12" w:name="_Toc243593639"/>
+      <w:bookmarkStart w:id="12" w:name="_Toc244006401"/>
       <w:r>
         <w:lastRenderedPageBreak/>
         <w:t>Diagrama de despliegue</w:t>
@@ -3996,7 +3999,7 @@
           <w:noProof/>
         </w:rPr>
         <w:drawing>
-          <wp:inline distT="0" distB="0" distL="0" distR="0" wp14:anchorId="10E6EC98" wp14:editId="060F2D7B">
+          <wp:inline distT="0" distB="0" distL="0" distR="0" wp14:anchorId="7D4BF3CB" wp14:editId="65D4B6C5">
             <wp:extent cx="5120640" cy="4265231"/>
             <wp:effectExtent l="0" t="0" r="0" b="0"/>
             <wp:docPr id="6" name="Picture 6"/>
@@ -4071,7 +4074,7 @@
       <w:pPr>
         <w:pStyle w:val="Ttulo1"/>
       </w:pPr>
-      <w:bookmarkStart w:id="13" w:name="_Toc243593640"/>
+      <w:bookmarkStart w:id="13" w:name="_Toc244006402"/>
       <w:r>
         <w:t>Selección y justificación de patrones de diseño</w:t>
       </w:r>
@@ -4933,7 +4936,7 @@
       <w:pPr>
         <w:pStyle w:val="Ttulo1"/>
       </w:pPr>
-      <w:bookmarkStart w:id="14" w:name="_Toc243593641"/>
+      <w:bookmarkStart w:id="14" w:name="_Toc244006403"/>
       <w:r>
         <w:lastRenderedPageBreak/>
         <w:t>Prototipo funcional en la nube</w:t>
@@ -5005,7 +5008,7 @@
           <w:noProof/>
         </w:rPr>
         <w:drawing>
-          <wp:inline distT="0" distB="0" distL="0" distR="0" wp14:anchorId="0F508C3F" wp14:editId="20210815">
+          <wp:inline distT="0" distB="0" distL="0" distR="0" wp14:anchorId="2C747F81" wp14:editId="0C4C4CD6">
             <wp:extent cx="5120640" cy="3073883"/>
             <wp:effectExtent l="0" t="0" r="0" b="0"/>
             <wp:docPr id="7" name="Picture 7"/>
@@ -5094,7 +5097,7 @@
           <w:noProof/>
         </w:rPr>
         <w:drawing>
-          <wp:inline distT="0" distB="0" distL="0" distR="0" wp14:anchorId="2E3FD423" wp14:editId="61BA19A1">
+          <wp:inline distT="0" distB="0" distL="0" distR="0" wp14:anchorId="662C6077" wp14:editId="4F7DB44F">
             <wp:extent cx="5120640" cy="3073883"/>
             <wp:effectExtent l="0" t="0" r="0" b="0"/>
             <wp:docPr id="8" name="Picture 8"/>
@@ -5667,7 +5670,7 @@
       <w:pPr>
         <w:pStyle w:val="Ttulo1"/>
       </w:pPr>
-      <w:bookmarkStart w:id="15" w:name="_Toc243593642"/>
+      <w:bookmarkStart w:id="15" w:name="_Toc244006404"/>
       <w:r>
         <w:t>Conclusiones</w:t>
       </w:r>
@@ -5704,7 +5707,7 @@
         <w:pStyle w:val="Ttulo1"/>
         <w:pageBreakBefore/>
       </w:pPr>
-      <w:bookmarkStart w:id="16" w:name="_Toc243593643"/>
+      <w:bookmarkStart w:id="16" w:name="_Toc244006405"/>
       <w:r>
         <w:lastRenderedPageBreak/>
         <w:t>Referencias</w:t>

</xml_diff>

<commit_message>
Agrega el nombre de la docente
Ing. Leydi Johana Polo Amador, en la portada del informe, la presentación
y la descripción del video.

Co-Authored-By: Claude Opus 5.5 <noreply@anthropic.com>
</commit_message>
<xml_diff>
--- a/docs/informe/Informe-AulaNube.docx
+++ b/docs/informe/Informe-AulaNube.docx
@@ -12,7 +12,7 @@
           <w:noProof/>
         </w:rPr>
         <w:drawing>
-          <wp:inline distT="0" distB="0" distL="0" distR="0" wp14:anchorId="3E7C219E" wp14:editId="3B229087">
+          <wp:inline distT="0" distB="0" distL="0" distR="0" wp14:anchorId="34FE61B3" wp14:editId="1DF6E35A">
             <wp:extent cx="3143250" cy="857250"/>
             <wp:effectExtent l="0" t="0" r="0" b="0"/>
             <wp:docPr id="1" name="Picture 1"/>
@@ -97,7 +97,7 @@
         <w:jc w:val="center"/>
       </w:pPr>
       <w:r>
-        <w:t>Docente: [Nombre del docente]</w:t>
+        <w:t>Docente: Ing. Leydi Johana Polo Amador</w:t>
       </w:r>
     </w:p>
     <w:p>
@@ -122,7 +122,7 @@
         <w:pStyle w:val="Ttulo1"/>
         <w:pageBreakBefore/>
       </w:pPr>
-      <w:bookmarkStart w:id="0" w:name="_Toc244006389"/>
+      <w:bookmarkStart w:id="0" w:name="_Toc244006667"/>
       <w:r>
         <w:lastRenderedPageBreak/>
         <w:t>Resumen</w:t>
@@ -134,22 +134,22 @@
         <w:pStyle w:val="parrafoApa"/>
       </w:pPr>
       <w:r>
-        <w:t>Este informe presenta la arquitectura propuesta para CapacitaPro S.A.S., empresa ficticia que ofrece capacitación virtual obligatoria a 3</w:t>
+        <w:t>Este informe presenta la arquitectura propuesta para CapacitaPro S.A.S., empresa ficticia que ofrece capacitación virtual obliga</w:t>
       </w:r>
       <w:r>
-        <w:t>8 empresas cliente con una instalación de WordPress por cliente, modelo que colapsa en los cierres de campaña, hace esperar al usuario mientras se genera el certificado y multiplica el mantenimiento. A partir del análisis de requisitos se formularon diez e</w:t>
+        <w:t>toria a 38 empresas cliente con una instalación de WordPress por cliente, modelo que colapsa en los cierres de campaña, hace esperar al usuario mientras se genera el certificado y multiplica el mantenimiento. A partir del análisis de requisitos se formular</w:t>
       </w:r>
       <w:r>
-        <w:t>scenarios de calidad medibles que orientaron el diseño de AulaNube, una plataforma multiempresa basada en microservicios, con un API Gateway, una base de datos por servicio y eventos asíncronos en Redis Streams. La arquitectura se documentó con diagramas U</w:t>
+        <w:t>on diez escenarios de calidad medibles que orientaron el diseño de AulaNube, una plataforma multiempresa basada en microservicios, con un API Gateway, una base de datos por servicio y eventos asíncronos en Redis Streams. La arquitectura se documentó con di</w:t>
       </w:r>
       <w:r>
-        <w:t>ML de casos de uso, clases, secuencia y despliegue, y se justificaron patrones de diseño para la nube como Transactional Outbox, Queue-Based Load Leveling, Competing Consumers y Circuit Breaker. El prototipo se desplegó en Oracle Cloud Infrastructure, sobr</w:t>
+        <w:t>agramas UML de casos de uso, clases, secuencia y despliegue, y se justificaron patrones de diseño para la nube como Transactional Outbox, Queue-Based Load Leveling, Competing Consumers y Circuit Breaker. El prototipo se desplegó en Oracle Cloud Infrastruct</w:t>
       </w:r>
       <w:r>
-        <w:t>e un clúster K3s de dos nodos Ampere A1 de la capa gratuita, y las mediciones confirmaron los escenarios: una campaña masiva responde en menos de 300 ms, el gateway responde en 110 ms con un servicio caído y ningún certificado se pierde cuando falla el tra</w:t>
+        <w:t>ure, sobre un clúster K3s de dos nodos Ampere A1 de la capa gratuita, y las mediciones confirmaron los escenarios: una campaña masiva responde en menos de 300 ms, el gateway responde en 110 ms con un servicio caído y ningún certificado se pierde cuando fal</w:t>
       </w:r>
       <w:r>
-        <w:t>bajador.</w:t>
+        <w:t>la el trabajador.</w:t>
       </w:r>
     </w:p>
     <w:p>
@@ -157,7 +157,7 @@
         <w:pStyle w:val="Ttulo1"/>
         <w:pageBreakBefore/>
       </w:pPr>
-      <w:bookmarkStart w:id="1" w:name="_Toc244006390"/>
+      <w:bookmarkStart w:id="1" w:name="_Toc244006668"/>
       <w:r>
         <w:lastRenderedPageBreak/>
         <w:t>Tabla de contenido</w:t>
@@ -186,7 +186,7 @@
       <w:r>
         <w:fldChar w:fldCharType="separate"/>
       </w:r>
-      <w:hyperlink w:anchor="_Toc244006389" w:history="1">
+      <w:hyperlink w:anchor="_Toc244006667" w:history="1">
         <w:r>
           <w:rPr>
             <w:rStyle w:val="Hipervnculo"/>
@@ -214,7 +214,7 @@
             <w:noProof/>
             <w:webHidden/>
           </w:rPr>
-          <w:instrText xml:space="preserve"> PAGEREF _Toc244006389 \h </w:instrText>
+          <w:instrText xml:space="preserve"> PAGEREF _Toc244006667 \h </w:instrText>
         </w:r>
         <w:r>
           <w:rPr>
@@ -258,7 +258,7 @@
           <w:lang w:val="es-CO" w:eastAsia="es-CO"/>
         </w:rPr>
       </w:pPr>
-      <w:hyperlink w:anchor="_Toc244006390" w:history="1">
+      <w:hyperlink w:anchor="_Toc244006668" w:history="1">
         <w:r>
           <w:rPr>
             <w:rStyle w:val="Hipervnculo"/>
@@ -286,7 +286,7 @@
             <w:noProof/>
             <w:webHidden/>
           </w:rPr>
-          <w:instrText xml:space="preserve"> PAGEREF _Toc244006390 \h </w:instrText>
+          <w:instrText xml:space="preserve"> PAGEREF _Toc244006668 \h </w:instrText>
         </w:r>
         <w:r>
           <w:rPr>
@@ -330,7 +330,7 @@
           <w:lang w:val="es-CO" w:eastAsia="es-CO"/>
         </w:rPr>
       </w:pPr>
-      <w:hyperlink w:anchor="_Toc244006391" w:history="1">
+      <w:hyperlink w:anchor="_Toc244006669" w:history="1">
         <w:r>
           <w:rPr>
             <w:rStyle w:val="Hipervnculo"/>
@@ -358,7 +358,7 @@
             <w:noProof/>
             <w:webHidden/>
           </w:rPr>
-          <w:instrText xml:space="preserve"> PAGEREF _Toc244006391 \h </w:instrText>
+          <w:instrText xml:space="preserve"> PAGEREF _Toc244006669 \h </w:instrText>
         </w:r>
         <w:r>
           <w:rPr>
@@ -402,7 +402,7 @@
           <w:lang w:val="es-CO" w:eastAsia="es-CO"/>
         </w:rPr>
       </w:pPr>
-      <w:hyperlink w:anchor="_Toc244006392" w:history="1">
+      <w:hyperlink w:anchor="_Toc244006670" w:history="1">
         <w:r>
           <w:rPr>
             <w:rStyle w:val="Hipervnculo"/>
@@ -430,7 +430,7 @@
             <w:noProof/>
             <w:webHidden/>
           </w:rPr>
-          <w:instrText xml:space="preserve"> PAGEREF _Toc244006392 \h </w:instrText>
+          <w:instrText xml:space="preserve"> PAGEREF _Toc244006670 \h </w:instrText>
         </w:r>
         <w:r>
           <w:rPr>
@@ -474,7 +474,7 @@
           <w:lang w:val="es-CO" w:eastAsia="es-CO"/>
         </w:rPr>
       </w:pPr>
-      <w:hyperlink w:anchor="_Toc244006393" w:history="1">
+      <w:hyperlink w:anchor="_Toc244006671" w:history="1">
         <w:r>
           <w:rPr>
             <w:rStyle w:val="Hipervnculo"/>
@@ -502,7 +502,7 @@
             <w:noProof/>
             <w:webHidden/>
           </w:rPr>
-          <w:instrText xml:space="preserve"> PAGEREF _Toc244006393 \h </w:instrText>
+          <w:instrText xml:space="preserve"> PAGEREF _Toc244006671 \h </w:instrText>
         </w:r>
         <w:r>
           <w:rPr>
@@ -546,7 +546,7 @@
           <w:lang w:val="es-CO" w:eastAsia="es-CO"/>
         </w:rPr>
       </w:pPr>
-      <w:hyperlink w:anchor="_Toc244006394" w:history="1">
+      <w:hyperlink w:anchor="_Toc244006672" w:history="1">
         <w:r>
           <w:rPr>
             <w:rStyle w:val="Hipervnculo"/>
@@ -574,7 +574,7 @@
             <w:noProof/>
             <w:webHidden/>
           </w:rPr>
-          <w:instrText xml:space="preserve"> PAGEREF _Toc244006394 \h </w:instrText>
+          <w:instrText xml:space="preserve"> PAGEREF _Toc244006672 \h </w:instrText>
         </w:r>
         <w:r>
           <w:rPr>
@@ -618,7 +618,7 @@
           <w:lang w:val="es-CO" w:eastAsia="es-CO"/>
         </w:rPr>
       </w:pPr>
-      <w:hyperlink w:anchor="_Toc244006395" w:history="1">
+      <w:hyperlink w:anchor="_Toc244006673" w:history="1">
         <w:r>
           <w:rPr>
             <w:rStyle w:val="Hipervnculo"/>
@@ -646,7 +646,7 @@
             <w:noProof/>
             <w:webHidden/>
           </w:rPr>
-          <w:instrText xml:space="preserve"> PAGEREF _Toc244006395 \h </w:instrText>
+          <w:instrText xml:space="preserve"> PAGEREF _Toc244006673 \h </w:instrText>
         </w:r>
         <w:r>
           <w:rPr>
@@ -690,7 +690,7 @@
           <w:lang w:val="es-CO" w:eastAsia="es-CO"/>
         </w:rPr>
       </w:pPr>
-      <w:hyperlink w:anchor="_Toc244006396" w:history="1">
+      <w:hyperlink w:anchor="_Toc244006674" w:history="1">
         <w:r>
           <w:rPr>
             <w:rStyle w:val="Hipervnculo"/>
@@ -718,7 +718,7 @@
             <w:noProof/>
             <w:webHidden/>
           </w:rPr>
-          <w:instrText xml:space="preserve"> PAGEREF _Toc244006396 \h </w:instrText>
+          <w:instrText xml:space="preserve"> PAGEREF _Toc244006674 \h </w:instrText>
         </w:r>
         <w:r>
           <w:rPr>
@@ -762,7 +762,7 @@
           <w:lang w:val="es-CO" w:eastAsia="es-CO"/>
         </w:rPr>
       </w:pPr>
-      <w:hyperlink w:anchor="_Toc244006397" w:history="1">
+      <w:hyperlink w:anchor="_Toc244006675" w:history="1">
         <w:r>
           <w:rPr>
             <w:rStyle w:val="Hipervnculo"/>
@@ -790,7 +790,7 @@
             <w:noProof/>
             <w:webHidden/>
           </w:rPr>
-          <w:instrText xml:space="preserve"> PAGEREF _Toc244006397 \h </w:instrText>
+          <w:instrText xml:space="preserve"> PAGEREF _Toc244006675 \h </w:instrText>
         </w:r>
         <w:r>
           <w:rPr>
@@ -834,7 +834,7 @@
           <w:lang w:val="es-CO" w:eastAsia="es-CO"/>
         </w:rPr>
       </w:pPr>
-      <w:hyperlink w:anchor="_Toc244006398" w:history="1">
+      <w:hyperlink w:anchor="_Toc244006676" w:history="1">
         <w:r>
           <w:rPr>
             <w:rStyle w:val="Hipervnculo"/>
@@ -862,7 +862,7 @@
             <w:noProof/>
             <w:webHidden/>
           </w:rPr>
-          <w:instrText xml:space="preserve"> PAGEREF _Toc244006398 \h </w:instrText>
+          <w:instrText xml:space="preserve"> PAGEREF _Toc244006676 \h </w:instrText>
         </w:r>
         <w:r>
           <w:rPr>
@@ -906,7 +906,7 @@
           <w:lang w:val="es-CO" w:eastAsia="es-CO"/>
         </w:rPr>
       </w:pPr>
-      <w:hyperlink w:anchor="_Toc244006399" w:history="1">
+      <w:hyperlink w:anchor="_Toc244006677" w:history="1">
         <w:r>
           <w:rPr>
             <w:rStyle w:val="Hipervnculo"/>
@@ -934,7 +934,7 @@
             <w:noProof/>
             <w:webHidden/>
           </w:rPr>
-          <w:instrText xml:space="preserve"> PAGEREF _Toc244006399 \h </w:instrText>
+          <w:instrText xml:space="preserve"> PAGEREF _Toc244006677 \h </w:instrText>
         </w:r>
         <w:r>
           <w:rPr>
@@ -978,7 +978,7 @@
           <w:lang w:val="es-CO" w:eastAsia="es-CO"/>
         </w:rPr>
       </w:pPr>
-      <w:hyperlink w:anchor="_Toc244006400" w:history="1">
+      <w:hyperlink w:anchor="_Toc244006678" w:history="1">
         <w:r>
           <w:rPr>
             <w:rStyle w:val="Hipervnculo"/>
@@ -1006,7 +1006,7 @@
             <w:noProof/>
             <w:webHidden/>
           </w:rPr>
-          <w:instrText xml:space="preserve"> PAGEREF _Toc244006400 \h </w:instrText>
+          <w:instrText xml:space="preserve"> PAGEREF _Toc244006678 \h </w:instrText>
         </w:r>
         <w:r>
           <w:rPr>
@@ -1050,7 +1050,7 @@
           <w:lang w:val="es-CO" w:eastAsia="es-CO"/>
         </w:rPr>
       </w:pPr>
-      <w:hyperlink w:anchor="_Toc244006401" w:history="1">
+      <w:hyperlink w:anchor="_Toc244006679" w:history="1">
         <w:r>
           <w:rPr>
             <w:rStyle w:val="Hipervnculo"/>
@@ -1078,7 +1078,7 @@
             <w:noProof/>
             <w:webHidden/>
           </w:rPr>
-          <w:instrText xml:space="preserve"> PAGEREF _Toc244006401 \h </w:instrText>
+          <w:instrText xml:space="preserve"> PAGEREF _Toc244006679 \h </w:instrText>
         </w:r>
         <w:r>
           <w:rPr>
@@ -1122,7 +1122,7 @@
           <w:lang w:val="es-CO" w:eastAsia="es-CO"/>
         </w:rPr>
       </w:pPr>
-      <w:hyperlink w:anchor="_Toc244006402" w:history="1">
+      <w:hyperlink w:anchor="_Toc244006680" w:history="1">
         <w:r>
           <w:rPr>
             <w:rStyle w:val="Hipervnculo"/>
@@ -1150,7 +1150,7 @@
             <w:noProof/>
             <w:webHidden/>
           </w:rPr>
-          <w:instrText xml:space="preserve"> PAGEREF _Toc244006402 \h </w:instrText>
+          <w:instrText xml:space="preserve"> PAGEREF _Toc244006680 \h </w:instrText>
         </w:r>
         <w:r>
           <w:rPr>
@@ -1194,7 +1194,7 @@
           <w:lang w:val="es-CO" w:eastAsia="es-CO"/>
         </w:rPr>
       </w:pPr>
-      <w:hyperlink w:anchor="_Toc244006403" w:history="1">
+      <w:hyperlink w:anchor="_Toc244006681" w:history="1">
         <w:r>
           <w:rPr>
             <w:rStyle w:val="Hipervnculo"/>
@@ -1222,7 +1222,7 @@
             <w:noProof/>
             <w:webHidden/>
           </w:rPr>
-          <w:instrText xml:space="preserve"> PAGEREF _Toc244006403 \h </w:instrText>
+          <w:instrText xml:space="preserve"> PAGEREF _Toc244006681 \h </w:instrText>
         </w:r>
         <w:r>
           <w:rPr>
@@ -1266,7 +1266,7 @@
           <w:lang w:val="es-CO" w:eastAsia="es-CO"/>
         </w:rPr>
       </w:pPr>
-      <w:hyperlink w:anchor="_Toc244006404" w:history="1">
+      <w:hyperlink w:anchor="_Toc244006682" w:history="1">
         <w:r>
           <w:rPr>
             <w:rStyle w:val="Hipervnculo"/>
@@ -1294,7 +1294,7 @@
             <w:noProof/>
             <w:webHidden/>
           </w:rPr>
-          <w:instrText xml:space="preserve"> PAGEREF _Toc244006404 \h </w:instrText>
+          <w:instrText xml:space="preserve"> PAGEREF _Toc244006682 \h </w:instrText>
         </w:r>
         <w:r>
           <w:rPr>
@@ -1338,7 +1338,7 @@
           <w:lang w:val="es-CO" w:eastAsia="es-CO"/>
         </w:rPr>
       </w:pPr>
-      <w:hyperlink w:anchor="_Toc244006405" w:history="1">
+      <w:hyperlink w:anchor="_Toc244006683" w:history="1">
         <w:r>
           <w:rPr>
             <w:rStyle w:val="Hipervnculo"/>
@@ -1366,7 +1366,7 @@
             <w:noProof/>
             <w:webHidden/>
           </w:rPr>
-          <w:instrText xml:space="preserve"> PAGEREF _Toc244006405 \h </w:instrText>
+          <w:instrText xml:space="preserve"> PAGEREF _Toc244006683 \h </w:instrText>
         </w:r>
         <w:r>
           <w:rPr>
@@ -1407,7 +1407,7 @@
         <w:pStyle w:val="Ttulo1"/>
         <w:pageBreakBefore/>
       </w:pPr>
-      <w:bookmarkStart w:id="2" w:name="_Toc244006391"/>
+      <w:bookmarkStart w:id="2" w:name="_Toc244006669"/>
       <w:r>
         <w:lastRenderedPageBreak/>
         <w:t>AulaNube: arquitectura de microservicios en la nube para la plataforma de capacitación corporativa de CapacitaPro S.A.S.</w:t>
@@ -1419,13 +1419,13 @@
         <w:pStyle w:val="parrafoApa"/>
       </w:pPr>
       <w:r>
-        <w:t>Según la norma IEEE 1471-20</w:t>
+        <w:t>Según la norma IEE</w:t>
       </w:r>
       <w:r>
-        <w:t>00, adoptada después como ISO/IEC 42010, la arquitectura de software es la organización fundamental de un sistema, manifestada en sus componentes, las relaciones entre ellos y con su entorno, y los principios que guían su diseño y evolución (Tecnológica de</w:t>
+        <w:t>E 1471-2000, adoptada después como ISO/IEC 42010, la arquitectura de software es la organización fundamental de un sistema, manifestada en sus componentes, las relaciones entre ellos y con su entorno, y los principios que guían su diseño y evolución (Tecno</w:t>
       </w:r>
       <w:r>
-        <w:t>l Oriente, 2026). Como estas decisiones se toman al inicio y cambiarlas después es costoso y riesgoso, deben responder a los atributos de calidad que el negocio necesita y no solo a la funcionalidad (Bass et al., 2012).</w:t>
+        <w:t>lógica del Oriente, 2026). Como estas decisiones se toman al inicio y cambiarlas después es costoso y riesgoso, deben responder a los atributos de calidad que el negocio necesita y no solo a la funcionalidad (Bass et al., 2012).</w:t>
       </w:r>
     </w:p>
     <w:p>
@@ -1433,20 +1433,20 @@
         <w:pStyle w:val="parrafoApa"/>
       </w:pPr>
       <w:r>
-        <w:t>El informe presenta la solución prop</w:t>
+        <w:t>El informe presenta la solu</w:t>
       </w:r>
       <w:r>
-        <w:t>uesta para CapacitaPro S.A.S.: el caso y sus requisitos, la arquitectura propuesta, su modelado en UML, los patrones de diseño seleccionados y el prototipo desplegado en la nube con las pruebas que comprueban cada decisión. El código fuente y los diagramas</w:t>
+        <w:t xml:space="preserve">ción propuesta para CapacitaPro S.A.S.: el caso y sus requisitos, la arquitectura propuesta, su modelado en UML, los patrones de diseño seleccionados y el prototipo desplegado en la nube con las pruebas que comprueban cada decisión. El código fuente y los </w:t>
       </w:r>
       <w:r>
-        <w:t xml:space="preserve"> están en https://github.com/augustocco/aulanube, y la aplicación funciona en https://aulanube.149-130-191-139.sslip.io.</w:t>
+        <w:t>diagramas están en https://github.com/augustocco/aulanube, y la aplicación funciona en https://aulanube.149-130-191-139.sslip.io.</w:t>
       </w:r>
     </w:p>
     <w:p>
       <w:pPr>
         <w:pStyle w:val="Ttulo1"/>
       </w:pPr>
-      <w:bookmarkStart w:id="3" w:name="_Toc244006392"/>
+      <w:bookmarkStart w:id="3" w:name="_Toc244006670"/>
       <w:r>
         <w:t>Caso de estudio: CapacitaPro S.A.S.</w:t>
       </w:r>
@@ -1457,13 +1457,13 @@
         <w:pStyle w:val="parrafoApa"/>
       </w:pPr>
       <w:r>
-        <w:t xml:space="preserve">CapacitaPro S.A.S. es una empresa ficticia de Bucaramanga que diseña y administra cursos virtuales </w:t>
+        <w:t>CapacitaPro S.A.S. es una empresa ficticia de Bucaramanga que diseña y administra cursos v</w:t>
       </w:r>
       <w:r>
-        <w:t xml:space="preserve">que la ley o los contratos hacen obligatorios: inducción al SG-SST, trabajo seguro en alturas, protección de datos personales y atención humanizada en salud. Atiende a 38 empresas cliente y unos 14.000 usuarios; cada cliente tiene su propia instalación de </w:t>
+        <w:t>irtuales que la ley o los contratos hacen obligatorios: inducción al SG-SST, trabajo seguro en alturas, protección de datos personales y atención humanizada en salud. Atiende a 38 empresas cliente y unos 14.000 usuarios; cada cliente tiene su propia instal</w:t>
       </w:r>
       <w:r>
-        <w:t>WordPress con un plugin de LMS, repartidas en cinco servidores. La Tabla 1 resume los problemas de ese modelo.</w:t>
+        <w:t>ación de WordPress con un plugin de LMS, repartidas en cinco servidores. La Tabla 1 resume los problemas de ese modelo.</w:t>
       </w:r>
     </w:p>
     <w:p>
@@ -1856,7 +1856,7 @@
       <w:pPr>
         <w:pStyle w:val="Ttulo1"/>
       </w:pPr>
-      <w:bookmarkStart w:id="4" w:name="_Toc244006393"/>
+      <w:bookmarkStart w:id="4" w:name="_Toc244006671"/>
       <w:r>
         <w:t>Análisis de requisitos</w:t>
       </w:r>
@@ -3380,7 +3380,7 @@
       <w:pPr>
         <w:pStyle w:val="Ttulo1"/>
       </w:pPr>
-      <w:bookmarkStart w:id="5" w:name="_Toc244006394"/>
+      <w:bookmarkStart w:id="5" w:name="_Toc244006672"/>
       <w:r>
         <w:t>Arquitectura propuesta</w:t>
       </w:r>
@@ -3390,7 +3390,7 @@
       <w:pPr>
         <w:pStyle w:val="Ttulo2"/>
       </w:pPr>
-      <w:bookmarkStart w:id="6" w:name="_Toc244006395"/>
+      <w:bookmarkStart w:id="6" w:name="_Toc244006673"/>
       <w:r>
         <w:t>Estilo arquitectónico</w:t>
       </w:r>
@@ -3451,7 +3451,7 @@
           <w:noProof/>
         </w:rPr>
         <w:drawing>
-          <wp:inline distT="0" distB="0" distL="0" distR="0" wp14:anchorId="380F54A0" wp14:editId="3F2E3FD6">
+          <wp:inline distT="0" distB="0" distL="0" distR="0" wp14:anchorId="237CA693" wp14:editId="000F15B2">
             <wp:extent cx="4389120" cy="3149445"/>
             <wp:effectExtent l="0" t="0" r="0" b="0"/>
             <wp:docPr id="2" name="Picture 2"/>
@@ -3509,7 +3509,7 @@
       <w:pPr>
         <w:pStyle w:val="Ttulo2"/>
       </w:pPr>
-      <w:bookmarkStart w:id="7" w:name="_Toc244006396"/>
+      <w:bookmarkStart w:id="7" w:name="_Toc244006674"/>
       <w:r>
         <w:t>Relación con los principios de la unidad</w:t>
       </w:r>
@@ -3570,7 +3570,7 @@
       <w:pPr>
         <w:pStyle w:val="Ttulo1"/>
       </w:pPr>
-      <w:bookmarkStart w:id="8" w:name="_Toc244006397"/>
+      <w:bookmarkStart w:id="8" w:name="_Toc244006675"/>
       <w:r>
         <w:t>Diseño de la arquitectura mediante UML</w:t>
       </w:r>
@@ -3598,7 +3598,7 @@
       <w:pPr>
         <w:pStyle w:val="Ttulo2"/>
       </w:pPr>
-      <w:bookmarkStart w:id="9" w:name="_Toc244006398"/>
+      <w:bookmarkStart w:id="9" w:name="_Toc244006676"/>
       <w:r>
         <w:lastRenderedPageBreak/>
         <w:t>Diagrama de casos de uso</w:t>
@@ -3639,7 +3639,7 @@
           <w:noProof/>
         </w:rPr>
         <w:drawing>
-          <wp:inline distT="0" distB="0" distL="0" distR="0" wp14:anchorId="6C53DA0B" wp14:editId="67E0C803">
+          <wp:inline distT="0" distB="0" distL="0" distR="0" wp14:anchorId="5DBFFB4B" wp14:editId="29185DD7">
             <wp:extent cx="5224812" cy="4206240"/>
             <wp:effectExtent l="0" t="0" r="0" b="0"/>
             <wp:docPr id="3" name="Picture 3"/>
@@ -3708,7 +3708,7 @@
       <w:pPr>
         <w:pStyle w:val="Ttulo2"/>
       </w:pPr>
-      <w:bookmarkStart w:id="10" w:name="_Toc244006399"/>
+      <w:bookmarkStart w:id="10" w:name="_Toc244006677"/>
       <w:r>
         <w:lastRenderedPageBreak/>
         <w:t>Diagrama de clases</w:t>
@@ -3749,7 +3749,7 @@
           <w:noProof/>
         </w:rPr>
         <w:drawing>
-          <wp:inline distT="0" distB="0" distL="0" distR="0" wp14:anchorId="35660A36" wp14:editId="26A27B68">
+          <wp:inline distT="0" distB="0" distL="0" distR="0" wp14:anchorId="26D4D04E" wp14:editId="4D4819F3">
             <wp:extent cx="4865321" cy="4389119"/>
             <wp:effectExtent l="0" t="0" r="0" b="0"/>
             <wp:docPr id="4" name="Picture 4"/>
@@ -3828,7 +3828,7 @@
       <w:pPr>
         <w:pStyle w:val="Ttulo2"/>
       </w:pPr>
-      <w:bookmarkStart w:id="11" w:name="_Toc244006400"/>
+      <w:bookmarkStart w:id="11" w:name="_Toc244006678"/>
       <w:r>
         <w:lastRenderedPageBreak/>
         <w:t>Diagrama de secuencia</w:t>
@@ -3869,7 +3869,7 @@
           <w:noProof/>
         </w:rPr>
         <w:drawing>
-          <wp:inline distT="0" distB="0" distL="0" distR="0" wp14:anchorId="42650AB1" wp14:editId="3957EDD6">
+          <wp:inline distT="0" distB="0" distL="0" distR="0" wp14:anchorId="62186268" wp14:editId="5C841588">
             <wp:extent cx="5943600" cy="3956013"/>
             <wp:effectExtent l="0" t="0" r="0" b="0"/>
             <wp:docPr id="5" name="Picture 5"/>
@@ -3958,7 +3958,7 @@
       <w:pPr>
         <w:pStyle w:val="Ttulo2"/>
       </w:pPr>
-      <w:bookmarkStart w:id="12" w:name="_Toc244006401"/>
+      <w:bookmarkStart w:id="12" w:name="_Toc244006679"/>
       <w:r>
         <w:lastRenderedPageBreak/>
         <w:t>Diagrama de despliegue</w:t>
@@ -3999,7 +3999,7 @@
           <w:noProof/>
         </w:rPr>
         <w:drawing>
-          <wp:inline distT="0" distB="0" distL="0" distR="0" wp14:anchorId="7D4BF3CB" wp14:editId="65D4B6C5">
+          <wp:inline distT="0" distB="0" distL="0" distR="0" wp14:anchorId="523AF5DF" wp14:editId="3AF74254">
             <wp:extent cx="5120640" cy="4265231"/>
             <wp:effectExtent l="0" t="0" r="0" b="0"/>
             <wp:docPr id="6" name="Picture 6"/>
@@ -4074,7 +4074,7 @@
       <w:pPr>
         <w:pStyle w:val="Ttulo1"/>
       </w:pPr>
-      <w:bookmarkStart w:id="13" w:name="_Toc244006402"/>
+      <w:bookmarkStart w:id="13" w:name="_Toc244006680"/>
       <w:r>
         <w:t>Selección y justificación de patrones de diseño</w:t>
       </w:r>
@@ -4936,7 +4936,7 @@
       <w:pPr>
         <w:pStyle w:val="Ttulo1"/>
       </w:pPr>
-      <w:bookmarkStart w:id="14" w:name="_Toc244006403"/>
+      <w:bookmarkStart w:id="14" w:name="_Toc244006681"/>
       <w:r>
         <w:lastRenderedPageBreak/>
         <w:t>Prototipo funcional en la nube</w:t>
@@ -5008,7 +5008,7 @@
           <w:noProof/>
         </w:rPr>
         <w:drawing>
-          <wp:inline distT="0" distB="0" distL="0" distR="0" wp14:anchorId="2C747F81" wp14:editId="0C4C4CD6">
+          <wp:inline distT="0" distB="0" distL="0" distR="0" wp14:anchorId="3AB873F2" wp14:editId="5144E62D">
             <wp:extent cx="5120640" cy="3073883"/>
             <wp:effectExtent l="0" t="0" r="0" b="0"/>
             <wp:docPr id="7" name="Picture 7"/>
@@ -5097,7 +5097,7 @@
           <w:noProof/>
         </w:rPr>
         <w:drawing>
-          <wp:inline distT="0" distB="0" distL="0" distR="0" wp14:anchorId="662C6077" wp14:editId="4F7DB44F">
+          <wp:inline distT="0" distB="0" distL="0" distR="0" wp14:anchorId="5B3F2F54" wp14:editId="22078155">
             <wp:extent cx="5120640" cy="3073883"/>
             <wp:effectExtent l="0" t="0" r="0" b="0"/>
             <wp:docPr id="8" name="Picture 8"/>
@@ -5670,7 +5670,7 @@
       <w:pPr>
         <w:pStyle w:val="Ttulo1"/>
       </w:pPr>
-      <w:bookmarkStart w:id="15" w:name="_Toc244006404"/>
+      <w:bookmarkStart w:id="15" w:name="_Toc244006682"/>
       <w:r>
         <w:t>Conclusiones</w:t>
       </w:r>
@@ -5707,7 +5707,7 @@
         <w:pStyle w:val="Ttulo1"/>
         <w:pageBreakBefore/>
       </w:pPr>
-      <w:bookmarkStart w:id="16" w:name="_Toc244006405"/>
+      <w:bookmarkStart w:id="16" w:name="_Toc244006683"/>
       <w:r>
         <w:lastRenderedPageBreak/>
         <w:t>Referencias</w:t>

</xml_diff>